<commit_message>
fix: mark subprojects as dirty after updates
</commit_message>
<xml_diff>
--- a/articles/current.docx
+++ b/articles/current.docx
@@ -156,7 +156,7 @@
         <w:pStyle w:val="FirstParagraph"/>
       </w:pPr>
       <w:r>
-        <w:t xml:space="preserve">Nel panorama dell’orientamento scolastico e professionale, i questionari occupano un ruolo centrale. Presentano allo studente una serie di affermazioni — su stili di studio, strategie, concentrazione, emozioni, studio in gruppo — chiedendo il grado di accordo. Al termine, restituiscono un profilo che sintetizza i risultati in fattori o brevi commenti. Questo esito può essere oggetto di riflessione personale o discusso con tutor, docente o orientatore; tale accompagnamento trova però un limite nella disponibilità di chi lo svolge. I recenti modelli conversazionali basati su Large Language Model (LLM) possono costituire un ampliamento di questo accompagnamento. L’articolo esplora tale possibilitò decrivendo la costruzione e la validazione di Counselorbot, un assistente conversazionale progettato per guidare lo studente nella riflessione su questi strumenti. In particolare, è testato sul Questionario sulle Strategie di Apprendimento (QSA), ma è già predisposto per essere usato con altri strumenti.</w:t>
+        <w:t xml:space="preserve">Nel panorama dell’orientamento scolastico e professionale, i questionari occupano un ruolo centrale. Presentano allo studente una serie di affermazioni — su stili di studio, strategie, concentrazione, emozioni, studio in gruppo — chiedendo il grado di accordo. Al termine, restituiscono un profilo che sintetizza i risultati in fattori o brevi commenti. Questo esito può essere oggetto di riflessione personale o discusso con tutor, docente o orientatore; tale accompagnamento trova però un limite nella disponibilità di chi lo svolge. I recenti modelli conversazionali basati su Large Language Model (LLM) possono costituire un ampliamento di questo accompagnamento. L’articolo esplora tale possibilitò decrivendo la costruzione e la validazione di Counselorbot, un assistente conversazionale progettato per guidare l’utente nella riflessione su questi strumenti. In particolare, è testato sul Questionario sulle Strategie di Apprendimento (QSA), ma è già predisposto per essere usato con altri strumenti.</w:t>
       </w:r>
     </w:p>
     <w:p>
@@ -191,7 +191,7 @@
         <w:pStyle w:val="FirstParagraph"/>
       </w:pPr>
       <w:r>
-        <w:t xml:space="preserve">L’intelligenza artificiale generativa (GenAI) è un insieme di strumenti in grado di produrre contenuti originali. Alla base di questi strumenti si trovano i</w:t>
+        <w:t xml:space="preserve">L’intelligenza artificiale generativa (GenAI) è un insieme di strumenti in grado di produrre contenuti originali. Alla base di questi strumenti vi sono i</w:t>
       </w:r>
       <w:r>
         <w:t xml:space="preserve"> </w:t>
@@ -280,7 +280,7 @@
         <w:t xml:space="preserve">rule-based</w:t>
       </w:r>
       <w:r>
-        <w:t xml:space="preserve">) (ELIZA, Weizenbaum 1966). Sono infatti in grado di produrre output adattivi e coerenti in linguaggio naturale, rendendo l’interazione più fluida e aperta a casi non previsti dal programmatore (Brown et al. 2020; Kasneci et al. 2023). Introducono tuttavia nuovi problemi — bias, comportamenti non in linea con la richiesta — che richiedono un’attenta gestione (Bender et al. 2021).</w:t>
+        <w:t xml:space="preserve">) (ELIZA, Weizenbaum 1966). Sono infatti in grado di produrre output adattivi e coerenti in linguaggio naturale, rendendo l’interazione più fluida e aperta a casi non previsti dal programmatore (Brown et al. 2020; Kasneci et al. 2023). Introducono tuttavia nuovi problemi tecnici — bias, allucinazioni, comportamenti non in linea con la richiesta — che richiedono un’attenta gestione (Bender et al. 2021). A questi si aggiunge un problema di accettazione: a parità di contenuto, le indicazioni fornite da un sistema artificiale tendono a essere percepite come meno credibili rispetto a quelle di un operatore umano (Cukurova et al. 2020).</w:t>
       </w:r>
     </w:p>
     <w:p>
@@ -320,7 +320,20 @@
         <w:t xml:space="preserve"> </w:t>
       </w:r>
       <w:r>
-        <w:t xml:space="preserve">intelligente (Self 1974). I chatbot basati su regole si sono dimostrati efficaci per compiti strutturati — tutoring in discipline specifiche, assessment, predizione (Zawacki-Richter et al. 2019; Kuhail et al. 2022). Il mentoring, inteso come accompagnamento tutoriale al percorso dello studente, è invece rimasto uno degli spazi meno coperti (Wollny et al. 2021): i diversi tentativi hanno mostrato che i sistemi a regole non erano ottimali per dialogo esteso e riflessione guidata (Su et al. 2020; Mendez et al. 2020; D’Silva et al. 2020).</w:t>
+        <w:t xml:space="preserve">intelligente (Self 1974). I chatbot basati su regole si sono dimostrati efficaci per compiti strutturati — tutoring in discipline specifiche, assessment, predizione (Zawacki-Richter et al. 2019; Kuhail et al. 2022). Il</w:t>
+      </w:r>
+      <w:r>
+        <w:t xml:space="preserve"> </w:t>
+      </w:r>
+      <w:r>
+        <w:rPr>
+          <w:iCs/>
+          <w:i/>
+        </w:rPr>
+        <w:t xml:space="preserve">mentoring</w:t>
+      </w:r>
+      <w:r>
+        <w:t xml:space="preserve">, inteso come accompagnamento tutoriale al percorso dello studente, è invece rimasto uno degli spazi meno coperti (Wollny et al. 2021): i diversi tentativi hanno mostrato che i sistemi a regole non erano ottimali per dialogo esteso e riflessione guidata (Su et al. 2020; Mendez et al. 2020; D’Silva et al. 2020).</w:t>
       </w:r>
     </w:p>
     <w:p>
@@ -344,7 +357,39 @@
         <w:t xml:space="preserve"> </w:t>
       </w:r>
       <w:r>
-        <w:t xml:space="preserve">— che ne vincolano il comportamento a un ruolo e a uno scopo, e generano linguaggio naturale coerente anche in risposta a input imprevisti (Kasneci et al. 2023). A questa istruibilità si aggiunge la possibilità di richiamare conoscenze contestuali — strategie approvate, dati del profilo dello studente, frammenti di letteratura — rendendo il dialogo adattivo alla situazione. È questa combinazione che può costituire la base per un assistente conversazionale in grado di accompagnare lo studente in un percorso di autovalutazione, sostenuto da conoscenze pertinenti e adattato alle sue risposte.</w:t>
+        <w:t xml:space="preserve">o i</w:t>
+      </w:r>
+      <w:r>
+        <w:t xml:space="preserve"> </w:t>
+      </w:r>
+      <w:r>
+        <w:rPr>
+          <w:iCs/>
+          <w:i/>
+        </w:rPr>
+        <w:t xml:space="preserve">meta prompt</w:t>
+      </w:r>
+      <w:r>
+        <w:t xml:space="preserve"> </w:t>
+      </w:r>
+      <w:r>
+        <w:t xml:space="preserve">— che ne vincolano il comportamento a un ruolo e a uno scopo, e generano linguaggio naturale coerente anche in risposta a input imprevisti (Kasneci et al. 2023). A questa istruibilità si aggiunge la possibilità di richiamare conoscenze contestuali — strategie approvate, dati del profilo dell’utente, frammenti di letteratura — migliorando l’accuratezza e la pertinenza delle risposte rispetto il contesto. Queste caratteristiche forniscono ingredienti promettenti per costruire un</w:t>
+      </w:r>
+      <w:r>
+        <w:t xml:space="preserve"> </w:t>
+      </w:r>
+      <w:r>
+        <w:rPr>
+          <w:iCs/>
+          <w:i/>
+        </w:rPr>
+        <w:t xml:space="preserve">mentoring chatbot</w:t>
+      </w:r>
+      <w:r>
+        <w:t xml:space="preserve"> </w:t>
+      </w:r>
+      <w:r>
+        <w:t xml:space="preserve">che accompagna l’utente in un percorso di autovalutazione, adattandosi alle sue esigenze.</w:t>
       </w:r>
     </w:p>
     <w:p>
@@ -352,7 +397,7 @@
         <w:pStyle w:val="BodyText"/>
       </w:pPr>
       <w:r>
-        <w:t xml:space="preserve">Tuttavia gli LLM presentano anche limiti che richiedono</w:t>
+        <w:t xml:space="preserve">Tuttavia gli LLM presentano limiti che richiedono</w:t>
       </w:r>
       <w:r>
         <w:t xml:space="preserve"> </w:t>
@@ -399,7 +444,23 @@
         <w:t xml:space="preserve"> </w:t>
       </w:r>
       <w:r>
-        <w:t xml:space="preserve">moderni possono quindi rendere scalabili processi di accompagnamento altrimenti non sostenibili (Neumann et al. 2021). Impiegati come tutor socratici — un modello dialogico in cui l’AI guida lo studente alla scoperta attraverso domande, non risposte dirette — possono inoltre sostenere lo sviluppo metacognitivo e l’</w:t>
+        <w:t xml:space="preserve">moderni possono quindi rendere scalabili processi di orientamento e</w:t>
+      </w:r>
+      <w:r>
+        <w:t xml:space="preserve"> </w:t>
+      </w:r>
+      <w:r>
+        <w:rPr>
+          <w:iCs/>
+          <w:i/>
+        </w:rPr>
+        <w:t xml:space="preserve">mentoring</w:t>
+      </w:r>
+      <w:r>
+        <w:t xml:space="preserve"> </w:t>
+      </w:r>
+      <w:r>
+        <w:t xml:space="preserve">altrimenti non sostenibili (Neumann et al. 2021). Impiegati come tutor socratici — un modello dialogico in cui l’AI guida lo studente alla scoperta attraverso domande, non risposte dirette — possono inoltre sostenere lo sviluppo metacognitivo e l’</w:t>
       </w:r>
       <w:r>
         <w:rPr>
@@ -412,7 +473,7 @@
         <w:t xml:space="preserve"> </w:t>
       </w:r>
       <w:r>
-        <w:t xml:space="preserve">epistemica, ossia la capacità dello studente di porsi come agente attivo nella costruzione della propria conoscenza (Antunes et al. 2025). Perché ciò avvenga, il dialogo va progettato attorno a principi di autoregolazione (Chang et al. 2023): le strategie di autovalutazione supportate dall’AI risultano infatti tra le meno utilizzate dagli studenti (Liu et al. 2025), e la consapevolezza metacognitiva richiesta per interagire con la GenAI è essa stessa un’abilità da sostenere (Tankelevitch et al. 2024). Il framework delle competenze strategiche, descritto nel paragrafo successivo, è uno strumento pensato proprio per rilevare e sostenere queste strategie.</w:t>
+        <w:t xml:space="preserve">epistemica, ossia la capacità dello studente di porsi come agente attivo nella costruzione della propria conoscenza (Antunes et al. 2025). Perché ciò avvenga, il dialogo va progettato attorno a principi di autoregolazione (Chang et al. 2023). Le strategie di autovalutazione supportate dall’AI risultano ancora tra le meno utilizzate dagli studenti (Liu et al. 2025). Inoltre, la consapevolezza metacognitiva richiesta per interagire con la GenAI è essa stessa un’abilità da sostenere (Tankelevitch et al. 2024). Il framework delle competenze strategiche, descritto nel paragrafo successivo, è uno strumento pensato proprio per rilevare e sostenere queste strategie.</w:t>
       </w:r>
     </w:p>
     <w:bookmarkEnd w:id="21"/>
@@ -446,7 +507,23 @@
         <w:t xml:space="preserve"> </w:t>
       </w:r>
       <w:r>
-        <w:t xml:space="preserve">designa l’insieme delle abilità cognitive, metacognitive, affettivo-motivazionali e volitive che uno studente attiva per pianificare, monitorare e regolare il proprio apprendimento, riconoscendo e mobilitando le risorse personali a disposizione. Il framework è stato sviluppato dal Centro Nazionale Opere Salesiane – Formazione Aggiornamento Professionale (CNOS-FAP) e dal gruppo di lavoro coordinato da Pellerey; i risultati confluiscono nella piattaforma competenzestrategiche.it.</w:t>
+        <w:t xml:space="preserve">— sviluppato dal gruppo di ricerca coordinato da Pellerey e Margottini nell’ambito del CNOS-FAP (Pellerey et al., 2013) — affonda le sue radici nel concetto aristotelico-tomista di</w:t>
+      </w:r>
+      <w:r>
+        <w:t xml:space="preserve"> </w:t>
+      </w:r>
+      <w:r>
+        <w:rPr>
+          <w:iCs/>
+          <w:i/>
+        </w:rPr>
+        <w:t xml:space="preserve">abito</w:t>
+      </w:r>
+      <w:r>
+        <w:t xml:space="preserve"> </w:t>
+      </w:r>
+      <w:r>
+        <w:t xml:space="preserve">(habitus), inteso come disposizione stabile della persona che integra dimensioni intellettuali, operative e morali. Nel contesto educativo, designa l’insieme delle abilità cognitive, metacognitive, affettivo-motivazionali e volitive che uno studente attiva per pianificare, monitorare e regolare il proprio apprendimento, riconoscendo e mobilitando le risorse personali a disposizione. Il framework articola il costrutto in nove aree — che spaziano dalle strategie di studio alla collaborazione, dalla percezione di competenza all’autoregolazione, dal coping alla progettualità — e costituisce il riferimento teorico della piattaforma competenzestrategiche.it.</w:t>
       </w:r>
     </w:p>
     <w:p>
@@ -454,23 +531,7 @@
         <w:pStyle w:val="BodyText"/>
       </w:pPr>
       <w:r>
-        <w:t xml:space="preserve">Il costrutto è esplorato attraverso il Questionario sulle Strategie di Apprendimento (QSA), che indaga due aree complementari: quella cognitiva (strategie elaborative, autoregolazione, organizzazione semantica, autointerrogazione) e quella affettivo-motivazionale (volizione, percezione di competenza, ansietà di base, attribuzioni causali). Gli esiti sono restituiti come profilo, con indicazioni per orientare l’interpretazione di ciascun ambito. Una forma ridotta del QSA (QSAr) è disponibile per i contesti in cui la versione integrale non è praticabile.</w:t>
-      </w:r>
-    </w:p>
-    <w:p>
-      <w:pPr>
-        <w:pStyle w:val="BodyText"/>
-      </w:pPr>
-      <w:r>
-        <w:t xml:space="preserve">La piattaforma competenzestrategiche.it consente la compilazione online del QSA e restituisce il profilo, corredato di istruzioni e strumenti per gli insegnanti che intendano analizzare gli esiti e riflettere insieme agli studenti.</w:t>
-      </w:r>
-    </w:p>
-    <w:p>
-      <w:pPr>
-        <w:pStyle w:val="BodyText"/>
-      </w:pPr>
-      <w:r>
-        <w:t xml:space="preserve">Al QSA si affiancano altri strumenti per l’orientamento: alcuni provengono dal framework delle competenzestrategiche.it — come lo ZTPI, che rileva la percezione del tempo lungo cinque prospettive, e l’intervista di Savickas (Savickas 2018) — altri da fonti esterne, come il Questionario di Balter (PQBL). Counselorbot è progettato come piattaforma aperta: nuovi strumenti possono essere integrati senza modifiche all’architettura.</w:t>
+        <w:t xml:space="preserve">A partire da questo costrutto è stato sviluppato il Questionario sulle Strategie di Apprendimento (QSA), che ne traduce le aree in fattori misurabili e ne restituisce un profilo individuale. Sulla piattaforma competenzestrategiche.it sono disponibili anche altri strumenti basati sul medesimo framework — tra cui lo ZTPI per la prospettiva temporale, il QAP per l’adattabilità professionale, il QPCS e il QPCC per diversi target di età — oltre a una forma ridotta del QSA (QSAr).</w:t>
       </w:r>
     </w:p>
     <w:bookmarkEnd w:id="22"/>
@@ -488,23 +549,7 @@
         <w:pStyle w:val="FirstParagraph"/>
       </w:pPr>
       <w:r>
-        <w:t xml:space="preserve">L’analisi della letteratura e degli strumenti esistenti evidenzia uno scarto. Da un lato, i sistemi basati su LLM per il dialogo in contesti educativi sono ancora prevalentemente orientati al supporto emotivo o al tutoring disciplinare; alcuni lavori mostrano come un LLM possa generare feedback prescrittivi a partire da dati e modelli predittivi (Susnjak 2023), ma raramente in connessione con strumenti strutturati di autovalutazione. Dall’altro, gli strumenti di autovalutazione delle competenze strategiche — come il QSA — restituiscono un profilo senza offrire un accompagnamento dialogico che aiuti lo studente a interpretarlo e a tradurlo in azioni concrete. A ciò si aggiunge una questione di accettazione: a parità di contenuto, le indicazioni attribuite a un’intelligenza artificiale tendono a essere percepite come meno credibili (Cukurova et al. 2020), il che rende cruciale un impianto</w:t>
-      </w:r>
-      <w:r>
-        <w:t xml:space="preserve"> </w:t>
-      </w:r>
-      <w:r>
-        <w:rPr>
-          <w:iCs/>
-          <w:i/>
-        </w:rPr>
-        <w:t xml:space="preserve">human-centered</w:t>
-      </w:r>
-      <w:r>
-        <w:t xml:space="preserve"> </w:t>
-      </w:r>
-      <w:r>
-        <w:t xml:space="preserve">in cui l’AI accompagna il giudizio senza sostituirlo.</w:t>
+        <w:t xml:space="preserve">L’analisi della letteratura e degli strumenti esistenti evidenzia uno scarto. Da un lato, i sistemi basati su LLM per il dialogo in contesti educativi sono ancora prevalentemente orientati al supporto emotivo o al tutoring disciplinare. Esistono lavori che esplorano l’uso degli LLM per generare feedback personalizzati — Susnjak (2023), ad esempio, usa un LLM per tradurre in linguaggio naturale le indicazioni emerse da un modello predittivo: «se aumenti la tua media del 10% e studi a tempo pieno, il tuo rischio di abbandono si riduce» — ma questi casi restano slegati da strumenti strutturati di autovalutazione. Dall’altro, gli strumenti di autovalutazione — come il QSA — restituiscono un profilo senza offrire uno strumento avannzato che aiuti lo studente a interpretarlo e a tradurlo in azioni concrete.</w:t>
       </w:r>
     </w:p>
     <w:p>
@@ -512,7 +557,7 @@
         <w:pStyle w:val="BodyText"/>
       </w:pPr>
       <w:r>
-        <w:t xml:space="preserve">Counselorbot si inserisce in questa lacuna: indipendentemente dallo strumento adottato — questionari come il QSA, interviste come quella di Savickas o altri strumenti integrabili — il sistema accompagna lo studente in un percorso di autovalutazione guidata, discutendo il profilo ambito per ambito, evidenziandone le connessioni e suggerendo strategie. L’attenzione di questo lavoro è rivolta all’interazione pedagogica costruita a partire dagli esiti, non alle caratteristiche tecniche dei singoli strumenti.</w:t>
+        <w:t xml:space="preserve">Counselorbot si inserisce in questa lacuna.</w:t>
       </w:r>
     </w:p>
     <w:bookmarkEnd w:id="23"/>
@@ -540,7 +585,23 @@
         <w:pStyle w:val="FirstParagraph"/>
       </w:pPr>
       <w:r>
-        <w:t xml:space="preserve">Il sistema è progettato per accompagnare lo studente in un percorso di autovalutazione e riflessione sulle proprie competenze strategiche, offrendo uno spazio di dialogo strutturato in cui la flessibilità dell’LLM è guidata da un piano pedagogico predefinito (Puech et al. 2025). I requisiti di design sono:</w:t>
+        <w:t xml:space="preserve">Il sistema accompagna l’utente in un percorso di riflessione fondato su strumenti di orientamento già validati — in particolare i questionari del sito competenzestrategiche.it. È aperto ad altri strumenti: include attualmente la simulazione del</w:t>
+      </w:r>
+      <w:r>
+        <w:t xml:space="preserve"> </w:t>
+      </w:r>
+      <w:r>
+        <w:rPr>
+          <w:iCs/>
+          <w:i/>
+        </w:rPr>
+        <w:t xml:space="preserve">Career Construction Interview</w:t>
+      </w:r>
+      <w:r>
+        <w:t xml:space="preserve"> </w:t>
+      </w:r>
+      <w:r>
+        <w:t xml:space="preserve">di Savickas (Savickas 2018) e il sistema PQBL di Jemstedt e Bälter (2024), con possibilità di integrarne altri in seguito. Il dialogo si basa su un piano pedagogico predefinito (Puech et al. 2025) in cui la flessibilità dell’LLM è guidata da una sequenza strutturata di passi. I criteri che hanno orientato la progettazione del sistema sono elencati qui di seguito; le implicazioni di ciascuno sono discusse nei paragrafi successivi.</w:t>
       </w:r>
     </w:p>
     <w:p>
@@ -552,14 +613,7 @@
         <w:pStyle w:val="Compact"/>
       </w:pPr>
       <w:r>
-        <w:rPr>
-          <w:bCs/>
-          <w:b/>
-        </w:rPr>
-        <w:t xml:space="preserve">Multi-strumento ed estensibile</w:t>
-      </w:r>
-      <w:r>
-        <w:t xml:space="preserve">: supporto per diversi strumenti di autovalutazione, ciascuno con la propria logica di calcolo e modalità di interazione, e possibilità di integrarne altri.</w:t>
+        <w:t xml:space="preserve">Multistrumento ed estensibile: supporto per diversi strumenti di orientamento, ciascuno con la propria logica di calcolo e modalità di interazione, e possibilità di integrarne altri.</w:t>
       </w:r>
     </w:p>
     <w:p>
@@ -571,14 +625,7 @@
         <w:pStyle w:val="Compact"/>
       </w:pPr>
       <w:r>
-        <w:rPr>
-          <w:bCs/>
-          <w:b/>
-        </w:rPr>
-        <w:t xml:space="preserve">Chat guidata</w:t>
-      </w:r>
-      <w:r>
-        <w:t xml:space="preserve">: la conversazione segue una sequenza di passi predefiniti; all’interno di ciascun passo, l’LLM adatta il linguaggio e le risposte agli input dello studente.</w:t>
+        <w:t xml:space="preserve">Chat guidata: la conversazione segue una sequenza predefinita di passi, all’interno dei quali l’LLM adatta il linguaggio all’utente.</w:t>
       </w:r>
     </w:p>
     <w:p>
@@ -590,14 +637,36 @@
         <w:pStyle w:val="Compact"/>
       </w:pPr>
       <w:r>
+        <w:t xml:space="preserve">Configurabilità da pannello amministrativo:</w:t>
+      </w:r>
+      <w:r>
+        <w:t xml:space="preserve"> </w:t>
+      </w:r>
+      <w:r>
         <w:rPr>
-          <w:bCs/>
-          <w:b/>
+          <w:iCs/>
+          <w:i/>
         </w:rPr>
-        <w:t xml:space="preserve">Configurabilità da pannello amministrativo</w:t>
-      </w:r>
-      <w:r>
-        <w:t xml:space="preserve">: prompt, sequenze e messaggi sono memorizzati nel database e modificabili senza intervento sul codice.</w:t>
+        <w:t xml:space="preserve">prompt</w:t>
+      </w:r>
+      <w:r>
+        <w:t xml:space="preserve">, sequenze e messaggi sono memorizzati nel</w:t>
+      </w:r>
+      <w:r>
+        <w:t xml:space="preserve"> </w:t>
+      </w:r>
+      <w:r>
+        <w:rPr>
+          <w:iCs/>
+          <w:i/>
+        </w:rPr>
+        <w:t xml:space="preserve">database</w:t>
+      </w:r>
+      <w:r>
+        <w:t xml:space="preserve"> </w:t>
+      </w:r>
+      <w:r>
+        <w:t xml:space="preserve">e modificabili senza intervento sul codice.</w:t>
       </w:r>
     </w:p>
     <w:p>
@@ -609,14 +678,39 @@
         <w:pStyle w:val="Compact"/>
       </w:pPr>
       <w:r>
+        <w:t xml:space="preserve">Flessibilità del</w:t>
+      </w:r>
+      <w:r>
+        <w:t xml:space="preserve"> </w:t>
+      </w:r>
+      <w:r>
         <w:rPr>
-          <w:bCs/>
-          <w:b/>
+          <w:iCs/>
+          <w:i/>
         </w:rPr>
-        <w:t xml:space="preserve">Flessibilità del provider AI</w:t>
-      </w:r>
-      <w:r>
-        <w:t xml:space="preserve">: supporto per molteplici provider (remoti e locali) intercambiabili senza modifiche al sistema.</w:t>
+        <w:t xml:space="preserve">provider</w:t>
+      </w:r>
+      <w:r>
+        <w:t xml:space="preserve"> </w:t>
+      </w:r>
+      <w:r>
+        <w:t xml:space="preserve">AI: supporto per</w:t>
+      </w:r>
+      <w:r>
+        <w:t xml:space="preserve"> </w:t>
+      </w:r>
+      <w:r>
+        <w:rPr>
+          <w:iCs/>
+          <w:i/>
+        </w:rPr>
+        <w:t xml:space="preserve">provider</w:t>
+      </w:r>
+      <w:r>
+        <w:t xml:space="preserve"> </w:t>
+      </w:r>
+      <w:r>
+        <w:t xml:space="preserve">intercambiabili senza modifiche al sistema.</w:t>
       </w:r>
     </w:p>
     <w:p>
@@ -628,14 +722,7 @@
         <w:pStyle w:val="Compact"/>
       </w:pPr>
       <w:r>
-        <w:rPr>
-          <w:bCs/>
-          <w:b/>
-        </w:rPr>
-        <w:t xml:space="preserve">Base di conoscenza condivisa</w:t>
-      </w:r>
-      <w:r>
-        <w:t xml:space="preserve">: strategie approvate dagli amministratori sono conservate in un archivio e richiamate dal LLM quando pertinenti.</w:t>
+        <w:t xml:space="preserve">Base di conoscenza condivisa: le strategie sono conservate in un archivio e recuperate dall’LLM in base al profilo dell’utente. Un grafo della conoscenza connette strumenti, fattori e strategie.</w:t>
       </w:r>
     </w:p>
     <w:p>
@@ -647,14 +734,7 @@
         <w:pStyle w:val="Compact"/>
       </w:pPr>
       <w:r>
-        <w:rPr>
-          <w:bCs/>
-          <w:b/>
-        </w:rPr>
-        <w:t xml:space="preserve">Multilingua</w:t>
-      </w:r>
-      <w:r>
-        <w:t xml:space="preserve">: interfaccia in sei lingue (italiano, inglese, spagnolo, francese, tedesco, svedese).</w:t>
+        <w:t xml:space="preserve">Supporto multilingua: interfaccia in sei lingue (italiano, inglese, spagnolo, francese, tedesco, svedese).</w:t>
       </w:r>
     </w:p>
     <w:bookmarkEnd w:id="25"/>
@@ -672,15 +752,15 @@
         <w:pStyle w:val="FirstParagraph"/>
       </w:pPr>
       <w:r>
-        <w:t xml:space="preserve">L’architettura di Counselorbot si fonda su tre componenti. Un</w:t>
+        <w:t xml:space="preserve">L’architettura di Counselorbot si articola in tre componenti. Un</w:t>
       </w:r>
       <w:r>
         <w:t xml:space="preserve"> </w:t>
       </w:r>
       <w:r>
         <w:rPr>
-          <w:bCs/>
-          <w:b/>
+          <w:iCs/>
+          <w:i/>
         </w:rPr>
         <w:t xml:space="preserve">backend</w:t>
       </w:r>
@@ -688,15 +768,47 @@
         <w:t xml:space="preserve"> </w:t>
       </w:r>
       <w:r>
-        <w:t xml:space="preserve">espone i servizi di chat, amministrazione, gestione dei questionari e memoria di sessione; un livello di astrazione verso i provider AI rende il sistema indipendente dal modello linguistico sottostante, permettendo di commutare tra provider remoti e locali senza interruzioni. Un</w:t>
+        <w:t xml:space="preserve">— che integra un livello di astrazione verso i</w:t>
       </w:r>
       <w:r>
         <w:t xml:space="preserve"> </w:t>
       </w:r>
       <w:r>
         <w:rPr>
-          <w:bCs/>
-          <w:b/>
+          <w:iCs/>
+          <w:i/>
+        </w:rPr>
+        <w:t xml:space="preserve">provider</w:t>
+      </w:r>
+      <w:r>
+        <w:t xml:space="preserve"> </w:t>
+      </w:r>
+      <w:r>
+        <w:t xml:space="preserve">AI — espone i servizi di chat, amministrazione, gestione dei questionari e memoria di sessione, consentendo di commutare tra</w:t>
+      </w:r>
+      <w:r>
+        <w:t xml:space="preserve"> </w:t>
+      </w:r>
+      <w:r>
+        <w:rPr>
+          <w:iCs/>
+          <w:i/>
+        </w:rPr>
+        <w:t xml:space="preserve">provider</w:t>
+      </w:r>
+      <w:r>
+        <w:t xml:space="preserve"> </w:t>
+      </w:r>
+      <w:r>
+        <w:t xml:space="preserve">remoti e locali senza interruzioni. Un</w:t>
+      </w:r>
+      <w:r>
+        <w:t xml:space="preserve"> </w:t>
+      </w:r>
+      <w:r>
+        <w:rPr>
+          <w:iCs/>
+          <w:i/>
         </w:rPr>
         <w:t xml:space="preserve">frontend</w:t>
       </w:r>
@@ -711,16 +823,29 @@
       </w:r>
       <w:r>
         <w:rPr>
-          <w:bCs/>
-          <w:b/>
+          <w:iCs/>
+          <w:i/>
         </w:rPr>
-        <w:t xml:space="preserve">database relazionale</w:t>
+        <w:t xml:space="preserve">database</w:t>
       </w:r>
       <w:r>
         <w:t xml:space="preserve"> </w:t>
       </w:r>
       <w:r>
-        <w:t xml:space="preserve">conserva le configurazioni (prompt, passi guidati, strategie) e la memoria di sessione.</w:t>
+        <w:t xml:space="preserve">relazionale conserva le configurazioni —</w:t>
+      </w:r>
+      <w:r>
+        <w:t xml:space="preserve"> </w:t>
+      </w:r>
+      <w:r>
+        <w:rPr>
+          <w:iCs/>
+          <w:i/>
+        </w:rPr>
+        <w:t xml:space="preserve">prompt</w:t>
+      </w:r>
+      <w:r>
+        <w:t xml:space="preserve">, passi guidati, strategie — e la memoria di sessione.</w:t>
       </w:r>
     </w:p>
     <w:p>
@@ -728,7 +853,182 @@
         <w:pStyle w:val="BodyText"/>
       </w:pPr>
       <w:r>
-        <w:t xml:space="preserve">Il sistema integra nativamente la logica di calcolo di molteplici questionari: non si limita a ricevere punteggi esterni, ma conosce la struttura di ciascuno strumento — fattori, item, scale, stanine (scala a 9 punti derivata dalla normale standardizzata) — e può generare interpretazioni coerenti con le proprietà psicometriche del test. A questo si aggiunge una</w:t>
+        <w:t xml:space="preserve">Il sistema non si limita a ricevere punteggi esterni: conosce la struttura di ciascun questionario — fattori, item, scale, stanine — e genera interpretazioni coerenti con le proprietà psicometriche del test. Le strategie approvate sono indicizzate per contenuto semantico e parole chiave, e il sistema le recupera automaticamente in base al fattore corrente e al profilo dell’utente, integrandole nella risposta dell’LLM senza richiedere all’amministratore di aggiornare manualmente il</w:t>
+      </w:r>
+      <w:r>
+        <w:t xml:space="preserve"> </w:t>
+      </w:r>
+      <w:r>
+        <w:rPr>
+          <w:iCs/>
+          <w:i/>
+        </w:rPr>
+        <w:t xml:space="preserve">prompt</w:t>
+      </w:r>
+      <w:r>
+        <w:t xml:space="preserve">. Un grafo della conoscenza — che collega strumenti, fattori, strategie e riferimenti — estende la ricerca documentale alle voci concettualmente vicine, consentendo al sistema di attingere a contenuti correlati anche quando non corrispondono esattamente ai termini della</w:t>
+      </w:r>
+      <w:r>
+        <w:t xml:space="preserve"> </w:t>
+      </w:r>
+      <w:r>
+        <w:rPr>
+          <w:iCs/>
+          <w:i/>
+        </w:rPr>
+        <w:t xml:space="preserve">query</w:t>
+      </w:r>
+      <w:r>
+        <w:t xml:space="preserve">.</w:t>
+      </w:r>
+    </w:p>
+    <w:p>
+      <w:pPr>
+        <w:pStyle w:val="BodyText"/>
+      </w:pPr>
+      <w:r>
+        <w:t xml:space="preserve">A queste funzionalità si aggiunge una memoria condivisa delle risposte: quando un utente valuta positivamente una risposta dell’assistente, questa viene conservata e riproposta come riferimento in sessioni successive per domande analoghe, creando un meccanismo di apprendimento collettivo che migliora la qualità del supporto nel tempo. Parallelamente, tutte le interazioni sono registrate in un archivio consultabile dagli amministratori per monitorare l’uso del sistema e identificare aree di miglioramento.</w:t>
+      </w:r>
+    </w:p>
+    <w:p>
+      <w:pPr>
+        <w:pStyle w:val="BodyText"/>
+      </w:pPr>
+      <w:r>
+        <w:t xml:space="preserve">L’elemento centrale dell’interazione è la sequenza di</w:t>
+      </w:r>
+      <w:r>
+        <w:t xml:space="preserve"> </w:t>
+      </w:r>
+      <w:r>
+        <w:rPr>
+          <w:iCs/>
+          <w:i/>
+        </w:rPr>
+        <w:t xml:space="preserve">passi guidati</w:t>
+      </w:r>
+      <w:r>
+        <w:t xml:space="preserve"> </w:t>
+      </w:r>
+      <w:r>
+        <w:t xml:space="preserve">(</w:t>
+      </w:r>
+      <w:r>
+        <w:rPr>
+          <w:iCs/>
+          <w:i/>
+        </w:rPr>
+        <w:t xml:space="preserve">guided steps</w:t>
+      </w:r>
+      <w:r>
+        <w:t xml:space="preserve">): una serie di fasi predefinite che determinano l’ordine del dialogo e il</w:t>
+      </w:r>
+      <w:r>
+        <w:t xml:space="preserve"> </w:t>
+      </w:r>
+      <w:r>
+        <w:rPr>
+          <w:iCs/>
+          <w:i/>
+        </w:rPr>
+        <w:t xml:space="preserve">prompt</w:t>
+      </w:r>
+      <w:r>
+        <w:t xml:space="preserve"> </w:t>
+      </w:r>
+      <w:r>
+        <w:t xml:space="preserve">di sistema per ciascuna fase, garantendo che la conversazione copra tutti gli ambiti del profilo. All’interno di ogni passo, l’LLM dispone della flessibilità necessaria per adattare linguaggio e risposte agli input dell’utente, realizzando la forma ibrida tra controllo deterministico e adattività conversazionale.</w:t>
+      </w:r>
+    </w:p>
+    <w:bookmarkEnd w:id="26"/>
+    <w:bookmarkStart w:id="27" w:name="flusso-di-interazione"/>
+    <w:p>
+      <w:pPr>
+        <w:pStyle w:val="Heading3"/>
+      </w:pPr>
+      <w:r>
+        <w:t xml:space="preserve">2.3 Flusso di interazione</w:t>
+      </w:r>
+    </w:p>
+    <w:p>
+      <w:pPr>
+        <w:pStyle w:val="FirstParagraph"/>
+      </w:pPr>
+      <w:r>
+        <w:t xml:space="preserve">Il percorso tipo si articola in quattro fasi.</w:t>
+      </w:r>
+    </w:p>
+    <w:p>
+      <w:pPr>
+        <w:numPr>
+          <w:ilvl w:val="0"/>
+          <w:numId w:val="1002"/>
+        </w:numPr>
+      </w:pPr>
+      <w:r>
+        <w:t xml:space="preserve">Selezione dello strumento. L’utente sceglie tra QSA, QSAr, ZTPI, PQBL o intervista Savickas. Ciascuno strumento attiva una propria sequenza di passi guidati e un insieme di</w:t>
+      </w:r>
+      <w:r>
+        <w:t xml:space="preserve"> </w:t>
+      </w:r>
+      <w:r>
+        <w:rPr>
+          <w:iCs/>
+          <w:i/>
+        </w:rPr>
+        <w:t xml:space="preserve">prompt</w:t>
+      </w:r>
+      <w:r>
+        <w:t xml:space="preserve"> </w:t>
+      </w:r>
+      <w:r>
+        <w:t xml:space="preserve">specifici.</w:t>
+      </w:r>
+    </w:p>
+    <w:p>
+      <w:pPr>
+        <w:numPr>
+          <w:ilvl w:val="0"/>
+          <w:numId w:val="1002"/>
+        </w:numPr>
+      </w:pPr>
+      <w:r>
+        <w:t xml:space="preserve">Inserimento del profilo. Per QSA, QSAr e ZTPI, l’utente inserisce i risultati del questionario; per il PQBL il sistema propone un testo e avvia un dialogo di domande e</w:t>
+      </w:r>
+      <w:r>
+        <w:t xml:space="preserve"> </w:t>
+      </w:r>
+      <w:r>
+        <w:rPr>
+          <w:iCs/>
+          <w:i/>
+        </w:rPr>
+        <w:t xml:space="preserve">feedback</w:t>
+      </w:r>
+      <w:r>
+        <w:t xml:space="preserve">; per l’intervista Savickas il sistema conduce un’intervista qualitativa a cinque domande, al termine della quale genera una sintesi narrativa.</w:t>
+      </w:r>
+    </w:p>
+    <w:p>
+      <w:pPr>
+        <w:numPr>
+          <w:ilvl w:val="0"/>
+          <w:numId w:val="1002"/>
+        </w:numPr>
+      </w:pPr>
+      <w:r>
+        <w:t xml:space="preserve">Visualizzazione. Il profilo è mostrato come grafico a barre con codifica cromatica (verde per i punti di forza, giallo per la fascia media, rosso per le aree di miglioramento).</w:t>
+      </w:r>
+    </w:p>
+    <w:p>
+      <w:pPr>
+        <w:numPr>
+          <w:ilvl w:val="0"/>
+          <w:numId w:val="1002"/>
+        </w:numPr>
+      </w:pPr>
+      <w:r>
+        <w:t xml:space="preserve">Chat guidata. Il sistema propone una lettura passo per passo, la cui sequenza varia in base allo strumento selezionato. La logica di ciascun passo è determinata dal suo oggetto: se il passo riguarda i punteggi di un fattore — ad esempio i fattori cognitivi — l’LLM ne spiega il significato e i singoli valori; se il passo riguarda le relazioni tra più fattori, il sistema costruisce una sintesi narrativa da proporre all’utente. Per ogni passo l’LLM attinge dalla</w:t>
       </w:r>
       <w:r>
         <w:t xml:space="preserve"> </w:t>
@@ -744,175 +1044,7 @@
         <w:t xml:space="preserve"> </w:t>
       </w:r>
       <w:r>
-        <w:t xml:space="preserve">di strategie editorialmente approvate, che il sistema richiama quando pertinenti al profilo dello studente.</w:t>
-      </w:r>
-    </w:p>
-    <w:p>
-      <w:pPr>
-        <w:pStyle w:val="BodyText"/>
-      </w:pPr>
-      <w:r>
-        <w:t xml:space="preserve">L’elemento centrale dell’interazione è la sequenza di</w:t>
-      </w:r>
-      <w:r>
-        <w:t xml:space="preserve"> </w:t>
-      </w:r>
-      <w:r>
-        <w:rPr>
-          <w:bCs/>
-          <w:b/>
-        </w:rPr>
-        <w:t xml:space="preserve">passi guidati</w:t>
-      </w:r>
-      <w:r>
-        <w:t xml:space="preserve"> </w:t>
-      </w:r>
-      <w:r>
-        <w:t xml:space="preserve">(</w:t>
-      </w:r>
-      <w:r>
-        <w:rPr>
-          <w:iCs/>
-          <w:i/>
-        </w:rPr>
-        <w:t xml:space="preserve">guided steps</w:t>
-      </w:r>
-      <w:r>
-        <w:t xml:space="preserve">): una serie di fasi predefinite che determinano l’ordine del dialogo e il prompt di sistema per ciascuna fase, garantendo che la conversazione copra tutti gli ambiti del profilo. All’interno di ogni passo, l’LLM dispone della flessibilità necessaria per adattare linguaggio e risposte agli input dello studente, realizzando la forma ibrida tra controllo deterministico e adattività conversazionale.</w:t>
-      </w:r>
-    </w:p>
-    <w:bookmarkEnd w:id="26"/>
-    <w:bookmarkStart w:id="27" w:name="flusso-di-interazione"/>
-    <w:p>
-      <w:pPr>
-        <w:pStyle w:val="Heading3"/>
-      </w:pPr>
-      <w:r>
-        <w:t xml:space="preserve">2.3 Flusso di interazione</w:t>
-      </w:r>
-    </w:p>
-    <w:p>
-      <w:pPr>
-        <w:pStyle w:val="FirstParagraph"/>
-      </w:pPr>
-      <w:r>
-        <w:t xml:space="preserve">Il percorso tipo si articola in quattro fasi.</w:t>
-      </w:r>
-    </w:p>
-    <w:p>
-      <w:pPr>
-        <w:numPr>
-          <w:ilvl w:val="0"/>
-          <w:numId w:val="1002"/>
-        </w:numPr>
-      </w:pPr>
-      <w:r>
-        <w:rPr>
-          <w:bCs/>
-          <w:b/>
-        </w:rPr>
-        <w:t xml:space="preserve">Selezione dello strumento.</w:t>
-      </w:r>
-      <w:r>
-        <w:t xml:space="preserve"> </w:t>
-      </w:r>
-      <w:r>
-        <w:t xml:space="preserve">L’utente sceglie tra QSA, QSAr, ZTPI o intervista Savickas. Ciascuno strumento attiva una propria sequenza di passi guidati e un set di</w:t>
-      </w:r>
-      <w:r>
-        <w:t xml:space="preserve"> </w:t>
-      </w:r>
-      <w:r>
-        <w:rPr>
-          <w:iCs/>
-          <w:i/>
-        </w:rPr>
-        <w:t xml:space="preserve">prompt</w:t>
-      </w:r>
-      <w:r>
-        <w:t xml:space="preserve"> </w:t>
-      </w:r>
-      <w:r>
-        <w:t xml:space="preserve">specifici.</w:t>
-      </w:r>
-    </w:p>
-    <w:p>
-      <w:pPr>
-        <w:numPr>
-          <w:ilvl w:val="0"/>
-          <w:numId w:val="1002"/>
-        </w:numPr>
-      </w:pPr>
-      <w:r>
-        <w:rPr>
-          <w:bCs/>
-          <w:b/>
-        </w:rPr>
-        <w:t xml:space="preserve">Inserimento del profilo.</w:t>
-      </w:r>
-      <w:r>
-        <w:t xml:space="preserve"> </w:t>
-      </w:r>
-      <w:r>
-        <w:t xml:space="preserve">Per QSA, QSAr e ZTPI, l’utente inserisce i risultati del questionario; per Savickas, il sistema avvia un’intervista qualitativa a cinque domande, in cui l’LLM conduce la conversazione e genera una sintesi narrativa al termine.</w:t>
-      </w:r>
-    </w:p>
-    <w:p>
-      <w:pPr>
-        <w:numPr>
-          <w:ilvl w:val="0"/>
-          <w:numId w:val="1002"/>
-        </w:numPr>
-      </w:pPr>
-      <w:r>
-        <w:rPr>
-          <w:bCs/>
-          <w:b/>
-        </w:rPr>
-        <w:t xml:space="preserve">Visualizzazione.</w:t>
-      </w:r>
-      <w:r>
-        <w:t xml:space="preserve"> </w:t>
-      </w:r>
-      <w:r>
-        <w:t xml:space="preserve">Il profilo è mostrato come grafico a barre con codifica cromatica (verde per punti di forza, giallo per fascia media, rosso per aree di crescita).</w:t>
-      </w:r>
-    </w:p>
-    <w:p>
-      <w:pPr>
-        <w:numPr>
-          <w:ilvl w:val="0"/>
-          <w:numId w:val="1002"/>
-        </w:numPr>
-      </w:pPr>
-      <w:r>
-        <w:rPr>
-          <w:bCs/>
-          <w:b/>
-        </w:rPr>
-        <w:t xml:space="preserve">Chat guidata.</w:t>
-      </w:r>
-      <w:r>
-        <w:t xml:space="preserve"> </w:t>
-      </w:r>
-      <w:r>
-        <w:t xml:space="preserve">Il sistema propone una lettura fattore per fattore. Per ciascun fattore, l’LLM presenta l’esito, ne discute il significato e suggerisce strategie, attingendo alla</w:t>
-      </w:r>
-      <w:r>
-        <w:t xml:space="preserve"> </w:t>
-      </w:r>
-      <w:r>
-        <w:rPr>
-          <w:iCs/>
-          <w:i/>
-        </w:rPr>
-        <w:t xml:space="preserve">knowledge base</w:t>
-      </w:r>
-      <w:r>
-        <w:t xml:space="preserve"> </w:t>
-      </w:r>
-      <w:r>
-        <w:t xml:space="preserve">quando pertinente. L’utente può approfondire liberamente prima di passare al fattore successivo. Oltre alla lettura dei singoli esiti, il sistema ne evidenzia le connessioni — ad esempio tra l’ambito cognitivo e quello affettivo-motivazionale — aiutando lo studente a costruire una visione d’insieme del proprio profilo. Al termine viene offerta una sintesi complessiva e la possibilità di condividere le strategie ritenute più utili.</w:t>
+        <w:t xml:space="preserve">per suggerire strategie pertinenti. L’utente può approfondire liberamente prima di passare al passo successivo. Al termine viene offerta una sintesi complessiva e la possibilità di condividere le strategie ritenute più utili.</w:t>
       </w:r>
     </w:p>
     <w:bookmarkEnd w:id="27"/>
@@ -940,7 +1072,151 @@
         <w:pStyle w:val="FirstParagraph"/>
       </w:pPr>
       <w:r>
-        <w:t xml:space="preserve">La valutazione adotta un disegno comparativo tra le due versioni del sistema, Step-by-Step (SBS) e la precedente ai4educ: al termine del percorso di chat guidata, i partecipanti hanno compilato un questionario di gradimento, descritto nel §3.3.</w:t>
+        <w:t xml:space="preserve">Lo sviluppo di Counselorbot segue il modello ADDIE (Branch 2009), un acronimo che indica cinque fasi:</w:t>
+      </w:r>
+      <w:r>
+        <w:t xml:space="preserve"> </w:t>
+      </w:r>
+      <w:r>
+        <w:rPr>
+          <w:iCs/>
+          <w:i/>
+        </w:rPr>
+        <w:t xml:space="preserve">Analysis</w:t>
+      </w:r>
+      <w:r>
+        <w:t xml:space="preserve"> </w:t>
+      </w:r>
+      <w:r>
+        <w:t xml:space="preserve">(analisi dei bisogni formativi e del contesto),</w:t>
+      </w:r>
+      <w:r>
+        <w:t xml:space="preserve"> </w:t>
+      </w:r>
+      <w:r>
+        <w:rPr>
+          <w:iCs/>
+          <w:i/>
+        </w:rPr>
+        <w:t xml:space="preserve">Design</w:t>
+      </w:r>
+      <w:r>
+        <w:t xml:space="preserve"> </w:t>
+      </w:r>
+      <w:r>
+        <w:t xml:space="preserve">(progettazione dell’architettura e dell’interazione),</w:t>
+      </w:r>
+      <w:r>
+        <w:t xml:space="preserve"> </w:t>
+      </w:r>
+      <w:r>
+        <w:rPr>
+          <w:iCs/>
+          <w:i/>
+        </w:rPr>
+        <w:t xml:space="preserve">Development</w:t>
+      </w:r>
+      <w:r>
+        <w:t xml:space="preserve"> </w:t>
+      </w:r>
+      <w:r>
+        <w:t xml:space="preserve">(realizzazione del sistema),</w:t>
+      </w:r>
+      <w:r>
+        <w:t xml:space="preserve"> </w:t>
+      </w:r>
+      <w:r>
+        <w:rPr>
+          <w:iCs/>
+          <w:i/>
+        </w:rPr>
+        <w:t xml:space="preserve">Implementation</w:t>
+      </w:r>
+      <w:r>
+        <w:t xml:space="preserve"> </w:t>
+      </w:r>
+      <w:r>
+        <w:t xml:space="preserve">(rilascio e formazione degli utenti) ed</w:t>
+      </w:r>
+      <w:r>
+        <w:t xml:space="preserve"> </w:t>
+      </w:r>
+      <w:r>
+        <w:rPr>
+          <w:iCs/>
+          <w:i/>
+        </w:rPr>
+        <w:t xml:space="preserve">Evaluation</w:t>
+      </w:r>
+      <w:r>
+        <w:t xml:space="preserve"> </w:t>
+      </w:r>
+      <w:r>
+        <w:t xml:space="preserve">(valutazione dei risultati). Il lavoro descritto in questo articolo si colloca nella fase di</w:t>
+      </w:r>
+      <w:r>
+        <w:t xml:space="preserve"> </w:t>
+      </w:r>
+      <w:r>
+        <w:rPr>
+          <w:iCs/>
+          <w:i/>
+        </w:rPr>
+        <w:t xml:space="preserve">Evaluation</w:t>
+      </w:r>
+      <w:r>
+        <w:t xml:space="preserve"> </w:t>
+      </w:r>
+      <w:r>
+        <w:t xml:space="preserve">del secondo ciclo di sviluppo.</w:t>
+      </w:r>
+    </w:p>
+    <w:p>
+      <w:pPr>
+        <w:pStyle w:val="BodyText"/>
+      </w:pPr>
+      <w:r>
+        <w:t xml:space="preserve">Il primo ciclo ha prodotto una versione basata su un’architettura RAG (Retrieval-Augmented Generation) con</w:t>
+      </w:r>
+      <w:r>
+        <w:t xml:space="preserve"> </w:t>
+      </w:r>
+      <w:r>
+        <w:rPr>
+          <w:iCs/>
+          <w:i/>
+        </w:rPr>
+        <w:t xml:space="preserve">system prompt</w:t>
+      </w:r>
+      <w:r>
+        <w:t xml:space="preserve"> </w:t>
+      </w:r>
+      <w:r>
+        <w:t xml:space="preserve">(ai4educ), in cui l’LLM rispondeva alle domande dell’utente attingendo da documenti caricati in una memoria vettoriale, senza una logica di navigazione predefinita. I risultati di questo primo ciclo — discussi in §4 — hanno evidenziato criticità nella coerenza delle analisi e nell’inserimento manuale dei dati, portando a un secondo ciclo di progettazione. Tra i due cicli sono state condotte prove interne e messe a punto incrementali che hanno guidato la progettazione della versione successiva. Il secondo ciclo ha prodotto la versione Step-by-Step (SBS), che introduce i passi guidati, il grafo della conoscenza, l’indicizzazione semantica delle strategie e l’interfaccia ottimizzata per l’inserimento dei profili.</w:t>
+      </w:r>
+    </w:p>
+    <w:p>
+      <w:pPr>
+        <w:pStyle w:val="BodyText"/>
+      </w:pPr>
+      <w:r>
+        <w:t xml:space="preserve">La valutazione presentata in questo lavoro adotta un disegno comparativo</w:t>
+      </w:r>
+      <w:r>
+        <w:t xml:space="preserve"> </w:t>
+      </w:r>
+      <w:r>
+        <w:rPr>
+          <w:iCs/>
+          <w:i/>
+        </w:rPr>
+        <w:t xml:space="preserve">between-subjects</w:t>
+      </w:r>
+      <w:r>
+        <w:t xml:space="preserve"> </w:t>
+      </w:r>
+      <w:r>
+        <w:t xml:space="preserve">tra le due versioni (SBS e ai4educ): ciascun partecipante ha utilizzato una sola versione, al termine della quale ha compilato un questionario di gradimento, descritto nel §3.3.</w:t>
       </w:r>
     </w:p>
     <w:bookmarkEnd w:id="29"/>
@@ -2431,6 +2707,27 @@
         <w:pStyle w:val="BodyText"/>
       </w:pPr>
       <w:r>
+        <w:t xml:space="preserve">Branch, R. M. (2009).</w:t>
+      </w:r>
+      <w:r>
+        <w:t xml:space="preserve"> </w:t>
+      </w:r>
+      <w:r>
+        <w:rPr>
+          <w:iCs/>
+          <w:i/>
+        </w:rPr>
+        <w:t xml:space="preserve">Instructional design: The ADDIE approach</w:t>
+      </w:r>
+      <w:r>
+        <w:t xml:space="preserve">. Springer. https://doi.org/10.1007/978-0-387-09506-6</w:t>
+      </w:r>
+    </w:p>
+    <w:p>
+      <w:pPr>
+        <w:pStyle w:val="BodyText"/>
+      </w:pPr>
+      <w:r>
         <w:t xml:space="preserve">Brown, T. B., Mann, B., Ryder, N., et al. (2020). Language models are few-shot learners.</w:t>
       </w:r>
       <w:r>
@@ -2598,6 +2895,27 @@
       </w:r>
       <w:r>
         <w:t xml:space="preserve">(1), 973–1018. https://doi.org/10.1007/s10639-022-11177-3</w:t>
+      </w:r>
+    </w:p>
+    <w:p>
+      <w:pPr>
+        <w:pStyle w:val="BodyText"/>
+      </w:pPr>
+      <w:r>
+        <w:t xml:space="preserve">Lewis, P., Perez, E., Piktus, A., et al. (2020). Retrieval-Augmented Generation for knowledge-intensive NLP tasks.</w:t>
+      </w:r>
+      <w:r>
+        <w:t xml:space="preserve"> </w:t>
+      </w:r>
+      <w:r>
+        <w:rPr>
+          <w:iCs/>
+          <w:i/>
+        </w:rPr>
+        <w:t xml:space="preserve">Advances in Neural Information Processing Systems, 33</w:t>
+      </w:r>
+      <w:r>
+        <w:t xml:space="preserve">, 9459–9474.</w:t>
       </w:r>
     </w:p>
     <w:p>

</xml_diff>

<commit_message>
Add revision details for session 024 and update decision log
- Added new session entry for revision discussion (session 024) dated 2026-06-16, detailing accepted decisions and rationale for revisions in §5.
- Updated decision log to include session 024 with a summary of changes made in the article.
- Created a new markdown file for session 024, documenting specific edits made to sections of the article to eliminate redundancies and improve clarity.
- Bumped article version from v33 to v34 following the completion of revisions.
</commit_message>
<xml_diff>
--- a/articles/current.docx
+++ b/articles/current.docx
@@ -8,7 +8,54 @@
         <w:pStyle w:val="Heading1"/>
       </w:pPr>
       <w:r>
+        <w:rPr>
+          <w:color w:val="000000"/>
+        </w:rPr>
         <w:t xml:space="preserve">Counselorbot: un</w:t>
+      </w:r>
+      <w:r>
+        <w:rPr>
+          <w:color w:val="000000"/>
+        </w:rPr>
+        <w:t xml:space="preserve"> </w:t>
+      </w:r>
+      <w:r>
+        <w:rPr>
+          <w:iCs/>
+          <w:i/>
+          <w:color w:val="000000"/>
+        </w:rPr>
+        <w:t xml:space="preserve">chatbot</w:t>
+      </w:r>
+      <w:r>
+        <w:rPr>
+          <w:color w:val="000000"/>
+        </w:rPr>
+        <w:t xml:space="preserve"> </w:t>
+      </w:r>
+      <w:r>
+        <w:rPr>
+          <w:color w:val="000000"/>
+        </w:rPr>
+        <w:t xml:space="preserve">per l’orientamento</w:t>
+      </w:r>
+    </w:p>
+    <w:p>
+      <w:pPr>
+        <w:pStyle w:val="FirstParagraph"/>
+        <w:jc w:val="both"/>
+      </w:pPr>
+      <w:r>
+        <w:t xml:space="preserve">Abstract (italiano)</w:t>
+      </w:r>
+    </w:p>
+    <w:p>
+      <w:pPr>
+        <w:pStyle w:val="BodyText"/>
+        <w:jc w:val="both"/>
+      </w:pPr>
+      <w:r>
+        <w:t xml:space="preserve">L’articolo presenta Counselorbot, un</w:t>
       </w:r>
       <w:r>
         <w:t xml:space="preserve"> </w:t>
@@ -24,23 +71,34 @@
         <w:t xml:space="preserve"> </w:t>
       </w:r>
       <w:r>
-        <w:t xml:space="preserve">per l’orientamento</w:t>
+        <w:t xml:space="preserve">basato su LLM per l’autovalutazione guidata delle competenze strategiche degli studenti. Il lavoro descrive l’architettura ibrida del sistema — che combina passi guidati deterministici con la flessibilità di un LLM — e il framework delle competenze strategiche (QSA) su cui si basa. La valutazione, condotta su 34 partecipanti confrontando due versioni (CB-SBS e CB-C), suggerisce tendenze positive in 9 dimensioni su 10, con incrementi in facilità d’uso (Δ = +0,79) e fiducia (Δ = +0,65). Il lavoro si colloca nella fase di test del modello ADDIE e discute limiti e direzioni di sviluppo.</w:t>
       </w:r>
     </w:p>
     <w:p>
       <w:pPr>
-        <w:pStyle w:val="FirstParagraph"/>
-      </w:pPr>
-      <w:r>
-        <w:t xml:space="preserve">Abstract (italiano)</w:t>
+        <w:pStyle w:val="BodyText"/>
+        <w:jc w:val="both"/>
+      </w:pPr>
+      <w:r>
+        <w:t xml:space="preserve">Abstract (inglese)</w:t>
       </w:r>
     </w:p>
     <w:p>
       <w:pPr>
         <w:pStyle w:val="BodyText"/>
-      </w:pPr>
-      <w:r>
-        <w:t xml:space="preserve">L’articolo presenta Counselorbot, un</w:t>
+        <w:jc w:val="both"/>
+      </w:pPr>
+      <w:r>
+        <w:t xml:space="preserve">This paper presents Counselorbot, an LLM-based conversational assistant for guided self-assessment of students’ strategic competences. The paper describes the hybrid architecture — combining deterministic guided steps with LLM flexibility — and the strategic competences framework (QSA) it builds on. The evaluation, carried out on 34 participants comparing two versions (CB-SBS and CB-C), suggests positive trends in 9 out of 10 dimensions, with increases in ease of use (Δ = +0.79) and trust (Δ = +0.65). The study is positioned within the test phase of the ADDIE model and discusses limitations and future directions.</w:t>
+      </w:r>
+    </w:p>
+    <w:p>
+      <w:pPr>
+        <w:pStyle w:val="BodyText"/>
+        <w:jc w:val="both"/>
+      </w:pPr>
+      <w:r>
+        <w:t xml:space="preserve">Parole chiave: autovalutazione; competenze strategiche; LLM;</w:t>
       </w:r>
       <w:r>
         <w:t xml:space="preserve"> </w:t>
@@ -56,31 +114,7 @@
         <w:t xml:space="preserve"> </w:t>
       </w:r>
       <w:r>
-        <w:t xml:space="preserve">basato su LLM per l’autovalutazione guidata delle competenze strategiche degli studenti. Il lavoro descrive l’architettura ibrida del sistema — che combina passi guidati deterministici con la flessibilità di un LLM — e il framework delle competenze strategiche (QSA) su cui si basa. La valutazione, condotta su 34 partecipanti confrontando due versioni (CB-SBS e CB-C), suggerisce tendenze positive in 9 dimensioni su 10, con incrementi in facilità d’uso (Δ = +0,79) e fiducia (Δ = +0,65). Il lavoro si colloca nella fase di test del modello ADDIE e discute limiti e direzioni di sviluppo.</w:t>
-      </w:r>
-    </w:p>
-    <w:p>
-      <w:pPr>
-        <w:pStyle w:val="BodyText"/>
-      </w:pPr>
-      <w:r>
-        <w:t xml:space="preserve">Abstract (inglese)</w:t>
-      </w:r>
-    </w:p>
-    <w:p>
-      <w:pPr>
-        <w:pStyle w:val="BodyText"/>
-      </w:pPr>
-      <w:r>
-        <w:t xml:space="preserve">This paper presents Counselorbot, an LLM-based conversational assistant for guided self-assessment of students’ strategic competences. The paper describes the hybrid architecture — combining deterministic guided steps with LLM flexibility — and the strategic competences framework (QSA) it builds on. The evaluation, carried out on 34 participants comparing two versions (CB-SBS and CB-C), suggests positive trends in 9 out of 10 dimensions, with increases in ease of use (Δ = +0.79) and trust (Δ = +0.65). The study is positioned within the test phase of the ADDIE model and discusses limitations and future directions.</w:t>
-      </w:r>
-    </w:p>
-    <w:p>
-      <w:pPr>
-        <w:pStyle w:val="BodyText"/>
-      </w:pPr>
-      <w:r>
-        <w:t xml:space="preserve">Parole chiave: autovalutazione; competenze strategiche; LLM;</w:t>
+        <w:t xml:space="preserve">educativo; QSA; intelligenza artificiale generativa; ADDIE Keywords: self-assessment; strategic competences; LLM; educational</w:t>
       </w:r>
       <w:r>
         <w:t xml:space="preserve"> </w:t>
@@ -93,10 +127,84 @@
         <w:t xml:space="preserve">chatbot</w:t>
       </w:r>
       <w:r>
+        <w:t xml:space="preserve">; QSA; generative AI; ADDIE</w:t>
+      </w:r>
+    </w:p>
+    <w:p>
+      <w:pPr>
+        <w:pStyle w:val="BodyText"/>
+        <w:jc w:val="both"/>
+      </w:pPr>
+      <w:r>
+        <w:t xml:space="preserve">Nota biografica [da completare: max 300 battute]</w:t>
+      </w:r>
+    </w:p>
+    <w:bookmarkStart w:id="20" w:name="introduzione"/>
+    <w:p>
+      <w:pPr>
+        <w:pStyle w:val="Heading2"/>
+      </w:pPr>
+      <w:r>
+        <w:rPr>
+          <w:color w:val="000000"/>
+        </w:rPr>
+        <w:t xml:space="preserve">Introduzione</w:t>
+      </w:r>
+    </w:p>
+    <w:p>
+      <w:pPr>
+        <w:pStyle w:val="FirstParagraph"/>
+        <w:jc w:val="both"/>
+      </w:pPr>
+      <w:r>
+        <w:t xml:space="preserve">Nel panorama dell’orientamento scolastico e professionale, i questionari di autovalutazione occupano un ruolo importante (Pellerey et al. 2013). Presentano allo studente una serie di affermazioni — su stili di studio, strategie, concentrazione, emozioni, studio in gruppo — chiedendo il grado di accordo. Al termine, restituiscono un profilo che sintetizza i risultati in fattori e brevi commenti. Questo esito può essere oggetto di riflessione personale o di discussione con un tutor, con il docente o con un orientatore; tale accompagnamento trova però un limite strutturale nella disponibilità di chi lo svolge. Inoltre, la letteratura evidenzia come la mancanza di supporto riduca l’efficacia di questi strumenti e la capacità di tradurre le indicazioni ricevute in azioni concrete (Wollny et al. 2021).</w:t>
+      </w:r>
+    </w:p>
+    <w:p>
+      <w:pPr>
+        <w:pStyle w:val="BodyText"/>
+        <w:jc w:val="both"/>
+      </w:pPr>
+      <w:r>
+        <w:t xml:space="preserve">I recenti assistenti conversazionali basati su</w:t>
+      </w:r>
+      <w:r>
         <w:t xml:space="preserve"> </w:t>
       </w:r>
       <w:r>
-        <w:t xml:space="preserve">educativo; QSA; intelligenza artificiale generativa; ADDIE Keywords: self-assessment; strategic competences; LLM; educational</w:t>
+        <w:rPr>
+          <w:iCs/>
+          <w:i/>
+        </w:rPr>
+        <w:t xml:space="preserve">Large Language Model</w:t>
+      </w:r>
+      <w:r>
+        <w:t xml:space="preserve"> </w:t>
+      </w:r>
+      <w:r>
+        <w:t xml:space="preserve">(LLM) possono costituire un nuovo strumento di supporto per i processi di orientamento ricoprendo alcune funzioni che fino ad ora erano competenze esclusivamente umane.</w:t>
+      </w:r>
+    </w:p>
+    <w:p>
+      <w:pPr>
+        <w:pStyle w:val="BodyText"/>
+        <w:jc w:val="both"/>
+      </w:pPr>
+      <w:r>
+        <w:t xml:space="preserve">Per verificare questa ipotesi è stato sviluppato</w:t>
+      </w:r>
+      <w:r>
+        <w:t xml:space="preserve"> </w:t>
+      </w:r>
+      <w:r>
+        <w:rPr>
+          <w:iCs/>
+          <w:i/>
+        </w:rPr>
+        <w:t xml:space="preserve">Counselorbot</w:t>
+      </w:r>
+      <w:r>
+        <w:t xml:space="preserve">, un</w:t>
       </w:r>
       <w:r>
         <w:t xml:space="preserve"> </w:t>
@@ -109,40 +217,10 @@
         <w:t xml:space="preserve">chatbot</w:t>
       </w:r>
       <w:r>
-        <w:t xml:space="preserve">; QSA; generative AI; ADDIE</w:t>
-      </w:r>
-    </w:p>
-    <w:p>
-      <w:pPr>
-        <w:pStyle w:val="BodyText"/>
-      </w:pPr>
-      <w:r>
-        <w:t xml:space="preserve">Nota biografica [da completare: max 300 battute]</w:t>
-      </w:r>
-    </w:p>
-    <w:bookmarkStart w:id="20" w:name="introduzione"/>
-    <w:p>
-      <w:pPr>
-        <w:pStyle w:val="Heading2"/>
-      </w:pPr>
-      <w:r>
-        <w:t xml:space="preserve">Introduzione</w:t>
-      </w:r>
-    </w:p>
-    <w:p>
-      <w:pPr>
-        <w:pStyle w:val="FirstParagraph"/>
-      </w:pPr>
-      <w:r>
-        <w:t xml:space="preserve">Nel panorama dell’orientamento scolastico e professionale, i questionari di autovalutazione occupano un ruolo importante (Pellerey et al. 2013). Presentano allo studente una serie di affermazioni — su stili di studio, strategie, concentrazione, emozioni, studio in gruppo — chiedendo il grado di accordo. Al termine, restituiscono un profilo che sintetizza i risultati in fattori e brevi commenti. Questo esito può essere oggetto di riflessione personale o di discussione con un tutor, con il docente o con un orientatore; tale accompagnamento trova però un limite strutturale nella disponibilità di chi lo svolge. Inoltre, la letteratura evidenzia come la mancanza di supporto riduca l’efficacia di questi strumenti e la capacità di tradurre le indicazioni ricevute in azioni concrete (Wollny et al. 2021).</w:t>
-      </w:r>
-    </w:p>
-    <w:p>
-      <w:pPr>
-        <w:pStyle w:val="BodyText"/>
-      </w:pPr>
-      <w:r>
-        <w:t xml:space="preserve">I recenti assistenti conversazionali basati su</w:t>
+        <w:t xml:space="preserve"> </w:t>
+      </w:r>
+      <w:r>
+        <w:t xml:space="preserve">implementato in due versioni. La prima, denominata</w:t>
       </w:r>
       <w:r>
         <w:t xml:space="preserve"> </w:t>
@@ -152,21 +230,88 @@
           <w:iCs/>
           <w:i/>
         </w:rPr>
-        <w:t xml:space="preserve">Large Language Model</w:t>
+        <w:t xml:space="preserve">Counselorbot-Conversetion</w:t>
       </w:r>
       <w:r>
         <w:t xml:space="preserve"> </w:t>
       </w:r>
       <w:r>
-        <w:t xml:space="preserve">(LLM) possono costituire un nuovo strumento di supporto per i processi di orientamento ricoprendo alcune funzioni che fino ad ora erano competenze esclusivamente umane.</w:t>
+        <w:t xml:space="preserve">(CB-C), adotta un approccio puramente conversazionale; la seconda</w:t>
+      </w:r>
+      <w:r>
+        <w:t xml:space="preserve"> </w:t>
+      </w:r>
+      <w:r>
+        <w:rPr>
+          <w:iCs/>
+          <w:i/>
+        </w:rPr>
+        <w:t xml:space="preserve">Counselorbot-Step-by-Step</w:t>
+      </w:r>
+      <w:r>
+        <w:t xml:space="preserve"> </w:t>
+      </w:r>
+      <w:r>
+        <w:t xml:space="preserve">(CB-SBS), presenta un’architettura strutturato in passi prestabiliti.</w:t>
       </w:r>
     </w:p>
     <w:p>
       <w:pPr>
         <w:pStyle w:val="BodyText"/>
-      </w:pPr>
-      <w:r>
-        <w:t xml:space="preserve">Per verificare questa ipotesi è stato sviluppato</w:t>
+        <w:jc w:val="both"/>
+      </w:pPr>
+      <w:r>
+        <w:t xml:space="preserve">Le domande di ricerca sono due: D1) si può costruire un</w:t>
+      </w:r>
+      <w:r>
+        <w:t xml:space="preserve"> </w:t>
+      </w:r>
+      <w:r>
+        <w:rPr>
+          <w:iCs/>
+          <w:i/>
+        </w:rPr>
+        <w:t xml:space="preserve">chatbot mentoring</w:t>
+      </w:r>
+      <w:r>
+        <w:t xml:space="preserve"> </w:t>
+      </w:r>
+      <w:r>
+        <w:t xml:space="preserve">efficace? D2) quale architettura conversazionale è più efficace, una guidata o una libera?</w:t>
+      </w:r>
+    </w:p>
+    <w:p>
+      <w:pPr>
+        <w:pStyle w:val="BodyText"/>
+        <w:jc w:val="both"/>
+      </w:pPr>
+      <w:r>
+        <w:t xml:space="preserve">La ricerca si colloca tuttavia in una fase ancora esplorativa.</w:t>
+      </w:r>
+    </w:p>
+    <w:p>
+      <w:pPr>
+        <w:pStyle w:val="BodyText"/>
+        <w:jc w:val="both"/>
+      </w:pPr>
+      <w:r>
+        <w:t xml:space="preserve">Il lavoro si articola in sei paragrafi. Il §1 presenta il quadro teorico e lo stato dell’arte sui</w:t>
+      </w:r>
+      <w:r>
+        <w:t xml:space="preserve"> </w:t>
+      </w:r>
+      <w:r>
+        <w:rPr>
+          <w:iCs/>
+          <w:i/>
+        </w:rPr>
+        <w:t xml:space="preserve">chatbot</w:t>
+      </w:r>
+      <w:r>
+        <w:t xml:space="preserve"> </w:t>
+      </w:r>
+      <w:r>
+        <w:t xml:space="preserve">in educazione; il §2 descrive la progettazione e l’architettura di</w:t>
       </w:r>
       <w:r>
         <w:t xml:space="preserve"> </w:t>
@@ -179,7 +324,41 @@
         <w:t xml:space="preserve">Counselorbot</w:t>
       </w:r>
       <w:r>
-        <w:t xml:space="preserve">, un</w:t>
+        <w:t xml:space="preserve">. Il §3 illustra la metodologia di valutazione del sistema, i cui risultati sono presentati al §4. Il §5 discute le implicazioni dei risultati e i limiti dello studio, mentre il §6 conclude tracciando le direzioni di sviluppo futuro.</w:t>
+      </w:r>
+    </w:p>
+    <w:bookmarkEnd w:id="20"/>
+    <w:bookmarkStart w:id="24" w:name="quadro-teorico-e-stato-dellarte"/>
+    <w:p>
+      <w:pPr>
+        <w:pStyle w:val="Heading2"/>
+      </w:pPr>
+      <w:r>
+        <w:rPr>
+          <w:color w:val="000000"/>
+        </w:rPr>
+        <w:t xml:space="preserve">1. Quadro teorico e stato dell’arte</w:t>
+      </w:r>
+    </w:p>
+    <w:bookmarkStart w:id="21" w:name="Xbd16a6b799e5d341a161fc0a5f7041e984aa183"/>
+    <w:p>
+      <w:pPr>
+        <w:pStyle w:val="Heading3"/>
+      </w:pPr>
+      <w:r>
+        <w:rPr>
+          <w:color w:val="000000"/>
+        </w:rPr>
+        <w:t xml:space="preserve">1.1 Large Language Models in educazione: potenzialità e rischi</w:t>
+      </w:r>
+    </w:p>
+    <w:p>
+      <w:pPr>
+        <w:pStyle w:val="FirstParagraph"/>
+        <w:jc w:val="both"/>
+      </w:pPr>
+      <w:r>
+        <w:t xml:space="preserve">Gli LLM — grandi reti neurali specializzate nel linguaggio (Brown et al. 2020) — costituiscono la famiglia più diffusa di strumenti di intelligenza artificiale generativa (GenAI) e sono il motore dei moderni</w:t>
       </w:r>
       <w:r>
         <w:t xml:space="preserve"> </w:t>
@@ -192,82 +371,57 @@
         <w:t xml:space="preserve">chatbot</w:t>
       </w:r>
       <w:r>
-        <w:t xml:space="preserve"> </w:t>
-      </w:r>
-      <w:r>
-        <w:t xml:space="preserve">implementato in due versioni. La prima, denominata</w:t>
-      </w:r>
-      <w:r>
-        <w:t xml:space="preserve"> </w:t>
+        <w:t xml:space="preserve">. Essi permettono di superare i limiti dei sistemi del passato basati su regole (</w:t>
       </w:r>
       <w:r>
         <w:rPr>
           <w:iCs/>
           <w:i/>
         </w:rPr>
-        <w:t xml:space="preserve">Counselorbot-Conversetion</w:t>
-      </w:r>
-      <w:r>
-        <w:t xml:space="preserve"> </w:t>
-      </w:r>
-      <w:r>
-        <w:t xml:space="preserve">(CB-C), adotta un approccio puramente conversazionale; la seconda</w:t>
-      </w:r>
-      <w:r>
-        <w:t xml:space="preserve"> </w:t>
-      </w:r>
-      <w:r>
-        <w:rPr>
-          <w:iCs/>
-          <w:i/>
-        </w:rPr>
-        <w:t xml:space="preserve">Counselorbot-Step-by-Step</w:t>
-      </w:r>
-      <w:r>
-        <w:t xml:space="preserve"> </w:t>
-      </w:r>
-      <w:r>
-        <w:t xml:space="preserve">(CB-SBS), presenta un’architettura strutturato in passi prestabiliti.</w:t>
+        <w:t xml:space="preserve">rule-based</w:t>
+      </w:r>
+      <w:r>
+        <w:t xml:space="preserve">) (ELIZA, Weizenbaum 1966), grazie alla loro capacità di produrre output adattivi e coerenti in linguaggio naturale possono rispondere a domande non previste dalla programmazione (Brown et al. 2020; Kasneci et al. 2023).</w:t>
       </w:r>
     </w:p>
     <w:p>
       <w:pPr>
         <w:pStyle w:val="BodyText"/>
-      </w:pPr>
-      <w:r>
-        <w:t xml:space="preserve">Le domande di ricerca sono due: D1) si può costruire un</w:t>
-      </w:r>
-      <w:r>
-        <w:t xml:space="preserve"> </w:t>
-      </w:r>
-      <w:r>
-        <w:rPr>
-          <w:iCs/>
-          <w:i/>
-        </w:rPr>
-        <w:t xml:space="preserve">chatbot mentoring</w:t>
-      </w:r>
-      <w:r>
-        <w:t xml:space="preserve"> </w:t>
-      </w:r>
-      <w:r>
-        <w:t xml:space="preserve">efficace? D2) quale architettura conversazionale è più efficace, una guidata o una libera?</w:t>
+        <w:jc w:val="both"/>
+      </w:pPr>
+      <w:r>
+        <w:t xml:space="preserve">Tuttavia, l’integrazione di queste tecnologie introduce una serie di rischi e problematiche di natura tecnica, contenutistica, di accettazione della tecnologia e di dipendenza. Dal punto di vista del contenuto possono produrre risposte inaccurate o inventate, le cosiddette allucinazioni. Inoltre, possono riprodurre bias di genere e demografici o dare informazioni stereotipate (Bender et al. 2021; Tankelevitch et al. 2024).</w:t>
       </w:r>
     </w:p>
     <w:p>
       <w:pPr>
         <w:pStyle w:val="BodyText"/>
-      </w:pPr>
-      <w:r>
-        <w:t xml:space="preserve">La ricerca si colloca tuttavia in una fase ancora esplorativa.</w:t>
+        <w:jc w:val="both"/>
+      </w:pPr>
+      <w:r>
+        <w:t xml:space="preserve">Dal lato dell’accettazione delle risposte da parte di umani, le indicazioni fornite da un sistema artificiale tendono a essere ritenute meno credibili rispetto a quelle di un operatore umano (Cukurova et al. 2020). Infine, un affidamento sproporzionato a tali strumenti per la risoluzione di problemi o la generazione di testi rischia di creare una dipendenza eccessiva, compromettendo lo sviluppo di abilità critiche come l’analisi, la sintesi e la creatività.</w:t>
+      </w:r>
+    </w:p>
+    <w:bookmarkEnd w:id="21"/>
+    <w:bookmarkStart w:id="22" w:name="X7e4dc5fa5ba1b52309736d98c86658002441900"/>
+    <w:p>
+      <w:pPr>
+        <w:pStyle w:val="Heading3"/>
+      </w:pPr>
+      <w:r>
+        <w:rPr>
+          <w:color w:val="000000"/>
+        </w:rPr>
+        <w:t xml:space="preserve">1.2 Chatbot educativi e tutoraggio socratico: autoregolazione, metacognizione e agency epistemica</w:t>
       </w:r>
     </w:p>
     <w:p>
       <w:pPr>
-        <w:pStyle w:val="BodyText"/>
-      </w:pPr>
-      <w:r>
-        <w:t xml:space="preserve">Il lavoro si articola in sei paragrafi. Il §1 presenta il quadro teorico e lo stato dell’arte sui</w:t>
+        <w:pStyle w:val="FirstParagraph"/>
+        <w:jc w:val="both"/>
+      </w:pPr>
+      <w:r>
+        <w:t xml:space="preserve">La letteratura scientifica evidenzia il potenziale dei</w:t>
       </w:r>
       <w:r>
         <w:t xml:space="preserve"> </w:t>
@@ -283,7 +437,151 @@
         <w:t xml:space="preserve"> </w:t>
       </w:r>
       <w:r>
-        <w:t xml:space="preserve">in educazione; il §2 descrive la progettazione e l’architettura di</w:t>
+        <w:t xml:space="preserve">educativi, le cui funzioni spaziano dall’orientamento informativo (</w:t>
+      </w:r>
+      <w:r>
+        <w:rPr>
+          <w:iCs/>
+          <w:i/>
+        </w:rPr>
+        <w:t xml:space="preserve">informational</w:t>
+      </w:r>
+      <w:r>
+        <w:t xml:space="preserve">) al</w:t>
+      </w:r>
+      <w:r>
+        <w:t xml:space="preserve"> </w:t>
+      </w:r>
+      <w:r>
+        <w:rPr>
+          <w:iCs/>
+          <w:i/>
+        </w:rPr>
+        <w:t xml:space="preserve">tutoring</w:t>
+      </w:r>
+      <w:r>
+        <w:t xml:space="preserve"> </w:t>
+      </w:r>
+      <w:r>
+        <w:t xml:space="preserve">disciplinare e al</w:t>
+      </w:r>
+      <w:r>
+        <w:t xml:space="preserve"> </w:t>
+      </w:r>
+      <w:r>
+        <w:rPr>
+          <w:iCs/>
+          <w:i/>
+        </w:rPr>
+        <w:t xml:space="preserve">mentoring</w:t>
+      </w:r>
+      <w:r>
+        <w:t xml:space="preserve"> </w:t>
+      </w:r>
+      <w:r>
+        <w:t xml:space="preserve">formativo (Kuhail et al., 2022; Wollny et al., 2021; Zawacki-Richter et al., 2019). Gli LLM, in particolare, possono essere condizionati nell’interazione tramite vincoli di alto livello noti come</w:t>
+      </w:r>
+      <w:r>
+        <w:t xml:space="preserve"> </w:t>
+      </w:r>
+      <w:r>
+        <w:rPr>
+          <w:iCs/>
+          <w:i/>
+        </w:rPr>
+        <w:t xml:space="preserve">system prompt</w:t>
+      </w:r>
+      <w:r>
+        <w:t xml:space="preserve"> </w:t>
+      </w:r>
+      <w:r>
+        <w:t xml:space="preserve">e</w:t>
+      </w:r>
+      <w:r>
+        <w:t xml:space="preserve"> </w:t>
+      </w:r>
+      <w:r>
+        <w:rPr>
+          <w:iCs/>
+          <w:i/>
+        </w:rPr>
+        <w:t xml:space="preserve">meta-prompt</w:t>
+      </w:r>
+      <w:r>
+        <w:t xml:space="preserve">. Tali istruzioni, ricevute dal modello prima del dialogo con l’utente, ne definiscono il ruolo, il comportamento e le modalità di interazione. Inoltre, mediante tecniche di</w:t>
+      </w:r>
+      <w:r>
+        <w:t xml:space="preserve"> </w:t>
+      </w:r>
+      <w:r>
+        <w:rPr>
+          <w:iCs/>
+          <w:i/>
+        </w:rPr>
+        <w:t xml:space="preserve">retrieval</w:t>
+      </w:r>
+      <w:r>
+        <w:t xml:space="preserve">, è possibile integrare nei prompt informazioni pertinenti estratte da documenti validati, migliorando l’accuratezza e l’affidabilità delle risposte (Kasneci et al., 2023). Tali sistemi sono dunque in grado di svolgere compiti finora di esclusiva competenza all’operatore umano, rendendo i processi di orientamento più scalabili e sostenibili (Neumann et al., 2021). Ad esempio, impiegati come</w:t>
+      </w:r>
+      <w:r>
+        <w:t xml:space="preserve"> </w:t>
+      </w:r>
+      <w:r>
+        <w:rPr>
+          <w:iCs/>
+          <w:i/>
+        </w:rPr>
+        <w:t xml:space="preserve">tutor socratici</w:t>
+      </w:r>
+      <w:r>
+        <w:t xml:space="preserve"> </w:t>
+      </w:r>
+      <w:r>
+        <w:t xml:space="preserve">— secondo un modello dialogico nel quale l’intelligenza artificiale guida lo studente attraverso domande progressive, anziché fornire risposte dirette — possono sostenere lo sviluppo della metacognizione e dell’</w:t>
+      </w:r>
+      <w:r>
+        <w:rPr>
+          <w:iCs/>
+          <w:i/>
+        </w:rPr>
+        <w:t xml:space="preserve">agency</w:t>
+      </w:r>
+      <w:r>
+        <w:t xml:space="preserve"> </w:t>
+      </w:r>
+      <w:r>
+        <w:t xml:space="preserve">epistemica, intesa come la capacità dello studente di assumere un ruolo attivo, consapevole e responsabile nella costruzione della propria conoscenza (Antunes et al., 2025; Chang et al., 2023).</w:t>
+      </w:r>
+    </w:p>
+    <w:p>
+      <w:pPr>
+        <w:pStyle w:val="BodyText"/>
+        <w:jc w:val="both"/>
+      </w:pPr>
+      <w:r>
+        <w:t xml:space="preserve">Tuttavia, è necessario che gli studenti sviluppino un senso critico verso l’AI che permetta loro di valutarne l’attendibilità e la pertinenza, al fine di integrare in maniera proficua questa interazione nel proprio percorso di apprendimento (Tankelevitch et al., 2024). Tale competenza assume particolare rilevanza, poiché le strategie di autovalutazione supportate dall’AI risultano ancora tra quelle meno conosciute dagli studenti (Liu et al., 2025).</w:t>
+      </w:r>
+    </w:p>
+    <w:bookmarkEnd w:id="22"/>
+    <w:bookmarkStart w:id="23" w:name="X02dcbc75d18e72b99aacf4db1c376484a80288e"/>
+    <w:p>
+      <w:pPr>
+        <w:pStyle w:val="Heading3"/>
+      </w:pPr>
+      <w:r>
+        <w:rPr>
+          <w:color w:val="000000"/>
+        </w:rPr>
+        <w:t xml:space="preserve">1.3 Il framework delle competenze strategiche come impalcatura semantica</w:t>
+      </w:r>
+    </w:p>
+    <w:p>
+      <w:pPr>
+        <w:pStyle w:val="FirstParagraph"/>
+        <w:jc w:val="both"/>
+      </w:pPr>
+      <w:r>
+        <w:t xml:space="preserve">Per comprendere meglio l’idea di</w:t>
       </w:r>
       <w:r>
         <w:t xml:space="preserve"> </w:t>
@@ -296,34 +594,10 @@
         <w:t xml:space="preserve">Counselorbot</w:t>
       </w:r>
       <w:r>
-        <w:t xml:space="preserve">. Il §3 illustra la metodologia di valutazione del sistema, i cui risultati sono presentati al §4. Il §5 discute le implicazioni dei risultati e i limiti dello studio, mentre il §6 conclude tracciando le direzioni di sviluppo futuro.</w:t>
-      </w:r>
-    </w:p>
-    <w:bookmarkEnd w:id="20"/>
-    <w:bookmarkStart w:id="24" w:name="quadro-teorico-e-stato-dellarte"/>
-    <w:p>
-      <w:pPr>
-        <w:pStyle w:val="Heading2"/>
-      </w:pPr>
-      <w:r>
-        <w:t xml:space="preserve">1. Quadro teorico e stato dell’arte</w:t>
-      </w:r>
-    </w:p>
-    <w:bookmarkStart w:id="21" w:name="Xbd16a6b799e5d341a161fc0a5f7041e984aa183"/>
-    <w:p>
-      <w:pPr>
-        <w:pStyle w:val="Heading3"/>
-      </w:pPr>
-      <w:r>
-        <w:t xml:space="preserve">1.1 Large Language Models in educazione: potenzialità e rischi</w:t>
-      </w:r>
-    </w:p>
-    <w:p>
-      <w:pPr>
-        <w:pStyle w:val="FirstParagraph"/>
-      </w:pPr>
-      <w:r>
-        <w:t xml:space="preserve">Gli LLM — grandi reti neurali specializzate nel linguaggio (Brown et al. 2020) — costituiscono la famiglia più diffusa di strumenti di intelligenza artificiale generativa (GenAI) e sono il motore dei moderni</w:t>
+        <w:t xml:space="preserve"> </w:t>
+      </w:r>
+      <w:r>
+        <w:t xml:space="preserve">è opportuno accennare brevemente al portale</w:t>
       </w:r>
       <w:r>
         <w:t xml:space="preserve"> </w:t>
@@ -333,54 +607,38 @@
           <w:iCs/>
           <w:i/>
         </w:rPr>
-        <w:t xml:space="preserve">chatbot</w:t>
-      </w:r>
-      <w:r>
-        <w:t xml:space="preserve">. Essi permettono di superare i limiti dei sistemi del passato basati su regole (</w:t>
+        <w:t xml:space="preserve">Competenze strategiche</w:t>
+      </w:r>
+      <w:r>
+        <w:t xml:space="preserve">. Il sito raccoglie strumenti di autovalutazione rivolti a studenti, docenti e operatori dell’orientamento. Questi strumenti aiutano a riflettere sulle proprie modalità di apprendimento, sulle strategie di studio, sulla motivazione, sulla gestione delle emozioni e sulla progettualità personale.</w:t>
+      </w:r>
+    </w:p>
+    <w:p>
+      <w:pPr>
+        <w:pStyle w:val="BodyText"/>
+        <w:jc w:val="both"/>
+      </w:pPr>
+      <w:r>
+        <w:t xml:space="preserve">Alla base del portale vi è il costrutto di competenza strategica, sviluppato dal gruppo di ricerca coordinato da Pellerey (Pellerey et al., 2013) e radicato nella nozione aristotelico-tomista di abito (</w:t>
       </w:r>
       <w:r>
         <w:rPr>
           <w:iCs/>
           <w:i/>
         </w:rPr>
-        <w:t xml:space="preserve">rule-based</w:t>
-      </w:r>
-      <w:r>
-        <w:t xml:space="preserve">) (ELIZA, Weizenbaum 1966), grazie alla loro capacità di produrre output adattivi e coerenti in linguaggio naturale possono rispondere a domande non previste dalla programmazione (Brown et al. 2020; Kasneci et al. 2023).</w:t>
+        <w:t xml:space="preserve">habitus</w:t>
+      </w:r>
+      <w:r>
+        <w:t xml:space="preserve">). Tale costrutto indica l’insieme delle abilità cognitive, metacognitive, affettivo-motivazionali e volitive che permettono allo studente di pianificare, monitorare e regolare il proprio apprendimento.</w:t>
       </w:r>
     </w:p>
     <w:p>
       <w:pPr>
         <w:pStyle w:val="BodyText"/>
-      </w:pPr>
-      <w:r>
-        <w:t xml:space="preserve">Tuttavia, l’integrazione di queste tecnologie introduce una serie di rischi e problematiche di natura tecnica, contenutistica, di accettazione della tecnologia e di dipendenza. Dal punto di vista del contenuto possono produrre risposte inaccurate o inventate, le cosiddette allucinazioni. Inoltre, possono riprodurre bias di genere e demografici o dare informazioni stereotipate (Bender et al. 2021; Tankelevitch et al. 2024).</w:t>
-      </w:r>
-    </w:p>
-    <w:p>
-      <w:pPr>
-        <w:pStyle w:val="BodyText"/>
-      </w:pPr>
-      <w:r>
-        <w:t xml:space="preserve">Dal lato dell’accettazione delle risposte da parte di umani, le indicazioni fornite da un sistema artificiale tendono a essere ritenute meno credibili rispetto a quelle di un operatore umano (Cukurova et al. 2020). Infine, un affidamento sproporzionato a tali strumenti per la risoluzione di problemi o la generazione di testi rischia di creare una dipendenza eccessiva, compromettendo lo sviluppo di abilità critiche come l’analisi, la sintesi e la creatività.</w:t>
-      </w:r>
-    </w:p>
-    <w:bookmarkEnd w:id="21"/>
-    <w:bookmarkStart w:id="22" w:name="X7e4dc5fa5ba1b52309736d98c86658002441900"/>
-    <w:p>
-      <w:pPr>
-        <w:pStyle w:val="Heading3"/>
-      </w:pPr>
-      <w:r>
-        <w:t xml:space="preserve">1.2 Chatbot educativi e tutoraggio socratico: autoregolazione, metacognizione e agency epistemica</w:t>
-      </w:r>
-    </w:p>
-    <w:p>
-      <w:pPr>
-        <w:pStyle w:val="FirstParagraph"/>
-      </w:pPr>
-      <w:r>
-        <w:t xml:space="preserve">La letteratura scientifica evidenzia il potenziale dei</w:t>
+        <w:jc w:val="both"/>
+      </w:pPr>
+      <w:r>
+        <w:t xml:space="preserve">Tra i questionari disponibili nel portale vi sono il QSA,</w:t>
       </w:r>
       <w:r>
         <w:t xml:space="preserve"> </w:t>
@@ -390,23 +648,67 @@
           <w:iCs/>
           <w:i/>
         </w:rPr>
-        <w:t xml:space="preserve">chatbot</w:t>
+        <w:t xml:space="preserve">Questionario sulle Strategie di Apprendimento</w:t>
+      </w:r>
+      <w:r>
+        <w:t xml:space="preserve">; il QSAr, nella sua versione ridotta; il QPCS,</w:t>
       </w:r>
       <w:r>
         <w:t xml:space="preserve"> </w:t>
-      </w:r>
-      <w:r>
-        <w:t xml:space="preserve">educativi, le cui funzioni spaziano dall’orientamento informativo (</w:t>
       </w:r>
       <w:r>
         <w:rPr>
           <w:iCs/>
           <w:i/>
         </w:rPr>
-        <w:t xml:space="preserve">informational</w:t>
-      </w:r>
-      <w:r>
-        <w:t xml:space="preserve">) al</w:t>
+        <w:t xml:space="preserve">Questionario sulla Percezione delle proprie Competenze Strategiche</w:t>
+      </w:r>
+      <w:r>
+        <w:t xml:space="preserve">; il QPCC; lo ZTPI, dedicato alla prospettiva temporale; e il QAP, relativo all’adattabilità professionale.</w:t>
+      </w:r>
+    </w:p>
+    <w:bookmarkEnd w:id="23"/>
+    <w:bookmarkEnd w:id="24"/>
+    <w:bookmarkStart w:id="33" w:name="progettazione-di-counselorbot"/>
+    <w:p>
+      <w:pPr>
+        <w:pStyle w:val="Heading2"/>
+      </w:pPr>
+      <w:r>
+        <w:rPr>
+          <w:color w:val="000000"/>
+        </w:rPr>
+        <w:t xml:space="preserve">2. Progettazione di Counselorbot</w:t>
+      </w:r>
+    </w:p>
+    <w:p>
+      <w:pPr>
+        <w:pStyle w:val="FirstParagraph"/>
+        <w:jc w:val="both"/>
+      </w:pPr>
+      <w:r>
+        <w:t xml:space="preserve">Counselorbot è stato concepito come un sistema multifunzionale dedicato all’orientamento formativo e professionale, all’autovalutazione e al supporto all’apprendimento. La piattaforma integra strumenti differenti, accomunati da un’interazione conversazionale strutturata, attraverso la quale l’utente viene accompagnato nell’interpretazione dei risultati, nella riflessione sulle proprie esperienze e nell’individuazione di strategie utili al proprio percorso.</w:t>
+      </w:r>
+    </w:p>
+    <w:bookmarkStart w:id="25" w:name="strumenti-disponibili-in-counselorbot"/>
+    <w:p>
+      <w:pPr>
+        <w:pStyle w:val="Heading3"/>
+      </w:pPr>
+      <w:r>
+        <w:rPr>
+          <w:color w:val="000000"/>
+        </w:rPr>
+        <w:t xml:space="preserve">2.1 Strumenti disponibili in Counselorbot</w:t>
+      </w:r>
+    </w:p>
+    <w:p>
+      <w:pPr>
+        <w:pStyle w:val="FirstParagraph"/>
+        <w:jc w:val="both"/>
+      </w:pPr>
+      <w:r>
+        <w:t xml:space="preserve">Nella schermata iniziale, Counselorbot presenta un selettore attraverso il quale l’utente può scegliere uno dei questionari disponibili, la</w:t>
       </w:r>
       <w:r>
         <w:t xml:space="preserve"> </w:t>
@@ -416,13 +718,13 @@
           <w:iCs/>
           <w:i/>
         </w:rPr>
-        <w:t xml:space="preserve">tutoring</w:t>
+        <w:t xml:space="preserve">Career Counseling Interview</w:t>
       </w:r>
       <w:r>
         <w:t xml:space="preserve"> </w:t>
       </w:r>
       <w:r>
-        <w:t xml:space="preserve">disciplinare e al</w:t>
+        <w:t xml:space="preserve">oppure il modulo di</w:t>
       </w:r>
       <w:r>
         <w:t xml:space="preserve"> </w:t>
@@ -432,13 +734,521 @@
           <w:iCs/>
           <w:i/>
         </w:rPr>
-        <w:t xml:space="preserve">mentoring</w:t>
+        <w:t xml:space="preserve">Question-Based Learning</w:t>
+      </w:r>
+      <w:r>
+        <w:t xml:space="preserve">. In base alla scelta effettuata, il sistema attiva l’interfaccia e il percorso di interazione corrispondenti.</w:t>
+      </w:r>
+    </w:p>
+    <w:p>
+      <w:pPr>
+        <w:pStyle w:val="BodyText"/>
+        <w:jc w:val="both"/>
+      </w:pPr>
+      <w:r>
+        <w:t xml:space="preserve">Una prima area funzionale riguarda l’interpretazione dei questionari presenti nel portale</w:t>
       </w:r>
       <w:r>
         <w:t xml:space="preserve"> </w:t>
       </w:r>
       <w:r>
-        <w:t xml:space="preserve">formativo (Kuhail et al., 2022; Wollny et al., 2021; Zawacki-Richter et al., 2019). Gli LLM, in particolare, possono essere condizionati nell’interazione tramite vincoli di alto livello noti come</w:t>
+        <w:rPr>
+          <w:iCs/>
+          <w:i/>
+        </w:rPr>
+        <w:t xml:space="preserve">Competenze strategiche</w:t>
+      </w:r>
+      <w:r>
+        <w:t xml:space="preserve">. Tra questi rientra il Questionario sulle Strategie di Apprendimento (QSA), finalizzato ad analizzare le modalità attraverso cui lo studente affronta, organizza e regola il proprio percorso formativo. Lo strumento prende in considerazione fattori cognitivi, metacognitivi, affettivi, motivazionali e volitivi. Counselorbot accompagna l’utente nell’interpretazione dei risultati attraverso undici passi guidati, ciascuno dedicato a una specifica dimensione. Per ogni fattore, il sistema illustra il significato del punteggio, formula domande di approfondimento e propone strategie coerenti con il profilo emerso.</w:t>
+      </w:r>
+    </w:p>
+    <w:p>
+      <w:pPr>
+        <w:pStyle w:val="BodyText"/>
+        <w:jc w:val="both"/>
+      </w:pPr>
+      <w:r>
+        <w:t xml:space="preserve">Accanto al QSA è integrato il QSAr, una versione ridotta del Questionario sulle Strategie di Apprendimento. Esso consente di ottenere una rappresentazione più sintetica delle principali modalità con cui lo studente affronta il proprio apprendimento. Anche in questo caso, Counselorbot restituisce il profilo in forma comprensibile, evidenzia i punti di forza e le aree suscettibili di sviluppo e guida l’utente nella riflessione sulle possibili strategie di miglioramento.</w:t>
+      </w:r>
+    </w:p>
+    <w:p>
+      <w:pPr>
+        <w:pStyle w:val="BodyText"/>
+        <w:jc w:val="both"/>
+      </w:pPr>
+      <w:r>
+        <w:t xml:space="preserve">Un ulteriore strumento è lo</w:t>
+      </w:r>
+      <w:r>
+        <w:t xml:space="preserve"> </w:t>
+      </w:r>
+      <w:r>
+        <w:rPr>
+          <w:iCs/>
+          <w:i/>
+        </w:rPr>
+        <w:t xml:space="preserve">Zimbardo Time Perspective Inventory</w:t>
+      </w:r>
+      <w:r>
+        <w:t xml:space="preserve"> </w:t>
+      </w:r>
+      <w:r>
+        <w:t xml:space="preserve">(ZTPI), attraverso il quale viene analizzato il rapporto dell’individuo con le dimensioni temporali del passato, del presente e del futuro. Le prospettive temporali possono incidere sulla capacità progettuale, sulle decisioni e sull’atteggiamento assunto verso il percorso formativo e professionale. Counselorbot supporta l’utente nell’interpretazione del proprio profilo temporale e lo aiuta a individuare le relazioni tra orientamento temporale, obiettivi personali e scelte future.</w:t>
+      </w:r>
+    </w:p>
+    <w:p>
+      <w:pPr>
+        <w:pStyle w:val="BodyText"/>
+        <w:jc w:val="both"/>
+      </w:pPr>
+      <w:r>
+        <w:t xml:space="preserve">Per QSA, QSAr e ZTPI, l’interfaccia richiede l’inserimento dei risultati e restituisce una rappresentazione grafica del profilo. Il grafico a barre utilizza una codifica cromatica nella quale il verde identifica i punti di forza, il giallo i risultati collocati nella fascia intermedia e il rosso le possibili aree di crescita. La visualizzazione grafica non sostituisce l’interpretazione, ma offre una prima rappresentazione sintetica del profilo, che viene successivamente approfondita attraverso il dialogo guidato.</w:t>
+      </w:r>
+    </w:p>
+    <w:p>
+      <w:pPr>
+        <w:pStyle w:val="BodyText"/>
+        <w:jc w:val="both"/>
+      </w:pPr>
+      <w:r>
+        <w:t xml:space="preserve">Ai questionari si affiancano due strumenti aggiuntivi, caratterizzati da finalità e modalità di funzionamento differenti. Il primo è la</w:t>
+      </w:r>
+      <w:r>
+        <w:t xml:space="preserve"> </w:t>
+      </w:r>
+      <w:r>
+        <w:rPr>
+          <w:iCs/>
+          <w:i/>
+        </w:rPr>
+        <w:t xml:space="preserve">Career Counseling Interview</w:t>
+      </w:r>
+      <w:r>
+        <w:t xml:space="preserve"> </w:t>
+      </w:r>
+      <w:r>
+        <w:t xml:space="preserve">di Savickas, un colloquio narrativo finalizzato a esplorare le esperienze, gli interessi, i modelli di riferimento e le aspirazioni dell’utente. Dopo la selezione dello strumento, il sistema avvia il colloquio e propone cinque domande qualitative, alle quali il modello linguistico può far seguire ulteriori richieste di approfondimento. Al termine dell’interazione, Counselorbot elabora una sintesi narrativa orientata alla ricostruzione dell’identità professionale e all’individuazione dei principali temi di vita emersi.</w:t>
+      </w:r>
+    </w:p>
+    <w:p>
+      <w:pPr>
+        <w:pStyle w:val="BodyText"/>
+        <w:jc w:val="both"/>
+      </w:pPr>
+      <w:r>
+        <w:t xml:space="preserve">Il secondo strumento aggiuntivo è il modulo di</w:t>
+      </w:r>
+      <w:r>
+        <w:t xml:space="preserve"> </w:t>
+      </w:r>
+      <w:r>
+        <w:rPr>
+          <w:iCs/>
+          <w:i/>
+        </w:rPr>
+        <w:t xml:space="preserve">Question-Based Learning</w:t>
+      </w:r>
+      <w:r>
+        <w:t xml:space="preserve"> </w:t>
+      </w:r>
+      <w:r>
+        <w:t xml:space="preserve">(PQBL), basato sulla metodologia proposta da Jemstedt e Bälter. In questo caso, l’interfaccia richiede il caricamento di un documento didattico in formato PDF. Il sistema ne trasforma il contenuto in un percorso interattivo fondato su domande e feedback. Il testo non viene quindi proposto soltanto come materiale da leggere, ma diventa la base di un’attività di apprendimento attivo, nella quale l’utente è chiamato a recuperare, rielaborare e applicare le informazioni contenute nel documento.</w:t>
+      </w:r>
+    </w:p>
+    <w:p>
+      <w:pPr>
+        <w:pStyle w:val="BodyText"/>
+        <w:jc w:val="both"/>
+      </w:pPr>
+      <w:r>
+        <w:t xml:space="preserve">L’architettura modulare di Counselorbot è stata progettata in modo da consentire la futura integrazione di ulteriori questionari, interviste e strumenti di supporto all’orientamento e all’apprendimento.</w:t>
+      </w:r>
+    </w:p>
+    <w:bookmarkEnd w:id="25"/>
+    <w:bookmarkStart w:id="26" w:name="passi-guidati-e-flussi-di-interazione"/>
+    <w:p>
+      <w:pPr>
+        <w:pStyle w:val="Heading3"/>
+      </w:pPr>
+      <w:r>
+        <w:rPr>
+          <w:color w:val="000000"/>
+        </w:rPr>
+        <w:t xml:space="preserve">2.2 Passi guidati e flussi di interazione</w:t>
+      </w:r>
+    </w:p>
+    <w:p>
+      <w:pPr>
+        <w:pStyle w:val="FirstParagraph"/>
+        <w:jc w:val="both"/>
+      </w:pPr>
+      <w:r>
+        <w:t xml:space="preserve">Il principio organizzativo centrale di Counselorbot è rappresentato dai passi guidati (</w:t>
+      </w:r>
+      <w:r>
+        <w:rPr>
+          <w:iCs/>
+          <w:i/>
+        </w:rPr>
+        <w:t xml:space="preserve">guided steps</w:t>
+      </w:r>
+      <w:r>
+        <w:t xml:space="preserve">), ossia sequenze predefinite che determinano l’ordine delle diverse fasi del dialogo. A ciascun passo è associato uno specifico meta-prompt, nel quale vengono definiti l’obiettivo della fase, le informazioni da prendere in considerazione e il tipo di risposta che il modello linguistico deve produrre. Questa struttura permette di affrontare sistematicamente tutti gli ambiti previsti dallo strumento selezionato, riducendo il rischio che alcune dimensioni vengano trascurate.</w:t>
+      </w:r>
+    </w:p>
+    <w:p>
+      <w:pPr>
+        <w:pStyle w:val="BodyText"/>
+        <w:jc w:val="both"/>
+      </w:pPr>
+      <w:r>
+        <w:t xml:space="preserve">All’interno di ciascun passo, tuttavia, il modello linguistico mantiene la flessibilità necessaria per adattare il linguaggio, gli esempi, le domande e il livello di approfondimento alle risposte dell’utente. Counselorbot realizza così una modalità di interazione ibrida, nella quale il controllo deterministico del percorso si combina con l’adattività conversazionale dell’LLM. L’interfaccia conversazionale presenta progressivamente le domande, le interpretazioni e le strategie associate a ciascun passo. L’utente può chiedere chiarimenti, richiedere esempi o soffermarsi su uno specifico argomento prima di proseguire.</w:t>
+      </w:r>
+    </w:p>
+    <w:p>
+      <w:pPr>
+        <w:pStyle w:val="BodyText"/>
+        <w:jc w:val="both"/>
+      </w:pPr>
+      <w:r>
+        <w:t xml:space="preserve">Poiché gli strumenti integrati presentano caratteristiche differenti, il sistema non applica un unico flusso indistinto, ma adotta percorsi specifici per i questionari, per la</w:t>
+      </w:r>
+      <w:r>
+        <w:t xml:space="preserve"> </w:t>
+      </w:r>
+      <w:r>
+        <w:rPr>
+          <w:iCs/>
+          <w:i/>
+        </w:rPr>
+        <w:t xml:space="preserve">Career Counseling Interview</w:t>
+      </w:r>
+      <w:r>
+        <w:t xml:space="preserve"> </w:t>
+      </w:r>
+      <w:r>
+        <w:t xml:space="preserve">e per il</w:t>
+      </w:r>
+      <w:r>
+        <w:t xml:space="preserve"> </w:t>
+      </w:r>
+      <w:r>
+        <w:rPr>
+          <w:iCs/>
+          <w:i/>
+        </w:rPr>
+        <w:t xml:space="preserve">Question-Based Learning</w:t>
+      </w:r>
+      <w:r>
+        <w:t xml:space="preserve">. Nel caso dei questionari QSA, QSAr e ZTPI, il percorso ha inizio con l’inserimento dei punteggi. Il sistema elabora quindi il profilo e ne presenta una prima visualizzazione grafica. Successivamente prende avvio l’analisi guidata dei risultati, durante la quale l’utente può approfondire liberamente ciascun fattore prima di passare al successivo. L’interpretazione dei questionari si sviluppa secondo due modalità complementari. La prima è analitica ed è dedicata all’esame progressivo dei singoli fattori. Per ciascuna dimensione, Counselorbot presenta il risultato, ne chiarisce il significato, formula eventuali domande di approfondimento e propone strategie personalizzate. La seconda modalità è sintetica e mette in relazione le diverse componenti del profilo, facendo emergere le connessioni tra aspetti cognitivi, metacognitivi, affettivi, motivazionali e volitivi. In questo modo, il sistema non si limita a restituire una serie di punteggi isolati, ma favorisce la costruzione di una rappresentazione unitaria del funzionamento dello studente. Al termine dell’analisi, Counselorbot propone una sintesi complessiva dei principali punti di forza, delle aree suscettibili di sviluppo e delle strategie emerse durante il dialogo. L’utente può quindi selezionare e salvare le indicazioni considerate maggiormente significative.</w:t>
+      </w:r>
+    </w:p>
+    <w:p>
+      <w:pPr>
+        <w:pStyle w:val="BodyText"/>
+        <w:jc w:val="both"/>
+      </w:pPr>
+      <w:r>
+        <w:t xml:space="preserve">La</w:t>
+      </w:r>
+      <w:r>
+        <w:t xml:space="preserve"> </w:t>
+      </w:r>
+      <w:r>
+        <w:rPr>
+          <w:iCs/>
+          <w:i/>
+        </w:rPr>
+        <w:t xml:space="preserve">Career Counseling Interview</w:t>
+      </w:r>
+      <w:r>
+        <w:t xml:space="preserve"> </w:t>
+      </w:r>
+      <w:r>
+        <w:t xml:space="preserve">segue invece un percorso qualitativo e narrativo. In questo modulo non vengono inseriti punteggi e non viene elaborato un profilo psicometrico. Il sistema presenta progressivamente le cinque domande previste dal protocollo, analizza le risposte dell’utente e può formulare ulteriori domande per approfondire gli elementi più significativi. Pur mantenendo la sequenza generale stabilita, il modello linguistico adatta il dialogo ai contenuti emersi. Al termine dell’intervista, Counselorbot individua i temi ricorrenti e li integra in una sintesi narrativa relativa agli interessi, ai modelli di riferimento, alle aspirazioni e alla costruzione dell’identità professionale.</w:t>
+      </w:r>
+    </w:p>
+    <w:p>
+      <w:pPr>
+        <w:pStyle w:val="BodyText"/>
+        <w:jc w:val="both"/>
+      </w:pPr>
+      <w:r>
+        <w:t xml:space="preserve">Il modulo di</w:t>
+      </w:r>
+      <w:r>
+        <w:t xml:space="preserve"> </w:t>
+      </w:r>
+      <w:r>
+        <w:rPr>
+          <w:iCs/>
+          <w:i/>
+        </w:rPr>
+        <w:t xml:space="preserve">Question-Based Learning</w:t>
+      </w:r>
+      <w:r>
+        <w:t xml:space="preserve"> </w:t>
+      </w:r>
+      <w:r>
+        <w:t xml:space="preserve">segue un terzo flusso, specificamente orientato all’apprendimento attivo. Dopo il caricamento del documento in formato PDF, il sistema ne analizza e segmenta il contenuto, genera una sequenza di domande e le presenta progressivamente all’utente. Dopo ciascuna risposta, Counselorbot restituisce un feedback, propone eventuali chiarimenti e può adattare la difficoltà o il livello di approfondimento delle domande successive. Il percorso rimane ancorato ai contenuti del documento e si conclude con una sintesi dell’attività svolta e degli aspetti principali affrontati.</w:t>
+      </w:r>
+    </w:p>
+    <w:bookmarkEnd w:id="26"/>
+    <w:bookmarkStart w:id="27" w:name="infrastruttura-hardware"/>
+    <w:p>
+      <w:pPr>
+        <w:pStyle w:val="Heading3"/>
+      </w:pPr>
+      <w:r>
+        <w:rPr>
+          <w:color w:val="000000"/>
+        </w:rPr>
+        <w:t xml:space="preserve">2.3 Infrastruttura hardware</w:t>
+      </w:r>
+    </w:p>
+    <w:p>
+      <w:pPr>
+        <w:pStyle w:val="FirstParagraph"/>
+        <w:jc w:val="both"/>
+      </w:pPr>
+      <w:r>
+        <w:t xml:space="preserve">Counselorbot è eseguito su una workstation ad alte prestazioni, configurata per gestire localmente modelli linguistici e carichi computazionali intensivi. La macchina è dotata di un processore AMD Ryzen Threadripper 7980X con 64 core e 128 thread, di 256 GB di memoria RAM e di una GPU NVIDIA RTX 5090. La realizzazione dell’infrastruttura ha richiesto un investimento iniziale di circa 13.000 euro. La scelta di un’infrastruttura locale risponde innanzitutto all’esigenza di tutelare la riservatezza dei dati, poiché consente di ridurre il trasferimento delle conversazioni e delle informazioni degli utenti verso servizi esterni. Inoltre, permette di mantenere una maggiore indipendenza dai provider commerciali di intelligenza artificiale, evitando che il funzionamento del sistema dipenda esclusivamente dalla disponibilità, dai costi o dalle modifiche delle API esterne. Infine, l’investimento iniziale può contribuire alla sostenibilità economica nel medio e lungo periodo, soprattutto in presenza di un numero elevato di interazioni.</w:t>
+      </w:r>
+    </w:p>
+    <w:bookmarkEnd w:id="27"/>
+    <w:bookmarkStart w:id="31" w:name="software"/>
+    <w:p>
+      <w:pPr>
+        <w:pStyle w:val="Heading3"/>
+      </w:pPr>
+      <w:r>
+        <w:rPr>
+          <w:color w:val="000000"/>
+        </w:rPr>
+        <w:t xml:space="preserve">2.4 Software</w:t>
+      </w:r>
+    </w:p>
+    <w:p>
+      <w:pPr>
+        <w:pStyle w:val="FirstParagraph"/>
+        <w:jc w:val="both"/>
+      </w:pPr>
+      <w:r>
+        <w:t xml:space="preserve">Il software di Counselorbot comprende il sistema di gestione dei modelli linguistici, i meccanismi di recupero delle conoscenze e della memoria e le funzioni di registrazione e analisi delle interazioni.</w:t>
+      </w:r>
+    </w:p>
+    <w:bookmarkStart w:id="28" w:name="modelli-linguistici"/>
+    <w:p>
+      <w:pPr>
+        <w:pStyle w:val="Heading4"/>
+      </w:pPr>
+      <w:r>
+        <w:rPr>
+          <w:color w:val="000000"/>
+        </w:rPr>
+        <w:t xml:space="preserve">2.4.1 Modelli linguistici</w:t>
+      </w:r>
+    </w:p>
+    <w:p>
+      <w:pPr>
+        <w:pStyle w:val="FirstParagraph"/>
+        <w:jc w:val="both"/>
+      </w:pPr>
+      <w:r>
+        <w:t xml:space="preserve">Per la gestione dei modelli linguistici, Counselorbot utilizza Ollama, uno strumento che consente l’esecuzione locale ed efficiente di modelli open-source. Durante la fase di sviluppo, la scelta si è orientata verso modelli con un numero di parametri inferiore a 15 miliardi, per garantire un equilibrio ottimale tra prestazioni e sostenibilità dell’infrastruttura locale. Sono stati testati modelli appartenenti a diverse famiglie, tra cui Gemma (nelle varianti da 2B, 4B e 12B parametri), DeepSeek-R1-Distill 8B e Qwen 3.5 9B.</w:t>
+      </w:r>
+    </w:p>
+    <w:bookmarkEnd w:id="28"/>
+    <w:bookmarkStart w:id="29" w:name="Xc64cd9a05b3a0c767b472b6f7103b658ac68a3e"/>
+    <w:p>
+      <w:pPr>
+        <w:pStyle w:val="Heading4"/>
+      </w:pPr>
+      <w:r>
+        <w:rPr>
+          <w:color w:val="000000"/>
+        </w:rPr>
+        <w:t xml:space="preserve">2.4.2 Recupero delle conoscenze e gestione della memoria</w:t>
+      </w:r>
+    </w:p>
+    <w:p>
+      <w:pPr>
+        <w:pStyle w:val="FirstParagraph"/>
+        <w:jc w:val="both"/>
+      </w:pPr>
+      <w:r>
+        <w:t xml:space="preserve">Counselorbot utilizza diversi meccanismi per recuperare le informazioni rilevanti e mantenere la continuità delle interazioni. Tali meccanismi comprendono la memoria di sessione, la base di conoscenza, il grafo della conoscenza e una memoria condivisa delle risposte. La memoria di sessione conserva le informazioni emerse nel corso della singola conversazione. In questo modo, il sistema può ricordare i risultati, le risposte dell’utente e le strategie già discusse, evitando ripetizioni e garantendo coerenza tra le diverse fasi del percorso. La base di conoscenza contiene strategie educative e contenuti teorici precedentemente selezionati e approvati. Le strategie sono associate ai fattori dei questionari e indicizzate attraverso parole chiave e rappresentazioni semantiche. Quando viene analizzata una determinata dimensione, il sistema recupera automaticamente i contenuti maggiormente pertinenti rispetto al fattore, al punteggio e alle informazioni fornite dallo studente. Le informazioni recuperate vengono inserite nel contesto del modello linguistico e impiegate per generare la risposta. Questa soluzione consente agli amministratori di ampliare o aggiornare la base di conoscenza senza dover intervenire manualmente sui prompt. Il grafo della conoscenza collega tra loro gli strumenti, i fattori, le strategie e i riferimenti teorici. Tale struttura permette di estendere la ricerca documentale anche ai concetti semanticamente vicini, superando una corrispondenza esclusivamente letterale tra i termini utilizzati dall’utente e quelli presenti nei contenuti indicizzati. A questi meccanismi si aggiunge una memoria condivisa delle risposte. Quando un utente valuta positivamente una risposta dell’assistente, questa può essere conservata e utilizzata come riferimento per domande analoghe formulate in sessioni successive. Le risposte precedenti non vengono necessariamente riproposte in forma identica, ma possono essere recuperate come esempi utili alla produzione di nuove risposte. Si introduce così un meccanismo di apprendimento collettivo, nel quale le interazioni considerate efficaci contribuiscono progressivamente al miglioramento del sistema. La memoria condivisa rimane tuttavia distinta dalla base di conoscenza validata: quest’ultima contiene materiali selezionati dagli amministratori, mentre la memoria condivisa deriva dalla valutazione delle risposte generate durante l’utilizzo.</w:t>
+      </w:r>
+    </w:p>
+    <w:bookmarkEnd w:id="29"/>
+    <w:bookmarkStart w:id="30" w:name="X2bc7d88a141625ea69f5b759b49be79527dd3a2"/>
+    <w:p>
+      <w:pPr>
+        <w:pStyle w:val="Heading4"/>
+      </w:pPr>
+      <w:r>
+        <w:rPr>
+          <w:color w:val="000000"/>
+        </w:rPr>
+        <w:t xml:space="preserve">2.4.3 Gestione delle interazioni e anonimizzazione</w:t>
+      </w:r>
+    </w:p>
+    <w:p>
+      <w:pPr>
+        <w:pStyle w:val="FirstParagraph"/>
+        <w:jc w:val="both"/>
+      </w:pPr>
+      <w:r>
+        <w:t xml:space="preserve">Le interazioni vengono registrate in un archivio consultabile dagli amministratori. Tale archivio permette di monitorare l’utilizzo del sistema, individuare domande ricorrenti, identificare eventuali difficoltà nei percorsi guidati e rilevare le aree nelle quali le risposte richiedono ulteriori miglioramenti. È inoltre in fase di progettazione un sistema di anonimizzazione che consenta di analizzare i contenuti delle conversazioni senza esporre i dati personali degli studenti. L’obiettivo è rendere possibile lo studio aggregato delle strategie maggiormente discusse, dei fattori percepiti come critici e dell’efficacia attribuita dagli utenti alle risposte del sistema. Questi dati potranno essere utilizzati per valutare l’impatto di Counselorbot, perfezionare i protocolli di interazione e studiare l’impiego del sistema su scala più ampia.</w:t>
+      </w:r>
+    </w:p>
+    <w:bookmarkEnd w:id="30"/>
+    <w:bookmarkEnd w:id="31"/>
+    <w:bookmarkStart w:id="32" w:name="struttura-del-sistema"/>
+    <w:p>
+      <w:pPr>
+        <w:pStyle w:val="Heading3"/>
+      </w:pPr>
+      <w:r>
+        <w:rPr>
+          <w:color w:val="000000"/>
+        </w:rPr>
+        <w:t xml:space="preserve">2.5 Struttura del sistema</w:t>
+      </w:r>
+    </w:p>
+    <w:p>
+      <w:pPr>
+        <w:pStyle w:val="FirstParagraph"/>
+        <w:jc w:val="both"/>
+      </w:pPr>
+      <w:r>
+        <w:t xml:space="preserve">L’architettura applicativa di Counselorbot si articola in quattro componenti principali: frontend, backend, database e livello di astrazione dei modelli linguistici. Il frontend costituisce il livello con cui l’utente interagisce direttamente. Comprende il selettore degli strumenti, i moduli per l’inserimento dei risultati, il caricamento dei documenti, la visualizzazione grafica del profilo, l’interfaccia conversazionale, la navigazione tra i passi guidati e le funzioni di salvataggio delle strategie. La sua organizzazione modulare permette di associare a ciascuno strumento una specifica interfaccia, mantenendo al tempo stesso un’esperienza d’uso coerente all’interno della piattaforma. Il backend gestisce la logica applicativa e coordina le differenti componenti del sistema. Esso espone i servizi relativi alla chat, ai questionari, ai passi guidati, alla memoria, alla base di conoscenza e alle funzioni amministrative. Durante l’interazione, il backend individua il passo corrente, seleziona il meta-prompt corrispondente, recupera le informazioni pertinenti e costruisce il contesto da inviare al modello linguistico. Successivamente riceve la risposta generata, la restituisce all’interfaccia e aggiorna la memoria della sessione. Il database relazionale conserva le configurazioni necessarie al funzionamento della piattaforma. Al suo interno sono registrati gli strumenti disponibili, la struttura dei questionari, i fattori, gli item, le scale, le stanine, i prompt, i meta-prompt, i passi guidati, le strategie, le configurazioni dei modelli, la memoria delle sessioni e le interazioni archiviate. Counselorbot non si limita quindi a ricevere punteggi esterni, ma dispone di una rappresentazione strutturata dei questionari e può interpretarli in relazione alle loro caratteristiche. Il livello di astrazione dei modelli linguistici mette infine in comunicazione il backend con i diversi provider di intelligenza artificiale. Attraverso un’interfaccia comune, esso gestisce l’invio dei prompt, la ricezione delle risposte e i parametri di generazione. Questa componente rende Counselorbot indipendente dal singolo modello e consente di utilizzare sia modelli eseguiti localmente mediante Ollama sia eventuali servizi remoti. L’organizzazione complessiva separa dunque i contenuti educativi, la logica dei percorsi, l’interfaccia utente e il modello linguistico. Tale separazione permette di aggiornare ed estendere Counselorbot intervenendo sulle singole componenti, senza dover riprogettare l’intero sistema.</w:t>
+      </w:r>
+    </w:p>
+    <w:bookmarkEnd w:id="32"/>
+    <w:bookmarkEnd w:id="33"/>
+    <w:bookmarkStart w:id="38" w:name="metodologia-di-valutazione"/>
+    <w:p>
+      <w:pPr>
+        <w:pStyle w:val="Heading2"/>
+      </w:pPr>
+      <w:r>
+        <w:rPr>
+          <w:color w:val="000000"/>
+        </w:rPr>
+        <w:t xml:space="preserve">3. Metodologia di valutazione</w:t>
+      </w:r>
+    </w:p>
+    <w:bookmarkStart w:id="34" w:name="disegno-della-ricerca"/>
+    <w:p>
+      <w:pPr>
+        <w:pStyle w:val="Heading3"/>
+      </w:pPr>
+      <w:r>
+        <w:rPr>
+          <w:color w:val="000000"/>
+        </w:rPr>
+        <w:t xml:space="preserve">3.1 Disegno della ricerca</w:t>
+      </w:r>
+    </w:p>
+    <w:p>
+      <w:pPr>
+        <w:pStyle w:val="FirstParagraph"/>
+        <w:jc w:val="both"/>
+      </w:pPr>
+      <w:r>
+        <w:t xml:space="preserve">Per valutare il sistema descritto nel § 2 è stato adottato un disegno di ricerca articolato secondo il modello ADDIE (Branch, 2009). L’acronimo identifica cinque fasi iterative:</w:t>
+      </w:r>
+      <w:r>
+        <w:t xml:space="preserve"> </w:t>
+      </w:r>
+      <w:r>
+        <w:rPr>
+          <w:iCs/>
+          <w:i/>
+        </w:rPr>
+        <w:t xml:space="preserve">Analysis</w:t>
+      </w:r>
+      <w:r>
+        <w:t xml:space="preserve">, relativa all’analisi dei bisogni formativi e del contesto;</w:t>
+      </w:r>
+      <w:r>
+        <w:t xml:space="preserve"> </w:t>
+      </w:r>
+      <w:r>
+        <w:rPr>
+          <w:iCs/>
+          <w:i/>
+        </w:rPr>
+        <w:t xml:space="preserve">Design</w:t>
+      </w:r>
+      <w:r>
+        <w:t xml:space="preserve">, dedicata alla progettazione dell’architettura e delle modalità di interazione;</w:t>
+      </w:r>
+      <w:r>
+        <w:t xml:space="preserve"> </w:t>
+      </w:r>
+      <w:r>
+        <w:rPr>
+          <w:iCs/>
+          <w:i/>
+        </w:rPr>
+        <w:t xml:space="preserve">Development</w:t>
+      </w:r>
+      <w:r>
+        <w:t xml:space="preserve">, riguardante la realizzazione del sistema;</w:t>
+      </w:r>
+      <w:r>
+        <w:t xml:space="preserve"> </w:t>
+      </w:r>
+      <w:r>
+        <w:rPr>
+          <w:iCs/>
+          <w:i/>
+        </w:rPr>
+        <w:t xml:space="preserve">Implementation</w:t>
+      </w:r>
+      <w:r>
+        <w:t xml:space="preserve">, riferita al rilascio e all’utilizzo del sistema; ed</w:t>
+      </w:r>
+      <w:r>
+        <w:t xml:space="preserve"> </w:t>
+      </w:r>
+      <w:r>
+        <w:rPr>
+          <w:iCs/>
+          <w:i/>
+        </w:rPr>
+        <w:t xml:space="preserve">Evaluation</w:t>
+      </w:r>
+      <w:r>
+        <w:t xml:space="preserve">, finalizzata alla valutazione del suo funzionamento e dei risultati ottenuti. Il lavoro presentato in questo articolo si colloca nella fase di</w:t>
+      </w:r>
+      <w:r>
+        <w:t xml:space="preserve"> </w:t>
+      </w:r>
+      <w:r>
+        <w:rPr>
+          <w:iCs/>
+          <w:i/>
+        </w:rPr>
+        <w:t xml:space="preserve">Evaluation</w:t>
+      </w:r>
+      <w:r>
+        <w:t xml:space="preserve"> </w:t>
+      </w:r>
+      <w:r>
+        <w:t xml:space="preserve">del secondo ciclo di sviluppo. Il primo ciclo ha portato alla realizzazione di Counselorbot-Chat (CB-C), una versione basata su un’architettura RAG (</w:t>
+      </w:r>
+      <w:r>
+        <w:rPr>
+          <w:iCs/>
+          <w:i/>
+        </w:rPr>
+        <w:t xml:space="preserve">Retrieval-Augmented Generation</w:t>
+      </w:r>
+      <w:r>
+        <w:t xml:space="preserve">) e su un</w:t>
       </w:r>
       <w:r>
         <w:t xml:space="preserve"> </w:t>
@@ -451,714 +1261,6 @@
         <w:t xml:space="preserve">system prompt</w:t>
       </w:r>
       <w:r>
-        <w:t xml:space="preserve"> </w:t>
-      </w:r>
-      <w:r>
-        <w:t xml:space="preserve">e</w:t>
-      </w:r>
-      <w:r>
-        <w:t xml:space="preserve"> </w:t>
-      </w:r>
-      <w:r>
-        <w:rPr>
-          <w:iCs/>
-          <w:i/>
-        </w:rPr>
-        <w:t xml:space="preserve">meta-prompt</w:t>
-      </w:r>
-      <w:r>
-        <w:t xml:space="preserve">. Tali istruzioni, ricevute dal modello prima del dialogo con l’utente, ne definiscono il ruolo, il comportamento e le modalità di interazione. Inoltre, mediante tecniche di</w:t>
-      </w:r>
-      <w:r>
-        <w:t xml:space="preserve"> </w:t>
-      </w:r>
-      <w:r>
-        <w:rPr>
-          <w:iCs/>
-          <w:i/>
-        </w:rPr>
-        <w:t xml:space="preserve">retrieval</w:t>
-      </w:r>
-      <w:r>
-        <w:t xml:space="preserve">, è possibile integrare nei prompt informazioni pertinenti estratte da documenti validati, migliorando l’accuratezza e l’affidabilità delle risposte (Kasneci et al., 2023). Tali sistemi sono dunque in grado di svolgere compiti finora di esclusiva competenza all’operatore umano, rendendo i processi di orientamento più scalabili e sostenibili (Neumann et al., 2021). Ad esempio, impiegati come</w:t>
-      </w:r>
-      <w:r>
-        <w:t xml:space="preserve"> </w:t>
-      </w:r>
-      <w:r>
-        <w:rPr>
-          <w:iCs/>
-          <w:i/>
-        </w:rPr>
-        <w:t xml:space="preserve">tutor socratici</w:t>
-      </w:r>
-      <w:r>
-        <w:t xml:space="preserve"> </w:t>
-      </w:r>
-      <w:r>
-        <w:t xml:space="preserve">— secondo un modello dialogico nel quale l’intelligenza artificiale guida lo studente attraverso domande progressive, anziché fornire risposte dirette — possono sostenere lo sviluppo della metacognizione e dell’</w:t>
-      </w:r>
-      <w:r>
-        <w:rPr>
-          <w:iCs/>
-          <w:i/>
-        </w:rPr>
-        <w:t xml:space="preserve">agency</w:t>
-      </w:r>
-      <w:r>
-        <w:t xml:space="preserve"> </w:t>
-      </w:r>
-      <w:r>
-        <w:t xml:space="preserve">epistemica, intesa come la capacità dello studente di assumere un ruolo attivo, consapevole e responsabile nella costruzione della propria conoscenza (Antunes et al., 2025; Chang et al., 2023).</w:t>
-      </w:r>
-    </w:p>
-    <w:p>
-      <w:pPr>
-        <w:pStyle w:val="BodyText"/>
-      </w:pPr>
-      <w:r>
-        <w:t xml:space="preserve">Tuttavia, è necessario che gli studenti sviluppino un senso critico verso l’AI che permetta loro di valutarne l’attendibilità e la pertinenza, al fine di integrare in maniera proficua questa interazione nel proprio percorso di apprendimento (Tankelevitch et al., 2024). Tale competenza assume particolare rilevanza, poiché le strategie di autovalutazione supportate dall’AI risultano ancora tra quelle meno conosciute dagli studenti (Liu et al., 2025).</w:t>
-      </w:r>
-    </w:p>
-    <w:bookmarkEnd w:id="22"/>
-    <w:bookmarkStart w:id="23" w:name="X02dcbc75d18e72b99aacf4db1c376484a80288e"/>
-    <w:p>
-      <w:pPr>
-        <w:pStyle w:val="Heading3"/>
-      </w:pPr>
-      <w:r>
-        <w:t xml:space="preserve">1.3 Il framework delle competenze strategiche come impalcatura semantica</w:t>
-      </w:r>
-    </w:p>
-    <w:p>
-      <w:pPr>
-        <w:pStyle w:val="FirstParagraph"/>
-      </w:pPr>
-      <w:r>
-        <w:t xml:space="preserve">Per comprendere meglio l’idea di</w:t>
-      </w:r>
-      <w:r>
-        <w:t xml:space="preserve"> </w:t>
-      </w:r>
-      <w:r>
-        <w:rPr>
-          <w:iCs/>
-          <w:i/>
-        </w:rPr>
-        <w:t xml:space="preserve">Counselorbot</w:t>
-      </w:r>
-      <w:r>
-        <w:t xml:space="preserve"> </w:t>
-      </w:r>
-      <w:r>
-        <w:t xml:space="preserve">è opportuno accennare brevemente al portale</w:t>
-      </w:r>
-      <w:r>
-        <w:t xml:space="preserve"> </w:t>
-      </w:r>
-      <w:r>
-        <w:rPr>
-          <w:iCs/>
-          <w:i/>
-        </w:rPr>
-        <w:t xml:space="preserve">Competenze strategiche</w:t>
-      </w:r>
-      <w:r>
-        <w:t xml:space="preserve">. Il sito raccoglie strumenti di autovalutazione rivolti a studenti, docenti e operatori dell’orientamento. Questi strumenti aiutano a riflettere sulle proprie modalità di apprendimento, sulle strategie di studio, sulla motivazione, sulla gestione delle emozioni e sulla progettualità personale.</w:t>
-      </w:r>
-    </w:p>
-    <w:p>
-      <w:pPr>
-        <w:pStyle w:val="BodyText"/>
-      </w:pPr>
-      <w:r>
-        <w:t xml:space="preserve">Alla base del portale vi è il costrutto di competenza strategica, sviluppato dal gruppo di ricerca coordinato da Pellerey (Pellerey et al., 2013) e radicato nella nozione aristotelico-tomista di abito (</w:t>
-      </w:r>
-      <w:r>
-        <w:rPr>
-          <w:iCs/>
-          <w:i/>
-        </w:rPr>
-        <w:t xml:space="preserve">habitus</w:t>
-      </w:r>
-      <w:r>
-        <w:t xml:space="preserve">). Tale costrutto indica l’insieme delle abilità cognitive, metacognitive, affettivo-motivazionali e volitive che permettono allo studente di pianificare, monitorare e regolare il proprio apprendimento.</w:t>
-      </w:r>
-    </w:p>
-    <w:p>
-      <w:pPr>
-        <w:pStyle w:val="BodyText"/>
-      </w:pPr>
-      <w:r>
-        <w:t xml:space="preserve">Tra i questionari disponibili nel portale vi sono il QSA,</w:t>
-      </w:r>
-      <w:r>
-        <w:t xml:space="preserve"> </w:t>
-      </w:r>
-      <w:r>
-        <w:rPr>
-          <w:iCs/>
-          <w:i/>
-        </w:rPr>
-        <w:t xml:space="preserve">Questionario sulle Strategie di Apprendimento</w:t>
-      </w:r>
-      <w:r>
-        <w:t xml:space="preserve">; il QSAr, nella sua versione ridotta; il QPCS,</w:t>
-      </w:r>
-      <w:r>
-        <w:t xml:space="preserve"> </w:t>
-      </w:r>
-      <w:r>
-        <w:rPr>
-          <w:iCs/>
-          <w:i/>
-        </w:rPr>
-        <w:t xml:space="preserve">Questionario sulla Percezione delle proprie Competenze Strategiche</w:t>
-      </w:r>
-      <w:r>
-        <w:t xml:space="preserve">; il QPCC; lo ZTPI, dedicato alla prospettiva temporale; e il QAP, relativo all’adattabilità professionale.</w:t>
-      </w:r>
-    </w:p>
-    <w:bookmarkEnd w:id="23"/>
-    <w:bookmarkEnd w:id="24"/>
-    <w:bookmarkStart w:id="33" w:name="progettazione-di-counselorbot"/>
-    <w:p>
-      <w:pPr>
-        <w:pStyle w:val="Heading2"/>
-      </w:pPr>
-      <w:r>
-        <w:t xml:space="preserve">2. Progettazione di Counselorbot</w:t>
-      </w:r>
-    </w:p>
-    <w:p>
-      <w:pPr>
-        <w:pStyle w:val="FirstParagraph"/>
-      </w:pPr>
-      <w:r>
-        <w:t xml:space="preserve">Counselorbot è stato concepito come un sistema multifunzionale dedicato all’orientamento formativo e professionale, all’autovalutazione e al supporto all’apprendimento. La piattaforma integra strumenti differenti, accomunati da un’interazione conversazionale strutturata, attraverso la quale l’utente viene accompagnato nell’interpretazione dei risultati, nella riflessione sulle proprie esperienze e nell’individuazione di strategie utili al proprio percorso.</w:t>
-      </w:r>
-    </w:p>
-    <w:bookmarkStart w:id="25" w:name="strumenti-disponibili-in-counselorbot"/>
-    <w:p>
-      <w:pPr>
-        <w:pStyle w:val="Heading3"/>
-      </w:pPr>
-      <w:r>
-        <w:t xml:space="preserve">2.1 Strumenti disponibili in Counselorbot</w:t>
-      </w:r>
-    </w:p>
-    <w:p>
-      <w:pPr>
-        <w:pStyle w:val="FirstParagraph"/>
-      </w:pPr>
-      <w:r>
-        <w:t xml:space="preserve">Nella schermata iniziale, Counselorbot presenta un selettore attraverso il quale l’utente può scegliere uno dei questionari disponibili, la</w:t>
-      </w:r>
-      <w:r>
-        <w:t xml:space="preserve"> </w:t>
-      </w:r>
-      <w:r>
-        <w:rPr>
-          <w:iCs/>
-          <w:i/>
-        </w:rPr>
-        <w:t xml:space="preserve">Career Counseling Interview</w:t>
-      </w:r>
-      <w:r>
-        <w:t xml:space="preserve"> </w:t>
-      </w:r>
-      <w:r>
-        <w:t xml:space="preserve">oppure il modulo di</w:t>
-      </w:r>
-      <w:r>
-        <w:t xml:space="preserve"> </w:t>
-      </w:r>
-      <w:r>
-        <w:rPr>
-          <w:iCs/>
-          <w:i/>
-        </w:rPr>
-        <w:t xml:space="preserve">Question-Based Learning</w:t>
-      </w:r>
-      <w:r>
-        <w:t xml:space="preserve">. In base alla scelta effettuata, il sistema attiva l’interfaccia e il percorso di interazione corrispondenti.</w:t>
-      </w:r>
-    </w:p>
-    <w:p>
-      <w:pPr>
-        <w:pStyle w:val="BodyText"/>
-      </w:pPr>
-      <w:r>
-        <w:t xml:space="preserve">Una prima area funzionale riguarda l’interpretazione dei questionari presenti nel portale</w:t>
-      </w:r>
-      <w:r>
-        <w:t xml:space="preserve"> </w:t>
-      </w:r>
-      <w:r>
-        <w:rPr>
-          <w:iCs/>
-          <w:i/>
-        </w:rPr>
-        <w:t xml:space="preserve">Competenze strategiche</w:t>
-      </w:r>
-      <w:r>
-        <w:t xml:space="preserve">. Tra questi rientra il Questionario sulle Strategie di Apprendimento (QSA), finalizzato ad analizzare le modalità attraverso cui lo studente affronta, organizza e regola il proprio percorso formativo. Lo strumento prende in considerazione fattori cognitivi, metacognitivi, affettivi, motivazionali e volitivi. Counselorbot accompagna l’utente nell’interpretazione dei risultati attraverso undici passi guidati, ciascuno dedicato a una specifica dimensione. Per ogni fattore, il sistema illustra il significato del punteggio, formula domande di approfondimento e propone strategie coerenti con il profilo emerso.</w:t>
-      </w:r>
-    </w:p>
-    <w:p>
-      <w:pPr>
-        <w:pStyle w:val="BodyText"/>
-      </w:pPr>
-      <w:r>
-        <w:t xml:space="preserve">Accanto al QSA è integrato il QSAr, una versione ridotta del Questionario sulle Strategie di Apprendimento. Esso consente di ottenere una rappresentazione più sintetica delle principali modalità con cui lo studente affronta il proprio apprendimento. Anche in questo caso, Counselorbot restituisce il profilo in forma comprensibile, evidenzia i punti di forza e le aree suscettibili di sviluppo e guida l’utente nella riflessione sulle possibili strategie di miglioramento.</w:t>
-      </w:r>
-    </w:p>
-    <w:p>
-      <w:pPr>
-        <w:pStyle w:val="BodyText"/>
-      </w:pPr>
-      <w:r>
-        <w:t xml:space="preserve">Un ulteriore strumento è lo</w:t>
-      </w:r>
-      <w:r>
-        <w:t xml:space="preserve"> </w:t>
-      </w:r>
-      <w:r>
-        <w:rPr>
-          <w:iCs/>
-          <w:i/>
-        </w:rPr>
-        <w:t xml:space="preserve">Zimbardo Time Perspective Inventory</w:t>
-      </w:r>
-      <w:r>
-        <w:t xml:space="preserve"> </w:t>
-      </w:r>
-      <w:r>
-        <w:t xml:space="preserve">(ZTPI), attraverso il quale viene analizzato il rapporto dell’individuo con le dimensioni temporali del passato, del presente e del futuro. Le prospettive temporali possono incidere sulla capacità progettuale, sulle decisioni e sull’atteggiamento assunto verso il percorso formativo e professionale. Counselorbot supporta l’utente nell’interpretazione del proprio profilo temporale e lo aiuta a individuare le relazioni tra orientamento temporale, obiettivi personali e scelte future.</w:t>
-      </w:r>
-    </w:p>
-    <w:p>
-      <w:pPr>
-        <w:pStyle w:val="BodyText"/>
-      </w:pPr>
-      <w:r>
-        <w:t xml:space="preserve">Per QSA, QSAr e ZTPI, l’interfaccia richiede l’inserimento dei risultati e restituisce una rappresentazione grafica del profilo. Il grafico a barre utilizza una codifica cromatica nella quale il verde identifica i punti di forza, il giallo i risultati collocati nella fascia intermedia e il rosso le possibili aree di crescita. La visualizzazione grafica non sostituisce l’interpretazione, ma offre una prima rappresentazione sintetica del profilo, che viene successivamente approfondita attraverso il dialogo guidato.</w:t>
-      </w:r>
-    </w:p>
-    <w:p>
-      <w:pPr>
-        <w:pStyle w:val="BodyText"/>
-      </w:pPr>
-      <w:r>
-        <w:t xml:space="preserve">Ai questionari si affiancano due strumenti aggiuntivi, caratterizzati da finalità e modalità di funzionamento differenti. Il primo è la</w:t>
-      </w:r>
-      <w:r>
-        <w:t xml:space="preserve"> </w:t>
-      </w:r>
-      <w:r>
-        <w:rPr>
-          <w:iCs/>
-          <w:i/>
-        </w:rPr>
-        <w:t xml:space="preserve">Career Counseling Interview</w:t>
-      </w:r>
-      <w:r>
-        <w:t xml:space="preserve"> </w:t>
-      </w:r>
-      <w:r>
-        <w:t xml:space="preserve">di Savickas, un colloquio narrativo finalizzato a esplorare le esperienze, gli interessi, i modelli di riferimento e le aspirazioni dell’utente. Dopo la selezione dello strumento, il sistema avvia il colloquio e propone cinque domande qualitative, alle quali il modello linguistico può far seguire ulteriori richieste di approfondimento. Al termine dell’interazione, Counselorbot elabora una sintesi narrativa orientata alla ricostruzione dell’identità professionale e all’individuazione dei principali temi di vita emersi.</w:t>
-      </w:r>
-    </w:p>
-    <w:p>
-      <w:pPr>
-        <w:pStyle w:val="BodyText"/>
-      </w:pPr>
-      <w:r>
-        <w:t xml:space="preserve">Il secondo strumento aggiuntivo è il modulo di</w:t>
-      </w:r>
-      <w:r>
-        <w:t xml:space="preserve"> </w:t>
-      </w:r>
-      <w:r>
-        <w:rPr>
-          <w:iCs/>
-          <w:i/>
-        </w:rPr>
-        <w:t xml:space="preserve">Question-Based Learning</w:t>
-      </w:r>
-      <w:r>
-        <w:t xml:space="preserve"> </w:t>
-      </w:r>
-      <w:r>
-        <w:t xml:space="preserve">(PQBL), basato sulla metodologia proposta da Jemstedt e Bälter. In questo caso, l’interfaccia richiede il caricamento di un documento didattico in formato PDF. Il sistema ne trasforma il contenuto in un percorso interattivo fondato su domande e feedback. Il testo non viene quindi proposto soltanto come materiale da leggere, ma diventa la base di un’attività di apprendimento attivo, nella quale l’utente è chiamato a recuperare, rielaborare e applicare le informazioni contenute nel documento.</w:t>
-      </w:r>
-    </w:p>
-    <w:p>
-      <w:pPr>
-        <w:pStyle w:val="BodyText"/>
-      </w:pPr>
-      <w:r>
-        <w:t xml:space="preserve">L’architettura modulare di Counselorbot è stata progettata in modo da consentire la futura integrazione di ulteriori questionari, interviste e strumenti di supporto all’orientamento e all’apprendimento.</w:t>
-      </w:r>
-    </w:p>
-    <w:bookmarkEnd w:id="25"/>
-    <w:bookmarkStart w:id="26" w:name="passi-guidati-e-flussi-di-interazione"/>
-    <w:p>
-      <w:pPr>
-        <w:pStyle w:val="Heading3"/>
-      </w:pPr>
-      <w:r>
-        <w:t xml:space="preserve">2.2 Passi guidati e flussi di interazione</w:t>
-      </w:r>
-    </w:p>
-    <w:p>
-      <w:pPr>
-        <w:pStyle w:val="FirstParagraph"/>
-      </w:pPr>
-      <w:r>
-        <w:t xml:space="preserve">Il principio organizzativo centrale di Counselorbot è rappresentato dai passi guidati (</w:t>
-      </w:r>
-      <w:r>
-        <w:rPr>
-          <w:iCs/>
-          <w:i/>
-        </w:rPr>
-        <w:t xml:space="preserve">guided steps</w:t>
-      </w:r>
-      <w:r>
-        <w:t xml:space="preserve">), ossia sequenze predefinite che determinano l’ordine delle diverse fasi del dialogo. A ciascun passo è associato uno specifico meta-prompt, nel quale vengono definiti l’obiettivo della fase, le informazioni da prendere in considerazione e il tipo di risposta che il modello linguistico deve produrre. Questa struttura permette di affrontare sistematicamente tutti gli ambiti previsti dallo strumento selezionato, riducendo il rischio che alcune dimensioni vengano trascurate.</w:t>
-      </w:r>
-    </w:p>
-    <w:p>
-      <w:pPr>
-        <w:pStyle w:val="BodyText"/>
-      </w:pPr>
-      <w:r>
-        <w:t xml:space="preserve">All’interno di ciascun passo, tuttavia, il modello linguistico mantiene la flessibilità necessaria per adattare il linguaggio, gli esempi, le domande e il livello di approfondimento alle risposte dell’utente. Counselorbot realizza così una modalità di interazione ibrida, nella quale il controllo deterministico del percorso si combina con l’adattività conversazionale dell’LLM. L’interfaccia conversazionale presenta progressivamente le domande, le interpretazioni e le strategie associate a ciascun passo. L’utente può chiedere chiarimenti, richiedere esempi o soffermarsi su uno specifico argomento prima di proseguire.</w:t>
-      </w:r>
-    </w:p>
-    <w:p>
-      <w:pPr>
-        <w:pStyle w:val="BodyText"/>
-      </w:pPr>
-      <w:r>
-        <w:t xml:space="preserve">Poiché gli strumenti integrati presentano caratteristiche differenti, il sistema non applica un unico flusso indistinto, ma adotta percorsi specifici per i questionari, per la</w:t>
-      </w:r>
-      <w:r>
-        <w:t xml:space="preserve"> </w:t>
-      </w:r>
-      <w:r>
-        <w:rPr>
-          <w:iCs/>
-          <w:i/>
-        </w:rPr>
-        <w:t xml:space="preserve">Career Counseling Interview</w:t>
-      </w:r>
-      <w:r>
-        <w:t xml:space="preserve"> </w:t>
-      </w:r>
-      <w:r>
-        <w:t xml:space="preserve">e per il</w:t>
-      </w:r>
-      <w:r>
-        <w:t xml:space="preserve"> </w:t>
-      </w:r>
-      <w:r>
-        <w:rPr>
-          <w:iCs/>
-          <w:i/>
-        </w:rPr>
-        <w:t xml:space="preserve">Question-Based Learning</w:t>
-      </w:r>
-      <w:r>
-        <w:t xml:space="preserve">. Nel caso dei questionari QSA, QSAr e ZTPI, il percorso ha inizio con l’inserimento dei punteggi. Il sistema elabora quindi il profilo e ne presenta una prima visualizzazione grafica. Successivamente prende avvio l’analisi guidata dei risultati, durante la quale l’utente può approfondire liberamente ciascun fattore prima di passare al successivo. L’interpretazione dei questionari si sviluppa secondo due modalità complementari. La prima è analitica ed è dedicata all’esame progressivo dei singoli fattori. Per ciascuna dimensione, Counselorbot presenta il risultato, ne chiarisce il significato, formula eventuali domande di approfondimento e propone strategie personalizzate. La seconda modalità è sintetica e mette in relazione le diverse componenti del profilo, facendo emergere le connessioni tra aspetti cognitivi, metacognitivi, affettivi, motivazionali e volitivi. In questo modo, il sistema non si limita a restituire una serie di punteggi isolati, ma favorisce la costruzione di una rappresentazione unitaria del funzionamento dello studente. Al termine dell’analisi, Counselorbot propone una sintesi complessiva dei principali punti di forza, delle aree suscettibili di sviluppo e delle strategie emerse durante il dialogo. L’utente può quindi selezionare e salvare le indicazioni considerate maggiormente significative.</w:t>
-      </w:r>
-    </w:p>
-    <w:p>
-      <w:pPr>
-        <w:pStyle w:val="BodyText"/>
-      </w:pPr>
-      <w:r>
-        <w:t xml:space="preserve">La</w:t>
-      </w:r>
-      <w:r>
-        <w:t xml:space="preserve"> </w:t>
-      </w:r>
-      <w:r>
-        <w:rPr>
-          <w:iCs/>
-          <w:i/>
-        </w:rPr>
-        <w:t xml:space="preserve">Career Counseling Interview</w:t>
-      </w:r>
-      <w:r>
-        <w:t xml:space="preserve"> </w:t>
-      </w:r>
-      <w:r>
-        <w:t xml:space="preserve">segue invece un percorso qualitativo e narrativo. In questo modulo non vengono inseriti punteggi e non viene elaborato un profilo psicometrico. Il sistema presenta progressivamente le cinque domande previste dal protocollo, analizza le risposte dell’utente e può formulare ulteriori domande per approfondire gli elementi più significativi. Pur mantenendo la sequenza generale stabilita, il modello linguistico adatta il dialogo ai contenuti emersi. Al termine dell’intervista, Counselorbot individua i temi ricorrenti e li integra in una sintesi narrativa relativa agli interessi, ai modelli di riferimento, alle aspirazioni e alla costruzione dell’identità professionale.</w:t>
-      </w:r>
-    </w:p>
-    <w:p>
-      <w:pPr>
-        <w:pStyle w:val="BodyText"/>
-      </w:pPr>
-      <w:r>
-        <w:t xml:space="preserve">Il modulo di</w:t>
-      </w:r>
-      <w:r>
-        <w:t xml:space="preserve"> </w:t>
-      </w:r>
-      <w:r>
-        <w:rPr>
-          <w:iCs/>
-          <w:i/>
-        </w:rPr>
-        <w:t xml:space="preserve">Question-Based Learning</w:t>
-      </w:r>
-      <w:r>
-        <w:t xml:space="preserve"> </w:t>
-      </w:r>
-      <w:r>
-        <w:t xml:space="preserve">segue un terzo flusso, specificamente orientato all’apprendimento attivo. Dopo il caricamento del documento in formato PDF, il sistema ne analizza e segmenta il contenuto, genera una sequenza di domande e le presenta progressivamente all’utente. Dopo ciascuna risposta, Counselorbot restituisce un feedback, propone eventuali chiarimenti e può adattare la difficoltà o il livello di approfondimento delle domande successive. Il percorso rimane ancorato ai contenuti del documento e si conclude con una sintesi dell’attività svolta e degli aspetti principali affrontati.</w:t>
-      </w:r>
-    </w:p>
-    <w:bookmarkEnd w:id="26"/>
-    <w:bookmarkStart w:id="27" w:name="infrastruttura-hardware"/>
-    <w:p>
-      <w:pPr>
-        <w:pStyle w:val="Heading3"/>
-      </w:pPr>
-      <w:r>
-        <w:t xml:space="preserve">2.3 Infrastruttura hardware</w:t>
-      </w:r>
-    </w:p>
-    <w:p>
-      <w:pPr>
-        <w:pStyle w:val="FirstParagraph"/>
-      </w:pPr>
-      <w:r>
-        <w:t xml:space="preserve">Counselorbot è eseguito su una workstation ad alte prestazioni, configurata per gestire localmente modelli linguistici e carichi computazionali intensivi. La macchina è dotata di un processore AMD Ryzen Threadripper 7980X con 64 core e 128 thread, di 256 GB di memoria RAM e di una GPU NVIDIA RTX 5090. La realizzazione dell’infrastruttura ha richiesto un investimento iniziale di circa 13.000 euro. La scelta di un’infrastruttura locale risponde innanzitutto all’esigenza di tutelare la riservatezza dei dati, poiché consente di ridurre il trasferimento delle conversazioni e delle informazioni degli utenti verso servizi esterni. Inoltre, permette di mantenere una maggiore indipendenza dai provider commerciali di intelligenza artificiale, evitando che il funzionamento del sistema dipenda esclusivamente dalla disponibilità, dai costi o dalle modifiche delle API esterne. Infine, l’investimento iniziale può contribuire alla sostenibilità economica nel medio e lungo periodo, soprattutto in presenza di un numero elevato di interazioni.</w:t>
-      </w:r>
-    </w:p>
-    <w:bookmarkEnd w:id="27"/>
-    <w:bookmarkStart w:id="31" w:name="software"/>
-    <w:p>
-      <w:pPr>
-        <w:pStyle w:val="Heading3"/>
-      </w:pPr>
-      <w:r>
-        <w:t xml:space="preserve">2.4 Software</w:t>
-      </w:r>
-    </w:p>
-    <w:p>
-      <w:pPr>
-        <w:pStyle w:val="FirstParagraph"/>
-      </w:pPr>
-      <w:r>
-        <w:t xml:space="preserve">Il software di Counselorbot comprende il sistema di gestione dei modelli linguistici, i meccanismi di recupero delle conoscenze e della memoria e le funzioni di registrazione e analisi delle interazioni.</w:t>
-      </w:r>
-    </w:p>
-    <w:bookmarkStart w:id="28" w:name="modelli-linguistici"/>
-    <w:p>
-      <w:pPr>
-        <w:pStyle w:val="Heading4"/>
-      </w:pPr>
-      <w:r>
-        <w:t xml:space="preserve">2.4.1 Modelli linguistici</w:t>
-      </w:r>
-    </w:p>
-    <w:p>
-      <w:pPr>
-        <w:pStyle w:val="FirstParagraph"/>
-      </w:pPr>
-      <w:r>
-        <w:t xml:space="preserve">Per la gestione dei modelli linguistici, Counselorbot utilizza Ollama, uno strumento che consente l’esecuzione locale ed efficiente di modelli open-source. Durante la fase di sviluppo, la scelta si è orientata verso modelli con un numero di parametri inferiore a 15 miliardi, per garantire un equilibrio ottimale tra prestazioni e sostenibilità dell’infrastruttura locale. Sono stati testati modelli appartenenti a diverse famiglie, tra cui Gemma (nelle varianti da 2B, 4B e 12B parametri), DeepSeek-R1-Distill 8B e Qwen 3.5 9B.</w:t>
-      </w:r>
-    </w:p>
-    <w:bookmarkEnd w:id="28"/>
-    <w:bookmarkStart w:id="29" w:name="Xc64cd9a05b3a0c767b472b6f7103b658ac68a3e"/>
-    <w:p>
-      <w:pPr>
-        <w:pStyle w:val="Heading4"/>
-      </w:pPr>
-      <w:r>
-        <w:t xml:space="preserve">2.4.2 Recupero delle conoscenze e gestione della memoria</w:t>
-      </w:r>
-    </w:p>
-    <w:p>
-      <w:pPr>
-        <w:pStyle w:val="FirstParagraph"/>
-      </w:pPr>
-      <w:r>
-        <w:t xml:space="preserve">Counselorbot utilizza diversi meccanismi per recuperare le informazioni rilevanti e mantenere la continuità delle interazioni. Tali meccanismi comprendono la memoria di sessione, la base di conoscenza, il grafo della conoscenza e una memoria condivisa delle risposte. La memoria di sessione conserva le informazioni emerse nel corso della singola conversazione. In questo modo, il sistema può ricordare i risultati, le risposte dell’utente e le strategie già discusse, evitando ripetizioni e garantendo coerenza tra le diverse fasi del percorso. La base di conoscenza contiene strategie educative e contenuti teorici precedentemente selezionati e approvati. Le strategie sono associate ai fattori dei questionari e indicizzate attraverso parole chiave e rappresentazioni semantiche. Quando viene analizzata una determinata dimensione, il sistema recupera automaticamente i contenuti maggiormente pertinenti rispetto al fattore, al punteggio e alle informazioni fornite dallo studente. Le informazioni recuperate vengono inserite nel contesto del modello linguistico e impiegate per generare la risposta. Questa soluzione consente agli amministratori di ampliare o aggiornare la base di conoscenza senza dover intervenire manualmente sui prompt. Il grafo della conoscenza collega tra loro gli strumenti, i fattori, le strategie e i riferimenti teorici. Tale struttura permette di estendere la ricerca documentale anche ai concetti semanticamente vicini, superando una corrispondenza esclusivamente letterale tra i termini utilizzati dall’utente e quelli presenti nei contenuti indicizzati. A questi meccanismi si aggiunge una memoria condivisa delle risposte. Quando un utente valuta positivamente una risposta dell’assistente, questa può essere conservata e utilizzata come riferimento per domande analoghe formulate in sessioni successive. Le risposte precedenti non vengono necessariamente riproposte in forma identica, ma possono essere recuperate come esempi utili alla produzione di nuove risposte. Si introduce così un meccanismo di apprendimento collettivo, nel quale le interazioni considerate efficaci contribuiscono progressivamente al miglioramento del sistema. La memoria condivisa rimane tuttavia distinta dalla base di conoscenza validata: quest’ultima contiene materiali selezionati dagli amministratori, mentre la memoria condivisa deriva dalla valutazione delle risposte generate durante l’utilizzo.</w:t>
-      </w:r>
-    </w:p>
-    <w:bookmarkEnd w:id="29"/>
-    <w:bookmarkStart w:id="30" w:name="X2bc7d88a141625ea69f5b759b49be79527dd3a2"/>
-    <w:p>
-      <w:pPr>
-        <w:pStyle w:val="Heading4"/>
-      </w:pPr>
-      <w:r>
-        <w:t xml:space="preserve">2.4.3 Gestione delle interazioni e anonimizzazione</w:t>
-      </w:r>
-    </w:p>
-    <w:p>
-      <w:pPr>
-        <w:pStyle w:val="FirstParagraph"/>
-      </w:pPr>
-      <w:r>
-        <w:t xml:space="preserve">Le interazioni vengono registrate in un archivio consultabile dagli amministratori. Tale archivio permette di monitorare l’utilizzo del sistema, individuare domande ricorrenti, identificare eventuali difficoltà nei percorsi guidati e rilevare le aree nelle quali le risposte richiedono ulteriori miglioramenti. È inoltre in fase di progettazione un sistema di anonimizzazione che consenta di analizzare i contenuti delle conversazioni senza esporre i dati personali degli studenti. L’obiettivo è rendere possibile lo studio aggregato delle strategie maggiormente discusse, dei fattori percepiti come critici e dell’efficacia attribuita dagli utenti alle risposte del sistema. Questi dati potranno essere utilizzati per valutare l’impatto di Counselorbot, perfezionare i protocolli di interazione e studiare l’impiego del sistema su scala più ampia.</w:t>
-      </w:r>
-    </w:p>
-    <w:bookmarkEnd w:id="30"/>
-    <w:bookmarkEnd w:id="31"/>
-    <w:bookmarkStart w:id="32" w:name="struttura-del-sistema"/>
-    <w:p>
-      <w:pPr>
-        <w:pStyle w:val="Heading3"/>
-      </w:pPr>
-      <w:r>
-        <w:t xml:space="preserve">2.5 Struttura del sistema</w:t>
-      </w:r>
-    </w:p>
-    <w:p>
-      <w:pPr>
-        <w:pStyle w:val="FirstParagraph"/>
-      </w:pPr>
-      <w:r>
-        <w:t xml:space="preserve">L’architettura applicativa di Counselorbot si articola in quattro componenti principali: frontend, backend, database e livello di astrazione dei modelli linguistici. Il frontend costituisce il livello con cui l’utente interagisce direttamente. Comprende il selettore degli strumenti, i moduli per l’inserimento dei risultati, il caricamento dei documenti, la visualizzazione grafica del profilo, l’interfaccia conversazionale, la navigazione tra i passi guidati e le funzioni di salvataggio delle strategie. La sua organizzazione modulare permette di associare a ciascuno strumento una specifica interfaccia, mantenendo al tempo stesso un’esperienza d’uso coerente all’interno della piattaforma. Il backend gestisce la logica applicativa e coordina le differenti componenti del sistema. Esso espone i servizi relativi alla chat, ai questionari, ai passi guidati, alla memoria, alla base di conoscenza e alle funzioni amministrative. Durante l’interazione, il backend individua il passo corrente, seleziona il meta-prompt corrispondente, recupera le informazioni pertinenti e costruisce il contesto da inviare al modello linguistico. Successivamente riceve la risposta generata, la restituisce all’interfaccia e aggiorna la memoria della sessione. Il database relazionale conserva le configurazioni necessarie al funzionamento della piattaforma. Al suo interno sono registrati gli strumenti disponibili, la struttura dei questionari, i fattori, gli item, le scale, le stanine, i prompt, i meta-prompt, i passi guidati, le strategie, le configurazioni dei modelli, la memoria delle sessioni e le interazioni archiviate. Counselorbot non si limita quindi a ricevere punteggi esterni, ma dispone di una rappresentazione strutturata dei questionari e può interpretarli in relazione alle loro caratteristiche. Il livello di astrazione dei modelli linguistici mette infine in comunicazione il backend con i diversi provider di intelligenza artificiale. Attraverso un’interfaccia comune, esso gestisce l’invio dei prompt, la ricezione delle risposte e i parametri di generazione. Questa componente rende Counselorbot indipendente dal singolo modello e consente di utilizzare sia modelli eseguiti localmente mediante Ollama sia eventuali servizi remoti. L’organizzazione complessiva separa dunque i contenuti educativi, la logica dei percorsi, l’interfaccia utente e il modello linguistico. Tale separazione permette di aggiornare ed estendere Counselorbot intervenendo sulle singole componenti, senza dover riprogettare l’intero sistema.</w:t>
-      </w:r>
-    </w:p>
-    <w:bookmarkEnd w:id="32"/>
-    <w:bookmarkEnd w:id="33"/>
-    <w:bookmarkStart w:id="38" w:name="metodologia-di-valutazione"/>
-    <w:p>
-      <w:pPr>
-        <w:pStyle w:val="Heading2"/>
-      </w:pPr>
-      <w:r>
-        <w:t xml:space="preserve">3. Metodologia di valutazione</w:t>
-      </w:r>
-    </w:p>
-    <w:bookmarkStart w:id="34" w:name="disegno-della-ricerca"/>
-    <w:p>
-      <w:pPr>
-        <w:pStyle w:val="Heading3"/>
-      </w:pPr>
-      <w:r>
-        <w:t xml:space="preserve">3.1 Disegno della ricerca</w:t>
-      </w:r>
-    </w:p>
-    <w:p>
-      <w:pPr>
-        <w:pStyle w:val="FirstParagraph"/>
-      </w:pPr>
-      <w:r>
-        <w:t xml:space="preserve">Per valutare il sistema descritto nel § 2 è stato adottato un disegno di ricerca articolato secondo il modello ADDIE (Branch, 2009). L’acronimo identifica cinque fasi iterative:</w:t>
-      </w:r>
-      <w:r>
-        <w:t xml:space="preserve"> </w:t>
-      </w:r>
-      <w:r>
-        <w:rPr>
-          <w:iCs/>
-          <w:i/>
-        </w:rPr>
-        <w:t xml:space="preserve">Analysis</w:t>
-      </w:r>
-      <w:r>
-        <w:t xml:space="preserve">, relativa all’analisi dei bisogni formativi e del contesto;</w:t>
-      </w:r>
-      <w:r>
-        <w:t xml:space="preserve"> </w:t>
-      </w:r>
-      <w:r>
-        <w:rPr>
-          <w:iCs/>
-          <w:i/>
-        </w:rPr>
-        <w:t xml:space="preserve">Design</w:t>
-      </w:r>
-      <w:r>
-        <w:t xml:space="preserve">, dedicata alla progettazione dell’architettura e delle modalità di interazione;</w:t>
-      </w:r>
-      <w:r>
-        <w:t xml:space="preserve"> </w:t>
-      </w:r>
-      <w:r>
-        <w:rPr>
-          <w:iCs/>
-          <w:i/>
-        </w:rPr>
-        <w:t xml:space="preserve">Development</w:t>
-      </w:r>
-      <w:r>
-        <w:t xml:space="preserve">, riguardante la realizzazione del sistema;</w:t>
-      </w:r>
-      <w:r>
-        <w:t xml:space="preserve"> </w:t>
-      </w:r>
-      <w:r>
-        <w:rPr>
-          <w:iCs/>
-          <w:i/>
-        </w:rPr>
-        <w:t xml:space="preserve">Implementation</w:t>
-      </w:r>
-      <w:r>
-        <w:t xml:space="preserve">, riferita al rilascio e all’utilizzo del sistema; ed</w:t>
-      </w:r>
-      <w:r>
-        <w:t xml:space="preserve"> </w:t>
-      </w:r>
-      <w:r>
-        <w:rPr>
-          <w:iCs/>
-          <w:i/>
-        </w:rPr>
-        <w:t xml:space="preserve">Evaluation</w:t>
-      </w:r>
-      <w:r>
-        <w:t xml:space="preserve">, finalizzata alla valutazione del suo funzionamento e dei risultati ottenuti. Il lavoro presentato in questo articolo si colloca nella fase di</w:t>
-      </w:r>
-      <w:r>
-        <w:t xml:space="preserve"> </w:t>
-      </w:r>
-      <w:r>
-        <w:rPr>
-          <w:iCs/>
-          <w:i/>
-        </w:rPr>
-        <w:t xml:space="preserve">Evaluation</w:t>
-      </w:r>
-      <w:r>
-        <w:t xml:space="preserve"> </w:t>
-      </w:r>
-      <w:r>
-        <w:t xml:space="preserve">del secondo ciclo di sviluppo. Il primo ciclo ha portato alla realizzazione di Counselorbot-Chat (CB-C), una versione basata su un’architettura RAG (</w:t>
-      </w:r>
-      <w:r>
-        <w:rPr>
-          <w:iCs/>
-          <w:i/>
-        </w:rPr>
-        <w:t xml:space="preserve">Retrieval-Augmented Generation</w:t>
-      </w:r>
-      <w:r>
-        <w:t xml:space="preserve">) e su un</w:t>
-      </w:r>
-      <w:r>
-        <w:t xml:space="preserve"> </w:t>
-      </w:r>
-      <w:r>
-        <w:rPr>
-          <w:iCs/>
-          <w:i/>
-        </w:rPr>
-        <w:t xml:space="preserve">system prompt</w:t>
-      </w:r>
-      <w:r>
         <w:t xml:space="preserve">. In tale configurazione, il modello linguistico rispondeva alle domande dello studente recuperando le informazioni pertinenti da documenti indicizzati in una memoria vettoriale, senza seguire una sequenza di interazione prestabilita. I risultati del primo ciclo, discussi nel § 4, hanno evidenziato alcune criticità, in particolare nella coerenza delle analisi prodotte e nelle modalità di inserimento manuale dei dati. Tali risultati hanno orientato un successivo processo di ottimizzazione e la progettazione di una nuova versione del sistema. Il secondo ciclo ha quindi condotto allo sviluppo di Step-by-Step Counselorbot (CB-SBS), che introduce una procedura guidata per passi, un grafo della conoscenza, l’indicizzazione semantica delle strategie e un’interfaccia ottimizzata per l’inserimento e la visualizzazione dei profili. La valutazione presentata in questo studio adotta un disegno comparativo</w:t>
       </w:r>
       <w:r>
@@ -1185,12 +1287,16 @@
         <w:pStyle w:val="Heading3"/>
       </w:pPr>
       <w:r>
+        <w:rPr>
+          <w:color w:val="000000"/>
+        </w:rPr>
         <w:t xml:space="preserve">3.2 Partecipanti e procedura</w:t>
       </w:r>
     </w:p>
     <w:p>
       <w:pPr>
         <w:pStyle w:val="FirstParagraph"/>
+        <w:jc w:val="both"/>
       </w:pPr>
       <w:r>
         <w:t xml:space="preserve">Al momento della stesura dell’articolo, la raccolta dei dati è ancora in corso. Hanno completato la procedura 34 partecipanti: 7 hanno utilizzato la versione CB-SBS, mentre 27 hanno interagito con la versione precedente, CB-C. Il campione presenta una composizione eterogenea sia per età, compresa tra 14 e 53 anni, sia per livello di istruzione, che varia dalla scuola secondaria di primo grado alla laurea magistrale. La procedura prevedeva inizialmente la compilazione del Questionario sulle Strategie di Apprendimento (QSA). Successivamente, i partecipanti visualizzavano il proprio profilo e avviavano un’interazione con il chatbot articolata nell’analisi dei singoli fattori del questionario. Al termine del percorso veniva somministrato il questionario di gradimento.</w:t>
@@ -1203,12 +1309,16 @@
         <w:pStyle w:val="Heading3"/>
       </w:pPr>
       <w:r>
+        <w:rPr>
+          <w:color w:val="000000"/>
+        </w:rPr>
         <w:t xml:space="preserve">3.3 Strumenti e metriche</w:t>
       </w:r>
     </w:p>
     <w:p>
       <w:pPr>
         <w:pStyle w:val="FirstParagraph"/>
+        <w:jc w:val="both"/>
       </w:pPr>
       <w:r>
         <w:t xml:space="preserve">Il questionario di gradimento è composto da dieci item relativi ad altrettanti aspetti dell’esperienza di utilizzo: utilità percepita, pertinenza delle risposte, chiarezza delle spiegazioni, adeguatezza del livello di dettaglio, facilità d’uso dell’interfaccia, velocità di risposta, fiducia nelle informazioni ricevute, capacità del sistema di stimolare la riflessione su di sé, coinvolgimento complessivo e intenzione di riutilizzare il chatbot o di raccomandarlo ad altri. Per ciascun item viene calcolata la media aritmetica, separatamente per le due versioni del sistema. Gli item vengono analizzati singolarmente e non sono aggregati in sottoscale. Il questionario raccoglie inoltre informazioni sociodemografiche relative a età, sesso, titolo di studio, tipo di istituto frequentato e provenienza geografica. Nella versione estesa sono presenti anche due domande aperte, finalizzate a raccogliere osservazioni sull’esperienza e suggerimenti per il miglioramento del sistema. Le risposte vengono analizzate qualitativamente mediante una categorizzazione tematica.</w:t>
@@ -1221,12 +1331,16 @@
         <w:pStyle w:val="Heading3"/>
       </w:pPr>
       <w:r>
+        <w:rPr>
+          <w:color w:val="000000"/>
+        </w:rPr>
         <w:t xml:space="preserve">3.4 Selezione e valutazione del modello linguistico locale</w:t>
       </w:r>
     </w:p>
     <w:p>
       <w:pPr>
         <w:pStyle w:val="FirstParagraph"/>
+        <w:jc w:val="both"/>
       </w:pPr>
       <w:r>
         <w:t xml:space="preserve">La selezione del modello linguistico locale è stata articolata in due fasi. In una prima fase sono stati esaminati i risultati pubblicamente disponibili di alcuni benchmark utilizzati per confrontare le prestazioni dei modelli linguistici in compiti di conoscenza generale, ragionamento avanzato e generazione di codice. In particolare, sono stati considerati i risultati ottenuti in MMLU-Pro, GPQA Diamond e LiveCodeBench. L’analisi di tali benchmark ha permesso di individuare i modelli con le prestazioni complessivamente più elevate tra quelli compatibili con i requisiti dell’infrastruttura locale.</w:t>
@@ -1255,7 +1369,7 @@
           <w:p>
             <w:pPr>
               <w:pStyle w:val="Compact"/>
-              <w:jc w:val="left"/>
+              <w:jc w:val="both"/>
             </w:pPr>
             <w:r>
               <w:rPr>
@@ -1271,7 +1385,7 @@
           <w:p>
             <w:pPr>
               <w:pStyle w:val="Compact"/>
-              <w:jc w:val="left"/>
+              <w:jc w:val="both"/>
             </w:pPr>
             <w:r>
               <w:rPr>
@@ -1287,7 +1401,7 @@
           <w:p>
             <w:pPr>
               <w:pStyle w:val="Compact"/>
-              <w:jc w:val="left"/>
+              <w:jc w:val="both"/>
             </w:pPr>
             <w:r>
               <w:rPr>
@@ -1303,7 +1417,7 @@
           <w:p>
             <w:pPr>
               <w:pStyle w:val="Compact"/>
-              <w:jc w:val="left"/>
+              <w:jc w:val="both"/>
             </w:pPr>
             <w:r>
               <w:rPr>
@@ -1319,7 +1433,7 @@
           <w:p>
             <w:pPr>
               <w:pStyle w:val="Compact"/>
-              <w:jc w:val="left"/>
+              <w:jc w:val="both"/>
             </w:pPr>
             <w:r>
               <w:rPr>
@@ -1337,7 +1451,7 @@
           <w:p>
             <w:pPr>
               <w:pStyle w:val="Compact"/>
-              <w:jc w:val="left"/>
+              <w:jc w:val="both"/>
             </w:pPr>
             <w:r>
               <w:t xml:space="preserve">Gemma 4 4B</w:t>
@@ -1349,7 +1463,7 @@
           <w:p>
             <w:pPr>
               <w:pStyle w:val="Compact"/>
-              <w:jc w:val="left"/>
+              <w:jc w:val="both"/>
             </w:pPr>
             <w:r>
               <w:t xml:space="preserve">4B</w:t>
@@ -1361,7 +1475,7 @@
           <w:p>
             <w:pPr>
               <w:pStyle w:val="Compact"/>
-              <w:jc w:val="left"/>
+              <w:jc w:val="both"/>
             </w:pPr>
             <w:r>
               <w:t xml:space="preserve">69,4%</w:t>
@@ -1373,7 +1487,7 @@
           <w:p>
             <w:pPr>
               <w:pStyle w:val="Compact"/>
-              <w:jc w:val="left"/>
+              <w:jc w:val="both"/>
             </w:pPr>
             <w:r>
               <w:t xml:space="preserve">58,6%</w:t>
@@ -1385,7 +1499,7 @@
           <w:p>
             <w:pPr>
               <w:pStyle w:val="Compact"/>
-              <w:jc w:val="left"/>
+              <w:jc w:val="both"/>
             </w:pPr>
             <w:r>
               <w:t xml:space="preserve">52,0%</w:t>
@@ -1399,7 +1513,7 @@
           <w:p>
             <w:pPr>
               <w:pStyle w:val="Compact"/>
-              <w:jc w:val="left"/>
+              <w:jc w:val="both"/>
             </w:pPr>
             <w:r>
               <w:t xml:space="preserve">Gemma 4 2B</w:t>
@@ -1411,7 +1525,7 @@
           <w:p>
             <w:pPr>
               <w:pStyle w:val="Compact"/>
-              <w:jc w:val="left"/>
+              <w:jc w:val="both"/>
             </w:pPr>
             <w:r>
               <w:t xml:space="preserve">2B</w:t>
@@ -1423,7 +1537,7 @@
           <w:p>
             <w:pPr>
               <w:pStyle w:val="Compact"/>
-              <w:jc w:val="left"/>
+              <w:jc w:val="both"/>
             </w:pPr>
             <w:r>
               <w:t xml:space="preserve">60,0%</w:t>
@@ -1435,7 +1549,7 @@
           <w:p>
             <w:pPr>
               <w:pStyle w:val="Compact"/>
-              <w:jc w:val="left"/>
+              <w:jc w:val="both"/>
             </w:pPr>
             <w:r>
               <w:t xml:space="preserve">43,4%</w:t>
@@ -1447,7 +1561,7 @@
           <w:p>
             <w:pPr>
               <w:pStyle w:val="Compact"/>
-              <w:jc w:val="left"/>
+              <w:jc w:val="both"/>
             </w:pPr>
             <w:r>
               <w:t xml:space="preserve">44,0%</w:t>
@@ -1461,7 +1575,7 @@
           <w:p>
             <w:pPr>
               <w:pStyle w:val="Compact"/>
-              <w:jc w:val="left"/>
+              <w:jc w:val="both"/>
             </w:pPr>
             <w:r>
               <w:t xml:space="preserve">Gemma 4 12B</w:t>
@@ -1473,7 +1587,7 @@
           <w:p>
             <w:pPr>
               <w:pStyle w:val="Compact"/>
-              <w:jc w:val="left"/>
+              <w:jc w:val="both"/>
             </w:pPr>
             <w:r>
               <w:t xml:space="preserve">12B</w:t>
@@ -1485,7 +1599,7 @@
           <w:p>
             <w:pPr>
               <w:pStyle w:val="Compact"/>
-              <w:jc w:val="left"/>
+              <w:jc w:val="both"/>
             </w:pPr>
             <w:r>
               <w:t xml:space="preserve">77,2%</w:t>
@@ -1497,7 +1611,7 @@
           <w:p>
             <w:pPr>
               <w:pStyle w:val="Compact"/>
-              <w:jc w:val="left"/>
+              <w:jc w:val="both"/>
             </w:pPr>
             <w:r>
               <w:t xml:space="preserve">78,8%</w:t>
@@ -1509,7 +1623,7 @@
           <w:p>
             <w:pPr>
               <w:pStyle w:val="Compact"/>
-              <w:jc w:val="left"/>
+              <w:jc w:val="both"/>
             </w:pPr>
             <w:r>
               <w:t xml:space="preserve">72,0%</w:t>
@@ -1523,7 +1637,7 @@
           <w:p>
             <w:pPr>
               <w:pStyle w:val="Compact"/>
-              <w:jc w:val="left"/>
+              <w:jc w:val="both"/>
             </w:pPr>
             <w:r>
               <w:t xml:space="preserve">DeepSeek-R1-Distill 8B</w:t>
@@ -1535,7 +1649,7 @@
           <w:p>
             <w:pPr>
               <w:pStyle w:val="Compact"/>
-              <w:jc w:val="left"/>
+              <w:jc w:val="both"/>
             </w:pPr>
             <w:r>
               <w:t xml:space="preserve">8B</w:t>
@@ -1547,7 +1661,7 @@
           <w:p>
             <w:pPr>
               <w:pStyle w:val="Compact"/>
-              <w:jc w:val="left"/>
+              <w:jc w:val="both"/>
             </w:pPr>
             <w:r>
               <w:t xml:space="preserve">—</w:t>
@@ -1559,7 +1673,7 @@
           <w:p>
             <w:pPr>
               <w:pStyle w:val="Compact"/>
-              <w:jc w:val="left"/>
+              <w:jc w:val="both"/>
             </w:pPr>
             <w:r>
               <w:t xml:space="preserve">49,0%</w:t>
@@ -1571,7 +1685,7 @@
           <w:p>
             <w:pPr>
               <w:pStyle w:val="Compact"/>
-              <w:jc w:val="left"/>
+              <w:jc w:val="both"/>
             </w:pPr>
             <w:r>
               <w:t xml:space="preserve">39,6%</w:t>
@@ -1585,7 +1699,7 @@
           <w:p>
             <w:pPr>
               <w:pStyle w:val="Compact"/>
-              <w:jc w:val="left"/>
+              <w:jc w:val="both"/>
             </w:pPr>
             <w:r>
               <w:t xml:space="preserve">Qwen 3.5 9B</w:t>
@@ -1597,7 +1711,7 @@
           <w:p>
             <w:pPr>
               <w:pStyle w:val="Compact"/>
-              <w:jc w:val="left"/>
+              <w:jc w:val="both"/>
             </w:pPr>
             <w:r>
               <w:t xml:space="preserve">9B</w:t>
@@ -1609,7 +1723,7 @@
           <w:p>
             <w:pPr>
               <w:pStyle w:val="Compact"/>
-              <w:jc w:val="left"/>
+              <w:jc w:val="both"/>
             </w:pPr>
             <w:r>
               <w:t xml:space="preserve">82,5%</w:t>
@@ -1621,7 +1735,7 @@
           <w:p>
             <w:pPr>
               <w:pStyle w:val="Compact"/>
-              <w:jc w:val="left"/>
+              <w:jc w:val="both"/>
             </w:pPr>
             <w:r>
               <w:t xml:space="preserve">81,7%</w:t>
@@ -1633,7 +1747,7 @@
           <w:p>
             <w:pPr>
               <w:pStyle w:val="Compact"/>
-              <w:jc w:val="left"/>
+              <w:jc w:val="both"/>
             </w:pPr>
             <w:r>
               <w:t xml:space="preserve">65,6%</w:t>
@@ -1645,6 +1759,7 @@
     <w:p>
       <w:pPr>
         <w:pStyle w:val="BodyText"/>
+        <w:jc w:val="both"/>
       </w:pPr>
       <w:r>
         <w:t xml:space="preserve">La scelta dei modelli candidati non è stata tuttavia determinata esclusivamente dai punteggi ottenuti nei benchmark. Sono stati considerati anche il numero di parametri e la compatibilità con l’hardware disponibile, privilegiando modelli con meno di 15 miliardi di parametri, in grado di garantire un equilibrio tra prestazioni, velocità di esecuzione e sostenibilità computazionale.</w:t>
@@ -1653,6 +1768,7 @@
     <w:p>
       <w:pPr>
         <w:pStyle w:val="BodyText"/>
+        <w:jc w:val="both"/>
       </w:pPr>
       <w:r>
         <w:t xml:space="preserve">Nella seconda fase, i modelli selezionati sulla base dei benchmark sono stati installati e testati direttamente sulla macchina locale descritta nel § 2.3. La valutazione è stata condotta sull’intero flusso degli undici passi previsti per l’analisi del QSA.</w:t>
@@ -1661,6 +1777,7 @@
     <w:p>
       <w:pPr>
         <w:pStyle w:val="BodyText"/>
+        <w:jc w:val="both"/>
       </w:pPr>
       <w:r>
         <w:t xml:space="preserve">Per ciascun modello sono state esaminate la capacità di rispettare la sequenza prestabilita, la copertura di tutti i fattori del questionario, la coerenza delle interpretazioni formulate e la pertinenza pedagogica delle strategie proposte. Sono stati inoltre rilevati due indicatori tecnici: la velocità media di generazione, espressa in token al secondo, e il Time to First Token (TTFT), corrispondente al tempo intercorrente tra l’invio della richiesta e la produzione del primo token della risposta.</w:t>
@@ -1674,6 +1791,9 @@
         <w:pStyle w:val="Heading2"/>
       </w:pPr>
       <w:r>
+        <w:rPr>
+          <w:color w:val="000000"/>
+        </w:rPr>
         <w:t xml:space="preserve">4. Risultati</w:t>
       </w:r>
     </w:p>
@@ -1683,12 +1803,16 @@
         <w:pStyle w:val="Heading3"/>
       </w:pPr>
       <w:r>
+        <w:rPr>
+          <w:color w:val="000000"/>
+        </w:rPr>
         <w:t xml:space="preserve">4.1 Selezione del modello locale</w:t>
       </w:r>
     </w:p>
     <w:p>
       <w:pPr>
         <w:pStyle w:val="FirstParagraph"/>
+        <w:jc w:val="both"/>
       </w:pPr>
       <w:r>
         <w:t xml:space="preserve">I modelli pre-selezionati in base ai benchmark pubblici (§3.4) sono stati sottoposti a una valutazione diretta sulla macchina locale (§2.3), riproducendo l’intero flusso degli undici passi dell’analisi del QSA con gli stessi</w:t>
@@ -1749,7 +1873,7 @@
           <w:p>
             <w:pPr>
               <w:pStyle w:val="Compact"/>
-              <w:jc w:val="left"/>
+              <w:jc w:val="both"/>
             </w:pPr>
             <w:r>
               <w:t xml:space="preserve">Modello</w:t>
@@ -1761,7 +1885,7 @@
           <w:p>
             <w:pPr>
               <w:pStyle w:val="Compact"/>
-              <w:jc w:val="left"/>
+              <w:jc w:val="both"/>
             </w:pPr>
             <w:r>
               <w:t xml:space="preserve">Parametri</w:t>
@@ -1773,7 +1897,7 @@
           <w:p>
             <w:pPr>
               <w:pStyle w:val="Compact"/>
-              <w:jc w:val="left"/>
+              <w:jc w:val="both"/>
             </w:pPr>
             <w:r>
               <w:t xml:space="preserve">Qualità</w:t>
@@ -1785,7 +1909,7 @@
           <w:p>
             <w:pPr>
               <w:pStyle w:val="Compact"/>
-              <w:jc w:val="left"/>
+              <w:jc w:val="both"/>
             </w:pPr>
             <w:r>
               <w:t xml:space="preserve">Token/s</w:t>
@@ -1797,7 +1921,7 @@
           <w:p>
             <w:pPr>
               <w:pStyle w:val="Compact"/>
-              <w:jc w:val="left"/>
+              <w:jc w:val="both"/>
             </w:pPr>
             <w:r>
               <w:t xml:space="preserve">TTFT</w:t>
@@ -1811,7 +1935,7 @@
           <w:p>
             <w:pPr>
               <w:pStyle w:val="Compact"/>
-              <w:jc w:val="left"/>
+              <w:jc w:val="both"/>
             </w:pPr>
             <w:r>
               <w:t xml:space="preserve">Gemma 4 4B</w:t>
@@ -1823,7 +1947,7 @@
           <w:p>
             <w:pPr>
               <w:pStyle w:val="Compact"/>
-              <w:jc w:val="left"/>
+              <w:jc w:val="both"/>
             </w:pPr>
             <w:r>
               <w:t xml:space="preserve">4B</w:t>
@@ -1835,7 +1959,7 @@
           <w:p>
             <w:pPr>
               <w:pStyle w:val="Compact"/>
-              <w:jc w:val="left"/>
+              <w:jc w:val="both"/>
             </w:pPr>
             <w:r>
               <w:t xml:space="preserve">0,83</w:t>
@@ -1847,7 +1971,7 @@
           <w:p>
             <w:pPr>
               <w:pStyle w:val="Compact"/>
-              <w:jc w:val="left"/>
+              <w:jc w:val="both"/>
             </w:pPr>
             <w:r>
               <w:t xml:space="preserve">472</w:t>
@@ -1859,7 +1983,7 @@
           <w:p>
             <w:pPr>
               <w:pStyle w:val="Compact"/>
-              <w:jc w:val="left"/>
+              <w:jc w:val="both"/>
             </w:pPr>
             <w:r>
               <w:t xml:space="preserve">4,5 s</w:t>
@@ -1873,7 +1997,7 @@
           <w:p>
             <w:pPr>
               <w:pStyle w:val="Compact"/>
-              <w:jc w:val="left"/>
+              <w:jc w:val="both"/>
             </w:pPr>
             <w:r>
               <w:t xml:space="preserve">Gemma 4 2B</w:t>
@@ -1885,7 +2009,7 @@
           <w:p>
             <w:pPr>
               <w:pStyle w:val="Compact"/>
-              <w:jc w:val="left"/>
+              <w:jc w:val="both"/>
             </w:pPr>
             <w:r>
               <w:t xml:space="preserve">2B</w:t>
@@ -1897,7 +2021,7 @@
           <w:p>
             <w:pPr>
               <w:pStyle w:val="Compact"/>
-              <w:jc w:val="left"/>
+              <w:jc w:val="both"/>
             </w:pPr>
             <w:r>
               <w:t xml:space="preserve">0,76</w:t>
@@ -1909,7 +2033,7 @@
           <w:p>
             <w:pPr>
               <w:pStyle w:val="Compact"/>
-              <w:jc w:val="left"/>
+              <w:jc w:val="both"/>
             </w:pPr>
             <w:r>
               <w:t xml:space="preserve">768</w:t>
@@ -1921,7 +2045,7 @@
           <w:p>
             <w:pPr>
               <w:pStyle w:val="Compact"/>
-              <w:jc w:val="left"/>
+              <w:jc w:val="both"/>
             </w:pPr>
             <w:r>
               <w:t xml:space="preserve">3,4 s</w:t>
@@ -1935,7 +2059,7 @@
           <w:p>
             <w:pPr>
               <w:pStyle w:val="Compact"/>
-              <w:jc w:val="left"/>
+              <w:jc w:val="both"/>
             </w:pPr>
             <w:r>
               <w:t xml:space="preserve">Gemma 4 12B</w:t>
@@ -1947,7 +2071,7 @@
           <w:p>
             <w:pPr>
               <w:pStyle w:val="Compact"/>
-              <w:jc w:val="left"/>
+              <w:jc w:val="both"/>
             </w:pPr>
             <w:r>
               <w:t xml:space="preserve">12B</w:t>
@@ -1959,7 +2083,7 @@
           <w:p>
             <w:pPr>
               <w:pStyle w:val="Compact"/>
-              <w:jc w:val="left"/>
+              <w:jc w:val="both"/>
             </w:pPr>
             <w:r>
               <w:t xml:space="preserve">0,74</w:t>
@@ -1971,7 +2095,7 @@
           <w:p>
             <w:pPr>
               <w:pStyle w:val="Compact"/>
-              <w:jc w:val="left"/>
+              <w:jc w:val="both"/>
             </w:pPr>
             <w:r>
               <w:t xml:space="preserve">374</w:t>
@@ -1983,7 +2107,7 @@
           <w:p>
             <w:pPr>
               <w:pStyle w:val="Compact"/>
-              <w:jc w:val="left"/>
+              <w:jc w:val="both"/>
             </w:pPr>
             <w:r>
               <w:t xml:space="preserve">12,3 s</w:t>
@@ -1997,7 +2121,7 @@
           <w:p>
             <w:pPr>
               <w:pStyle w:val="Compact"/>
-              <w:jc w:val="left"/>
+              <w:jc w:val="both"/>
             </w:pPr>
             <w:r>
               <w:t xml:space="preserve">DeepSeek-R1-Distill 8B</w:t>
@@ -2009,7 +2133,7 @@
           <w:p>
             <w:pPr>
               <w:pStyle w:val="Compact"/>
-              <w:jc w:val="left"/>
+              <w:jc w:val="both"/>
             </w:pPr>
             <w:r>
               <w:t xml:space="preserve">8B</w:t>
@@ -2021,7 +2145,7 @@
           <w:p>
             <w:pPr>
               <w:pStyle w:val="Compact"/>
-              <w:jc w:val="left"/>
+              <w:jc w:val="both"/>
             </w:pPr>
             <w:r>
               <w:t xml:space="preserve">0,62</w:t>
@@ -2033,7 +2157,7 @@
           <w:p>
             <w:pPr>
               <w:pStyle w:val="Compact"/>
-              <w:jc w:val="left"/>
+              <w:jc w:val="both"/>
             </w:pPr>
             <w:r>
               <w:t xml:space="preserve">555</w:t>
@@ -2045,7 +2169,7 @@
           <w:p>
             <w:pPr>
               <w:pStyle w:val="Compact"/>
-              <w:jc w:val="left"/>
+              <w:jc w:val="both"/>
             </w:pPr>
             <w:r>
               <w:t xml:space="preserve">7,9 s</w:t>
@@ -2059,7 +2183,7 @@
           <w:p>
             <w:pPr>
               <w:pStyle w:val="Compact"/>
-              <w:jc w:val="left"/>
+              <w:jc w:val="both"/>
             </w:pPr>
             <w:r>
               <w:t xml:space="preserve">Qwen 3.5 9B</w:t>
@@ -2071,7 +2195,7 @@
           <w:p>
             <w:pPr>
               <w:pStyle w:val="Compact"/>
-              <w:jc w:val="left"/>
+              <w:jc w:val="both"/>
             </w:pPr>
             <w:r>
               <w:t xml:space="preserve">9B</w:t>
@@ -2083,7 +2207,7 @@
           <w:p>
             <w:pPr>
               <w:pStyle w:val="Compact"/>
-              <w:jc w:val="left"/>
+              <w:jc w:val="both"/>
             </w:pPr>
             <w:r>
               <w:t xml:space="preserve">0,45</w:t>
@@ -2095,7 +2219,7 @@
           <w:p>
             <w:pPr>
               <w:pStyle w:val="Compact"/>
-              <w:jc w:val="left"/>
+              <w:jc w:val="both"/>
             </w:pPr>
             <w:r>
               <w:t xml:space="preserve">186</w:t>
@@ -2107,7 +2231,7 @@
           <w:p>
             <w:pPr>
               <w:pStyle w:val="Compact"/>
-              <w:jc w:val="left"/>
+              <w:jc w:val="both"/>
             </w:pPr>
             <w:r>
               <w:t xml:space="preserve">11,3 s</w:t>
@@ -2119,6 +2243,7 @@
     <w:p>
       <w:pPr>
         <w:pStyle w:val="BodyText"/>
+        <w:jc w:val="both"/>
       </w:pPr>
       <w:r>
         <w:t xml:space="preserve">Tutti i modelli hanno mantenuto piena affidabilità di connessione lungo l’intero flusso. Gemma 4 4B ha ottenuto la qualità più alta (0,83), rispettando la sequenza prestabilita e fornendo interpretazioni coerenti con i punteggi in nove degli undici passi, a fronte di una velocità di generazione (472 token/s) e di un TTFT (4,5 s) adeguati all’uso interattivo. Gemma 4 12B, pur completo nella profondità d’analisi, ha registrato un TTFT sensibilmente superiore (12,3 s); DeepSeek-R1-Distill 8B ha alternato risposte eccellenti e scadenti a seconda del passo, mentre Qwen 3.5 9B ha riportato la qualità più bassa (0,45) nonostante il maggior numero di parametri. Sulla base di questo equilibrio tra qualità, velocità e sostenibilità computazionale, Gemma 4 4B è stato selezionato per l’istanza CB-SBS.</w:t>
@@ -2131,12 +2256,16 @@
         <w:pStyle w:val="Heading3"/>
       </w:pPr>
       <w:r>
+        <w:rPr>
+          <w:color w:val="000000"/>
+        </w:rPr>
         <w:t xml:space="preserve">4.2 Esperienza utente</w:t>
       </w:r>
     </w:p>
     <w:p>
       <w:pPr>
         <w:pStyle w:val="FirstParagraph"/>
+        <w:jc w:val="both"/>
       </w:pPr>
       <w:r>
         <w:t xml:space="preserve">La versione CB-SBS presenta valutazioni tendenzialmente superiori alla precedente in 9 dimensioni su 10. Dei 27 partecipanti della versione CB-C, 16 hanno fornito valutazioni numeriche e 11 solo commenti aperti; per CB-SBS è stato escluso un record di test, portando il numeratore a 6. La tabella seguente confronta le medie delle due versioni.</w:t>
@@ -2164,7 +2293,7 @@
           <w:p>
             <w:pPr>
               <w:pStyle w:val="Compact"/>
-              <w:jc w:val="left"/>
+              <w:jc w:val="both"/>
             </w:pPr>
             <w:r>
               <w:t xml:space="preserve">Dimensione</w:t>
@@ -2176,7 +2305,7 @@
           <w:p>
             <w:pPr>
               <w:pStyle w:val="Compact"/>
-              <w:jc w:val="left"/>
+              <w:jc w:val="both"/>
             </w:pPr>
             <w:r>
               <w:t xml:space="preserve">CB-SBS (n=6)</w:t>
@@ -2188,7 +2317,7 @@
           <w:p>
             <w:pPr>
               <w:pStyle w:val="Compact"/>
-              <w:jc w:val="left"/>
+              <w:jc w:val="both"/>
             </w:pPr>
             <w:r>
               <w:t xml:space="preserve">CB-C (n=16)</w:t>
@@ -2200,7 +2329,7 @@
           <w:p>
             <w:pPr>
               <w:pStyle w:val="Compact"/>
-              <w:jc w:val="left"/>
+              <w:jc w:val="both"/>
             </w:pPr>
             <w:r>
               <w:t xml:space="preserve">Δ</w:t>
@@ -2214,7 +2343,7 @@
           <w:p>
             <w:pPr>
               <w:pStyle w:val="Compact"/>
-              <w:jc w:val="left"/>
+              <w:jc w:val="both"/>
             </w:pPr>
             <w:r>
               <w:t xml:space="preserve">Facilità d’uso</w:t>
@@ -2226,7 +2355,7 @@
           <w:p>
             <w:pPr>
               <w:pStyle w:val="Compact"/>
-              <w:jc w:val="left"/>
+              <w:jc w:val="both"/>
             </w:pPr>
             <w:r>
               <w:t xml:space="preserve">4,17</w:t>
@@ -2238,7 +2367,7 @@
           <w:p>
             <w:pPr>
               <w:pStyle w:val="Compact"/>
-              <w:jc w:val="left"/>
+              <w:jc w:val="both"/>
             </w:pPr>
             <w:r>
               <w:t xml:space="preserve">3,38</w:t>
@@ -2250,7 +2379,7 @@
           <w:p>
             <w:pPr>
               <w:pStyle w:val="Compact"/>
-              <w:jc w:val="left"/>
+              <w:jc w:val="both"/>
             </w:pPr>
             <w:r>
               <w:t xml:space="preserve">+0,79</w:t>
@@ -2264,7 +2393,7 @@
           <w:p>
             <w:pPr>
               <w:pStyle w:val="Compact"/>
-              <w:jc w:val="left"/>
+              <w:jc w:val="both"/>
             </w:pPr>
             <w:r>
               <w:t xml:space="preserve">Pertinenza delle risposte</w:t>
@@ -2276,7 +2405,7 @@
           <w:p>
             <w:pPr>
               <w:pStyle w:val="Compact"/>
-              <w:jc w:val="left"/>
+              <w:jc w:val="both"/>
             </w:pPr>
             <w:r>
               <w:t xml:space="preserve">4,17</w:t>
@@ -2288,7 +2417,7 @@
           <w:p>
             <w:pPr>
               <w:pStyle w:val="Compact"/>
-              <w:jc w:val="left"/>
+              <w:jc w:val="both"/>
             </w:pPr>
             <w:r>
               <w:t xml:space="preserve">3,56</w:t>
@@ -2300,7 +2429,7 @@
           <w:p>
             <w:pPr>
               <w:pStyle w:val="Compact"/>
-              <w:jc w:val="left"/>
+              <w:jc w:val="both"/>
             </w:pPr>
             <w:r>
               <w:t xml:space="preserve">+0,60</w:t>
@@ -2314,7 +2443,7 @@
           <w:p>
             <w:pPr>
               <w:pStyle w:val="Compact"/>
-              <w:jc w:val="left"/>
+              <w:jc w:val="both"/>
             </w:pPr>
             <w:r>
               <w:t xml:space="preserve">Fiducia nelle informazioni</w:t>
@@ -2326,7 +2455,7 @@
           <w:p>
             <w:pPr>
               <w:pStyle w:val="Compact"/>
-              <w:jc w:val="left"/>
+              <w:jc w:val="both"/>
             </w:pPr>
             <w:r>
               <w:t xml:space="preserve">3,83</w:t>
@@ -2338,7 +2467,7 @@
           <w:p>
             <w:pPr>
               <w:pStyle w:val="Compact"/>
-              <w:jc w:val="left"/>
+              <w:jc w:val="both"/>
             </w:pPr>
             <w:r>
               <w:t xml:space="preserve">3,19</w:t>
@@ -2350,7 +2479,7 @@
           <w:p>
             <w:pPr>
               <w:pStyle w:val="Compact"/>
-              <w:jc w:val="left"/>
+              <w:jc w:val="both"/>
             </w:pPr>
             <w:r>
               <w:t xml:space="preserve">+0,65</w:t>
@@ -2364,7 +2493,7 @@
           <w:p>
             <w:pPr>
               <w:pStyle w:val="Compact"/>
-              <w:jc w:val="left"/>
+              <w:jc w:val="both"/>
             </w:pPr>
             <w:r>
               <w:t xml:space="preserve">Coinvolgimento</w:t>
@@ -2376,7 +2505,7 @@
           <w:p>
             <w:pPr>
               <w:pStyle w:val="Compact"/>
-              <w:jc w:val="left"/>
+              <w:jc w:val="both"/>
             </w:pPr>
             <w:r>
               <w:t xml:space="preserve">3,67</w:t>
@@ -2388,7 +2517,7 @@
           <w:p>
             <w:pPr>
               <w:pStyle w:val="Compact"/>
-              <w:jc w:val="left"/>
+              <w:jc w:val="both"/>
             </w:pPr>
             <w:r>
               <w:t xml:space="preserve">3,06</w:t>
@@ -2400,7 +2529,7 @@
           <w:p>
             <w:pPr>
               <w:pStyle w:val="Compact"/>
-              <w:jc w:val="left"/>
+              <w:jc w:val="both"/>
             </w:pPr>
             <w:r>
               <w:t xml:space="preserve">+0,60</w:t>
@@ -2414,7 +2543,7 @@
           <w:p>
             <w:pPr>
               <w:pStyle w:val="Compact"/>
-              <w:jc w:val="left"/>
+              <w:jc w:val="both"/>
             </w:pPr>
             <w:r>
               <w:t xml:space="preserve">Capacità di stimolare la riflessione</w:t>
@@ -2426,7 +2555,7 @@
           <w:p>
             <w:pPr>
               <w:pStyle w:val="Compact"/>
-              <w:jc w:val="left"/>
+              <w:jc w:val="both"/>
             </w:pPr>
             <w:r>
               <w:t xml:space="preserve">3,83</w:t>
@@ -2438,7 +2567,7 @@
           <w:p>
             <w:pPr>
               <w:pStyle w:val="Compact"/>
-              <w:jc w:val="left"/>
+              <w:jc w:val="both"/>
             </w:pPr>
             <w:r>
               <w:t xml:space="preserve">3,25</w:t>
@@ -2450,7 +2579,7 @@
           <w:p>
             <w:pPr>
               <w:pStyle w:val="Compact"/>
-              <w:jc w:val="left"/>
+              <w:jc w:val="both"/>
             </w:pPr>
             <w:r>
               <w:t xml:space="preserve">+0,58</w:t>
@@ -2464,7 +2593,7 @@
           <w:p>
             <w:pPr>
               <w:pStyle w:val="Compact"/>
-              <w:jc w:val="left"/>
+              <w:jc w:val="both"/>
             </w:pPr>
             <w:r>
               <w:t xml:space="preserve">Chiarezza</w:t>
@@ -2476,7 +2605,7 @@
           <w:p>
             <w:pPr>
               <w:pStyle w:val="Compact"/>
-              <w:jc w:val="left"/>
+              <w:jc w:val="both"/>
             </w:pPr>
             <w:r>
               <w:t xml:space="preserve">4,00</w:t>
@@ -2488,7 +2617,7 @@
           <w:p>
             <w:pPr>
               <w:pStyle w:val="Compact"/>
-              <w:jc w:val="left"/>
+              <w:jc w:val="both"/>
             </w:pPr>
             <w:r>
               <w:t xml:space="preserve">3,69</w:t>
@@ -2500,7 +2629,7 @@
           <w:p>
             <w:pPr>
               <w:pStyle w:val="Compact"/>
-              <w:jc w:val="left"/>
+              <w:jc w:val="both"/>
             </w:pPr>
             <w:r>
               <w:t xml:space="preserve">+0,31</w:t>
@@ -2514,7 +2643,7 @@
           <w:p>
             <w:pPr>
               <w:pStyle w:val="Compact"/>
-              <w:jc w:val="left"/>
+              <w:jc w:val="both"/>
             </w:pPr>
             <w:r>
               <w:t xml:space="preserve">Velocità di risposta</w:t>
@@ -2526,7 +2655,7 @@
           <w:p>
             <w:pPr>
               <w:pStyle w:val="Compact"/>
-              <w:jc w:val="left"/>
+              <w:jc w:val="both"/>
             </w:pPr>
             <w:r>
               <w:t xml:space="preserve">3,83</w:t>
@@ -2538,7 +2667,7 @@
           <w:p>
             <w:pPr>
               <w:pStyle w:val="Compact"/>
-              <w:jc w:val="left"/>
+              <w:jc w:val="both"/>
             </w:pPr>
             <w:r>
               <w:t xml:space="preserve">3,44</w:t>
@@ -2550,7 +2679,7 @@
           <w:p>
             <w:pPr>
               <w:pStyle w:val="Compact"/>
-              <w:jc w:val="left"/>
+              <w:jc w:val="both"/>
             </w:pPr>
             <w:r>
               <w:t xml:space="preserve">+0,40</w:t>
@@ -2564,7 +2693,7 @@
           <w:p>
             <w:pPr>
               <w:pStyle w:val="Compact"/>
-              <w:jc w:val="left"/>
+              <w:jc w:val="both"/>
             </w:pPr>
             <w:r>
               <w:t xml:space="preserve">Dettaglio delle risposte</w:t>
@@ -2576,7 +2705,7 @@
           <w:p>
             <w:pPr>
               <w:pStyle w:val="Compact"/>
-              <w:jc w:val="left"/>
+              <w:jc w:val="both"/>
             </w:pPr>
             <w:r>
               <w:t xml:space="preserve">3,67</w:t>
@@ -2588,7 +2717,7 @@
           <w:p>
             <w:pPr>
               <w:pStyle w:val="Compact"/>
-              <w:jc w:val="left"/>
+              <w:jc w:val="both"/>
             </w:pPr>
             <w:r>
               <w:t xml:space="preserve">3,56</w:t>
@@ -2600,7 +2729,7 @@
           <w:p>
             <w:pPr>
               <w:pStyle w:val="Compact"/>
-              <w:jc w:val="left"/>
+              <w:jc w:val="both"/>
             </w:pPr>
             <w:r>
               <w:t xml:space="preserve">+0,10</w:t>
@@ -2614,7 +2743,7 @@
           <w:p>
             <w:pPr>
               <w:pStyle w:val="Compact"/>
-              <w:jc w:val="left"/>
+              <w:jc w:val="both"/>
             </w:pPr>
             <w:r>
               <w:t xml:space="preserve">Utilità percepita</w:t>
@@ -2626,7 +2755,7 @@
           <w:p>
             <w:pPr>
               <w:pStyle w:val="Compact"/>
-              <w:jc w:val="left"/>
+              <w:jc w:val="both"/>
             </w:pPr>
             <w:r>
               <w:t xml:space="preserve">3,17</w:t>
@@ -2638,7 +2767,7 @@
           <w:p>
             <w:pPr>
               <w:pStyle w:val="Compact"/>
-              <w:jc w:val="left"/>
+              <w:jc w:val="both"/>
             </w:pPr>
             <w:r>
               <w:t xml:space="preserve">3,31</w:t>
@@ -2650,7 +2779,7 @@
           <w:p>
             <w:pPr>
               <w:pStyle w:val="Compact"/>
-              <w:jc w:val="left"/>
+              <w:jc w:val="both"/>
             </w:pPr>
             <w:r>
               <w:t xml:space="preserve">−0,15</w:t>
@@ -2664,7 +2793,7 @@
           <w:p>
             <w:pPr>
               <w:pStyle w:val="Compact"/>
-              <w:jc w:val="left"/>
+              <w:jc w:val="both"/>
             </w:pPr>
             <w:r>
               <w:t xml:space="preserve">Intenzione di riutilizzo</w:t>
@@ -2676,7 +2805,7 @@
           <w:p>
             <w:pPr>
               <w:pStyle w:val="Compact"/>
-              <w:jc w:val="left"/>
+              <w:jc w:val="both"/>
             </w:pPr>
             <w:r>
               <w:t xml:space="preserve">3,83</w:t>
@@ -2688,7 +2817,7 @@
           <w:p>
             <w:pPr>
               <w:pStyle w:val="Compact"/>
-              <w:jc w:val="left"/>
+              <w:jc w:val="both"/>
             </w:pPr>
             <w:r>
               <w:t xml:space="preserve">3,12</w:t>
@@ -2700,7 +2829,7 @@
           <w:p>
             <w:pPr>
               <w:pStyle w:val="Compact"/>
-              <w:jc w:val="left"/>
+              <w:jc w:val="both"/>
             </w:pPr>
             <w:r>
               <w:t xml:space="preserve">+0,71</w:t>
@@ -2712,6 +2841,7 @@
     <w:p>
       <w:pPr>
         <w:pStyle w:val="BodyText"/>
+        <w:jc w:val="both"/>
       </w:pPr>
       <w:r>
         <w:t xml:space="preserve">I miglioramenti più marcati riguardano facilità d’uso (Δ = +0,79), intenzione di riutilizzo (Δ = +0,71) e fiducia (Δ = +0,65); l’unica dimensione sostanzialmente invariata è l’utilità percepita (Δ = −0,15, entro il range di variabilità atteso per campioni ridotti).</w:t>
@@ -2724,12 +2854,16 @@
         <w:pStyle w:val="Heading3"/>
       </w:pPr>
       <w:r>
+        <w:rPr>
+          <w:color w:val="000000"/>
+        </w:rPr>
         <w:t xml:space="preserve">4.3 Risposte aperte</w:t>
       </w:r>
     </w:p>
     <w:p>
       <w:pPr>
         <w:pStyle w:val="FirstParagraph"/>
+        <w:jc w:val="both"/>
       </w:pPr>
       <w:r>
         <w:t xml:space="preserve">Undici partecipanti hanno fornito risposte alle domande aperte (tutti della versione CB-C). Dall’analisi tematica emergono quattro aree di criticità, affrontate nella versione CB-SBS.</w:t>
@@ -2738,6 +2872,7 @@
     <w:p>
       <w:pPr>
         <w:pStyle w:val="BodyText"/>
+        <w:jc w:val="both"/>
       </w:pPr>
       <w:r>
         <w:t xml:space="preserve">Inserimento dati. (i) Tre partecipanti segnalano difficoltà nel caricamento dei punteggi: «mi ha chiesto di fare una cosa che avevo appena fatto», «inserirli 1 per 1 in chat è stato scomodo», con la richiesta esplicita di poter caricare un PDF per evitare errori di digitazione. Nella versione CB-SBS questa fase è stata sostituita da un form iniziale di inserimento e dal caricamento diretto dei PDF degli esiti.</w:t>
@@ -2746,6 +2881,7 @@
     <w:p>
       <w:pPr>
         <w:pStyle w:val="BodyText"/>
+        <w:jc w:val="both"/>
       </w:pPr>
       <w:r>
         <w:t xml:space="preserve">Coerenza della memoria di sessione. (ii) Un partecipante riporta «incongruenze molto grandi tra i dati forniti e i riassunti finali» nella prima analisi, pur riconoscendo che una seconda analisi era più coerente. Nella versione CB-SBS la gestione della memoria di sessione è stata rivista attraverso una sintesi dinamica del dialogo, integrata dall’iniezione costante dei punteggi del profilo tramite file JSON a ogni turno, garantendo che il contesto venga preservato fedelmente lungo l’intero percorso.</w:t>
@@ -2754,6 +2890,7 @@
     <w:p>
       <w:pPr>
         <w:pStyle w:val="BodyText"/>
+        <w:jc w:val="both"/>
       </w:pPr>
       <w:r>
         <w:t xml:space="preserve">Completezza del contesto. (iii) Un partecipante osserva che il</w:t>
@@ -2791,6 +2928,7 @@
     <w:p>
       <w:pPr>
         <w:pStyle w:val="BodyText"/>
+        <w:jc w:val="both"/>
       </w:pPr>
       <w:r>
         <w:t xml:space="preserve">Lunghezza delle risposte. (iv) Un partecipante suggerisce di «sintetizzare le risposte». Nella versione CB-SBS è stato introdotto un limite di token per contenere l’estensione degli interventi del LLM, favorendo risposte più concise.</w:t>
@@ -2799,6 +2937,7 @@
     <w:p>
       <w:pPr>
         <w:pStyle w:val="BodyText"/>
+        <w:jc w:val="both"/>
       </w:pPr>
       <w:r>
         <w:t xml:space="preserve">La scelta di un modello locale di dimensioni contenute, motivata in §2.3, si colloca nello stesso quadro di ottimizzazione: il benchmark preliminare ha orientato la selezione di una soluzione ritenuta adeguata al compito, sostenibile nei costi e più favorevole alla tutela della riservatezza.</w:t>
@@ -2807,6 +2946,7 @@
     <w:p>
       <w:pPr>
         <w:pStyle w:val="BodyText"/>
+        <w:jc w:val="both"/>
       </w:pPr>
       <w:r>
         <w:t xml:space="preserve">Sei partecipanti hanno espresso valutazioni positive sulla chiarezza, la pertinenza e l’utilità del sistema, descrivendo l’esperienza come «positiva», «interessante» e «il</w:t>
@@ -2836,12 +2976,16 @@
         <w:pStyle w:val="Heading2"/>
       </w:pPr>
       <w:r>
+        <w:rPr>
+          <w:color w:val="000000"/>
+        </w:rPr>
         <w:t xml:space="preserve">5. Discussione</w:t>
       </w:r>
     </w:p>
     <w:p>
       <w:pPr>
         <w:pStyle w:val="FirstParagraph"/>
+        <w:jc w:val="both"/>
       </w:pPr>
       <w:r>
         <w:t xml:space="preserve">Alla luce di questi risultati, si possono formulare le seguenti considerazioni. I risultati mostrano un miglioramento diffuso della versione CB-SBS rispetto alla precedente su 9 dimensioni su 10, con incrementi particolarmente marcati su facilità d’uso (Δ = +0,79), fiducia nelle informazioni (Δ = +0,65) e intenzione di riutilizzo (Δ = +0,71). Questi dati suggeriscono che le modifiche introdotte nella versione CB-SBS (cfr. §4) hanno prodotto un effetto positivo sull’esperienza utente.</w:t>
@@ -2850,6 +2994,7 @@
     <w:p>
       <w:pPr>
         <w:pStyle w:val="BodyText"/>
+        <w:jc w:val="both"/>
       </w:pPr>
       <w:r>
         <w:t xml:space="preserve">Le criticità emerse dalle risposte aperte della versione CB-C riguardavano principalmente l’inserimento manuale dei dati e la coerenza delle analisi. La loro risoluzione nella versione CB-SBS è coerente con i punteggi più alti registrati in facilità d’uso e fiducia. Rimane da verificare su un campione più ampio se anche le altre dimensioni — in particolare l’utilità percepita, sostanzialmente invariata — beneficino delle stesse modifiche.</w:t>
@@ -2858,6 +3003,7 @@
     <w:p>
       <w:pPr>
         <w:pStyle w:val="BodyText"/>
+        <w:jc w:val="both"/>
       </w:pPr>
       <w:r>
         <w:t xml:space="preserve">Il presente lavoro si colloca nella fase di test del modello ADDIE: i dati raccolti informano il ciclo iterativo di sviluppo, più che costituire una validazione conclusiva. Il campione è ridotto (n=6 per CB-SBS, n=16 per CB-C con dati numerici) e non probabilistico, e la differenza tra le due versioni potrebbe risentire di fattori confondenti come la diversa composizione demografica o la maturità del percorso di sviluppo. Per queste ragioni i risultati vanno letti come indicatori di tendenza, non come evidenza definitiva.</w:t>
@@ -2866,6 +3012,7 @@
     <w:p>
       <w:pPr>
         <w:pStyle w:val="BodyText"/>
+        <w:jc w:val="both"/>
       </w:pPr>
       <w:r>
         <w:t xml:space="preserve">Sul piano più generale, l’architettura ibrida di Counselorbot — che combina passi guidati deterministici con la flessibilità di un LLM — si dimostra praticabile per l’autovalutazione assistita delle competenze strategiche. La possibilità di istruire il modello con direttive specifiche e di richiamare conoscenze contestuali apre la strada a forme di accompagnamento scalabili che la letteratura indica come ancora poco coperte (Wollny et al. 2021; Liu et al. 2025). Quanto alla sostenibilità economica sollevata in apertura, l’impiego di modelli aperti di dimensioni contenute, eseguibili anche su infrastrutture locali — come Gemma 4 4B, selezionato tramite benchmark sistematico per l’istanza CB-SBS — suggerisce una via percorribile per contenere i costi di esercizio.</w:t>
@@ -2874,6 +3021,7 @@
     <w:p>
       <w:pPr>
         <w:pStyle w:val="BodyText"/>
+        <w:jc w:val="both"/>
       </w:pPr>
       <w:r>
         <w:t xml:space="preserve">Si aggiunga che il dato disponibile è esclusivamente basato sull’autovalutazione degli studenti, che potrebbe risentire di effetti di desiderabilità sociale; restano da acquisire metriche oggettive come tempi di risposta e tassi di completamento.</w:t>
@@ -2886,12 +3034,16 @@
         <w:pStyle w:val="Heading2"/>
       </w:pPr>
       <w:r>
+        <w:rPr>
+          <w:color w:val="000000"/>
+        </w:rPr>
         <w:t xml:space="preserve">6. Conclusioni</w:t>
       </w:r>
     </w:p>
     <w:p>
       <w:pPr>
         <w:pStyle w:val="FirstParagraph"/>
+        <w:jc w:val="both"/>
       </w:pPr>
       <w:r>
         <w:t xml:space="preserve">Sebbene</w:t>
@@ -2932,6 +3084,7 @@
     <w:p>
       <w:pPr>
         <w:pStyle w:val="BodyText"/>
+        <w:jc w:val="both"/>
       </w:pPr>
       <w:r>
         <w:t xml:space="preserve">Le prestazioni del chatbot possono quindi variare sensibilmente in funzione del design adottato. Il passaggio da un’architettura prevalentemente conversazionale a una struttura step-by-step, così come l’impiego di modelli linguistici differenti, ha mostrato quanto le scelte progettuali incidono (Kasneci et al., 2023; Antunes et al., 2025) non solo sulla coerenza delle risposte, sulla completezza dell’analisi e sulla capacità del sistema di accompagnare l’utente lungo un percorso di riflessione, ma anche sulla percezione complessiva dell’esperienza d’uso. I risultati comparativi mostrano infatti una tendenza favorevole alla versione CB-SBS nella maggior parte delle dimensioni considerate, in particolare per quanto riguarda la facilità d’uso, la fiducia nelle informazioni ricevute e l’intenzione di ri-utilizzare il sistema.</w:t>
@@ -2940,6 +3093,7 @@
     <w:p>
       <w:pPr>
         <w:pStyle w:val="BodyText"/>
+        <w:jc w:val="both"/>
       </w:pPr>
       <w:r>
         <w:t xml:space="preserve">Questi risultati vanno tuttavia interpretati alla luce dei limiti dello studio. Il campione è ridotto (n=6 per CB-SBS, n=16 per CB-C con dati numerici) e non probabilistico; la differenza tra le due versioni potrebbe risentire di fattori confondenti come la diversa composizione demografica o la maturità del percorso di sviluppo. Lo studio si inserisce nella fase di test del modello ADDIE (Branch, 2009) e non costituisce una validazione conclusiva. Per queste ragioni i risultati vanno letti come indicatori di tendenza, non come evidenza definitiva.</w:t>
@@ -2948,6 +3102,7 @@
     <w:p>
       <w:pPr>
         <w:pStyle w:val="BodyText"/>
+        <w:jc w:val="both"/>
       </w:pPr>
       <w:r>
         <w:t xml:space="preserve">Per quanto riguarda lo sviluppo futuro, le direzioni di lavoro possono essere articolate su tre orizzonti temporali. A breve termine, l’obiettivo è consolidare l’affidabilità del percorso guidato sul QSA ed estendere la sperimentazione agli altri strumenti del sistema — QSAr, ZTPI, intervista di Savickas, QPCS, QPCC e QAP — per verificarne l’efficacia su un ventaglio più ampio di costrutti e utenti. Parallelamente, i dati raccolti durante le interazioni, opportunamente anonimizzati, potranno essere impiegati per un affinamento (</w:t>
@@ -2966,6 +3121,7 @@
     <w:p>
       <w:pPr>
         <w:pStyle w:val="BodyText"/>
+        <w:jc w:val="both"/>
       </w:pPr>
       <w:r>
         <w:t xml:space="preserve">A medio termine, lo sviluppo riguarda la possibilità di rendere Counselorbot multilingue, così da ampliarne l’accessibilità in contesti educativi internazionali. Tale evoluzione richiede non solo la traduzione dell’interfaccia e delle istruzioni del sistema, ma anche la disponibilità di versioni validate degli strumenti del portale</w:t>
@@ -2990,6 +3146,7 @@
     <w:p>
       <w:pPr>
         <w:pStyle w:val="BodyText"/>
+        <w:jc w:val="both"/>
       </w:pPr>
       <w:r>
         <w:t xml:space="preserve">A lungo termine, si prospettano studi longitudinali per valutare l’impatto del sistema sulle strategie di apprendimento, sui processi di autoriflessione e sulle capacità di orientamento degli studenti. Sarà inoltre necessario proseguire la valutazione con gruppi di utenti più ampi e differenziati, analizzando le modalità con cui studenti, tutor e orientatori possono integrare lo strumento nelle rispettive pratiche. L’evoluzione dei modelli con meno di 15 miliardi di parametri — soglia che ha orientato la selezione per l’infrastruttura locale — amplia continuamente lo spazio delle opzioni disponibili. A titolo esemplificativo, Gemma 4 12B (Gemma Team, 2025) non era ancora disponibile al momento della valutazione e, una volta testato, potrebbe rivelarsi un candidato interessante per le future iterazioni del sistema.</w:t>
@@ -3002,12 +3159,16 @@
         <w:pStyle w:val="Heading2"/>
       </w:pPr>
       <w:r>
+        <w:rPr>
+          <w:color w:val="000000"/>
+        </w:rPr>
         <w:t xml:space="preserve">Bibliografia</w:t>
       </w:r>
     </w:p>
     <w:p>
       <w:pPr>
         <w:pStyle w:val="FirstParagraph"/>
+        <w:jc w:val="both"/>
       </w:pPr>
       <w:r>
         <w:t xml:space="preserve">Gemma Team, Google DeepMind. (2025). Gemma 4: Advancing open language models. https://ai.google.dev/gemma</w:t>
@@ -3016,6 +3177,7 @@
     <w:p>
       <w:pPr>
         <w:pStyle w:val="BodyText"/>
+        <w:jc w:val="both"/>
       </w:pPr>
       <w:r>
         <w:t xml:space="preserve">Pellerey, M., Epifani, F., Grządziel, D., Margottini, M., &amp; Ottone, E. (2013).</w:t>
@@ -3037,6 +3199,7 @@
     <w:p>
       <w:pPr>
         <w:pStyle w:val="BodyText"/>
+        <w:jc w:val="both"/>
       </w:pPr>
       <w:r>
         <w:t xml:space="preserve">Puech, R., Mačina, J., Chatain, J., Sachan, M., &amp; Kapur, M. (2025). Towards the pedagogical steering of large language models for tutoring: A case study with modeling productive failure. In</w:t>
@@ -3058,6 +3221,7 @@
     <w:p>
       <w:pPr>
         <w:pStyle w:val="BodyText"/>
+        <w:jc w:val="both"/>
       </w:pPr>
       <w:r>
         <w:t xml:space="preserve">Antunes, L. G., Passarelli, B., &amp; Claro, S. V. (2025). Large language models as Socratic mentors: Transforming educational approaches for epistemic development.</w:t>
@@ -3079,6 +3243,7 @@
     <w:p>
       <w:pPr>
         <w:pStyle w:val="BodyText"/>
+        <w:jc w:val="both"/>
       </w:pPr>
       <w:r>
         <w:t xml:space="preserve">Bender, E. M., Gebru, T., McMillan-Major, A., &amp; Shmitchell, S. (2021). On the dangers of stochastic parrots: Can language models be too big? In</w:t>
@@ -3103,6 +3268,7 @@
     <w:p>
       <w:pPr>
         <w:pStyle w:val="BodyText"/>
+        <w:jc w:val="both"/>
       </w:pPr>
       <w:r>
         <w:t xml:space="preserve">Branch, R. M. (2009).</w:t>
@@ -3124,6 +3290,7 @@
     <w:p>
       <w:pPr>
         <w:pStyle w:val="BodyText"/>
+        <w:jc w:val="both"/>
       </w:pPr>
       <w:r>
         <w:t xml:space="preserve">Brown, T. B., Mann, B., Ryder, N., et al. (2020). Language models are few-shot learners.</w:t>
@@ -3145,6 +3312,7 @@
     <w:p>
       <w:pPr>
         <w:pStyle w:val="BodyText"/>
+        <w:jc w:val="both"/>
       </w:pPr>
       <w:r>
         <w:t xml:space="preserve">Chang, D. H., Lin, M. P.-C., Hajian, S., &amp; Wang, Q. Q. (2023). Educational design principles of using AI</w:t>
@@ -3182,6 +3350,7 @@
     <w:p>
       <w:pPr>
         <w:pStyle w:val="BodyText"/>
+        <w:jc w:val="both"/>
       </w:pPr>
       <w:r>
         <w:t xml:space="preserve">Cukurova, M., Luckin, R., &amp; Kent, C. (2020). Impact of an artificial intelligence research frame on the perceived credibility of educational research evidence.</w:t>
@@ -3203,6 +3372,7 @@
     <w:p>
       <w:pPr>
         <w:pStyle w:val="BodyText"/>
+        <w:jc w:val="both"/>
       </w:pPr>
       <w:r>
         <w:t xml:space="preserve">D’Silva, G. M., Jani, M., Jadhav, V., Bhoir, A., &amp; Amin, P. N. (2020). Career counselling</w:t>
@@ -3243,6 +3413,7 @@
     <w:p>
       <w:pPr>
         <w:pStyle w:val="BodyText"/>
+        <w:jc w:val="both"/>
       </w:pPr>
       <w:r>
         <w:t xml:space="preserve">Jemstedt, A., Bälter, O., Gavel, A., Glassey, R., &amp; Bosk, D. (2024). Less to produce and less to consume: The advantage of pure question-based learning.</w:t>
@@ -3264,6 +3435,7 @@
     <w:p>
       <w:pPr>
         <w:pStyle w:val="BodyText"/>
+        <w:jc w:val="both"/>
       </w:pPr>
       <w:r>
         <w:t xml:space="preserve">Kasneci, E., Seßler, K., Küchemann, S., et al. (2023). ChatGPT for good? On opportunities and challenges of large language models for education.</w:t>
@@ -3285,6 +3457,7 @@
     <w:p>
       <w:pPr>
         <w:pStyle w:val="BodyText"/>
+        <w:jc w:val="both"/>
       </w:pPr>
       <w:r>
         <w:t xml:space="preserve">Kuhail, M. A., Alturki, N., Alramlawi, S., &amp; Alhejori, K. (2022). Interacting with educational</w:t>
@@ -3319,6 +3492,7 @@
     <w:p>
       <w:pPr>
         <w:pStyle w:val="BodyText"/>
+        <w:jc w:val="both"/>
       </w:pPr>
       <w:r>
         <w:t xml:space="preserve">Lewis, P., Perez, E., Piktus, A., et al. (2020). Retrieval-Augmented Generation for knowledge-intensive NLP tasks.</w:t>
@@ -3340,6 +3514,7 @@
     <w:p>
       <w:pPr>
         <w:pStyle w:val="BodyText"/>
+        <w:jc w:val="both"/>
       </w:pPr>
       <w:r>
         <w:t xml:space="preserve">Liu, X., Xiao, Y., &amp; Li, D. (2025). Assessing strategic use of artificial intelligence in self-regulated learning: Instrument development and evidence from Chinese university students.</w:t>
@@ -3361,6 +3536,7 @@
     <w:p>
       <w:pPr>
         <w:pStyle w:val="BodyText"/>
+        <w:jc w:val="both"/>
       </w:pPr>
       <w:r>
         <w:t xml:space="preserve">Mendez, S., Johanson, K., Conley, V. M., et al. (2020).</w:t>
@@ -3395,6 +3571,7 @@
     <w:p>
       <w:pPr>
         <w:pStyle w:val="BodyText"/>
+        <w:jc w:val="both"/>
       </w:pPr>
       <w:r>
         <w:t xml:space="preserve">Neumann, A. T., Arndt, T., Köbis, L., et al. (2021).</w:t>
@@ -3429,6 +3606,7 @@
     <w:p>
       <w:pPr>
         <w:pStyle w:val="BodyText"/>
+        <w:jc w:val="both"/>
       </w:pPr>
       <w:r>
         <w:t xml:space="preserve">Savickas, M. L. (2018). The career construction interview. In</w:t>
@@ -3453,6 +3631,7 @@
     <w:p>
       <w:pPr>
         <w:pStyle w:val="BodyText"/>
+        <w:jc w:val="both"/>
       </w:pPr>
       <w:r>
         <w:t xml:space="preserve">Self, J. A. (1974). Student models in computer-aided instruction.</w:t>
@@ -3474,6 +3653,7 @@
     <w:p>
       <w:pPr>
         <w:pStyle w:val="BodyText"/>
+        <w:jc w:val="both"/>
       </w:pPr>
       <w:r>
         <w:t xml:space="preserve">Su, L. H., Truong, D.-H., Tran, T.-Y.-L., et al. (2020). Development of an AI</w:t>
@@ -3511,6 +3691,7 @@
     <w:p>
       <w:pPr>
         <w:pStyle w:val="BodyText"/>
+        <w:jc w:val="both"/>
       </w:pPr>
       <w:r>
         <w:t xml:space="preserve">Susnjak, T. (2023). Beyond predictive learning analytics modelling and onto explainable artificial intelligence with prescriptive analytics and ChatGPT.</w:t>
@@ -3532,6 +3713,7 @@
     <w:p>
       <w:pPr>
         <w:pStyle w:val="BodyText"/>
+        <w:jc w:val="both"/>
       </w:pPr>
       <w:r>
         <w:t xml:space="preserve">Tankelevitch, L., Kewenig, V., Simkute, A., et al. (2024). The metacognitive demands and opportunities of generative AI. In</w:t>
@@ -3556,6 +3738,7 @@
     <w:p>
       <w:pPr>
         <w:pStyle w:val="BodyText"/>
+        <w:jc w:val="both"/>
       </w:pPr>
       <w:r>
         <w:t xml:space="preserve">Weizenbaum, J. (1966). ELIZA—A computer program for the study of natural language communication between man and machine.</w:t>
@@ -3577,6 +3760,7 @@
     <w:p>
       <w:pPr>
         <w:pStyle w:val="BodyText"/>
+        <w:jc w:val="both"/>
       </w:pPr>
       <w:r>
         <w:t xml:space="preserve">Wollny, S., Schneider, J., Di Mitri, D., et al. (2021). Are we there yet? A systematic literature review on</w:t>
@@ -3611,6 +3795,7 @@
     <w:p>
       <w:pPr>
         <w:pStyle w:val="BodyText"/>
+        <w:jc w:val="both"/>
       </w:pPr>
       <w:r>
         <w:t xml:space="preserve">Zawacki-Richter, O., Marín, V. I., Bond, M., &amp; Gouverneur, F. (2019). Systematic review of research on artificial intelligence applications in higher education: Where are the educators?</w:t>
@@ -4108,6 +4293,7 @@
     <w:rsid w:val="00FC693F"/>
     <w:pPr>
       <w:spacing w:after="120" w:line="360" w:lineRule="auto"/>
+      <w:jc w:val="both"/>
     </w:pPr>
     <w:rPr>
       <w:rFonts w:ascii="Times New Roman" w:hAnsi="Times New Roman"/>
@@ -4127,6 +4313,7 @@
         <w:tab w:pos="9360" w:val="right"/>
       </w:tabs>
       <w:spacing w:after="0" w:line="240" w:lineRule="auto"/>
+      <w:jc w:val="both"/>
     </w:pPr>
     <w:rPr>
       <w:rFonts w:ascii="Times New Roman" w:hAnsi="Times New Roman"/>
@@ -4155,6 +4342,7 @@
         <w:tab w:pos="9360" w:val="right"/>
       </w:tabs>
       <w:spacing w:after="0" w:line="240" w:lineRule="auto"/>
+      <w:jc w:val="both"/>
     </w:pPr>
     <w:rPr>
       <w:rFonts w:ascii="Times New Roman" w:hAnsi="Times New Roman"/>
@@ -4190,6 +4378,7 @@
       <w:bCs/>
       <w:sz w:val="28"/>
       <w:szCs w:val="28"/>
+      <w:color w:val="000000"/>
     </w:rPr>
   </w:style>
   <w:style w:styleId="Heading2" w:type="paragraph">
@@ -4213,6 +4402,7 @@
       <w:bCs/>
       <w:sz w:val="26"/>
       <w:szCs w:val="26"/>
+      <w:color w:val="000000"/>
     </w:rPr>
   </w:style>
   <w:style w:styleId="Heading3" w:type="paragraph">
@@ -4235,6 +4425,7 @@
       <w:b/>
       <w:bCs/>
       <w:sz w:val="24"/>
+      <w:color w:val="000000"/>
     </w:rPr>
   </w:style>
   <w:style w:styleId="Heading4" w:type="paragraph">
@@ -4259,6 +4450,7 @@
       <w:bCs/>
       <w:i/>
       <w:iCs/>
+      <w:color w:val="000000"/>
     </w:rPr>
   </w:style>
   <w:style w:styleId="Heading5" w:type="paragraph">
@@ -4279,6 +4471,7 @@
     </w:pPr>
     <w:rPr>
       <w:rFonts w:ascii="Times New Roman" w:asciiTheme="majorHAnsi" w:cstheme="majorBidi" w:eastAsiaTheme="majorEastAsia" w:hAnsi="Times New Roman" w:hAnsiTheme="majorHAnsi"/>
+      <w:color w:val="000000"/>
     </w:rPr>
   </w:style>
   <w:style w:styleId="Heading6" w:type="paragraph">
@@ -4301,6 +4494,7 @@
       <w:rFonts w:ascii="Times New Roman" w:asciiTheme="majorHAnsi" w:cstheme="majorBidi" w:eastAsiaTheme="majorEastAsia" w:hAnsi="Times New Roman" w:hAnsiTheme="majorHAnsi"/>
       <w:i/>
       <w:iCs/>
+      <w:color w:val="000000"/>
     </w:rPr>
   </w:style>
   <w:style w:styleId="Heading7" w:type="paragraph">
@@ -4323,6 +4517,7 @@
       <w:rFonts w:ascii="Times New Roman" w:asciiTheme="majorHAnsi" w:cstheme="majorBidi" w:eastAsiaTheme="majorEastAsia" w:hAnsi="Times New Roman" w:hAnsiTheme="majorHAnsi"/>
       <w:i/>
       <w:iCs/>
+      <w:color w:val="000000"/>
     </w:rPr>
   </w:style>
   <w:style w:styleId="Heading8" w:type="paragraph">
@@ -4345,6 +4540,7 @@
       <w:rFonts w:ascii="Times New Roman" w:asciiTheme="majorHAnsi" w:cstheme="majorBidi" w:eastAsiaTheme="majorEastAsia" w:hAnsi="Times New Roman" w:hAnsiTheme="majorHAnsi"/>
       <w:sz w:val="20"/>
       <w:szCs w:val="20"/>
+      <w:color w:val="000000"/>
     </w:rPr>
   </w:style>
   <w:style w:styleId="Heading9" w:type="paragraph">
@@ -4369,6 +4565,7 @@
       <w:iCs/>
       <w:sz w:val="20"/>
       <w:szCs w:val="20"/>
+      <w:color w:val="000000"/>
     </w:rPr>
   </w:style>
   <w:style w:default="1" w:styleId="DefaultParagraphFont" w:type="character">
@@ -4414,6 +4611,7 @@
     <w:rsid w:val="00FC693F"/>
     <w:pPr>
       <w:spacing w:after="0" w:line="240" w:lineRule="auto"/>
+      <w:jc w:val="both"/>
     </w:pPr>
     <w:rPr>
       <w:rFonts w:ascii="Times New Roman" w:hAnsi="Times New Roman"/>
@@ -4480,6 +4678,7 @@
       <w:kern w:val="28"/>
       <w:sz w:val="52"/>
       <w:szCs w:val="52"/>
+      <w:color w:val="000000"/>
     </w:rPr>
   </w:style>
   <w:style w:customStyle="1" w:styleId="TitleChar" w:type="character">
@@ -4516,6 +4715,7 @@
       <w:spacing w:val="15"/>
       <w:sz w:val="24"/>
       <w:szCs w:val="24"/>
+      <w:color w:val="000000"/>
     </w:rPr>
   </w:style>
   <w:style w:customStyle="1" w:styleId="SubtitleChar" w:type="character">
@@ -4542,6 +4742,7 @@
     <w:pPr>
       <w:ind w:left="720"/>
       <w:contextualSpacing/>
+      <w:jc w:val="both"/>
     </w:pPr>
     <w:rPr>
       <w:rFonts w:ascii="Times New Roman" w:hAnsi="Times New Roman"/>
@@ -4556,6 +4757,7 @@
     <w:rsid w:val="00AA1D8D"/>
     <w:pPr>
       <w:spacing w:after="120"/>
+      <w:jc w:val="both"/>
     </w:pPr>
     <w:rPr>
       <w:rFonts w:ascii="Times New Roman" w:hAnsi="Times New Roman"/>
@@ -4580,6 +4782,7 @@
     <w:rsid w:val="00AA1D8D"/>
     <w:pPr>
       <w:spacing w:after="120" w:line="480" w:lineRule="auto"/>
+      <w:jc w:val="both"/>
     </w:pPr>
     <w:rPr>
       <w:rFonts w:ascii="Times New Roman" w:hAnsi="Times New Roman"/>
@@ -4604,6 +4807,7 @@
     <w:rsid w:val="00AA1D8D"/>
     <w:pPr>
       <w:spacing w:after="120"/>
+      <w:jc w:val="both"/>
     </w:pPr>
     <w:rPr>
       <w:rFonts w:ascii="Times New Roman" w:hAnsi="Times New Roman"/>
@@ -4632,6 +4836,7 @@
     <w:pPr>
       <w:ind w:hanging="360" w:left="360"/>
       <w:contextualSpacing/>
+      <w:jc w:val="both"/>
     </w:pPr>
     <w:rPr>
       <w:rFonts w:ascii="Times New Roman" w:hAnsi="Times New Roman"/>
@@ -4646,6 +4851,7 @@
     <w:pPr>
       <w:ind w:hanging="360" w:left="720"/>
       <w:contextualSpacing/>
+      <w:jc w:val="both"/>
     </w:pPr>
     <w:rPr>
       <w:rFonts w:ascii="Times New Roman" w:hAnsi="Times New Roman"/>
@@ -4660,6 +4866,7 @@
     <w:pPr>
       <w:ind w:hanging="360" w:left="1080"/>
       <w:contextualSpacing/>
+      <w:jc w:val="both"/>
     </w:pPr>
     <w:rPr>
       <w:rFonts w:ascii="Times New Roman" w:hAnsi="Times New Roman"/>
@@ -4676,6 +4883,7 @@
         <w:numId w:val="1"/>
       </w:numPr>
       <w:contextualSpacing/>
+      <w:jc w:val="both"/>
     </w:pPr>
     <w:rPr>
       <w:rFonts w:ascii="Times New Roman" w:hAnsi="Times New Roman"/>
@@ -4692,6 +4900,7 @@
         <w:numId w:val="2"/>
       </w:numPr>
       <w:contextualSpacing/>
+      <w:jc w:val="both"/>
     </w:pPr>
     <w:rPr>
       <w:rFonts w:ascii="Times New Roman" w:hAnsi="Times New Roman"/>
@@ -4708,6 +4917,7 @@
         <w:numId w:val="3"/>
       </w:numPr>
       <w:contextualSpacing/>
+      <w:jc w:val="both"/>
     </w:pPr>
     <w:rPr>
       <w:rFonts w:ascii="Times New Roman" w:hAnsi="Times New Roman"/>
@@ -4724,6 +4934,7 @@
         <w:numId w:val="5"/>
       </w:numPr>
       <w:contextualSpacing/>
+      <w:jc w:val="both"/>
     </w:pPr>
     <w:rPr>
       <w:rFonts w:ascii="Times New Roman" w:hAnsi="Times New Roman"/>
@@ -4740,6 +4951,7 @@
         <w:numId w:val="6"/>
       </w:numPr>
       <w:contextualSpacing/>
+      <w:jc w:val="both"/>
     </w:pPr>
     <w:rPr>
       <w:rFonts w:ascii="Times New Roman" w:hAnsi="Times New Roman"/>
@@ -4756,6 +4968,7 @@
         <w:numId w:val="7"/>
       </w:numPr>
       <w:contextualSpacing/>
+      <w:jc w:val="both"/>
     </w:pPr>
     <w:rPr>
       <w:rFonts w:ascii="Times New Roman" w:hAnsi="Times New Roman"/>
@@ -4771,6 +4984,7 @@
       <w:spacing w:after="120"/>
       <w:ind w:left="360"/>
       <w:contextualSpacing/>
+      <w:jc w:val="both"/>
     </w:pPr>
     <w:rPr>
       <w:rFonts w:ascii="Times New Roman" w:hAnsi="Times New Roman"/>
@@ -4786,6 +5000,7 @@
       <w:spacing w:after="120"/>
       <w:ind w:left="720"/>
       <w:contextualSpacing/>
+      <w:jc w:val="both"/>
     </w:pPr>
     <w:rPr>
       <w:rFonts w:ascii="Times New Roman" w:hAnsi="Times New Roman"/>
@@ -4801,6 +5016,7 @@
       <w:spacing w:after="120"/>
       <w:ind w:left="1080"/>
       <w:contextualSpacing/>
+      <w:jc w:val="both"/>
     </w:pPr>
     <w:rPr>
       <w:rFonts w:ascii="Times New Roman" w:hAnsi="Times New Roman"/>
@@ -4822,6 +5038,7 @@
         <w:tab w:pos="3456" w:val="left"/>
         <w:tab w:pos="4032" w:val="left"/>
       </w:tabs>
+      <w:jc w:val="both"/>
     </w:pPr>
     <w:rPr>
       <w:rFonts w:ascii="Times New Roman" w:hAnsi="Times New Roman"/>
@@ -4842,6 +5059,9 @@
     </w:rPr>
   </w:style>
   <w:style w:styleId="Quote" w:type="paragraph">
+    <w:pPr>
+      <w:jc w:val="both"/>
+    </w:pPr>
     <w:name w:val="Quote"/>
     <w:basedOn w:val="Normal"/>
     <w:next w:val="Normal"/>
@@ -4958,6 +5178,7 @@
     <w:rsid w:val="00FC693F"/>
     <w:pPr>
       <w:spacing w:line="240" w:lineRule="auto"/>
+      <w:jc w:val="both"/>
     </w:pPr>
     <w:rPr>
       <w:rFonts w:ascii="Times New Roman" w:hAnsi="Times New Roman"/>
@@ -5005,6 +5226,7 @@
       </w:pBdr>
       <w:spacing w:after="280" w:before="200"/>
       <w:ind w:left="936" w:right="936"/>
+      <w:jc w:val="both"/>
     </w:pPr>
     <w:rPr>
       <w:rFonts w:ascii="Times New Roman" w:hAnsi="Times New Roman"/>
@@ -5109,6 +5331,7 @@
     </w:pPr>
     <w:rPr>
       <w:rFonts w:ascii="Times New Roman" w:hAnsi="Times New Roman"/>
+      <w:color w:val="000000"/>
     </w:rPr>
   </w:style>
   <w:style w:styleId="TableGrid" w:type="table">
@@ -15979,6 +16202,7 @@
     <w:link w:val="VerbatimChar"/>
     <w:pPr>
       <w:wordWrap w:val="off"/>
+      <w:jc w:val="both"/>
     </w:pPr>
   </w:style>
   <w:style w:type="character" w:customStyle="1" w:styleId="KeywordTok">

</xml_diff>

<commit_message>
feat: Revise article-v37 to v38 with paragraph-by-paragraph review
- Updated article version from v37 to v38, incorporating 15 accepted modifications across paragraphs P18 to P21.
- Expanded acronyms QPCC and QAP with verified definitions from competenzestrategiche.it.
- Enhanced clarity and connectivity between sections, specifically linking §1.3 to §2.
- Removed redundant repetitions and ensured compliance with citation norms.
- Created freeze ledger for tracking changes and decisions made during the revision process.
- Documented decision log for session 026, detailing the rationale and outcomes of the review.
</commit_message>
<xml_diff>
--- a/articles/current.docx
+++ b/articles/current.docx
@@ -8,54 +8,7 @@
         <w:pStyle w:val="Heading1"/>
       </w:pPr>
       <w:r>
-        <w:rPr>
-          <w:color w:val="000000"/>
-        </w:rPr>
         <w:t xml:space="preserve">Counselorbot: un</w:t>
-      </w:r>
-      <w:r>
-        <w:rPr>
-          <w:color w:val="000000"/>
-        </w:rPr>
-        <w:t xml:space="preserve"> </w:t>
-      </w:r>
-      <w:r>
-        <w:rPr>
-          <w:iCs/>
-          <w:i/>
-          <w:color w:val="000000"/>
-        </w:rPr>
-        <w:t xml:space="preserve">chatbot</w:t>
-      </w:r>
-      <w:r>
-        <w:rPr>
-          <w:color w:val="000000"/>
-        </w:rPr>
-        <w:t xml:space="preserve"> </w:t>
-      </w:r>
-      <w:r>
-        <w:rPr>
-          <w:color w:val="000000"/>
-        </w:rPr>
-        <w:t xml:space="preserve">per l’orientamento</w:t>
-      </w:r>
-    </w:p>
-    <w:p>
-      <w:pPr>
-        <w:pStyle w:val="FirstParagraph"/>
-        <w:jc w:val="both"/>
-      </w:pPr>
-      <w:r>
-        <w:t xml:space="preserve">Abstract (italiano)</w:t>
-      </w:r>
-    </w:p>
-    <w:p>
-      <w:pPr>
-        <w:pStyle w:val="BodyText"/>
-        <w:jc w:val="both"/>
-      </w:pPr>
-      <w:r>
-        <w:t xml:space="preserve">L’articolo presenta Counselorbot, un</w:t>
       </w:r>
       <w:r>
         <w:t xml:space="preserve"> </w:t>
@@ -71,34 +24,23 @@
         <w:t xml:space="preserve"> </w:t>
       </w:r>
       <w:r>
-        <w:t xml:space="preserve">basato su LLM per l’autovalutazione guidata delle competenze strategiche degli studenti. Il lavoro descrive l’architettura ibrida del sistema — che combina passi guidati deterministici con la flessibilità di un LLM — e il framework delle competenze strategiche (QSA) su cui si basa. La valutazione, condotta su 34 partecipanti confrontando due versioni (CB-SBS e CB-C), suggerisce tendenze positive in 9 dimensioni su 10, con incrementi in facilità d’uso (Δ = +0,79) e fiducia (Δ = +0,65). Il lavoro si colloca nella fase di test del modello ADDIE e discute limiti e direzioni di sviluppo.</w:t>
+        <w:t xml:space="preserve">per l’orientamento</w:t>
       </w:r>
     </w:p>
     <w:p>
       <w:pPr>
-        <w:pStyle w:val="BodyText"/>
-        <w:jc w:val="both"/>
-      </w:pPr>
-      <w:r>
-        <w:t xml:space="preserve">Abstract (inglese)</w:t>
+        <w:pStyle w:val="FirstParagraph"/>
+      </w:pPr>
+      <w:r>
+        <w:t xml:space="preserve">Abstract (italiano)</w:t>
       </w:r>
     </w:p>
     <w:p>
       <w:pPr>
         <w:pStyle w:val="BodyText"/>
-        <w:jc w:val="both"/>
-      </w:pPr>
-      <w:r>
-        <w:t xml:space="preserve">This paper presents Counselorbot, an LLM-based conversational assistant for guided self-assessment of students’ strategic competences. The paper describes the hybrid architecture — combining deterministic guided steps with LLM flexibility — and the strategic competences framework (QSA) it builds on. The evaluation, carried out on 34 participants comparing two versions (CB-SBS and CB-C), suggests positive trends in 9 out of 10 dimensions, with increases in ease of use (Δ = +0.79) and trust (Δ = +0.65). The study is positioned within the test phase of the ADDIE model and discusses limitations and future directions.</w:t>
-      </w:r>
-    </w:p>
-    <w:p>
-      <w:pPr>
-        <w:pStyle w:val="BodyText"/>
-        <w:jc w:val="both"/>
-      </w:pPr>
-      <w:r>
-        <w:t xml:space="preserve">Parole chiave: autovalutazione; competenze strategiche; LLM;</w:t>
+      </w:pPr>
+      <w:r>
+        <w:t xml:space="preserve">L’articolo presenta Counselorbot, un</w:t>
       </w:r>
       <w:r>
         <w:t xml:space="preserve"> </w:t>
@@ -114,7 +56,31 @@
         <w:t xml:space="preserve"> </w:t>
       </w:r>
       <w:r>
-        <w:t xml:space="preserve">educativo; QSA; intelligenza artificiale generativa; ADDIE Keywords: self-assessment; strategic competences; LLM; educational</w:t>
+        <w:t xml:space="preserve">basato su LLM a supporto della riflessione assistita sui risultati dell’autovalutazione delle competenze strategiche degli studenti. Il lavoro descrive l’architettura ibrida del sistema — che combina passi guidati deterministici con la flessibilità di un LLM — e il framework delle competenze strategiche su cui si basa. La valutazione, condotta su 34 partecipanti confrontando due versioni (CB-SBS e CB-C), suggerisce tendenze positive in 9 dimensioni su 10, con incrementi in facilità d’uso (Δ = +0,79) e fiducia (Δ = +0,65). Il lavoro si colloca nella fase di test del modello ADDIE e discute limiti e direzioni di sviluppo.</w:t>
+      </w:r>
+    </w:p>
+    <w:p>
+      <w:pPr>
+        <w:pStyle w:val="BodyText"/>
+      </w:pPr>
+      <w:r>
+        <w:t xml:space="preserve">Abstract (inglese)</w:t>
+      </w:r>
+    </w:p>
+    <w:p>
+      <w:pPr>
+        <w:pStyle w:val="BodyText"/>
+      </w:pPr>
+      <w:r>
+        <w:t xml:space="preserve">This paper presents Counselorbot, an LLM-based conversational assistant supporting students’ assisted reflection on their strategic-competences self-assessment. The paper describes the hybrid architecture — combining deterministic guided steps with LLM flexibility — and the strategic competences framework it builds on. The evaluation, carried out on 34 participants comparing two versions (CB-SBS and CB-C), suggests positive trends in 9 out of 10 dimensions, with increases in ease of use (Δ = +0.79) and trust (Δ = +0.65). The study is positioned within the test phase of the ADDIE model and discusses limitations and future directions.</w:t>
+      </w:r>
+    </w:p>
+    <w:p>
+      <w:pPr>
+        <w:pStyle w:val="BodyText"/>
+      </w:pPr>
+      <w:r>
+        <w:t xml:space="preserve">Parole chiave: autovalutazione; competenze strategiche; LLM;</w:t>
       </w:r>
       <w:r>
         <w:t xml:space="preserve"> </w:t>
@@ -127,13 +93,36 @@
         <w:t xml:space="preserve">chatbot</w:t>
       </w:r>
       <w:r>
-        <w:t xml:space="preserve">; QSA; generative AI; ADDIE</w:t>
+        <w:t xml:space="preserve"> </w:t>
+      </w:r>
+      <w:r>
+        <w:t xml:space="preserve">educativo; QSA; intelligenza artificiale generativa; ADDIE</w:t>
       </w:r>
     </w:p>
     <w:p>
       <w:pPr>
         <w:pStyle w:val="BodyText"/>
-        <w:jc w:val="both"/>
+      </w:pPr>
+      <w:r>
+        <w:t xml:space="preserve">Keywords: self-assessment; strategic competences; LLM; educational</w:t>
+      </w:r>
+      <w:r>
+        <w:t xml:space="preserve"> </w:t>
+      </w:r>
+      <w:r>
+        <w:rPr>
+          <w:iCs/>
+          <w:i/>
+        </w:rPr>
+        <w:t xml:space="preserve">chatbot</w:t>
+      </w:r>
+      <w:r>
+        <w:t xml:space="preserve">; QSA; generative AI; ADDIE</w:t>
+      </w:r>
+    </w:p>
+    <w:p>
+      <w:pPr>
+        <w:pStyle w:val="BodyText"/>
       </w:pPr>
       <w:r>
         <w:t xml:space="preserve">Nota biografica [da completare: max 300 battute]</w:t>
@@ -145,28 +134,23 @@
         <w:pStyle w:val="Heading2"/>
       </w:pPr>
       <w:r>
-        <w:rPr>
-          <w:color w:val="000000"/>
-        </w:rPr>
         <w:t xml:space="preserve">Introduzione</w:t>
       </w:r>
     </w:p>
     <w:p>
       <w:pPr>
         <w:pStyle w:val="FirstParagraph"/>
-        <w:jc w:val="both"/>
-      </w:pPr>
-      <w:r>
-        <w:t xml:space="preserve">Nel panorama dell’orientamento scolastico e professionale, i questionari di autovalutazione occupano un ruolo importante (Pellerey et al. 2013). Presentano allo studente una serie di affermazioni — su stili di studio, strategie, concentrazione, emozioni, studio in gruppo — chiedendo il grado di accordo. Al termine, restituiscono un profilo che sintetizza i risultati in fattori e brevi commenti. Questo esito può essere oggetto di riflessione personale o di discussione con un tutor, con il docente o con un orientatore; tale accompagnamento trova però un limite strutturale nella disponibilità di chi lo svolge. Inoltre, la letteratura evidenzia come la mancanza di supporto riduca l’efficacia di questi strumenti e la capacità di tradurre le indicazioni ricevute in azioni concrete (Wollny et al. 2021).</w:t>
+      </w:pPr>
+      <w:r>
+        <w:t xml:space="preserve">Nel panorama dell’orientamento scolastico e professionale, i questionari di autovalutazione occupano un ruolo importante (Pellerey et al., 2013). Presentano allo studente una serie di affermazioni — su stili di studio, strategie, concentrazione, emozioni, studio in gruppo — chiedendo il grado di accordo. Al termine, restituiscono un profilo che sintetizza i risultati in fattori e brevi commenti. Questo esito può essere oggetto di riflessione personale o di discussione con un tutor, con il docente o con un orientatore; tale accompagnamento trova però un limite strutturale nella disponibilità di chi lo svolge. Inoltre, la letteratura evidenzia come la mancanza di supporto riduca l’efficacia di questi strumenti e la capacità di tradurre le indicazioni ricevute in azioni concrete (Wollny et al., 2021).</w:t>
       </w:r>
     </w:p>
     <w:p>
       <w:pPr>
         <w:pStyle w:val="BodyText"/>
-        <w:jc w:val="both"/>
-      </w:pPr>
-      <w:r>
-        <w:t xml:space="preserve">I recenti assistenti conversazionali basati su</w:t>
+      </w:pPr>
+      <w:r>
+        <w:t xml:space="preserve">Per rispondere a questa esigenza, i recenti assistenti conversazionali basati su</w:t>
       </w:r>
       <w:r>
         <w:t xml:space="preserve"> </w:t>
@@ -182,13 +166,12 @@
         <w:t xml:space="preserve"> </w:t>
       </w:r>
       <w:r>
-        <w:t xml:space="preserve">(LLM) possono costituire un nuovo strumento di supporto per i processi di orientamento ricoprendo alcune funzioni che fino ad ora erano competenze esclusivamente umane.</w:t>
+        <w:t xml:space="preserve">(LLM) possono costituire un nuovo strumento di supporto per i processi di orientamento, svolgendo alcune funzioni finora di esclusiva competenza umana.</w:t>
       </w:r>
     </w:p>
     <w:p>
       <w:pPr>
         <w:pStyle w:val="BodyText"/>
-        <w:jc w:val="both"/>
       </w:pPr>
       <w:r>
         <w:t xml:space="preserve">Per verificare questa ipotesi è stato sviluppato</w:t>
@@ -230,13 +213,13 @@
           <w:iCs/>
           <w:i/>
         </w:rPr>
-        <w:t xml:space="preserve">Counselorbot-Conversetion</w:t>
+        <w:t xml:space="preserve">Counselorbot-Conversation</w:t>
       </w:r>
       <w:r>
         <w:t xml:space="preserve"> </w:t>
       </w:r>
       <w:r>
-        <w:t xml:space="preserve">(CB-C), adotta un approccio puramente conversazionale; la seconda</w:t>
+        <w:t xml:space="preserve">(CB-C), adotta un approccio puramente conversazionale; la seconda, denominata</w:t>
       </w:r>
       <w:r>
         <w:t xml:space="preserve"> </w:t>
@@ -252,13 +235,12 @@
         <w:t xml:space="preserve"> </w:t>
       </w:r>
       <w:r>
-        <w:t xml:space="preserve">(CB-SBS), presenta un’architettura strutturato in passi prestabiliti.</w:t>
+        <w:t xml:space="preserve">(CB-SBS), presenta un’architettura strutturata in passi prestabiliti.</w:t>
       </w:r>
     </w:p>
     <w:p>
       <w:pPr>
         <w:pStyle w:val="BodyText"/>
-        <w:jc w:val="both"/>
       </w:pPr>
       <w:r>
         <w:t xml:space="preserve">Le domande di ricerca sono due: D1) si può costruire un</w:t>
@@ -277,22 +259,12 @@
         <w:t xml:space="preserve"> </w:t>
       </w:r>
       <w:r>
-        <w:t xml:space="preserve">efficace? D2) quale architettura conversazionale è più efficace, una guidata o una libera?</w:t>
+        <w:t xml:space="preserve">— assistente che sostiene lo studente in un percorso riflessivo e formativo — efficace? D2) quale architettura conversazionale è più efficace, una guidata o una libera? La ricerca ha tuttavia carattere ancora esplorativo.</w:t>
       </w:r>
     </w:p>
     <w:p>
       <w:pPr>
         <w:pStyle w:val="BodyText"/>
-        <w:jc w:val="both"/>
-      </w:pPr>
-      <w:r>
-        <w:t xml:space="preserve">La ricerca si colloca tuttavia in una fase ancora esplorativa.</w:t>
-      </w:r>
-    </w:p>
-    <w:p>
-      <w:pPr>
-        <w:pStyle w:val="BodyText"/>
-        <w:jc w:val="both"/>
       </w:pPr>
       <w:r>
         <w:t xml:space="preserve">Il lavoro si articola in sei paragrafi. Il §1 presenta il quadro teorico e lo stato dell’arte sui</w:t>
@@ -324,7 +296,7 @@
         <w:t xml:space="preserve">Counselorbot</w:t>
       </w:r>
       <w:r>
-        <w:t xml:space="preserve">. Il §3 illustra la metodologia di valutazione del sistema, i cui risultati sono presentati al §4. Il §5 discute le implicazioni dei risultati e i limiti dello studio, mentre il §6 conclude tracciando le direzioni di sviluppo futuro.</w:t>
+        <w:t xml:space="preserve">. Il §3 illustra la metodologia di valutazione del sistema, i cui risultati sono presentati al §4. Il §5 discute le implicazioni dei risultati, mentre il §6 conclude con i limiti dello studio e le direzioni di sviluppo futuro.</w:t>
       </w:r>
     </w:p>
     <w:bookmarkEnd w:id="20"/>
@@ -334,9 +306,6 @@
         <w:pStyle w:val="Heading2"/>
       </w:pPr>
       <w:r>
-        <w:rPr>
-          <w:color w:val="000000"/>
-        </w:rPr>
         <w:t xml:space="preserve">1. Quadro teorico e stato dell’arte</w:t>
       </w:r>
     </w:p>
@@ -346,19 +315,15 @@
         <w:pStyle w:val="Heading3"/>
       </w:pPr>
       <w:r>
-        <w:rPr>
-          <w:color w:val="000000"/>
-        </w:rPr>
         <w:t xml:space="preserve">1.1 Large Language Models in educazione: potenzialità e rischi</w:t>
       </w:r>
     </w:p>
     <w:p>
       <w:pPr>
         <w:pStyle w:val="FirstParagraph"/>
-        <w:jc w:val="both"/>
-      </w:pPr>
-      <w:r>
-        <w:t xml:space="preserve">Gli LLM — grandi reti neurali specializzate nel linguaggio (Brown et al. 2020) — costituiscono la famiglia più diffusa di strumenti di intelligenza artificiale generativa (GenAI) e sono il motore dei moderni</w:t>
+      </w:pPr>
+      <w:r>
+        <w:t xml:space="preserve">Gli LLM — grandi reti neurali specializzate nel linguaggio (Brown et al., 2020) — costituiscono la famiglia più diffusa di strumenti di intelligenza artificiale generativa (GenAI) e sono il motore dei moderni</w:t>
       </w:r>
       <w:r>
         <w:t xml:space="preserve"> </w:t>
@@ -371,7 +336,7 @@
         <w:t xml:space="preserve">chatbot</w:t>
       </w:r>
       <w:r>
-        <w:t xml:space="preserve">. Essi permettono di superare i limiti dei sistemi del passato basati su regole (</w:t>
+        <w:t xml:space="preserve">. Grazie alla capacità di produrre output adattivi e coerenti in linguaggio naturale, essi permettono di superare i limiti dei sistemi del passato basati su regole (</w:t>
       </w:r>
       <w:r>
         <w:rPr>
@@ -381,25 +346,31 @@
         <w:t xml:space="preserve">rule-based</w:t>
       </w:r>
       <w:r>
-        <w:t xml:space="preserve">) (ELIZA, Weizenbaum 1966), grazie alla loro capacità di produrre output adattivi e coerenti in linguaggio naturale possono rispondere a domande non previste dalla programmazione (Brown et al. 2020; Kasneci et al. 2023).</w:t>
+        <w:t xml:space="preserve">), come ELIZA (Weizenbaum, 1966), e di rispondere a domande non previste dalla programmazione (Brown et al., 2020; Kasneci et al., 2023).</w:t>
       </w:r>
     </w:p>
     <w:p>
       <w:pPr>
         <w:pStyle w:val="BodyText"/>
-        <w:jc w:val="both"/>
-      </w:pPr>
-      <w:r>
-        <w:t xml:space="preserve">Tuttavia, l’integrazione di queste tecnologie introduce una serie di rischi e problematiche di natura tecnica, contenutistica, di accettazione della tecnologia e di dipendenza. Dal punto di vista del contenuto possono produrre risposte inaccurate o inventate, le cosiddette allucinazioni. Inoltre, possono riprodurre bias di genere e demografici o dare informazioni stereotipate (Bender et al. 2021; Tankelevitch et al. 2024).</w:t>
-      </w:r>
-    </w:p>
-    <w:p>
-      <w:pPr>
-        <w:pStyle w:val="BodyText"/>
-        <w:jc w:val="both"/>
-      </w:pPr>
-      <w:r>
-        <w:t xml:space="preserve">Dal lato dell’accettazione delle risposte da parte di umani, le indicazioni fornite da un sistema artificiale tendono a essere ritenute meno credibili rispetto a quelle di un operatore umano (Cukurova et al. 2020). Infine, un affidamento sproporzionato a tali strumenti per la risoluzione di problemi o la generazione di testi rischia di creare una dipendenza eccessiva, compromettendo lo sviluppo di abilità critiche come l’analisi, la sintesi e la creatività.</w:t>
+      </w:pPr>
+      <w:r>
+        <w:t xml:space="preserve">Tuttavia, l’integrazione di queste tecnologie introduce una serie di rischi di natura tecnica, contenutistica, di accettazione e di dipendenza. Sul piano tecnico, l’esecuzione di questi modelli pone vincoli di affidabilità, latenza e ampiezza del contesto, che possono incidere sulla continuità e sulla tempestività delle risposte. Sul piano dei contenuti, gli LLM possono produrre risposte inaccurate o inventate — le cosiddette</w:t>
+      </w:r>
+      <w:r>
+        <w:t xml:space="preserve"> </w:t>
+      </w:r>
+      <w:r>
+        <w:rPr>
+          <w:iCs/>
+          <w:i/>
+        </w:rPr>
+        <w:t xml:space="preserve">allucinazioni</w:t>
+      </w:r>
+      <w:r>
+        <w:t xml:space="preserve"> </w:t>
+      </w:r>
+      <w:r>
+        <w:t xml:space="preserve">— e riprodurre bias di genere e demografici o veicolare informazioni stereotipate (Bender et al., 2021; Tankelevitch et al., 2024). Sul piano dell’accettazione, le indicazioni fornite da un sistema artificiale tendono a essere ritenute meno credibili rispetto a quelle di un operatore umano (Cukurova et al., 2020). Infine, un affidamento sproporzionato a tali strumenti per la risoluzione di problemi o la generazione di testi rischia di creare una dipendenza eccessiva, compromettendo lo sviluppo di abilità critiche come l’analisi, la sintesi e la creatività.</w:t>
       </w:r>
     </w:p>
     <w:bookmarkEnd w:id="21"/>
@@ -409,16 +380,12 @@
         <w:pStyle w:val="Heading3"/>
       </w:pPr>
       <w:r>
-        <w:rPr>
-          <w:color w:val="000000"/>
-        </w:rPr>
         <w:t xml:space="preserve">1.2 Chatbot educativi e tutoraggio socratico: autoregolazione, metacognizione e agency epistemica</w:t>
       </w:r>
     </w:p>
     <w:p>
       <w:pPr>
         <w:pStyle w:val="FirstParagraph"/>
-        <w:jc w:val="both"/>
       </w:pPr>
       <w:r>
         <w:t xml:space="preserve">La letteratura scientifica evidenzia il potenziale dei</w:t>
@@ -508,20 +475,7 @@
         <w:t xml:space="preserve">meta-prompt</w:t>
       </w:r>
       <w:r>
-        <w:t xml:space="preserve">. Tali istruzioni, ricevute dal modello prima del dialogo con l’utente, ne definiscono il ruolo, il comportamento e le modalità di interazione. Inoltre, mediante tecniche di</w:t>
-      </w:r>
-      <w:r>
-        <w:t xml:space="preserve"> </w:t>
-      </w:r>
-      <w:r>
-        <w:rPr>
-          <w:iCs/>
-          <w:i/>
-        </w:rPr>
-        <w:t xml:space="preserve">retrieval</w:t>
-      </w:r>
-      <w:r>
-        <w:t xml:space="preserve">, è possibile integrare nei prompt informazioni pertinenti estratte da documenti validati, migliorando l’accuratezza e l’affidabilità delle risposte (Kasneci et al., 2023). Tali sistemi sono dunque in grado di svolgere compiti finora di esclusiva competenza all’operatore umano, rendendo i processi di orientamento più scalabili e sostenibili (Neumann et al., 2021). Ad esempio, impiegati come</w:t>
+        <w:t xml:space="preserve">. Tali istruzioni, ricevute dal modello prima del dialogo con l’utente, ne definiscono il ruolo, il comportamento e le modalità di interazione. Inoltre, mediante tecniche di recupero semantico, è possibile integrare nei prompt informazioni pertinenti estratte da documenti validati, migliorando l’accuratezza e l’affidabilità delle risposte (Kasneci et al., 2023). Tali sistemi sono dunque in grado di svolgere compiti finora di esclusiva competenza dell’operatore umano, rendendo i processi di orientamento più scalabili e sostenibili (Neumann et al., 2021). Ad esempio, impiegati come</w:t>
       </w:r>
       <w:r>
         <w:t xml:space="preserve"> </w:t>
@@ -556,10 +510,9 @@
     <w:p>
       <w:pPr>
         <w:pStyle w:val="BodyText"/>
-        <w:jc w:val="both"/>
-      </w:pPr>
-      <w:r>
-        <w:t xml:space="preserve">Tuttavia, è necessario che gli studenti sviluppino un senso critico verso l’AI che permetta loro di valutarne l’attendibilità e la pertinenza, al fine di integrare in maniera proficua questa interazione nel proprio percorso di apprendimento (Tankelevitch et al., 2024). Tale competenza assume particolare rilevanza, poiché le strategie di autovalutazione supportate dall’AI risultano ancora tra quelle meno conosciute dagli studenti (Liu et al., 2025).</w:t>
+      </w:pPr>
+      <w:r>
+        <w:t xml:space="preserve">Tuttavia, è necessario che gli studenti sviluppino un senso critico verso l’AI che permetta loro di valutarne l’attendibilità e la pertinenza, al fine di integrare in modo proficuo questa interazione nel proprio percorso di apprendimento (Tankelevitch et al., 2024). Tale competenza assume particolare rilevanza, poiché le strategie di autovalutazione supportate dall’AI risultano ancora tra quelle meno conosciute dagli studenti (Liu et al., 2025).</w:t>
       </w:r>
     </w:p>
     <w:bookmarkEnd w:id="22"/>
@@ -569,16 +522,12 @@
         <w:pStyle w:val="Heading3"/>
       </w:pPr>
       <w:r>
-        <w:rPr>
-          <w:color w:val="000000"/>
-        </w:rPr>
         <w:t xml:space="preserve">1.3 Il framework delle competenze strategiche come impalcatura semantica</w:t>
       </w:r>
     </w:p>
     <w:p>
       <w:pPr>
         <w:pStyle w:val="FirstParagraph"/>
-        <w:jc w:val="both"/>
       </w:pPr>
       <w:r>
         <w:t xml:space="preserve">Per comprendere meglio l’idea di</w:t>
@@ -597,7 +546,7 @@
         <w:t xml:space="preserve"> </w:t>
       </w:r>
       <w:r>
-        <w:t xml:space="preserve">è opportuno accennare brevemente al portale</w:t>
+        <w:t xml:space="preserve">è opportuno accennare al portale</w:t>
       </w:r>
       <w:r>
         <w:t xml:space="preserve"> </w:t>
@@ -610,13 +559,12 @@
         <w:t xml:space="preserve">Competenze strategiche</w:t>
       </w:r>
       <w:r>
-        <w:t xml:space="preserve">. Il sito raccoglie strumenti di autovalutazione rivolti a studenti, docenti e operatori dell’orientamento. Questi strumenti aiutano a riflettere sulle proprie modalità di apprendimento, sulle strategie di studio, sulla motivazione, sulla gestione delle emozioni e sulla progettualità personale.</w:t>
+        <w:t xml:space="preserve">. Il sito raccoglie strumenti di autovalutazione rivolti a studenti, docenti, ricercatori e operatori dell’orientamento e della formazione. Questi strumenti aiutano a riflettere sulle proprie modalità di apprendimento, sulle strategie di studio, sulla motivazione, sulla gestione delle emozioni e sulla progettualità personale.</w:t>
       </w:r>
     </w:p>
     <w:p>
       <w:pPr>
         <w:pStyle w:val="BodyText"/>
-        <w:jc w:val="both"/>
       </w:pPr>
       <w:r>
         <w:t xml:space="preserve">Alla base del portale vi è il costrutto di competenza strategica, sviluppato dal gruppo di ricerca coordinato da Pellerey (Pellerey et al., 2013) e radicato nella nozione aristotelico-tomista di abito (</w:t>
@@ -635,10 +583,9 @@
     <w:p>
       <w:pPr>
         <w:pStyle w:val="BodyText"/>
-        <w:jc w:val="both"/>
-      </w:pPr>
-      <w:r>
-        <w:t xml:space="preserve">Tra i questionari disponibili nel portale vi sono il QSA,</w:t>
+      </w:pPr>
+      <w:r>
+        <w:t xml:space="preserve">Tale costrutto si declina operativamente in una batteria di questionari disponibili nel portale: il</w:t>
       </w:r>
       <w:r>
         <w:t xml:space="preserve"> </w:t>
@@ -651,7 +598,10 @@
         <w:t xml:space="preserve">Questionario sulle Strategie di Apprendimento</w:t>
       </w:r>
       <w:r>
-        <w:t xml:space="preserve">; il QSAr, nella sua versione ridotta; il QPCS,</w:t>
+        <w:t xml:space="preserve"> </w:t>
+      </w:r>
+      <w:r>
+        <w:t xml:space="preserve">(QSA); il QSAr, versione ridotta del QSA; il</w:t>
       </w:r>
       <w:r>
         <w:t xml:space="preserve"> </w:t>
@@ -664,7 +614,58 @@
         <w:t xml:space="preserve">Questionario sulla Percezione delle proprie Competenze Strategiche</w:t>
       </w:r>
       <w:r>
-        <w:t xml:space="preserve">; il QPCC; lo ZTPI, dedicato alla prospettiva temporale; e il QAP, relativo all’adattabilità professionale.</w:t>
+        <w:t xml:space="preserve"> </w:t>
+      </w:r>
+      <w:r>
+        <w:t xml:space="preserve">(QPCS); il</w:t>
+      </w:r>
+      <w:r>
+        <w:t xml:space="preserve"> </w:t>
+      </w:r>
+      <w:r>
+        <w:rPr>
+          <w:iCs/>
+          <w:i/>
+        </w:rPr>
+        <w:t xml:space="preserve">Questionario di Percezione delle proprie Competenze e Convinzioni</w:t>
+      </w:r>
+      <w:r>
+        <w:t xml:space="preserve"> </w:t>
+      </w:r>
+      <w:r>
+        <w:t xml:space="preserve">(QPCC); lo</w:t>
+      </w:r>
+      <w:r>
+        <w:t xml:space="preserve"> </w:t>
+      </w:r>
+      <w:r>
+        <w:rPr>
+          <w:iCs/>
+          <w:i/>
+        </w:rPr>
+        <w:t xml:space="preserve">Zimbardo Time Perspective Inventory</w:t>
+      </w:r>
+      <w:r>
+        <w:t xml:space="preserve"> </w:t>
+      </w:r>
+      <w:r>
+        <w:t xml:space="preserve">(ZTPI), dedicato alla prospettiva temporale; e il</w:t>
+      </w:r>
+      <w:r>
+        <w:t xml:space="preserve"> </w:t>
+      </w:r>
+      <w:r>
+        <w:rPr>
+          <w:iCs/>
+          <w:i/>
+        </w:rPr>
+        <w:t xml:space="preserve">Questionario di Adattabilità Professionale</w:t>
+      </w:r>
+      <w:r>
+        <w:t xml:space="preserve"> </w:t>
+      </w:r>
+      <w:r>
+        <w:t xml:space="preserve">(QAP).</w:t>
       </w:r>
     </w:p>
     <w:bookmarkEnd w:id="23"/>
@@ -675,19 +676,15 @@
         <w:pStyle w:val="Heading2"/>
       </w:pPr>
       <w:r>
-        <w:rPr>
-          <w:color w:val="000000"/>
-        </w:rPr>
         <w:t xml:space="preserve">2. Progettazione di Counselorbot</w:t>
       </w:r>
     </w:p>
     <w:p>
       <w:pPr>
         <w:pStyle w:val="FirstParagraph"/>
-        <w:jc w:val="both"/>
-      </w:pPr>
-      <w:r>
-        <w:t xml:space="preserve">Counselorbot è stato concepito come un sistema multifunzionale dedicato all’orientamento formativo e professionale, all’autovalutazione e al supporto all’apprendimento. La piattaforma integra strumenti differenti, accomunati da un’interazione conversazionale strutturata, attraverso la quale l’utente viene accompagnato nell’interpretazione dei risultati, nella riflessione sulle proprie esperienze e nell’individuazione di strategie utili al proprio percorso.</w:t>
+      </w:pPr>
+      <w:r>
+        <w:t xml:space="preserve">Counselorbot prende avvio dal framework delle competenze strategiche illustrato nel §1.3 e ne integra gli strumenti in un sistema multifunzionale dedicato all’orientamento formativo e professionale e alla riflessione assistita sui risultati dell’autovalutazione. La piattaforma accomuna strumenti differenti mediante un’interazione conversazionale strutturata, attraverso la quale l’utente viene accompagnato nell’interpretazione del proprio profilo, nella riflessione sulle esperienze e nell’individuazione di strategie utili al proprio percorso.</w:t>
       </w:r>
     </w:p>
     <w:bookmarkStart w:id="25" w:name="strumenti-disponibili-in-counselorbot"/>
@@ -696,19 +693,31 @@
         <w:pStyle w:val="Heading3"/>
       </w:pPr>
       <w:r>
-        <w:rPr>
-          <w:color w:val="000000"/>
-        </w:rPr>
         <w:t xml:space="preserve">2.1 Strumenti disponibili in Counselorbot</w:t>
       </w:r>
     </w:p>
     <w:p>
       <w:pPr>
         <w:pStyle w:val="FirstParagraph"/>
-        <w:jc w:val="both"/>
-      </w:pPr>
-      <w:r>
-        <w:t xml:space="preserve">Nella schermata iniziale, Counselorbot presenta un selettore attraverso il quale l’utente può scegliere uno dei questionari disponibili, la</w:t>
+      </w:pPr>
+      <w:r>
+        <w:t xml:space="preserve">Nella schermata iniziale, Counselorbot presenta un selettore attraverso il quale l’utente può scegliere uno dei questionari del portale</w:t>
+      </w:r>
+      <w:r>
+        <w:t xml:space="preserve"> </w:t>
+      </w:r>
+      <w:r>
+        <w:rPr>
+          <w:iCs/>
+          <w:i/>
+        </w:rPr>
+        <w:t xml:space="preserve">Competenze strategiche</w:t>
+      </w:r>
+      <w:r>
+        <w:t xml:space="preserve"> </w:t>
+      </w:r>
+      <w:r>
+        <w:t xml:space="preserve">(QSA, QSAr, QPCS, QPCC, ZTPI, QAP), la</w:t>
       </w:r>
       <w:r>
         <w:t xml:space="preserve"> </w:t>
@@ -724,7 +733,103 @@
         <w:t xml:space="preserve"> </w:t>
       </w:r>
       <w:r>
-        <w:t xml:space="preserve">oppure il modulo di</w:t>
+        <w:t xml:space="preserve">di Savickas oppure il modulo di</w:t>
+      </w:r>
+      <w:r>
+        <w:t xml:space="preserve"> </w:t>
+      </w:r>
+      <w:r>
+        <w:rPr>
+          <w:iCs/>
+          <w:i/>
+        </w:rPr>
+        <w:t xml:space="preserve">Pure Question-Based Learning</w:t>
+      </w:r>
+      <w:r>
+        <w:t xml:space="preserve"> </w:t>
+      </w:r>
+      <w:r>
+        <w:t xml:space="preserve">(PQBL) di Jemstedt e Bälter. La scelta determina l’interfaccia e il percorso di interazione che il sistema attiva.</w:t>
+      </w:r>
+    </w:p>
+    <w:p>
+      <w:pPr>
+        <w:pStyle w:val="BodyText"/>
+      </w:pPr>
+      <w:r>
+        <w:t xml:space="preserve">Il QSA, finalizzato ad analizzare le modalità attraverso cui lo studente affronta, organizza e regola il proprio percorso formativo, è il primo degli strumenti integrati. Counselorbot accompagna l’utente nell’interpretazione dei risultati attraverso undici passi guidati, ciascuno dedicato a una specifica dimensione. Per ogni fattore, il sistema illustra il significato del punteggio, formula domande di approfondimento e propone strategie coerenti con il profilo emerso.</w:t>
+      </w:r>
+    </w:p>
+    <w:p>
+      <w:pPr>
+        <w:pStyle w:val="BodyText"/>
+      </w:pPr>
+      <w:r>
+        <w:t xml:space="preserve">Accanto al QSA è integrato il QSAr, una versione ridotta del Questionario sulle Strategie di Apprendimento. Esso consente di ottenere una rappresentazione più sintetica delle principali modalità con cui lo studente affronta il proprio apprendimento. Anche in questo caso, Counselorbot restituisce il profilo in forma comprensibile, evidenzia i punti di forza e le aree suscettibili di sviluppo e guida l’utente nella riflessione sulle possibili strategie di miglioramento.</w:t>
+      </w:r>
+    </w:p>
+    <w:p>
+      <w:pPr>
+        <w:pStyle w:val="BodyText"/>
+      </w:pPr>
+      <w:r>
+        <w:t xml:space="preserve">Un ulteriore strumento è lo</w:t>
+      </w:r>
+      <w:r>
+        <w:t xml:space="preserve"> </w:t>
+      </w:r>
+      <w:r>
+        <w:rPr>
+          <w:iCs/>
+          <w:i/>
+        </w:rPr>
+        <w:t xml:space="preserve">Zimbardo Time Perspective Inventory</w:t>
+      </w:r>
+      <w:r>
+        <w:t xml:space="preserve"> </w:t>
+      </w:r>
+      <w:r>
+        <w:t xml:space="preserve">(ZTPI), attraverso il quale viene analizzato il rapporto dell’individuo con le dimensioni temporali del passato, del presente e del futuro. Le prospettive temporali possono incidere sulla capacità progettuale, sulle decisioni e sull’atteggiamento assunto verso il percorso formativo e professionale. Counselorbot supporta l’utente nell’interpretazione del proprio profilo temporale e lo aiuta a individuare le relazioni tra orientamento temporale, obiettivi personali e scelte future.</w:t>
+      </w:r>
+    </w:p>
+    <w:p>
+      <w:pPr>
+        <w:pStyle w:val="BodyText"/>
+      </w:pPr>
+      <w:r>
+        <w:t xml:space="preserve">Per QSA, QSAr e ZTPI, l’interfaccia richiede l’inserimento dei risultati e restituisce una rappresentazione grafica del profilo. Il grafico a barre utilizza una codifica cromatica nella quale il verde identifica i punti di forza, il giallo i risultati collocati nella fascia intermedia e il rosso le possibili aree di crescita. La visualizzazione grafica non sostituisce l’interpretazione, ma offre una prima rappresentazione sintetica del profilo, che viene successivamente approfondita attraverso il dialogo guidato.</w:t>
+      </w:r>
+    </w:p>
+    <w:p>
+      <w:pPr>
+        <w:pStyle w:val="BodyText"/>
+      </w:pPr>
+      <w:r>
+        <w:t xml:space="preserve">Ai questionari si affiancano due strumenti aggiuntivi, caratterizzati da finalità e modalità di funzionamento differenti. Il primo è la</w:t>
+      </w:r>
+      <w:r>
+        <w:t xml:space="preserve"> </w:t>
+      </w:r>
+      <w:r>
+        <w:rPr>
+          <w:iCs/>
+          <w:i/>
+        </w:rPr>
+        <w:t xml:space="preserve">Career Counseling Interview</w:t>
+      </w:r>
+      <w:r>
+        <w:t xml:space="preserve"> </w:t>
+      </w:r>
+      <w:r>
+        <w:t xml:space="preserve">di Savickas, un colloquio narrativo finalizzato a esplorare le esperienze, gli interessi, i modelli di riferimento e le aspirazioni dell’utente. Dopo la selezione dello strumento, il sistema avvia il colloquio e propone cinque domande qualitative, alle quali il modello linguistico può far seguire ulteriori richieste di approfondimento. Al termine dell’interazione, Counselorbot elabora una sintesi narrativa orientata alla ricostruzione dell’identità professionale e all’individuazione dei principali temi di vita emersi.</w:t>
+      </w:r>
+    </w:p>
+    <w:p>
+      <w:pPr>
+        <w:pStyle w:val="BodyText"/>
+      </w:pPr>
+      <w:r>
+        <w:t xml:space="preserve">Il secondo strumento aggiuntivo è il modulo di</w:t>
       </w:r>
       <w:r>
         <w:t xml:space="preserve"> </w:t>
@@ -737,81 +842,62 @@
         <w:t xml:space="preserve">Question-Based Learning</w:t>
       </w:r>
       <w:r>
-        <w:t xml:space="preserve">. In base alla scelta effettuata, il sistema attiva l’interfaccia e il percorso di interazione corrispondenti.</w:t>
+        <w:t xml:space="preserve"> </w:t>
+      </w:r>
+      <w:r>
+        <w:t xml:space="preserve">(PQBL), basato sulla metodologia proposta da Jemstedt e Bälter. In questo caso, l’interfaccia richiede il caricamento di un documento didattico in formato PDF. Il sistema ne trasforma il contenuto in un percorso interattivo fondato su domande e feedback. Il testo non viene quindi proposto soltanto come materiale da leggere, ma diventa la base di un’attività di apprendimento attivo, nella quale l’utente è chiamato a recuperare, rielaborare e applicare le informazioni contenute nel documento.</w:t>
       </w:r>
     </w:p>
     <w:p>
       <w:pPr>
         <w:pStyle w:val="BodyText"/>
-        <w:jc w:val="both"/>
-      </w:pPr>
-      <w:r>
-        <w:t xml:space="preserve">Una prima area funzionale riguarda l’interpretazione dei questionari presenti nel portale</w:t>
-      </w:r>
-      <w:r>
-        <w:t xml:space="preserve"> </w:t>
+      </w:pPr>
+      <w:r>
+        <w:t xml:space="preserve">L’architettura modulare di Counselorbot è stata progettata in modo da consentire la futura integrazione di ulteriori questionari, interviste e strumenti di supporto all’orientamento e all’apprendimento.</w:t>
+      </w:r>
+    </w:p>
+    <w:bookmarkEnd w:id="25"/>
+    <w:bookmarkStart w:id="26" w:name="passi-guidati-e-flussi-di-interazione"/>
+    <w:p>
+      <w:pPr>
+        <w:pStyle w:val="Heading3"/>
+      </w:pPr>
+      <w:r>
+        <w:t xml:space="preserve">2.2 Passi guidati e flussi di interazione</w:t>
+      </w:r>
+    </w:p>
+    <w:p>
+      <w:pPr>
+        <w:pStyle w:val="FirstParagraph"/>
+      </w:pPr>
+      <w:r>
+        <w:t xml:space="preserve">Il principio organizzativo centrale di Counselorbot è rappresentato dai passi guidati (</w:t>
       </w:r>
       <w:r>
         <w:rPr>
           <w:iCs/>
           <w:i/>
         </w:rPr>
-        <w:t xml:space="preserve">Competenze strategiche</w:t>
-      </w:r>
-      <w:r>
-        <w:t xml:space="preserve">. Tra questi rientra il Questionario sulle Strategie di Apprendimento (QSA), finalizzato ad analizzare le modalità attraverso cui lo studente affronta, organizza e regola il proprio percorso formativo. Lo strumento prende in considerazione fattori cognitivi, metacognitivi, affettivi, motivazionali e volitivi. Counselorbot accompagna l’utente nell’interpretazione dei risultati attraverso undici passi guidati, ciascuno dedicato a una specifica dimensione. Per ogni fattore, il sistema illustra il significato del punteggio, formula domande di approfondimento e propone strategie coerenti con il profilo emerso.</w:t>
+        <w:t xml:space="preserve">guided steps</w:t>
+      </w:r>
+      <w:r>
+        <w:t xml:space="preserve">), ossia sequenze predefinite che determinano l’ordine delle diverse fasi del dialogo. A ciascun passo è associato uno specifico meta-prompt, nel quale vengono definiti l’obiettivo della fase, le informazioni da prendere in considerazione e il tipo di risposta che il modello linguistico deve produrre. Questa struttura permette di affrontare sistematicamente tutti gli ambiti previsti dallo strumento selezionato, riducendo il rischio che alcune dimensioni vengano trascurate.</w:t>
       </w:r>
     </w:p>
     <w:p>
       <w:pPr>
         <w:pStyle w:val="BodyText"/>
-        <w:jc w:val="both"/>
-      </w:pPr>
-      <w:r>
-        <w:t xml:space="preserve">Accanto al QSA è integrato il QSAr, una versione ridotta del Questionario sulle Strategie di Apprendimento. Esso consente di ottenere una rappresentazione più sintetica delle principali modalità con cui lo studente affronta il proprio apprendimento. Anche in questo caso, Counselorbot restituisce il profilo in forma comprensibile, evidenzia i punti di forza e le aree suscettibili di sviluppo e guida l’utente nella riflessione sulle possibili strategie di miglioramento.</w:t>
+      </w:pPr>
+      <w:r>
+        <w:t xml:space="preserve">All’interno di ciascun passo, tuttavia, il modello linguistico mantiene la flessibilità necessaria per adattare il linguaggio, gli esempi, le domande e il livello di approfondimento alle risposte dell’utente. Counselorbot realizza così una modalità di interazione ibrida, nella quale il controllo deterministico del percorso si combina con l’adattività conversazionale dell’LLM. L’interfaccia conversazionale presenta progressivamente le domande, le interpretazioni e le strategie associate a ciascun passo. L’utente può chiedere chiarimenti, richiedere esempi o soffermarsi su uno specifico argomento prima di proseguire.</w:t>
       </w:r>
     </w:p>
     <w:p>
       <w:pPr>
         <w:pStyle w:val="BodyText"/>
-        <w:jc w:val="both"/>
-      </w:pPr>
-      <w:r>
-        <w:t xml:space="preserve">Un ulteriore strumento è lo</w:t>
-      </w:r>
-      <w:r>
-        <w:t xml:space="preserve"> </w:t>
-      </w:r>
-      <w:r>
-        <w:rPr>
-          <w:iCs/>
-          <w:i/>
-        </w:rPr>
-        <w:t xml:space="preserve">Zimbardo Time Perspective Inventory</w:t>
-      </w:r>
-      <w:r>
-        <w:t xml:space="preserve"> </w:t>
-      </w:r>
-      <w:r>
-        <w:t xml:space="preserve">(ZTPI), attraverso il quale viene analizzato il rapporto dell’individuo con le dimensioni temporali del passato, del presente e del futuro. Le prospettive temporali possono incidere sulla capacità progettuale, sulle decisioni e sull’atteggiamento assunto verso il percorso formativo e professionale. Counselorbot supporta l’utente nell’interpretazione del proprio profilo temporale e lo aiuta a individuare le relazioni tra orientamento temporale, obiettivi personali e scelte future.</w:t>
-      </w:r>
-    </w:p>
-    <w:p>
-      <w:pPr>
-        <w:pStyle w:val="BodyText"/>
-        <w:jc w:val="both"/>
-      </w:pPr>
-      <w:r>
-        <w:t xml:space="preserve">Per QSA, QSAr e ZTPI, l’interfaccia richiede l’inserimento dei risultati e restituisce una rappresentazione grafica del profilo. Il grafico a barre utilizza una codifica cromatica nella quale il verde identifica i punti di forza, il giallo i risultati collocati nella fascia intermedia e il rosso le possibili aree di crescita. La visualizzazione grafica non sostituisce l’interpretazione, ma offre una prima rappresentazione sintetica del profilo, che viene successivamente approfondita attraverso il dialogo guidato.</w:t>
-      </w:r>
-    </w:p>
-    <w:p>
-      <w:pPr>
-        <w:pStyle w:val="BodyText"/>
-        <w:jc w:val="both"/>
-      </w:pPr>
-      <w:r>
-        <w:t xml:space="preserve">Ai questionari si affiancano due strumenti aggiuntivi, caratterizzati da finalità e modalità di funzionamento differenti. Il primo è la</w:t>
+      </w:pPr>
+      <w:r>
+        <w:t xml:space="preserve">Poiché gli strumenti integrati presentano caratteristiche differenti, il sistema non applica un unico flusso indistinto, ma adotta percorsi specifici per i questionari, per la</w:t>
       </w:r>
       <w:r>
         <w:t xml:space="preserve"> </w:t>
@@ -827,16 +913,7 @@
         <w:t xml:space="preserve"> </w:t>
       </w:r>
       <w:r>
-        <w:t xml:space="preserve">di Savickas, un colloquio narrativo finalizzato a esplorare le esperienze, gli interessi, i modelli di riferimento e le aspirazioni dell’utente. Dopo la selezione dello strumento, il sistema avvia il colloquio e propone cinque domande qualitative, alle quali il modello linguistico può far seguire ulteriori richieste di approfondimento. Al termine dell’interazione, Counselorbot elabora una sintesi narrativa orientata alla ricostruzione dell’identità professionale e all’individuazione dei principali temi di vita emersi.</w:t>
-      </w:r>
-    </w:p>
-    <w:p>
-      <w:pPr>
-        <w:pStyle w:val="BodyText"/>
-        <w:jc w:val="both"/>
-      </w:pPr>
-      <w:r>
-        <w:t xml:space="preserve">Il secondo strumento aggiuntivo è il modulo di</w:t>
+        <w:t xml:space="preserve">e per il</w:t>
       </w:r>
       <w:r>
         <w:t xml:space="preserve"> </w:t>
@@ -849,69 +926,15 @@
         <w:t xml:space="preserve">Question-Based Learning</w:t>
       </w:r>
       <w:r>
-        <w:t xml:space="preserve"> </w:t>
-      </w:r>
-      <w:r>
-        <w:t xml:space="preserve">(PQBL), basato sulla metodologia proposta da Jemstedt e Bälter. In questo caso, l’interfaccia richiede il caricamento di un documento didattico in formato PDF. Il sistema ne trasforma il contenuto in un percorso interattivo fondato su domande e feedback. Il testo non viene quindi proposto soltanto come materiale da leggere, ma diventa la base di un’attività di apprendimento attivo, nella quale l’utente è chiamato a recuperare, rielaborare e applicare le informazioni contenute nel documento.</w:t>
+        <w:t xml:space="preserve">. Nel caso dei questionari QSA, QSAr e ZTPI, il percorso ha inizio con l’inserimento dei punteggi. Il sistema elabora quindi il profilo e ne presenta una prima visualizzazione grafica. Successivamente prende avvio l’analisi guidata dei risultati, durante la quale l’utente può approfondire liberamente ciascun fattore prima di passare al successivo. L’interpretazione dei questionari si sviluppa secondo due modalità complementari. La prima è analitica ed è dedicata all’esame progressivo dei singoli fattori. Per ciascuna dimensione, Counselorbot presenta il risultato, ne chiarisce il significato, formula eventuali domande di approfondimento e propone strategie personalizzate. La seconda modalità è sintetica e mette in relazione le diverse componenti del profilo, facendo emergere le connessioni tra aspetti cognitivi, metacognitivi, affettivi, motivazionali e volitivi. In questo modo, il sistema non si limita a restituire una serie di punteggi isolati, ma favorisce la costruzione di una rappresentazione unitaria del funzionamento dello studente. Al termine dell’analisi, Counselorbot propone una sintesi complessiva dei principali punti di forza, delle aree suscettibili di sviluppo e delle strategie emerse durante il dialogo. L’utente può quindi selezionare e salvare le indicazioni considerate maggiormente significative.</w:t>
       </w:r>
     </w:p>
     <w:p>
       <w:pPr>
         <w:pStyle w:val="BodyText"/>
-        <w:jc w:val="both"/>
-      </w:pPr>
-      <w:r>
-        <w:t xml:space="preserve">L’architettura modulare di Counselorbot è stata progettata in modo da consentire la futura integrazione di ulteriori questionari, interviste e strumenti di supporto all’orientamento e all’apprendimento.</w:t>
-      </w:r>
-    </w:p>
-    <w:bookmarkEnd w:id="25"/>
-    <w:bookmarkStart w:id="26" w:name="passi-guidati-e-flussi-di-interazione"/>
-    <w:p>
-      <w:pPr>
-        <w:pStyle w:val="Heading3"/>
-      </w:pPr>
-      <w:r>
-        <w:rPr>
-          <w:color w:val="000000"/>
-        </w:rPr>
-        <w:t xml:space="preserve">2.2 Passi guidati e flussi di interazione</w:t>
-      </w:r>
-    </w:p>
-    <w:p>
-      <w:pPr>
-        <w:pStyle w:val="FirstParagraph"/>
-        <w:jc w:val="both"/>
-      </w:pPr>
-      <w:r>
-        <w:t xml:space="preserve">Il principio organizzativo centrale di Counselorbot è rappresentato dai passi guidati (</w:t>
-      </w:r>
-      <w:r>
-        <w:rPr>
-          <w:iCs/>
-          <w:i/>
-        </w:rPr>
-        <w:t xml:space="preserve">guided steps</w:t>
-      </w:r>
-      <w:r>
-        <w:t xml:space="preserve">), ossia sequenze predefinite che determinano l’ordine delle diverse fasi del dialogo. A ciascun passo è associato uno specifico meta-prompt, nel quale vengono definiti l’obiettivo della fase, le informazioni da prendere in considerazione e il tipo di risposta che il modello linguistico deve produrre. Questa struttura permette di affrontare sistematicamente tutti gli ambiti previsti dallo strumento selezionato, riducendo il rischio che alcune dimensioni vengano trascurate.</w:t>
-      </w:r>
-    </w:p>
-    <w:p>
-      <w:pPr>
-        <w:pStyle w:val="BodyText"/>
-        <w:jc w:val="both"/>
-      </w:pPr>
-      <w:r>
-        <w:t xml:space="preserve">All’interno di ciascun passo, tuttavia, il modello linguistico mantiene la flessibilità necessaria per adattare il linguaggio, gli esempi, le domande e il livello di approfondimento alle risposte dell’utente. Counselorbot realizza così una modalità di interazione ibrida, nella quale il controllo deterministico del percorso si combina con l’adattività conversazionale dell’LLM. L’interfaccia conversazionale presenta progressivamente le domande, le interpretazioni e le strategie associate a ciascun passo. L’utente può chiedere chiarimenti, richiedere esempi o soffermarsi su uno specifico argomento prima di proseguire.</w:t>
-      </w:r>
-    </w:p>
-    <w:p>
-      <w:pPr>
-        <w:pStyle w:val="BodyText"/>
-        <w:jc w:val="both"/>
-      </w:pPr>
-      <w:r>
-        <w:t xml:space="preserve">Poiché gli strumenti integrati presentano caratteristiche differenti, il sistema non applica un unico flusso indistinto, ma adotta percorsi specifici per i questionari, per la</w:t>
+      </w:pPr>
+      <w:r>
+        <w:t xml:space="preserve">La</w:t>
       </w:r>
       <w:r>
         <w:t xml:space="preserve"> </w:t>
@@ -927,7 +950,15 @@
         <w:t xml:space="preserve"> </w:t>
       </w:r>
       <w:r>
-        <w:t xml:space="preserve">e per il</w:t>
+        <w:t xml:space="preserve">segue invece un percorso qualitativo e narrativo. In questo modulo non vengono inseriti punteggi e non viene elaborato un profilo psicometrico. Il sistema presenta progressivamente le cinque domande previste dal protocollo, analizza le risposte dell’utente e può formulare ulteriori domande per approfondire gli elementi più significativi. Pur mantenendo la sequenza generale stabilita, il modello linguistico adatta il dialogo ai contenuti emersi. Al termine dell’intervista, Counselorbot individua i temi ricorrenti e li integra in una sintesi narrativa relativa agli interessi, ai modelli di riferimento, alle aspirazioni e alla costruzione dell’identità professionale.</w:t>
+      </w:r>
+    </w:p>
+    <w:p>
+      <w:pPr>
+        <w:pStyle w:val="BodyText"/>
+      </w:pPr>
+      <w:r>
+        <w:t xml:space="preserve">Il modulo di</w:t>
       </w:r>
       <w:r>
         <w:t xml:space="preserve"> </w:t>
@@ -940,53 +971,6 @@
         <w:t xml:space="preserve">Question-Based Learning</w:t>
       </w:r>
       <w:r>
-        <w:t xml:space="preserve">. Nel caso dei questionari QSA, QSAr e ZTPI, il percorso ha inizio con l’inserimento dei punteggi. Il sistema elabora quindi il profilo e ne presenta una prima visualizzazione grafica. Successivamente prende avvio l’analisi guidata dei risultati, durante la quale l’utente può approfondire liberamente ciascun fattore prima di passare al successivo. L’interpretazione dei questionari si sviluppa secondo due modalità complementari. La prima è analitica ed è dedicata all’esame progressivo dei singoli fattori. Per ciascuna dimensione, Counselorbot presenta il risultato, ne chiarisce il significato, formula eventuali domande di approfondimento e propone strategie personalizzate. La seconda modalità è sintetica e mette in relazione le diverse componenti del profilo, facendo emergere le connessioni tra aspetti cognitivi, metacognitivi, affettivi, motivazionali e volitivi. In questo modo, il sistema non si limita a restituire una serie di punteggi isolati, ma favorisce la costruzione di una rappresentazione unitaria del funzionamento dello studente. Al termine dell’analisi, Counselorbot propone una sintesi complessiva dei principali punti di forza, delle aree suscettibili di sviluppo e delle strategie emerse durante il dialogo. L’utente può quindi selezionare e salvare le indicazioni considerate maggiormente significative.</w:t>
-      </w:r>
-    </w:p>
-    <w:p>
-      <w:pPr>
-        <w:pStyle w:val="BodyText"/>
-        <w:jc w:val="both"/>
-      </w:pPr>
-      <w:r>
-        <w:t xml:space="preserve">La</w:t>
-      </w:r>
-      <w:r>
-        <w:t xml:space="preserve"> </w:t>
-      </w:r>
-      <w:r>
-        <w:rPr>
-          <w:iCs/>
-          <w:i/>
-        </w:rPr>
-        <w:t xml:space="preserve">Career Counseling Interview</w:t>
-      </w:r>
-      <w:r>
-        <w:t xml:space="preserve"> </w:t>
-      </w:r>
-      <w:r>
-        <w:t xml:space="preserve">segue invece un percorso qualitativo e narrativo. In questo modulo non vengono inseriti punteggi e non viene elaborato un profilo psicometrico. Il sistema presenta progressivamente le cinque domande previste dal protocollo, analizza le risposte dell’utente e può formulare ulteriori domande per approfondire gli elementi più significativi. Pur mantenendo la sequenza generale stabilita, il modello linguistico adatta il dialogo ai contenuti emersi. Al termine dell’intervista, Counselorbot individua i temi ricorrenti e li integra in una sintesi narrativa relativa agli interessi, ai modelli di riferimento, alle aspirazioni e alla costruzione dell’identità professionale.</w:t>
-      </w:r>
-    </w:p>
-    <w:p>
-      <w:pPr>
-        <w:pStyle w:val="BodyText"/>
-        <w:jc w:val="both"/>
-      </w:pPr>
-      <w:r>
-        <w:t xml:space="preserve">Il modulo di</w:t>
-      </w:r>
-      <w:r>
-        <w:t xml:space="preserve"> </w:t>
-      </w:r>
-      <w:r>
-        <w:rPr>
-          <w:iCs/>
-          <w:i/>
-        </w:rPr>
-        <w:t xml:space="preserve">Question-Based Learning</w:t>
-      </w:r>
-      <w:r>
         <w:t xml:space="preserve"> </w:t>
       </w:r>
       <w:r>
@@ -1000,16 +984,12 @@
         <w:pStyle w:val="Heading3"/>
       </w:pPr>
       <w:r>
-        <w:rPr>
-          <w:color w:val="000000"/>
-        </w:rPr>
         <w:t xml:space="preserve">2.3 Infrastruttura hardware</w:t>
       </w:r>
     </w:p>
     <w:p>
       <w:pPr>
         <w:pStyle w:val="FirstParagraph"/>
-        <w:jc w:val="both"/>
       </w:pPr>
       <w:r>
         <w:t xml:space="preserve">Counselorbot è eseguito su una workstation ad alte prestazioni, configurata per gestire localmente modelli linguistici e carichi computazionali intensivi. La macchina è dotata di un processore AMD Ryzen Threadripper 7980X con 64 core e 128 thread, di 256 GB di memoria RAM e di una GPU NVIDIA RTX 5090. La realizzazione dell’infrastruttura ha richiesto un investimento iniziale di circa 13.000 euro. La scelta di un’infrastruttura locale risponde innanzitutto all’esigenza di tutelare la riservatezza dei dati, poiché consente di ridurre il trasferimento delle conversazioni e delle informazioni degli utenti verso servizi esterni. Inoltre, permette di mantenere una maggiore indipendenza dai provider commerciali di intelligenza artificiale, evitando che il funzionamento del sistema dipenda esclusivamente dalla disponibilità, dai costi o dalle modifiche delle API esterne. Infine, l’investimento iniziale può contribuire alla sostenibilità economica nel medio e lungo periodo, soprattutto in presenza di un numero elevato di interazioni.</w:t>
@@ -1022,16 +1002,12 @@
         <w:pStyle w:val="Heading3"/>
       </w:pPr>
       <w:r>
-        <w:rPr>
-          <w:color w:val="000000"/>
-        </w:rPr>
         <w:t xml:space="preserve">2.4 Software</w:t>
       </w:r>
     </w:p>
     <w:p>
       <w:pPr>
         <w:pStyle w:val="FirstParagraph"/>
-        <w:jc w:val="both"/>
       </w:pPr>
       <w:r>
         <w:t xml:space="preserve">Il software di Counselorbot comprende il sistema di gestione dei modelli linguistici, i meccanismi di recupero delle conoscenze e della memoria e le funzioni di registrazione e analisi delle interazioni.</w:t>
@@ -1043,16 +1019,12 @@
         <w:pStyle w:val="Heading4"/>
       </w:pPr>
       <w:r>
-        <w:rPr>
-          <w:color w:val="000000"/>
-        </w:rPr>
         <w:t xml:space="preserve">2.4.1 Modelli linguistici</w:t>
       </w:r>
     </w:p>
     <w:p>
       <w:pPr>
         <w:pStyle w:val="FirstParagraph"/>
-        <w:jc w:val="both"/>
       </w:pPr>
       <w:r>
         <w:t xml:space="preserve">Per la gestione dei modelli linguistici, Counselorbot utilizza Ollama, uno strumento che consente l’esecuzione locale ed efficiente di modelli open-source. Durante la fase di sviluppo, la scelta si è orientata verso modelli con un numero di parametri inferiore a 15 miliardi, per garantire un equilibrio ottimale tra prestazioni e sostenibilità dell’infrastruttura locale. Sono stati testati modelli appartenenti a diverse famiglie, tra cui Gemma (nelle varianti da 2B, 4B e 12B parametri), DeepSeek-R1-Distill 8B e Qwen 3.5 9B.</w:t>
@@ -1065,16 +1037,12 @@
         <w:pStyle w:val="Heading4"/>
       </w:pPr>
       <w:r>
-        <w:rPr>
-          <w:color w:val="000000"/>
-        </w:rPr>
         <w:t xml:space="preserve">2.4.2 Recupero delle conoscenze e gestione della memoria</w:t>
       </w:r>
     </w:p>
     <w:p>
       <w:pPr>
         <w:pStyle w:val="FirstParagraph"/>
-        <w:jc w:val="both"/>
       </w:pPr>
       <w:r>
         <w:t xml:space="preserve">Counselorbot utilizza diversi meccanismi per recuperare le informazioni rilevanti e mantenere la continuità delle interazioni. Tali meccanismi comprendono la memoria di sessione, la base di conoscenza, il grafo della conoscenza e una memoria condivisa delle risposte. La memoria di sessione conserva le informazioni emerse nel corso della singola conversazione. In questo modo, il sistema può ricordare i risultati, le risposte dell’utente e le strategie già discusse, evitando ripetizioni e garantendo coerenza tra le diverse fasi del percorso. La base di conoscenza contiene strategie educative e contenuti teorici precedentemente selezionati e approvati. Le strategie sono associate ai fattori dei questionari e indicizzate attraverso parole chiave e rappresentazioni semantiche. Quando viene analizzata una determinata dimensione, il sistema recupera automaticamente i contenuti maggiormente pertinenti rispetto al fattore, al punteggio e alle informazioni fornite dallo studente. Le informazioni recuperate vengono inserite nel contesto del modello linguistico e impiegate per generare la risposta. Questa soluzione consente agli amministratori di ampliare o aggiornare la base di conoscenza senza dover intervenire manualmente sui prompt. Il grafo della conoscenza collega tra loro gli strumenti, i fattori, le strategie e i riferimenti teorici. Tale struttura permette di estendere la ricerca documentale anche ai concetti semanticamente vicini, superando una corrispondenza esclusivamente letterale tra i termini utilizzati dall’utente e quelli presenti nei contenuti indicizzati. A questi meccanismi si aggiunge una memoria condivisa delle risposte. Quando un utente valuta positivamente una risposta dell’assistente, questa può essere conservata e utilizzata come riferimento per domande analoghe formulate in sessioni successive. Le risposte precedenti non vengono necessariamente riproposte in forma identica, ma possono essere recuperate come esempi utili alla produzione di nuove risposte. Si introduce così un meccanismo di apprendimento collettivo, nel quale le interazioni considerate efficaci contribuiscono progressivamente al miglioramento del sistema. La memoria condivisa rimane tuttavia distinta dalla base di conoscenza validata: quest’ultima contiene materiali selezionati dagli amministratori, mentre la memoria condivisa deriva dalla valutazione delle risposte generate durante l’utilizzo.</w:t>
@@ -1087,16 +1055,12 @@
         <w:pStyle w:val="Heading4"/>
       </w:pPr>
       <w:r>
-        <w:rPr>
-          <w:color w:val="000000"/>
-        </w:rPr>
         <w:t xml:space="preserve">2.4.3 Gestione delle interazioni e anonimizzazione</w:t>
       </w:r>
     </w:p>
     <w:p>
       <w:pPr>
         <w:pStyle w:val="FirstParagraph"/>
-        <w:jc w:val="both"/>
       </w:pPr>
       <w:r>
         <w:t xml:space="preserve">Le interazioni vengono registrate in un archivio consultabile dagli amministratori. Tale archivio permette di monitorare l’utilizzo del sistema, individuare domande ricorrenti, identificare eventuali difficoltà nei percorsi guidati e rilevare le aree nelle quali le risposte richiedono ulteriori miglioramenti. È inoltre in fase di progettazione un sistema di anonimizzazione che consenta di analizzare i contenuti delle conversazioni senza esporre i dati personali degli studenti. L’obiettivo è rendere possibile lo studio aggregato delle strategie maggiormente discusse, dei fattori percepiti come critici e dell’efficacia attribuita dagli utenti alle risposte del sistema. Questi dati potranno essere utilizzati per valutare l’impatto di Counselorbot, perfezionare i protocolli di interazione e studiare l’impiego del sistema su scala più ampia.</w:t>
@@ -1110,16 +1074,12 @@
         <w:pStyle w:val="Heading3"/>
       </w:pPr>
       <w:r>
-        <w:rPr>
-          <w:color w:val="000000"/>
-        </w:rPr>
         <w:t xml:space="preserve">2.5 Struttura del sistema</w:t>
       </w:r>
     </w:p>
     <w:p>
       <w:pPr>
         <w:pStyle w:val="FirstParagraph"/>
-        <w:jc w:val="both"/>
       </w:pPr>
       <w:r>
         <w:t xml:space="preserve">L’architettura applicativa di Counselorbot si articola in quattro componenti principali: frontend, backend, database e livello di astrazione dei modelli linguistici. Il frontend costituisce il livello con cui l’utente interagisce direttamente. Comprende il selettore degli strumenti, i moduli per l’inserimento dei risultati, il caricamento dei documenti, la visualizzazione grafica del profilo, l’interfaccia conversazionale, la navigazione tra i passi guidati e le funzioni di salvataggio delle strategie. La sua organizzazione modulare permette di associare a ciascuno strumento una specifica interfaccia, mantenendo al tempo stesso un’esperienza d’uso coerente all’interno della piattaforma. Il backend gestisce la logica applicativa e coordina le differenti componenti del sistema. Esso espone i servizi relativi alla chat, ai questionari, ai passi guidati, alla memoria, alla base di conoscenza e alle funzioni amministrative. Durante l’interazione, il backend individua il passo corrente, seleziona il meta-prompt corrispondente, recupera le informazioni pertinenti e costruisce il contesto da inviare al modello linguistico. Successivamente riceve la risposta generata, la restituisce all’interfaccia e aggiorna la memoria della sessione. Il database relazionale conserva le configurazioni necessarie al funzionamento della piattaforma. Al suo interno sono registrati gli strumenti disponibili, la struttura dei questionari, i fattori, gli item, le scale, le stanine, i prompt, i meta-prompt, i passi guidati, le strategie, le configurazioni dei modelli, la memoria delle sessioni e le interazioni archiviate. Counselorbot non si limita quindi a ricevere punteggi esterni, ma dispone di una rappresentazione strutturata dei questionari e può interpretarli in relazione alle loro caratteristiche. Il livello di astrazione dei modelli linguistici mette infine in comunicazione il backend con i diversi provider di intelligenza artificiale. Attraverso un’interfaccia comune, esso gestisce l’invio dei prompt, la ricezione delle risposte e i parametri di generazione. Questa componente rende Counselorbot indipendente dal singolo modello e consente di utilizzare sia modelli eseguiti localmente mediante Ollama sia eventuali servizi remoti. L’organizzazione complessiva separa dunque i contenuti educativi, la logica dei percorsi, l’interfaccia utente e il modello linguistico. Tale separazione permette di aggiornare ed estendere Counselorbot intervenendo sulle singole componenti, senza dover riprogettare l’intero sistema.</w:t>
@@ -1133,9 +1093,6 @@
         <w:pStyle w:val="Heading2"/>
       </w:pPr>
       <w:r>
-        <w:rPr>
-          <w:color w:val="000000"/>
-        </w:rPr>
         <w:t xml:space="preserve">3. Metodologia di valutazione</w:t>
       </w:r>
     </w:p>
@@ -1145,16 +1102,12 @@
         <w:pStyle w:val="Heading3"/>
       </w:pPr>
       <w:r>
-        <w:rPr>
-          <w:color w:val="000000"/>
-        </w:rPr>
         <w:t xml:space="preserve">3.1 Disegno della ricerca</w:t>
       </w:r>
     </w:p>
     <w:p>
       <w:pPr>
         <w:pStyle w:val="FirstParagraph"/>
-        <w:jc w:val="both"/>
       </w:pPr>
       <w:r>
         <w:t xml:space="preserve">Per valutare il sistema descritto nel § 2 è stato adottato un disegno di ricerca articolato secondo il modello ADDIE (Branch, 2009). L’acronimo identifica cinque fasi iterative:</w:t>
@@ -1238,7 +1191,7 @@
         <w:t xml:space="preserve"> </w:t>
       </w:r>
       <w:r>
-        <w:t xml:space="preserve">del secondo ciclo di sviluppo. Il primo ciclo ha portato alla realizzazione di Counselorbot-Chat (CB-C), una versione basata su un’architettura RAG (</w:t>
+        <w:t xml:space="preserve">del secondo ciclo di sviluppo. Il primo ciclo ha portato alla realizzazione di CB-C, una versione basata su un’architettura RAG (</w:t>
       </w:r>
       <w:r>
         <w:rPr>
@@ -1261,7 +1214,7 @@
         <w:t xml:space="preserve">system prompt</w:t>
       </w:r>
       <w:r>
-        <w:t xml:space="preserve">. In tale configurazione, il modello linguistico rispondeva alle domande dello studente recuperando le informazioni pertinenti da documenti indicizzati in una memoria vettoriale, senza seguire una sequenza di interazione prestabilita. I risultati del primo ciclo, discussi nel § 4, hanno evidenziato alcune criticità, in particolare nella coerenza delle analisi prodotte e nelle modalità di inserimento manuale dei dati. Tali risultati hanno orientato un successivo processo di ottimizzazione e la progettazione di una nuova versione del sistema. Il secondo ciclo ha quindi condotto allo sviluppo di Step-by-Step Counselorbot (CB-SBS), che introduce una procedura guidata per passi, un grafo della conoscenza, l’indicizzazione semantica delle strategie e un’interfaccia ottimizzata per l’inserimento e la visualizzazione dei profili. La valutazione presentata in questo studio adotta un disegno comparativo</w:t>
+        <w:t xml:space="preserve">. In tale configurazione, il modello linguistico rispondeva alle domande dello studente recuperando le informazioni pertinenti da documenti indicizzati in una memoria vettoriale, senza seguire una sequenza di interazione prestabilita. I risultati del primo ciclo, discussi nel § 4, hanno evidenziato alcune criticità, in particolare nella coerenza delle analisi prodotte e nelle modalità di inserimento manuale dei dati. Tali risultati hanno orientato un successivo processo di ottimizzazione e la progettazione di una nuova versione del sistema. Il secondo ciclo ha quindi condotto allo sviluppo di CB-SBS, che introduce una procedura guidata per passi, un grafo della conoscenza, l’indicizzazione semantica delle strategie e un’interfaccia ottimizzata per l’inserimento e la visualizzazione dei profili. In particolare, l’inserimento manuale dei punteggi — segnalato come critico nella prima fase — è stato sostituito da un form iniziale e dal caricamento diretto dei PDF degli esiti; la memoria di sessione è stata rivista tramite sintesi dinamica del dialogo e iniezione costante dei punteggi a ogni turno; ed è stato introdotto un limite di token per contenere l’estensione degli interventi del LLM. La valutazione presentata in questo studio adotta un disegno comparativo</w:t>
       </w:r>
       <w:r>
         <w:t xml:space="preserve"> </w:t>
@@ -1287,16 +1240,12 @@
         <w:pStyle w:val="Heading3"/>
       </w:pPr>
       <w:r>
-        <w:rPr>
-          <w:color w:val="000000"/>
-        </w:rPr>
         <w:t xml:space="preserve">3.2 Partecipanti e procedura</w:t>
       </w:r>
     </w:p>
     <w:p>
       <w:pPr>
         <w:pStyle w:val="FirstParagraph"/>
-        <w:jc w:val="both"/>
       </w:pPr>
       <w:r>
         <w:t xml:space="preserve">Al momento della stesura dell’articolo, la raccolta dei dati è ancora in corso. Hanno completato la procedura 34 partecipanti: 7 hanno utilizzato la versione CB-SBS, mentre 27 hanno interagito con la versione precedente, CB-C. Il campione presenta una composizione eterogenea sia per età, compresa tra 14 e 53 anni, sia per livello di istruzione, che varia dalla scuola secondaria di primo grado alla laurea magistrale. La procedura prevedeva inizialmente la compilazione del Questionario sulle Strategie di Apprendimento (QSA). Successivamente, i partecipanti visualizzavano il proprio profilo e avviavano un’interazione con il chatbot articolata nell’analisi dei singoli fattori del questionario. Al termine del percorso veniva somministrato il questionario di gradimento.</w:t>
@@ -1309,16 +1258,12 @@
         <w:pStyle w:val="Heading3"/>
       </w:pPr>
       <w:r>
-        <w:rPr>
-          <w:color w:val="000000"/>
-        </w:rPr>
         <w:t xml:space="preserve">3.3 Strumenti e metriche</w:t>
       </w:r>
     </w:p>
     <w:p>
       <w:pPr>
         <w:pStyle w:val="FirstParagraph"/>
-        <w:jc w:val="both"/>
       </w:pPr>
       <w:r>
         <w:t xml:space="preserve">Il questionario di gradimento è composto da dieci item relativi ad altrettanti aspetti dell’esperienza di utilizzo: utilità percepita, pertinenza delle risposte, chiarezza delle spiegazioni, adeguatezza del livello di dettaglio, facilità d’uso dell’interfaccia, velocità di risposta, fiducia nelle informazioni ricevute, capacità del sistema di stimolare la riflessione su di sé, coinvolgimento complessivo e intenzione di riutilizzare il chatbot o di raccomandarlo ad altri. Per ciascun item viene calcolata la media aritmetica, separatamente per le due versioni del sistema. Gli item vengono analizzati singolarmente e non sono aggregati in sottoscale. Il questionario raccoglie inoltre informazioni sociodemografiche relative a età, sesso, titolo di studio, tipo di istituto frequentato e provenienza geografica. Nella versione estesa sono presenti anche due domande aperte, finalizzate a raccogliere osservazioni sull’esperienza e suggerimenti per il miglioramento del sistema. Le risposte vengono analizzate qualitativamente mediante una categorizzazione tematica.</w:t>
@@ -1331,16 +1276,12 @@
         <w:pStyle w:val="Heading3"/>
       </w:pPr>
       <w:r>
-        <w:rPr>
-          <w:color w:val="000000"/>
-        </w:rPr>
         <w:t xml:space="preserve">3.4 Selezione e valutazione del modello linguistico locale</w:t>
       </w:r>
     </w:p>
     <w:p>
       <w:pPr>
         <w:pStyle w:val="FirstParagraph"/>
-        <w:jc w:val="both"/>
       </w:pPr>
       <w:r>
         <w:t xml:space="preserve">La selezione del modello linguistico locale è stata articolata in due fasi. In una prima fase sono stati esaminati i risultati pubblicamente disponibili di alcuni benchmark utilizzati per confrontare le prestazioni dei modelli linguistici in compiti di conoscenza generale, ragionamento avanzato e generazione di codice. In particolare, sono stati considerati i risultati ottenuti in MMLU-Pro, GPQA Diamond e LiveCodeBench. L’analisi di tali benchmark ha permesso di individuare i modelli con le prestazioni complessivamente più elevate tra quelli compatibili con i requisiti dell’infrastruttura locale.</w:t>
@@ -1369,7 +1310,7 @@
           <w:p>
             <w:pPr>
               <w:pStyle w:val="Compact"/>
-              <w:jc w:val="both"/>
+              <w:jc w:val="left"/>
             </w:pPr>
             <w:r>
               <w:rPr>
@@ -1385,7 +1326,7 @@
           <w:p>
             <w:pPr>
               <w:pStyle w:val="Compact"/>
-              <w:jc w:val="both"/>
+              <w:jc w:val="left"/>
             </w:pPr>
             <w:r>
               <w:rPr>
@@ -1401,7 +1342,7 @@
           <w:p>
             <w:pPr>
               <w:pStyle w:val="Compact"/>
-              <w:jc w:val="both"/>
+              <w:jc w:val="left"/>
             </w:pPr>
             <w:r>
               <w:rPr>
@@ -1417,7 +1358,7 @@
           <w:p>
             <w:pPr>
               <w:pStyle w:val="Compact"/>
-              <w:jc w:val="both"/>
+              <w:jc w:val="left"/>
             </w:pPr>
             <w:r>
               <w:rPr>
@@ -1433,7 +1374,7 @@
           <w:p>
             <w:pPr>
               <w:pStyle w:val="Compact"/>
-              <w:jc w:val="both"/>
+              <w:jc w:val="left"/>
             </w:pPr>
             <w:r>
               <w:rPr>
@@ -1451,7 +1392,7 @@
           <w:p>
             <w:pPr>
               <w:pStyle w:val="Compact"/>
-              <w:jc w:val="both"/>
+              <w:jc w:val="left"/>
             </w:pPr>
             <w:r>
               <w:t xml:space="preserve">Gemma 4 4B</w:t>
@@ -1463,7 +1404,7 @@
           <w:p>
             <w:pPr>
               <w:pStyle w:val="Compact"/>
-              <w:jc w:val="both"/>
+              <w:jc w:val="left"/>
             </w:pPr>
             <w:r>
               <w:t xml:space="preserve">4B</w:t>
@@ -1475,7 +1416,7 @@
           <w:p>
             <w:pPr>
               <w:pStyle w:val="Compact"/>
-              <w:jc w:val="both"/>
+              <w:jc w:val="left"/>
             </w:pPr>
             <w:r>
               <w:t xml:space="preserve">69,4%</w:t>
@@ -1487,7 +1428,7 @@
           <w:p>
             <w:pPr>
               <w:pStyle w:val="Compact"/>
-              <w:jc w:val="both"/>
+              <w:jc w:val="left"/>
             </w:pPr>
             <w:r>
               <w:t xml:space="preserve">58,6%</w:t>
@@ -1499,7 +1440,7 @@
           <w:p>
             <w:pPr>
               <w:pStyle w:val="Compact"/>
-              <w:jc w:val="both"/>
+              <w:jc w:val="left"/>
             </w:pPr>
             <w:r>
               <w:t xml:space="preserve">52,0%</w:t>
@@ -1513,7 +1454,7 @@
           <w:p>
             <w:pPr>
               <w:pStyle w:val="Compact"/>
-              <w:jc w:val="both"/>
+              <w:jc w:val="left"/>
             </w:pPr>
             <w:r>
               <w:t xml:space="preserve">Gemma 4 2B</w:t>
@@ -1525,7 +1466,7 @@
           <w:p>
             <w:pPr>
               <w:pStyle w:val="Compact"/>
-              <w:jc w:val="both"/>
+              <w:jc w:val="left"/>
             </w:pPr>
             <w:r>
               <w:t xml:space="preserve">2B</w:t>
@@ -1537,7 +1478,7 @@
           <w:p>
             <w:pPr>
               <w:pStyle w:val="Compact"/>
-              <w:jc w:val="both"/>
+              <w:jc w:val="left"/>
             </w:pPr>
             <w:r>
               <w:t xml:space="preserve">60,0%</w:t>
@@ -1549,7 +1490,7 @@
           <w:p>
             <w:pPr>
               <w:pStyle w:val="Compact"/>
-              <w:jc w:val="both"/>
+              <w:jc w:val="left"/>
             </w:pPr>
             <w:r>
               <w:t xml:space="preserve">43,4%</w:t>
@@ -1561,7 +1502,7 @@
           <w:p>
             <w:pPr>
               <w:pStyle w:val="Compact"/>
-              <w:jc w:val="both"/>
+              <w:jc w:val="left"/>
             </w:pPr>
             <w:r>
               <w:t xml:space="preserve">44,0%</w:t>
@@ -1575,7 +1516,7 @@
           <w:p>
             <w:pPr>
               <w:pStyle w:val="Compact"/>
-              <w:jc w:val="both"/>
+              <w:jc w:val="left"/>
             </w:pPr>
             <w:r>
               <w:t xml:space="preserve">Gemma 4 12B</w:t>
@@ -1587,7 +1528,7 @@
           <w:p>
             <w:pPr>
               <w:pStyle w:val="Compact"/>
-              <w:jc w:val="both"/>
+              <w:jc w:val="left"/>
             </w:pPr>
             <w:r>
               <w:t xml:space="preserve">12B</w:t>
@@ -1599,7 +1540,7 @@
           <w:p>
             <w:pPr>
               <w:pStyle w:val="Compact"/>
-              <w:jc w:val="both"/>
+              <w:jc w:val="left"/>
             </w:pPr>
             <w:r>
               <w:t xml:space="preserve">77,2%</w:t>
@@ -1611,7 +1552,7 @@
           <w:p>
             <w:pPr>
               <w:pStyle w:val="Compact"/>
-              <w:jc w:val="both"/>
+              <w:jc w:val="left"/>
             </w:pPr>
             <w:r>
               <w:t xml:space="preserve">78,8%</w:t>
@@ -1623,7 +1564,7 @@
           <w:p>
             <w:pPr>
               <w:pStyle w:val="Compact"/>
-              <w:jc w:val="both"/>
+              <w:jc w:val="left"/>
             </w:pPr>
             <w:r>
               <w:t xml:space="preserve">72,0%</w:t>
@@ -1637,7 +1578,7 @@
           <w:p>
             <w:pPr>
               <w:pStyle w:val="Compact"/>
-              <w:jc w:val="both"/>
+              <w:jc w:val="left"/>
             </w:pPr>
             <w:r>
               <w:t xml:space="preserve">DeepSeek-R1-Distill 8B</w:t>
@@ -1649,7 +1590,7 @@
           <w:p>
             <w:pPr>
               <w:pStyle w:val="Compact"/>
-              <w:jc w:val="both"/>
+              <w:jc w:val="left"/>
             </w:pPr>
             <w:r>
               <w:t xml:space="preserve">8B</w:t>
@@ -1661,7 +1602,7 @@
           <w:p>
             <w:pPr>
               <w:pStyle w:val="Compact"/>
-              <w:jc w:val="both"/>
+              <w:jc w:val="left"/>
             </w:pPr>
             <w:r>
               <w:t xml:space="preserve">—</w:t>
@@ -1673,7 +1614,7 @@
           <w:p>
             <w:pPr>
               <w:pStyle w:val="Compact"/>
-              <w:jc w:val="both"/>
+              <w:jc w:val="left"/>
             </w:pPr>
             <w:r>
               <w:t xml:space="preserve">49,0%</w:t>
@@ -1685,7 +1626,7 @@
           <w:p>
             <w:pPr>
               <w:pStyle w:val="Compact"/>
-              <w:jc w:val="both"/>
+              <w:jc w:val="left"/>
             </w:pPr>
             <w:r>
               <w:t xml:space="preserve">39,6%</w:t>
@@ -1699,7 +1640,7 @@
           <w:p>
             <w:pPr>
               <w:pStyle w:val="Compact"/>
-              <w:jc w:val="both"/>
+              <w:jc w:val="left"/>
             </w:pPr>
             <w:r>
               <w:t xml:space="preserve">Qwen 3.5 9B</w:t>
@@ -1711,7 +1652,7 @@
           <w:p>
             <w:pPr>
               <w:pStyle w:val="Compact"/>
-              <w:jc w:val="both"/>
+              <w:jc w:val="left"/>
             </w:pPr>
             <w:r>
               <w:t xml:space="preserve">9B</w:t>
@@ -1723,7 +1664,7 @@
           <w:p>
             <w:pPr>
               <w:pStyle w:val="Compact"/>
-              <w:jc w:val="both"/>
+              <w:jc w:val="left"/>
             </w:pPr>
             <w:r>
               <w:t xml:space="preserve">82,5%</w:t>
@@ -1735,7 +1676,7 @@
           <w:p>
             <w:pPr>
               <w:pStyle w:val="Compact"/>
-              <w:jc w:val="both"/>
+              <w:jc w:val="left"/>
             </w:pPr>
             <w:r>
               <w:t xml:space="preserve">81,7%</w:t>
@@ -1747,7 +1688,7 @@
           <w:p>
             <w:pPr>
               <w:pStyle w:val="Compact"/>
-              <w:jc w:val="both"/>
+              <w:jc w:val="left"/>
             </w:pPr>
             <w:r>
               <w:t xml:space="preserve">65,6%</w:t>
@@ -1759,7 +1700,6 @@
     <w:p>
       <w:pPr>
         <w:pStyle w:val="BodyText"/>
-        <w:jc w:val="both"/>
       </w:pPr>
       <w:r>
         <w:t xml:space="preserve">La scelta dei modelli candidati non è stata tuttavia determinata esclusivamente dai punteggi ottenuti nei benchmark. Sono stati considerati anche il numero di parametri e la compatibilità con l’hardware disponibile, privilegiando modelli con meno di 15 miliardi di parametri, in grado di garantire un equilibrio tra prestazioni, velocità di esecuzione e sostenibilità computazionale.</w:t>
@@ -1768,7 +1708,6 @@
     <w:p>
       <w:pPr>
         <w:pStyle w:val="BodyText"/>
-        <w:jc w:val="both"/>
       </w:pPr>
       <w:r>
         <w:t xml:space="preserve">Nella seconda fase, i modelli selezionati sulla base dei benchmark sono stati installati e testati direttamente sulla macchina locale descritta nel § 2.3. La valutazione è stata condotta sull’intero flusso degli undici passi previsti per l’analisi del QSA.</w:t>
@@ -1777,10 +1716,9 @@
     <w:p>
       <w:pPr>
         <w:pStyle w:val="BodyText"/>
-        <w:jc w:val="both"/>
-      </w:pPr>
-      <w:r>
-        <w:t xml:space="preserve">Per ciascun modello sono state esaminate la capacità di rispettare la sequenza prestabilita, la copertura di tutti i fattori del questionario, la coerenza delle interpretazioni formulate e la pertinenza pedagogica delle strategie proposte. Sono stati inoltre rilevati due indicatori tecnici: la velocità media di generazione, espressa in token al secondo, e il Time to First Token (TTFT), corrispondente al tempo intercorrente tra l’invio della richiesta e la produzione del primo token della risposta.</w:t>
+      </w:pPr>
+      <w:r>
+        <w:t xml:space="preserve">Per ciascun modello sono state esaminate la capacità di rispettare la sequenza prestabilita, la copertura di tutti i fattori del questionario, la coerenza delle interpretazioni formulate e la pertinenza pedagogica delle strategie proposte. Tali criteri sono stati aggregati in un punteggio complessivo di qualità (da 0 a 1) che sintetizza copertura dei fattori, correttezza interpretativa rispetto ai punteggi, pertinenza pedagogica dei consigli e aderenza al formato richiesto. Sono stati inoltre rilevati due indicatori tecnici: la velocità media di generazione, espressa in token al secondo, e il Time to First Token (TTFT), corrispondente al tempo intercorrente tra l’invio della richiesta e la produzione del primo token della risposta. La valutazione dei criteri qualitativi e l’attribuzione del punteggio di qualità sono state eseguite in modalità automatica tramite Opus 4.8.</w:t>
       </w:r>
     </w:p>
     <w:bookmarkEnd w:id="37"/>
@@ -1791,9 +1729,6 @@
         <w:pStyle w:val="Heading2"/>
       </w:pPr>
       <w:r>
-        <w:rPr>
-          <w:color w:val="000000"/>
-        </w:rPr>
         <w:t xml:space="preserve">4. Risultati</w:t>
       </w:r>
     </w:p>
@@ -1803,19 +1738,15 @@
         <w:pStyle w:val="Heading3"/>
       </w:pPr>
       <w:r>
-        <w:rPr>
-          <w:color w:val="000000"/>
-        </w:rPr>
         <w:t xml:space="preserve">4.1 Selezione del modello locale</w:t>
       </w:r>
     </w:p>
     <w:p>
       <w:pPr>
         <w:pStyle w:val="FirstParagraph"/>
-        <w:jc w:val="both"/>
-      </w:pPr>
-      <w:r>
-        <w:t xml:space="preserve">I modelli pre-selezionati in base ai benchmark pubblici (§3.4) sono stati sottoposti a una valutazione diretta sulla macchina locale (§2.3), riproducendo l’intero flusso degli undici passi dell’analisi del QSA con gli stessi</w:t>
+      </w:pPr>
+      <w:r>
+        <w:t xml:space="preserve">La tabella seguente presenta i risultati della valutazione locale dei modelli, condotta riproducendo l’intero flusso degli undici passi del QSA con gli stessi</w:t>
       </w:r>
       <w:r>
         <w:t xml:space="preserve"> </w:t>
@@ -1831,23 +1762,7 @@
         <w:t xml:space="preserve"> </w:t>
       </w:r>
       <w:r>
-        <w:t xml:space="preserve">e direttive impiegati in produzione. Per ciascun modello sono stati rilevati due indicatori tecnici — velocità media di generazione (token al secondo) e</w:t>
-      </w:r>
-      <w:r>
-        <w:t xml:space="preserve"> </w:t>
-      </w:r>
-      <w:r>
-        <w:rPr>
-          <w:iCs/>
-          <w:i/>
-        </w:rPr>
-        <w:t xml:space="preserve">Time to First Token</w:t>
-      </w:r>
-      <w:r>
-        <w:t xml:space="preserve"> </w:t>
-      </w:r>
-      <w:r>
-        <w:t xml:space="preserve">(TTFT) — e un punteggio di qualità (da 0 a 1) che aggrega copertura dei fattori, correttezza interpretativa rispetto ai punteggi, pertinenza pedagogica dei consigli e aderenza al formato richiesto.</w:t>
+        <w:t xml:space="preserve">e direttive impiegati in produzione.</w:t>
       </w:r>
     </w:p>
     <w:tbl>
@@ -1873,7 +1788,7 @@
           <w:p>
             <w:pPr>
               <w:pStyle w:val="Compact"/>
-              <w:jc w:val="both"/>
+              <w:jc w:val="left"/>
             </w:pPr>
             <w:r>
               <w:t xml:space="preserve">Modello</w:t>
@@ -1885,7 +1800,7 @@
           <w:p>
             <w:pPr>
               <w:pStyle w:val="Compact"/>
-              <w:jc w:val="both"/>
+              <w:jc w:val="left"/>
             </w:pPr>
             <w:r>
               <w:t xml:space="preserve">Parametri</w:t>
@@ -1897,7 +1812,7 @@
           <w:p>
             <w:pPr>
               <w:pStyle w:val="Compact"/>
-              <w:jc w:val="both"/>
+              <w:jc w:val="left"/>
             </w:pPr>
             <w:r>
               <w:t xml:space="preserve">Qualità</w:t>
@@ -1909,7 +1824,7 @@
           <w:p>
             <w:pPr>
               <w:pStyle w:val="Compact"/>
-              <w:jc w:val="both"/>
+              <w:jc w:val="left"/>
             </w:pPr>
             <w:r>
               <w:t xml:space="preserve">Token/s</w:t>
@@ -1921,7 +1836,7 @@
           <w:p>
             <w:pPr>
               <w:pStyle w:val="Compact"/>
-              <w:jc w:val="both"/>
+              <w:jc w:val="left"/>
             </w:pPr>
             <w:r>
               <w:t xml:space="preserve">TTFT</w:t>
@@ -1935,7 +1850,7 @@
           <w:p>
             <w:pPr>
               <w:pStyle w:val="Compact"/>
-              <w:jc w:val="both"/>
+              <w:jc w:val="left"/>
             </w:pPr>
             <w:r>
               <w:t xml:space="preserve">Gemma 4 4B</w:t>
@@ -1947,7 +1862,7 @@
           <w:p>
             <w:pPr>
               <w:pStyle w:val="Compact"/>
-              <w:jc w:val="both"/>
+              <w:jc w:val="left"/>
             </w:pPr>
             <w:r>
               <w:t xml:space="preserve">4B</w:t>
@@ -1959,7 +1874,7 @@
           <w:p>
             <w:pPr>
               <w:pStyle w:val="Compact"/>
-              <w:jc w:val="both"/>
+              <w:jc w:val="left"/>
             </w:pPr>
             <w:r>
               <w:t xml:space="preserve">0,83</w:t>
@@ -1971,7 +1886,7 @@
           <w:p>
             <w:pPr>
               <w:pStyle w:val="Compact"/>
-              <w:jc w:val="both"/>
+              <w:jc w:val="left"/>
             </w:pPr>
             <w:r>
               <w:t xml:space="preserve">472</w:t>
@@ -1983,7 +1898,7 @@
           <w:p>
             <w:pPr>
               <w:pStyle w:val="Compact"/>
-              <w:jc w:val="both"/>
+              <w:jc w:val="left"/>
             </w:pPr>
             <w:r>
               <w:t xml:space="preserve">4,5 s</w:t>
@@ -1997,7 +1912,7 @@
           <w:p>
             <w:pPr>
               <w:pStyle w:val="Compact"/>
-              <w:jc w:val="both"/>
+              <w:jc w:val="left"/>
             </w:pPr>
             <w:r>
               <w:t xml:space="preserve">Gemma 4 2B</w:t>
@@ -2009,7 +1924,7 @@
           <w:p>
             <w:pPr>
               <w:pStyle w:val="Compact"/>
-              <w:jc w:val="both"/>
+              <w:jc w:val="left"/>
             </w:pPr>
             <w:r>
               <w:t xml:space="preserve">2B</w:t>
@@ -2021,7 +1936,7 @@
           <w:p>
             <w:pPr>
               <w:pStyle w:val="Compact"/>
-              <w:jc w:val="both"/>
+              <w:jc w:val="left"/>
             </w:pPr>
             <w:r>
               <w:t xml:space="preserve">0,76</w:t>
@@ -2033,7 +1948,7 @@
           <w:p>
             <w:pPr>
               <w:pStyle w:val="Compact"/>
-              <w:jc w:val="both"/>
+              <w:jc w:val="left"/>
             </w:pPr>
             <w:r>
               <w:t xml:space="preserve">768</w:t>
@@ -2045,7 +1960,7 @@
           <w:p>
             <w:pPr>
               <w:pStyle w:val="Compact"/>
-              <w:jc w:val="both"/>
+              <w:jc w:val="left"/>
             </w:pPr>
             <w:r>
               <w:t xml:space="preserve">3,4 s</w:t>
@@ -2059,7 +1974,7 @@
           <w:p>
             <w:pPr>
               <w:pStyle w:val="Compact"/>
-              <w:jc w:val="both"/>
+              <w:jc w:val="left"/>
             </w:pPr>
             <w:r>
               <w:t xml:space="preserve">Gemma 4 12B</w:t>
@@ -2071,7 +1986,7 @@
           <w:p>
             <w:pPr>
               <w:pStyle w:val="Compact"/>
-              <w:jc w:val="both"/>
+              <w:jc w:val="left"/>
             </w:pPr>
             <w:r>
               <w:t xml:space="preserve">12B</w:t>
@@ -2083,7 +1998,7 @@
           <w:p>
             <w:pPr>
               <w:pStyle w:val="Compact"/>
-              <w:jc w:val="both"/>
+              <w:jc w:val="left"/>
             </w:pPr>
             <w:r>
               <w:t xml:space="preserve">0,74</w:t>
@@ -2095,7 +2010,7 @@
           <w:p>
             <w:pPr>
               <w:pStyle w:val="Compact"/>
-              <w:jc w:val="both"/>
+              <w:jc w:val="left"/>
             </w:pPr>
             <w:r>
               <w:t xml:space="preserve">374</w:t>
@@ -2107,7 +2022,7 @@
           <w:p>
             <w:pPr>
               <w:pStyle w:val="Compact"/>
-              <w:jc w:val="both"/>
+              <w:jc w:val="left"/>
             </w:pPr>
             <w:r>
               <w:t xml:space="preserve">12,3 s</w:t>
@@ -2121,7 +2036,7 @@
           <w:p>
             <w:pPr>
               <w:pStyle w:val="Compact"/>
-              <w:jc w:val="both"/>
+              <w:jc w:val="left"/>
             </w:pPr>
             <w:r>
               <w:t xml:space="preserve">DeepSeek-R1-Distill 8B</w:t>
@@ -2133,7 +2048,7 @@
           <w:p>
             <w:pPr>
               <w:pStyle w:val="Compact"/>
-              <w:jc w:val="both"/>
+              <w:jc w:val="left"/>
             </w:pPr>
             <w:r>
               <w:t xml:space="preserve">8B</w:t>
@@ -2145,7 +2060,7 @@
           <w:p>
             <w:pPr>
               <w:pStyle w:val="Compact"/>
-              <w:jc w:val="both"/>
+              <w:jc w:val="left"/>
             </w:pPr>
             <w:r>
               <w:t xml:space="preserve">0,62</w:t>
@@ -2157,7 +2072,7 @@
           <w:p>
             <w:pPr>
               <w:pStyle w:val="Compact"/>
-              <w:jc w:val="both"/>
+              <w:jc w:val="left"/>
             </w:pPr>
             <w:r>
               <w:t xml:space="preserve">555</w:t>
@@ -2169,7 +2084,7 @@
           <w:p>
             <w:pPr>
               <w:pStyle w:val="Compact"/>
-              <w:jc w:val="both"/>
+              <w:jc w:val="left"/>
             </w:pPr>
             <w:r>
               <w:t xml:space="preserve">7,9 s</w:t>
@@ -2183,7 +2098,7 @@
           <w:p>
             <w:pPr>
               <w:pStyle w:val="Compact"/>
-              <w:jc w:val="both"/>
+              <w:jc w:val="left"/>
             </w:pPr>
             <w:r>
               <w:t xml:space="preserve">Qwen 3.5 9B</w:t>
@@ -2195,7 +2110,7 @@
           <w:p>
             <w:pPr>
               <w:pStyle w:val="Compact"/>
-              <w:jc w:val="both"/>
+              <w:jc w:val="left"/>
             </w:pPr>
             <w:r>
               <w:t xml:space="preserve">9B</w:t>
@@ -2207,7 +2122,7 @@
           <w:p>
             <w:pPr>
               <w:pStyle w:val="Compact"/>
-              <w:jc w:val="both"/>
+              <w:jc w:val="left"/>
             </w:pPr>
             <w:r>
               <w:t xml:space="preserve">0,45</w:t>
@@ -2219,7 +2134,7 @@
           <w:p>
             <w:pPr>
               <w:pStyle w:val="Compact"/>
-              <w:jc w:val="both"/>
+              <w:jc w:val="left"/>
             </w:pPr>
             <w:r>
               <w:t xml:space="preserve">186</w:t>
@@ -2231,7 +2146,7 @@
           <w:p>
             <w:pPr>
               <w:pStyle w:val="Compact"/>
-              <w:jc w:val="both"/>
+              <w:jc w:val="left"/>
             </w:pPr>
             <w:r>
               <w:t xml:space="preserve">11,3 s</w:t>
@@ -2243,7 +2158,6 @@
     <w:p>
       <w:pPr>
         <w:pStyle w:val="BodyText"/>
-        <w:jc w:val="both"/>
       </w:pPr>
       <w:r>
         <w:t xml:space="preserve">Tutti i modelli hanno mantenuto piena affidabilità di connessione lungo l’intero flusso. Gemma 4 4B ha ottenuto la qualità più alta (0,83), rispettando la sequenza prestabilita e fornendo interpretazioni coerenti con i punteggi in nove degli undici passi, a fronte di una velocità di generazione (472 token/s) e di un TTFT (4,5 s) adeguati all’uso interattivo. Gemma 4 12B, pur completo nella profondità d’analisi, ha registrato un TTFT sensibilmente superiore (12,3 s); DeepSeek-R1-Distill 8B ha alternato risposte eccellenti e scadenti a seconda del passo, mentre Qwen 3.5 9B ha riportato la qualità più bassa (0,45) nonostante il maggior numero di parametri. Sulla base di questo equilibrio tra qualità, velocità e sostenibilità computazionale, Gemma 4 4B è stato selezionato per l’istanza CB-SBS.</w:t>
@@ -2256,16 +2170,12 @@
         <w:pStyle w:val="Heading3"/>
       </w:pPr>
       <w:r>
-        <w:rPr>
-          <w:color w:val="000000"/>
-        </w:rPr>
         <w:t xml:space="preserve">4.2 Esperienza utente</w:t>
       </w:r>
     </w:p>
     <w:p>
       <w:pPr>
         <w:pStyle w:val="FirstParagraph"/>
-        <w:jc w:val="both"/>
       </w:pPr>
       <w:r>
         <w:t xml:space="preserve">La versione CB-SBS presenta valutazioni tendenzialmente superiori alla precedente in 9 dimensioni su 10. Dei 27 partecipanti della versione CB-C, 16 hanno fornito valutazioni numeriche e 11 solo commenti aperti; per CB-SBS è stato escluso un record di test, portando il numeratore a 6. La tabella seguente confronta le medie delle due versioni.</w:t>
@@ -2293,7 +2203,7 @@
           <w:p>
             <w:pPr>
               <w:pStyle w:val="Compact"/>
-              <w:jc w:val="both"/>
+              <w:jc w:val="left"/>
             </w:pPr>
             <w:r>
               <w:t xml:space="preserve">Dimensione</w:t>
@@ -2305,7 +2215,7 @@
           <w:p>
             <w:pPr>
               <w:pStyle w:val="Compact"/>
-              <w:jc w:val="both"/>
+              <w:jc w:val="left"/>
             </w:pPr>
             <w:r>
               <w:t xml:space="preserve">CB-SBS (n=6)</w:t>
@@ -2317,7 +2227,7 @@
           <w:p>
             <w:pPr>
               <w:pStyle w:val="Compact"/>
-              <w:jc w:val="both"/>
+              <w:jc w:val="left"/>
             </w:pPr>
             <w:r>
               <w:t xml:space="preserve">CB-C (n=16)</w:t>
@@ -2329,7 +2239,7 @@
           <w:p>
             <w:pPr>
               <w:pStyle w:val="Compact"/>
-              <w:jc w:val="both"/>
+              <w:jc w:val="left"/>
             </w:pPr>
             <w:r>
               <w:t xml:space="preserve">Δ</w:t>
@@ -2343,7 +2253,7 @@
           <w:p>
             <w:pPr>
               <w:pStyle w:val="Compact"/>
-              <w:jc w:val="both"/>
+              <w:jc w:val="left"/>
             </w:pPr>
             <w:r>
               <w:t xml:space="preserve">Facilità d’uso</w:t>
@@ -2355,7 +2265,7 @@
           <w:p>
             <w:pPr>
               <w:pStyle w:val="Compact"/>
-              <w:jc w:val="both"/>
+              <w:jc w:val="left"/>
             </w:pPr>
             <w:r>
               <w:t xml:space="preserve">4,17</w:t>
@@ -2367,7 +2277,7 @@
           <w:p>
             <w:pPr>
               <w:pStyle w:val="Compact"/>
-              <w:jc w:val="both"/>
+              <w:jc w:val="left"/>
             </w:pPr>
             <w:r>
               <w:t xml:space="preserve">3,38</w:t>
@@ -2379,7 +2289,7 @@
           <w:p>
             <w:pPr>
               <w:pStyle w:val="Compact"/>
-              <w:jc w:val="both"/>
+              <w:jc w:val="left"/>
             </w:pPr>
             <w:r>
               <w:t xml:space="preserve">+0,79</w:t>
@@ -2393,7 +2303,7 @@
           <w:p>
             <w:pPr>
               <w:pStyle w:val="Compact"/>
-              <w:jc w:val="both"/>
+              <w:jc w:val="left"/>
             </w:pPr>
             <w:r>
               <w:t xml:space="preserve">Pertinenza delle risposte</w:t>
@@ -2405,7 +2315,7 @@
           <w:p>
             <w:pPr>
               <w:pStyle w:val="Compact"/>
-              <w:jc w:val="both"/>
+              <w:jc w:val="left"/>
             </w:pPr>
             <w:r>
               <w:t xml:space="preserve">4,17</w:t>
@@ -2417,7 +2327,7 @@
           <w:p>
             <w:pPr>
               <w:pStyle w:val="Compact"/>
-              <w:jc w:val="both"/>
+              <w:jc w:val="left"/>
             </w:pPr>
             <w:r>
               <w:t xml:space="preserve">3,56</w:t>
@@ -2429,7 +2339,7 @@
           <w:p>
             <w:pPr>
               <w:pStyle w:val="Compact"/>
-              <w:jc w:val="both"/>
+              <w:jc w:val="left"/>
             </w:pPr>
             <w:r>
               <w:t xml:space="preserve">+0,60</w:t>
@@ -2443,7 +2353,7 @@
           <w:p>
             <w:pPr>
               <w:pStyle w:val="Compact"/>
-              <w:jc w:val="both"/>
+              <w:jc w:val="left"/>
             </w:pPr>
             <w:r>
               <w:t xml:space="preserve">Fiducia nelle informazioni</w:t>
@@ -2455,7 +2365,7 @@
           <w:p>
             <w:pPr>
               <w:pStyle w:val="Compact"/>
-              <w:jc w:val="both"/>
+              <w:jc w:val="left"/>
             </w:pPr>
             <w:r>
               <w:t xml:space="preserve">3,83</w:t>
@@ -2467,7 +2377,7 @@
           <w:p>
             <w:pPr>
               <w:pStyle w:val="Compact"/>
-              <w:jc w:val="both"/>
+              <w:jc w:val="left"/>
             </w:pPr>
             <w:r>
               <w:t xml:space="preserve">3,19</w:t>
@@ -2479,7 +2389,7 @@
           <w:p>
             <w:pPr>
               <w:pStyle w:val="Compact"/>
-              <w:jc w:val="both"/>
+              <w:jc w:val="left"/>
             </w:pPr>
             <w:r>
               <w:t xml:space="preserve">+0,65</w:t>
@@ -2493,7 +2403,7 @@
           <w:p>
             <w:pPr>
               <w:pStyle w:val="Compact"/>
-              <w:jc w:val="both"/>
+              <w:jc w:val="left"/>
             </w:pPr>
             <w:r>
               <w:t xml:space="preserve">Coinvolgimento</w:t>
@@ -2505,7 +2415,7 @@
           <w:p>
             <w:pPr>
               <w:pStyle w:val="Compact"/>
-              <w:jc w:val="both"/>
+              <w:jc w:val="left"/>
             </w:pPr>
             <w:r>
               <w:t xml:space="preserve">3,67</w:t>
@@ -2517,7 +2427,7 @@
           <w:p>
             <w:pPr>
               <w:pStyle w:val="Compact"/>
-              <w:jc w:val="both"/>
+              <w:jc w:val="left"/>
             </w:pPr>
             <w:r>
               <w:t xml:space="preserve">3,06</w:t>
@@ -2529,7 +2439,7 @@
           <w:p>
             <w:pPr>
               <w:pStyle w:val="Compact"/>
-              <w:jc w:val="both"/>
+              <w:jc w:val="left"/>
             </w:pPr>
             <w:r>
               <w:t xml:space="preserve">+0,60</w:t>
@@ -2543,7 +2453,7 @@
           <w:p>
             <w:pPr>
               <w:pStyle w:val="Compact"/>
-              <w:jc w:val="both"/>
+              <w:jc w:val="left"/>
             </w:pPr>
             <w:r>
               <w:t xml:space="preserve">Capacità di stimolare la riflessione</w:t>
@@ -2555,7 +2465,7 @@
           <w:p>
             <w:pPr>
               <w:pStyle w:val="Compact"/>
-              <w:jc w:val="both"/>
+              <w:jc w:val="left"/>
             </w:pPr>
             <w:r>
               <w:t xml:space="preserve">3,83</w:t>
@@ -2567,7 +2477,7 @@
           <w:p>
             <w:pPr>
               <w:pStyle w:val="Compact"/>
-              <w:jc w:val="both"/>
+              <w:jc w:val="left"/>
             </w:pPr>
             <w:r>
               <w:t xml:space="preserve">3,25</w:t>
@@ -2579,7 +2489,7 @@
           <w:p>
             <w:pPr>
               <w:pStyle w:val="Compact"/>
-              <w:jc w:val="both"/>
+              <w:jc w:val="left"/>
             </w:pPr>
             <w:r>
               <w:t xml:space="preserve">+0,58</w:t>
@@ -2593,7 +2503,7 @@
           <w:p>
             <w:pPr>
               <w:pStyle w:val="Compact"/>
-              <w:jc w:val="both"/>
+              <w:jc w:val="left"/>
             </w:pPr>
             <w:r>
               <w:t xml:space="preserve">Chiarezza</w:t>
@@ -2605,7 +2515,7 @@
           <w:p>
             <w:pPr>
               <w:pStyle w:val="Compact"/>
-              <w:jc w:val="both"/>
+              <w:jc w:val="left"/>
             </w:pPr>
             <w:r>
               <w:t xml:space="preserve">4,00</w:t>
@@ -2617,7 +2527,7 @@
           <w:p>
             <w:pPr>
               <w:pStyle w:val="Compact"/>
-              <w:jc w:val="both"/>
+              <w:jc w:val="left"/>
             </w:pPr>
             <w:r>
               <w:t xml:space="preserve">3,69</w:t>
@@ -2629,7 +2539,7 @@
           <w:p>
             <w:pPr>
               <w:pStyle w:val="Compact"/>
-              <w:jc w:val="both"/>
+              <w:jc w:val="left"/>
             </w:pPr>
             <w:r>
               <w:t xml:space="preserve">+0,31</w:t>
@@ -2643,7 +2553,7 @@
           <w:p>
             <w:pPr>
               <w:pStyle w:val="Compact"/>
-              <w:jc w:val="both"/>
+              <w:jc w:val="left"/>
             </w:pPr>
             <w:r>
               <w:t xml:space="preserve">Velocità di risposta</w:t>
@@ -2655,7 +2565,7 @@
           <w:p>
             <w:pPr>
               <w:pStyle w:val="Compact"/>
-              <w:jc w:val="both"/>
+              <w:jc w:val="left"/>
             </w:pPr>
             <w:r>
               <w:t xml:space="preserve">3,83</w:t>
@@ -2667,7 +2577,7 @@
           <w:p>
             <w:pPr>
               <w:pStyle w:val="Compact"/>
-              <w:jc w:val="both"/>
+              <w:jc w:val="left"/>
             </w:pPr>
             <w:r>
               <w:t xml:space="preserve">3,44</w:t>
@@ -2679,7 +2589,7 @@
           <w:p>
             <w:pPr>
               <w:pStyle w:val="Compact"/>
-              <w:jc w:val="both"/>
+              <w:jc w:val="left"/>
             </w:pPr>
             <w:r>
               <w:t xml:space="preserve">+0,40</w:t>
@@ -2693,7 +2603,7 @@
           <w:p>
             <w:pPr>
               <w:pStyle w:val="Compact"/>
-              <w:jc w:val="both"/>
+              <w:jc w:val="left"/>
             </w:pPr>
             <w:r>
               <w:t xml:space="preserve">Dettaglio delle risposte</w:t>
@@ -2705,7 +2615,7 @@
           <w:p>
             <w:pPr>
               <w:pStyle w:val="Compact"/>
-              <w:jc w:val="both"/>
+              <w:jc w:val="left"/>
             </w:pPr>
             <w:r>
               <w:t xml:space="preserve">3,67</w:t>
@@ -2717,7 +2627,7 @@
           <w:p>
             <w:pPr>
               <w:pStyle w:val="Compact"/>
-              <w:jc w:val="both"/>
+              <w:jc w:val="left"/>
             </w:pPr>
             <w:r>
               <w:t xml:space="preserve">3,56</w:t>
@@ -2729,7 +2639,7 @@
           <w:p>
             <w:pPr>
               <w:pStyle w:val="Compact"/>
-              <w:jc w:val="both"/>
+              <w:jc w:val="left"/>
             </w:pPr>
             <w:r>
               <w:t xml:space="preserve">+0,10</w:t>
@@ -2743,7 +2653,7 @@
           <w:p>
             <w:pPr>
               <w:pStyle w:val="Compact"/>
-              <w:jc w:val="both"/>
+              <w:jc w:val="left"/>
             </w:pPr>
             <w:r>
               <w:t xml:space="preserve">Utilità percepita</w:t>
@@ -2755,7 +2665,7 @@
           <w:p>
             <w:pPr>
               <w:pStyle w:val="Compact"/>
-              <w:jc w:val="both"/>
+              <w:jc w:val="left"/>
             </w:pPr>
             <w:r>
               <w:t xml:space="preserve">3,17</w:t>
@@ -2767,7 +2677,7 @@
           <w:p>
             <w:pPr>
               <w:pStyle w:val="Compact"/>
-              <w:jc w:val="both"/>
+              <w:jc w:val="left"/>
             </w:pPr>
             <w:r>
               <w:t xml:space="preserve">3,31</w:t>
@@ -2779,7 +2689,7 @@
           <w:p>
             <w:pPr>
               <w:pStyle w:val="Compact"/>
-              <w:jc w:val="both"/>
+              <w:jc w:val="left"/>
             </w:pPr>
             <w:r>
               <w:t xml:space="preserve">−0,15</w:t>
@@ -2793,7 +2703,7 @@
           <w:p>
             <w:pPr>
               <w:pStyle w:val="Compact"/>
-              <w:jc w:val="both"/>
+              <w:jc w:val="left"/>
             </w:pPr>
             <w:r>
               <w:t xml:space="preserve">Intenzione di riutilizzo</w:t>
@@ -2805,7 +2715,7 @@
           <w:p>
             <w:pPr>
               <w:pStyle w:val="Compact"/>
-              <w:jc w:val="both"/>
+              <w:jc w:val="left"/>
             </w:pPr>
             <w:r>
               <w:t xml:space="preserve">3,83</w:t>
@@ -2817,7 +2727,7 @@
           <w:p>
             <w:pPr>
               <w:pStyle w:val="Compact"/>
-              <w:jc w:val="both"/>
+              <w:jc w:val="left"/>
             </w:pPr>
             <w:r>
               <w:t xml:space="preserve">3,12</w:t>
@@ -2829,7 +2739,7 @@
           <w:p>
             <w:pPr>
               <w:pStyle w:val="Compact"/>
-              <w:jc w:val="both"/>
+              <w:jc w:val="left"/>
             </w:pPr>
             <w:r>
               <w:t xml:space="preserve">+0,71</w:t>
@@ -2841,7 +2751,6 @@
     <w:p>
       <w:pPr>
         <w:pStyle w:val="BodyText"/>
-        <w:jc w:val="both"/>
       </w:pPr>
       <w:r>
         <w:t xml:space="preserve">I miglioramenti più marcati riguardano facilità d’uso (Δ = +0,79), intenzione di riutilizzo (Δ = +0,71) e fiducia (Δ = +0,65); l’unica dimensione sostanzialmente invariata è l’utilità percepita (Δ = −0,15, entro il range di variabilità atteso per campioni ridotti).</w:t>
@@ -2854,43 +2763,36 @@
         <w:pStyle w:val="Heading3"/>
       </w:pPr>
       <w:r>
-        <w:rPr>
-          <w:color w:val="000000"/>
-        </w:rPr>
         <w:t xml:space="preserve">4.3 Risposte aperte</w:t>
       </w:r>
     </w:p>
     <w:p>
       <w:pPr>
         <w:pStyle w:val="FirstParagraph"/>
-        <w:jc w:val="both"/>
-      </w:pPr>
-      <w:r>
-        <w:t xml:space="preserve">Undici partecipanti hanno fornito risposte alle domande aperte (tutti della versione CB-C). Dall’analisi tematica emergono quattro aree di criticità, affrontate nella versione CB-SBS.</w:t>
+      </w:pPr>
+      <w:r>
+        <w:t xml:space="preserve">Undici partecipanti hanno fornito risposte alle domande aperte (tutti della versione CB-C). Dall’analisi tematica emergono quattro aree di criticità.</w:t>
       </w:r>
     </w:p>
     <w:p>
       <w:pPr>
         <w:pStyle w:val="BodyText"/>
-        <w:jc w:val="both"/>
-      </w:pPr>
-      <w:r>
-        <w:t xml:space="preserve">Inserimento dati. (i) Tre partecipanti segnalano difficoltà nel caricamento dei punteggi: «mi ha chiesto di fare una cosa che avevo appena fatto», «inserirli 1 per 1 in chat è stato scomodo», con la richiesta esplicita di poter caricare un PDF per evitare errori di digitazione. Nella versione CB-SBS questa fase è stata sostituita da un form iniziale di inserimento e dal caricamento diretto dei PDF degli esiti.</w:t>
+      </w:pPr>
+      <w:r>
+        <w:t xml:space="preserve">Inserimento dati. (i) Tre partecipanti segnalano difficoltà nel caricamento dei punteggi: «mi ha chiesto di fare una cosa che avevo appena fatto», «inserirli 1 per 1 in chat è stato scomodo», con la richiesta esplicita di poter caricare un PDF per evitare errori di digitazione.</w:t>
       </w:r>
     </w:p>
     <w:p>
       <w:pPr>
         <w:pStyle w:val="BodyText"/>
-        <w:jc w:val="both"/>
-      </w:pPr>
-      <w:r>
-        <w:t xml:space="preserve">Coerenza della memoria di sessione. (ii) Un partecipante riporta «incongruenze molto grandi tra i dati forniti e i riassunti finali» nella prima analisi, pur riconoscendo che una seconda analisi era più coerente. Nella versione CB-SBS la gestione della memoria di sessione è stata rivista attraverso una sintesi dinamica del dialogo, integrata dall’iniezione costante dei punteggi del profilo tramite file JSON a ogni turno, garantendo che il contesto venga preservato fedelmente lungo l’intero percorso.</w:t>
+      </w:pPr>
+      <w:r>
+        <w:t xml:space="preserve">Coerenza della memoria di sessione. (ii) Un partecipante riporta «incongruenze molto grandi tra i dati forniti e i riassunti finali» nella prima analisi, pur riconoscendo che una seconda analisi era più coerente.</w:t>
       </w:r>
     </w:p>
     <w:p>
       <w:pPr>
         <w:pStyle w:val="BodyText"/>
-        <w:jc w:val="both"/>
       </w:pPr>
       <w:r>
         <w:t xml:space="preserve">Completezza del contesto. (iii) Un partecipante osserva che il</w:t>
@@ -2909,44 +2811,20 @@
         <w:t xml:space="preserve"> </w:t>
       </w:r>
       <w:r>
-        <w:t xml:space="preserve">«dimentica alcune informazioni». Nella versione CB-SBS la memoria di sessione è stata potenziata per preservare il contesto lungo l’intero dialogo, riducendo i fenomeni di</w:t>
-      </w:r>
-      <w:r>
-        <w:t xml:space="preserve"> </w:t>
-      </w:r>
-      <w:r>
-        <w:rPr>
-          <w:iCs/>
-          <w:i/>
-        </w:rPr>
-        <w:t xml:space="preserve">forgetting</w:t>
-      </w:r>
-      <w:r>
-        <w:t xml:space="preserve">.</w:t>
+        <w:t xml:space="preserve">«dimentica alcune informazioni».</w:t>
       </w:r>
     </w:p>
     <w:p>
       <w:pPr>
         <w:pStyle w:val="BodyText"/>
-        <w:jc w:val="both"/>
-      </w:pPr>
-      <w:r>
-        <w:t xml:space="preserve">Lunghezza delle risposte. (iv) Un partecipante suggerisce di «sintetizzare le risposte». Nella versione CB-SBS è stato introdotto un limite di token per contenere l’estensione degli interventi del LLM, favorendo risposte più concise.</w:t>
+      </w:pPr>
+      <w:r>
+        <w:t xml:space="preserve">Lunghezza delle risposte. (iv) Un partecipante suggerisce di «sintetizzare le risposte».</w:t>
       </w:r>
     </w:p>
     <w:p>
       <w:pPr>
         <w:pStyle w:val="BodyText"/>
-        <w:jc w:val="both"/>
-      </w:pPr>
-      <w:r>
-        <w:t xml:space="preserve">La scelta di un modello locale di dimensioni contenute, motivata in §2.3, si colloca nello stesso quadro di ottimizzazione: il benchmark preliminare ha orientato la selezione di una soluzione ritenuta adeguata al compito, sostenibile nei costi e più favorevole alla tutela della riservatezza.</w:t>
-      </w:r>
-    </w:p>
-    <w:p>
-      <w:pPr>
-        <w:pStyle w:val="BodyText"/>
-        <w:jc w:val="both"/>
       </w:pPr>
       <w:r>
         <w:t xml:space="preserve">Sei partecipanti hanno espresso valutazioni positive sulla chiarezza, la pertinenza e l’utilità del sistema, descrivendo l’esperienza come «positiva», «interessante» e «il</w:t>
@@ -2976,55 +2854,23 @@
         <w:pStyle w:val="Heading2"/>
       </w:pPr>
       <w:r>
-        <w:rPr>
-          <w:color w:val="000000"/>
-        </w:rPr>
         <w:t xml:space="preserve">5. Discussione</w:t>
       </w:r>
     </w:p>
     <w:p>
       <w:pPr>
         <w:pStyle w:val="FirstParagraph"/>
-        <w:jc w:val="both"/>
-      </w:pPr>
-      <w:r>
-        <w:t xml:space="preserve">Alla luce di questi risultati, si possono formulare le seguenti considerazioni. I risultati mostrano un miglioramento diffuso della versione CB-SBS rispetto alla precedente su 9 dimensioni su 10, con incrementi particolarmente marcati su facilità d’uso (Δ = +0,79), fiducia nelle informazioni (Δ = +0,65) e intenzione di riutilizzo (Δ = +0,71). Questi dati suggeriscono che le modifiche introdotte nella versione CB-SBS (cfr. §4) hanno prodotto un effetto positivo sull’esperienza utente.</w:t>
+      </w:pPr>
+      <w:r>
+        <w:t xml:space="preserve">I risultati presentati in §4 indicano una tendenza favorevole alla versione CB-SBS rispetto alla CB-C. Le criticità emerse dalle risposte aperte della versione CB-C — inserimento manuale dei dati e coerenza delle analisi — trovano riscontro nei punteggi più alti registrati da CB-SBS in facilità d’uso e fiducia; la loro risoluzione conferma che le scelte progettuali hanno prodotto un effetto positivo sull’esperienza utente. Rimane da verificare, su un campione più ampio, se anche le altre dimensioni — in particolare l’utilità percepita, sostanzialmente invariata — possano beneficiare delle stesse modifiche.</w:t>
       </w:r>
     </w:p>
     <w:p>
       <w:pPr>
         <w:pStyle w:val="BodyText"/>
-        <w:jc w:val="both"/>
-      </w:pPr>
-      <w:r>
-        <w:t xml:space="preserve">Le criticità emerse dalle risposte aperte della versione CB-C riguardavano principalmente l’inserimento manuale dei dati e la coerenza delle analisi. La loro risoluzione nella versione CB-SBS è coerente con i punteggi più alti registrati in facilità d’uso e fiducia. Rimane da verificare su un campione più ampio se anche le altre dimensioni — in particolare l’utilità percepita, sostanzialmente invariata — beneficino delle stesse modifiche.</w:t>
-      </w:r>
-    </w:p>
-    <w:p>
-      <w:pPr>
-        <w:pStyle w:val="BodyText"/>
-        <w:jc w:val="both"/>
-      </w:pPr>
-      <w:r>
-        <w:t xml:space="preserve">Il presente lavoro si colloca nella fase di test del modello ADDIE: i dati raccolti informano il ciclo iterativo di sviluppo, più che costituire una validazione conclusiva. Il campione è ridotto (n=6 per CB-SBS, n=16 per CB-C con dati numerici) e non probabilistico, e la differenza tra le due versioni potrebbe risentire di fattori confondenti come la diversa composizione demografica o la maturità del percorso di sviluppo. Per queste ragioni i risultati vanno letti come indicatori di tendenza, non come evidenza definitiva.</w:t>
-      </w:r>
-    </w:p>
-    <w:p>
-      <w:pPr>
-        <w:pStyle w:val="BodyText"/>
-        <w:jc w:val="both"/>
-      </w:pPr>
-      <w:r>
-        <w:t xml:space="preserve">Sul piano più generale, l’architettura ibrida di Counselorbot — che combina passi guidati deterministici con la flessibilità di un LLM — si dimostra praticabile per l’autovalutazione assistita delle competenze strategiche. La possibilità di istruire il modello con direttive specifiche e di richiamare conoscenze contestuali apre la strada a forme di accompagnamento scalabili che la letteratura indica come ancora poco coperte (Wollny et al. 2021; Liu et al. 2025). Quanto alla sostenibilità economica sollevata in apertura, l’impiego di modelli aperti di dimensioni contenute, eseguibili anche su infrastrutture locali — come Gemma 4 4B, selezionato tramite benchmark sistematico per l’istanza CB-SBS — suggerisce una via percorribile per contenere i costi di esercizio.</w:t>
-      </w:r>
-    </w:p>
-    <w:p>
-      <w:pPr>
-        <w:pStyle w:val="BodyText"/>
-        <w:jc w:val="both"/>
-      </w:pPr>
-      <w:r>
-        <w:t xml:space="preserve">Si aggiunga che il dato disponibile è esclusivamente basato sull’autovalutazione degli studenti, che potrebbe risentire di effetti di desiderabilità sociale; restano da acquisire metriche oggettive come tempi di risposta e tassi di completamento.</w:t>
+      </w:pPr>
+      <w:r>
+        <w:t xml:space="preserve">Sul piano più generale, l’architettura ibrida di Counselorbot — che combina passi guidati deterministici con la flessibilità di un LLM — si dimostra praticabile per la riflessione assistita delle competenze strategiche. La possibilità di istruire il modello con direttive specifiche e di richiamare conoscenze contestuali apre la strada a forme di accompagnamento scalabili che la letteratura indica come ancora poco coperte (Wollny et al., 2021; Liu et al., 2025). Quanto alla sostenibilità economica, l’impiego di modelli aperti di dimensioni contenute, eseguibili anche su infrastrutture locali — come Gemma 4 4B, selezionato tramite benchmark sistematico per l’istanza CB-SBS — indica una via percorribile per contenere i costi di esercizio.</w:t>
       </w:r>
     </w:p>
     <w:bookmarkEnd w:id="43"/>
@@ -3034,19 +2880,15 @@
         <w:pStyle w:val="Heading2"/>
       </w:pPr>
       <w:r>
-        <w:rPr>
-          <w:color w:val="000000"/>
-        </w:rPr>
         <w:t xml:space="preserve">6. Conclusioni</w:t>
       </w:r>
     </w:p>
     <w:p>
       <w:pPr>
         <w:pStyle w:val="FirstParagraph"/>
-        <w:jc w:val="both"/>
-      </w:pPr>
-      <w:r>
-        <w:t xml:space="preserve">Sebbene</w:t>
+      </w:pPr>
+      <w:r>
+        <w:t xml:space="preserve">Rispondendo alla prima domanda di ricerca (D1), i risultati indicano che è possibile realizzare un</w:t>
       </w:r>
       <w:r>
         <w:t xml:space="preserve"> </w:t>
@@ -3056,13 +2898,226 @@
           <w:iCs/>
           <w:i/>
         </w:rPr>
-        <w:t xml:space="preserve">Counselorbot</w:t>
+        <w:t xml:space="preserve">chatbot mentoring</w:t>
       </w:r>
       <w:r>
         <w:t xml:space="preserve"> </w:t>
       </w:r>
       <w:r>
-        <w:t xml:space="preserve">si trovi ancora in una fase di sviluppo, i risultati ottenuti consentono già di formulare alcune considerazioni rilevanti. Rispondendo alla prima domanda di ricerca (D1), i risultati mostrano che è possibile realizzare un</w:t>
+        <w:t xml:space="preserve">efficace con un investimento infrastrutturale rapportato ai costi ricorrenti delle API commerciali, a condizione di disporre di hardware adeguato (cfr. §2.3). Quanto alla seconda (D2), i dati comparativi suggeriscono che l’architettura step-by-step (CB-SBS) sia più efficace di quella puramente conversazionale (CB-C) per la riflessione assistita (cfr. Liu et al., 2025; Wollny et al., 2021). La qualità di uno strumento di questo tipo non dipende tuttavia da un singolo elemento, ma dalla configurazione complessiva di diversi fattori: la scelta del modello linguistico, la progettazione dell’esperienza d’uso, la gestione della memoria, la formulazione delle istruzioni e i tempi della loro somministrazione, le conoscenze integrate nel sistema, le modalità di recupero delle informazioni e un processo di miglioramento continuo. Le prestazioni possono variare sensibilmente in funzione del design adottato: il passaggio da un’architettura conversazionale a una struttura step-by-step, così come l’impiego di modelli differenti, incide non solo sulla coerenza e la completezza delle risposte, ma anche sulla percezione complessiva dell’esperienza d’uso (Kasneci et al., 2023; Antunes et al., 2025).</w:t>
+      </w:r>
+    </w:p>
+    <w:p>
+      <w:pPr>
+        <w:pStyle w:val="BodyText"/>
+      </w:pPr>
+      <w:r>
+        <w:t xml:space="preserve">I risultati vanno tuttavia interpretati alla luce dei limiti dello studio. Il presente lavoro si colloca nella fase di test del modello ADDIE (Branch, 2009): i dati raccolti informano il ciclo iterativo di sviluppo più che costituire una validazione conclusiva. Il campione è ridotto (n=6 per CB-SBS, n=16 per CB-C con dati numerici) e non probabilistico; la differenza tra le due versioni potrebbe risentire di fattori confondenti, quali la diversa composizione demografica o la maturità del percorso di sviluppo. Il dato disponibile è inoltre esclusivamente basato sulle valutazione degli studenti, che potrebbe risentire di effetti di desiderabilità sociale; restano da acquisire metriche oggettive — quali tempi di risposta e tassi di completamento — per una valutazione più completa. Per queste ragioni, i risultati vanno letti come indicatori di tendenza, non come evidenza definitiva.</w:t>
+      </w:r>
+    </w:p>
+    <w:p>
+      <w:pPr>
+        <w:pStyle w:val="BodyText"/>
+      </w:pPr>
+      <w:r>
+        <w:t xml:space="preserve">Per quanto riguarda lo sviluppo futuro, le direzioni di lavoro possono essere articolate su tre orizzonti temporali. A breve termine, l’obiettivo è consolidare l’affidabilità del percorso guidato sul QSA ed estendere la sperimentazione agli altri strumenti del sistema — QSAr, ZTPI, intervista di Savickas, QPCS, QPCC e QAP — per verificarne l’efficacia su un ventaglio più ampio di costrutti e utenti. Parallelamente, i dati raccolti durante le interazioni, opportunamente anonimizzati, potranno essere impiegati per un affinamento (</w:t>
+      </w:r>
+      <w:r>
+        <w:rPr>
+          <w:iCs/>
+          <w:i/>
+        </w:rPr>
+        <w:t xml:space="preserve">fine-tuning</w:t>
+      </w:r>
+      <w:r>
+        <w:t xml:space="preserve">) del modello linguistico — ovvero un addestramento aggiuntivo sui dati specifici del dominio — per migliorare progressivamente la pertinenza delle risposte e l’aderenza al contesto dell’orientamento.</w:t>
+      </w:r>
+    </w:p>
+    <w:p>
+      <w:pPr>
+        <w:pStyle w:val="BodyText"/>
+      </w:pPr>
+      <w:r>
+        <w:t xml:space="preserve">A medio termine, lo sviluppo riguarda la possibilità di rendere Counselorbot multilingue, così da ampliarne l’accessibilità in contesti educativi internazionali. Tale evoluzione richiede non solo la traduzione dell’interfaccia e delle istruzioni del sistema, ma anche la disponibilità di versioni validate degli strumenti del portale</w:t>
+      </w:r>
+      <w:r>
+        <w:t xml:space="preserve"> </w:t>
+      </w:r>
+      <w:r>
+        <w:rPr>
+          <w:iCs/>
+          <w:i/>
+        </w:rPr>
+        <w:t xml:space="preserve">Competenze strategiche</w:t>
+      </w:r>
+      <w:r>
+        <w:t xml:space="preserve"> </w:t>
+      </w:r>
+      <w:r>
+        <w:t xml:space="preserve">in inglese e nelle altre lingue di interesse.</w:t>
+      </w:r>
+    </w:p>
+    <w:p>
+      <w:pPr>
+        <w:pStyle w:val="BodyText"/>
+      </w:pPr>
+      <w:r>
+        <w:t xml:space="preserve">A lungo termine, si prospettano studi longitudinali per valutare l’impatto del sistema sulle strategie di apprendimento, sui processi di riflessione assistita e sulle capacità di orientamento degli studenti. Sarà inoltre necessario proseguire la valutazione con gruppi di utenti più ampi e differenziati, analizzando le modalità con cui studenti, tutor e orientatori possono integrare lo strumento nelle rispettive pratiche. Infine, bisognerà tenere sempre sotto osservazione l’evoluzione dei modelli con meno di 15 miliardi di parametri — soglia che ha orientato la selezione per l’infrastruttura locale. Tale evoluzione amplia continuamente lo spazio delle opzioni disponibili. A titolo esemplificativo, Gemma 4 12B (Gemma Team, 2025) non era ancora disponibile al momento della valutazione e, una volta testato, potrebbe rivelarsi un candidato interessante per le future iterazioni del sistema.</w:t>
+      </w:r>
+    </w:p>
+    <w:bookmarkEnd w:id="44"/>
+    <w:bookmarkStart w:id="45" w:name="bibliografia"/>
+    <w:p>
+      <w:pPr>
+        <w:pStyle w:val="Heading2"/>
+      </w:pPr>
+      <w:r>
+        <w:t xml:space="preserve">Bibliografia</w:t>
+      </w:r>
+    </w:p>
+    <w:p>
+      <w:pPr>
+        <w:pStyle w:val="FirstParagraph"/>
+      </w:pPr>
+      <w:r>
+        <w:t xml:space="preserve">Gemma Team, Google DeepMind. (2025). Gemma 4: Advancing open language models. https://ai.google.dev/gemma</w:t>
+      </w:r>
+    </w:p>
+    <w:p>
+      <w:pPr>
+        <w:pStyle w:val="BodyText"/>
+      </w:pPr>
+      <w:r>
+        <w:t xml:space="preserve">Pellerey, M., Epifani, F., Grządziel, D., Margottini, M., &amp; Ottone, E. (2013).</w:t>
+      </w:r>
+      <w:r>
+        <w:t xml:space="preserve"> </w:t>
+      </w:r>
+      <w:r>
+        <w:rPr>
+          <w:iCs/>
+          <w:i/>
+        </w:rPr>
+        <w:t xml:space="preserve">Imparare a dirigere se stessi</w:t>
+      </w:r>
+      <w:r>
+        <w:t xml:space="preserve">. CNOS-FAP, Roma.</w:t>
+      </w:r>
+    </w:p>
+    <w:p>
+      <w:pPr>
+        <w:pStyle w:val="BodyText"/>
+      </w:pPr>
+      <w:r>
+        <w:t xml:space="preserve">Puech, R., Mačina, J., Chatain, J., Sachan, M., &amp; Kapur, M. (2025). Towards the pedagogical steering of large language models for tutoring: A case study with modeling productive failure. In</w:t>
+      </w:r>
+      <w:r>
+        <w:t xml:space="preserve"> </w:t>
+      </w:r>
+      <w:r>
+        <w:rPr>
+          <w:iCs/>
+          <w:i/>
+        </w:rPr>
+        <w:t xml:space="preserve">Findings of the Association for Computational Linguistics: ACL 2025</w:t>
+      </w:r>
+      <w:r>
+        <w:t xml:space="preserve">. https://doi.org/10.18653/v1/2025.findings-acl.1348</w:t>
+      </w:r>
+    </w:p>
+    <w:p>
+      <w:pPr>
+        <w:pStyle w:val="BodyText"/>
+      </w:pPr>
+      <w:r>
+        <w:t xml:space="preserve">Antunes, L. G., Passarelli, B., &amp; Claro, S. V. (2025). Large language models as Socratic mentors: Transforming educational approaches for epistemic development.</w:t>
+      </w:r>
+      <w:r>
+        <w:t xml:space="preserve"> </w:t>
+      </w:r>
+      <w:r>
+        <w:rPr>
+          <w:iCs/>
+          <w:i/>
+        </w:rPr>
+        <w:t xml:space="preserve">Aracê, 7</w:t>
+      </w:r>
+      <w:r>
+        <w:t xml:space="preserve">(5), 24921–24936. https://doi.org/10.56238/arev7n5-229</w:t>
+      </w:r>
+    </w:p>
+    <w:p>
+      <w:pPr>
+        <w:pStyle w:val="BodyText"/>
+      </w:pPr>
+      <w:r>
+        <w:t xml:space="preserve">Bender, E. M., Gebru, T., McMillan-Major, A., &amp; Shmitchell, S. (2021). On the dangers of stochastic parrots: Can language models be too big? In</w:t>
+      </w:r>
+      <w:r>
+        <w:t xml:space="preserve"> </w:t>
+      </w:r>
+      <w:r>
+        <w:rPr>
+          <w:iCs/>
+          <w:i/>
+        </w:rPr>
+        <w:t xml:space="preserve">Proceedings of the 2021 ACM Conference on Fairness, Accountability, and Transparency</w:t>
+      </w:r>
+      <w:r>
+        <w:t xml:space="preserve"> </w:t>
+      </w:r>
+      <w:r>
+        <w:t xml:space="preserve">(pp. 610–623). https://doi.org/10.1145/3442188.3445922</w:t>
+      </w:r>
+    </w:p>
+    <w:p>
+      <w:pPr>
+        <w:pStyle w:val="BodyText"/>
+      </w:pPr>
+      <w:r>
+        <w:t xml:space="preserve">Branch, R. M. (2009).</w:t>
+      </w:r>
+      <w:r>
+        <w:t xml:space="preserve"> </w:t>
+      </w:r>
+      <w:r>
+        <w:rPr>
+          <w:iCs/>
+          <w:i/>
+        </w:rPr>
+        <w:t xml:space="preserve">Instructional design: The ADDIE approach</w:t>
+      </w:r>
+      <w:r>
+        <w:t xml:space="preserve">. Springer. https://doi.org/10.1007/978-0-387-09506-6</w:t>
+      </w:r>
+    </w:p>
+    <w:p>
+      <w:pPr>
+        <w:pStyle w:val="BodyText"/>
+      </w:pPr>
+      <w:r>
+        <w:t xml:space="preserve">Brown, T. B., Mann, B., Ryder, N., et al. (2020). Language models are few-shot learners.</w:t>
+      </w:r>
+      <w:r>
+        <w:t xml:space="preserve"> </w:t>
+      </w:r>
+      <w:r>
+        <w:rPr>
+          <w:iCs/>
+          <w:i/>
+        </w:rPr>
+        <w:t xml:space="preserve">Advances in Neural Information Processing Systems, 33</w:t>
+      </w:r>
+      <w:r>
+        <w:t xml:space="preserve">, 1877–1901.</w:t>
+      </w:r>
+    </w:p>
+    <w:p>
+      <w:pPr>
+        <w:pStyle w:val="BodyText"/>
+      </w:pPr>
+      <w:r>
+        <w:t xml:space="preserve">Chang, D. H., Lin, M. P.-C., Hajian, S., &amp; Wang, Q. Q. (2023). Educational design principles of using AI</w:t>
       </w:r>
       <w:r>
         <w:t xml:space="preserve"> </w:t>
@@ -3078,53 +3133,28 @@
         <w:t xml:space="preserve"> </w:t>
       </w:r>
       <w:r>
-        <w:t xml:space="preserve">mentoring efficace con un investimento infrastrutturale rapportato ai costi ricorrenti delle API commerciali, a condizione di disporre di hardware adeguato (§2.3). Quanto alla seconda (D2), i dati comparativi indicano che l’architettura step-by-step (CB-SBS) ottiene valutazioni superiori in 9 dimensioni su 10 rispetto a quella puramente conversazionale (CB-C), suggerendo che una struttura guidata sia più efficace per l’autovalutazione assistita (cfr. Liu et al., 2025; Wollny et al., 2021). In secondo luogo, evidenziano che la qualità di uno strumento di questo tipo non dipende da un singolo elemento, ma dalla configurazione complessiva di diversi fattori: la scelta del modello linguistico più adatto, la progettazione dell’esperienza d’uso, la gestione della memoria, la formulazione delle istruzioni, il modo e i tempi in cui esse vengono fornite, le conoscenze integrate nel sistema, le modalità di recupero delle informazioni e la presenza di un processo di miglioramento continuo.</w:t>
-      </w:r>
-    </w:p>
-    <w:p>
-      <w:pPr>
-        <w:pStyle w:val="BodyText"/>
-        <w:jc w:val="both"/>
-      </w:pPr>
-      <w:r>
-        <w:t xml:space="preserve">Le prestazioni del chatbot possono quindi variare sensibilmente in funzione del design adottato. Il passaggio da un’architettura prevalentemente conversazionale a una struttura step-by-step, così come l’impiego di modelli linguistici differenti, ha mostrato quanto le scelte progettuali incidono (Kasneci et al., 2023; Antunes et al., 2025) non solo sulla coerenza delle risposte, sulla completezza dell’analisi e sulla capacità del sistema di accompagnare l’utente lungo un percorso di riflessione, ma anche sulla percezione complessiva dell’esperienza d’uso. I risultati comparativi mostrano infatti una tendenza favorevole alla versione CB-SBS nella maggior parte delle dimensioni considerate, in particolare per quanto riguarda la facilità d’uso, la fiducia nelle informazioni ricevute e l’intenzione di ri-utilizzare il sistema.</w:t>
-      </w:r>
-    </w:p>
-    <w:p>
-      <w:pPr>
-        <w:pStyle w:val="BodyText"/>
-        <w:jc w:val="both"/>
-      </w:pPr>
-      <w:r>
-        <w:t xml:space="preserve">Questi risultati vanno tuttavia interpretati alla luce dei limiti dello studio. Il campione è ridotto (n=6 per CB-SBS, n=16 per CB-C con dati numerici) e non probabilistico; la differenza tra le due versioni potrebbe risentire di fattori confondenti come la diversa composizione demografica o la maturità del percorso di sviluppo. Lo studio si inserisce nella fase di test del modello ADDIE (Branch, 2009) e non costituisce una validazione conclusiva. Per queste ragioni i risultati vanno letti come indicatori di tendenza, non come evidenza definitiva.</w:t>
-      </w:r>
-    </w:p>
-    <w:p>
-      <w:pPr>
-        <w:pStyle w:val="BodyText"/>
-        <w:jc w:val="both"/>
-      </w:pPr>
-      <w:r>
-        <w:t xml:space="preserve">Per quanto riguarda lo sviluppo futuro, le direzioni di lavoro possono essere articolate su tre orizzonti temporali. A breve termine, l’obiettivo è consolidare l’affidabilità del percorso guidato sul QSA ed estendere la sperimentazione agli altri strumenti del sistema — QSAr, ZTPI, intervista di Savickas, QPCS, QPCC e QAP — per verificarne l’efficacia su un ventaglio più ampio di costrutti e utenti. Parallelamente, i dati raccolti durante le interazioni, opportunamente anonimizzati, potranno essere impiegati per un affinamento (</w:t>
+        <w:t xml:space="preserve">that supports self-regulated learning in education: Goal setting, feedback, and personalization.</w:t>
+      </w:r>
+      <w:r>
+        <w:t xml:space="preserve"> </w:t>
       </w:r>
       <w:r>
         <w:rPr>
           <w:iCs/>
           <w:i/>
         </w:rPr>
-        <w:t xml:space="preserve">fine-tuning</w:t>
-      </w:r>
-      <w:r>
-        <w:t xml:space="preserve">) del modello linguistico — ovvero un addestramento aggiuntivo sui dati specifici del dominio — per migliorare progressivamente la pertinenza delle risposte e l’aderenza al contesto dell’orientamento.</w:t>
+        <w:t xml:space="preserve">Sustainability, 15</w:t>
+      </w:r>
+      <w:r>
+        <w:t xml:space="preserve">(17), 12921. https://doi.org/10.3390/su151712921</w:t>
       </w:r>
     </w:p>
     <w:p>
       <w:pPr>
         <w:pStyle w:val="BodyText"/>
-        <w:jc w:val="both"/>
-      </w:pPr>
-      <w:r>
-        <w:t xml:space="preserve">A medio termine, lo sviluppo riguarda la possibilità di rendere Counselorbot multilingue, così da ampliarne l’accessibilità in contesti educativi internazionali. Tale evoluzione richiede non solo la traduzione dell’interfaccia e delle istruzioni del sistema, ma anche la disponibilità di versioni validate degli strumenti del portale</w:t>
+      </w:pPr>
+      <w:r>
+        <w:t xml:space="preserve">Cukurova, M., Luckin, R., &amp; Kent, C. (2020). Impact of an artificial intelligence research frame on the perceived credibility of educational research evidence.</w:t>
       </w:r>
       <w:r>
         <w:t xml:space="preserve"> </w:t>
@@ -3134,53 +3164,18 @@
           <w:iCs/>
           <w:i/>
         </w:rPr>
-        <w:t xml:space="preserve">Competenze strategiche</w:t>
-      </w:r>
-      <w:r>
-        <w:t xml:space="preserve"> </w:t>
-      </w:r>
-      <w:r>
-        <w:t xml:space="preserve">in inglese e nelle altre lingue di interesse.</w:t>
+        <w:t xml:space="preserve">International Journal of Artificial Intelligence in Education, 30</w:t>
+      </w:r>
+      <w:r>
+        <w:t xml:space="preserve">(2), 205–235. https://doi.org/10.1007/s40593-019-00188-w</w:t>
       </w:r>
     </w:p>
     <w:p>
       <w:pPr>
         <w:pStyle w:val="BodyText"/>
-        <w:jc w:val="both"/>
-      </w:pPr>
-      <w:r>
-        <w:t xml:space="preserve">A lungo termine, si prospettano studi longitudinali per valutare l’impatto del sistema sulle strategie di apprendimento, sui processi di autoriflessione e sulle capacità di orientamento degli studenti. Sarà inoltre necessario proseguire la valutazione con gruppi di utenti più ampi e differenziati, analizzando le modalità con cui studenti, tutor e orientatori possono integrare lo strumento nelle rispettive pratiche. L’evoluzione dei modelli con meno di 15 miliardi di parametri — soglia che ha orientato la selezione per l’infrastruttura locale — amplia continuamente lo spazio delle opzioni disponibili. A titolo esemplificativo, Gemma 4 12B (Gemma Team, 2025) non era ancora disponibile al momento della valutazione e, una volta testato, potrebbe rivelarsi un candidato interessante per le future iterazioni del sistema.</w:t>
-      </w:r>
-    </w:p>
-    <w:bookmarkEnd w:id="44"/>
-    <w:bookmarkStart w:id="45" w:name="bibliografia"/>
-    <w:p>
-      <w:pPr>
-        <w:pStyle w:val="Heading2"/>
-      </w:pPr>
-      <w:r>
-        <w:rPr>
-          <w:color w:val="000000"/>
-        </w:rPr>
-        <w:t xml:space="preserve">Bibliografia</w:t>
-      </w:r>
-    </w:p>
-    <w:p>
-      <w:pPr>
-        <w:pStyle w:val="FirstParagraph"/>
-        <w:jc w:val="both"/>
-      </w:pPr>
-      <w:r>
-        <w:t xml:space="preserve">Gemma Team, Google DeepMind. (2025). Gemma 4: Advancing open language models. https://ai.google.dev/gemma</w:t>
-      </w:r>
-    </w:p>
-    <w:p>
-      <w:pPr>
-        <w:pStyle w:val="BodyText"/>
-        <w:jc w:val="both"/>
-      </w:pPr>
-      <w:r>
-        <w:t xml:space="preserve">Pellerey, M., Epifani, F., Grządziel, D., Margottini, M., &amp; Ottone, E. (2013).</w:t>
+      </w:pPr>
+      <w:r>
+        <w:t xml:space="preserve">D’Silva, G. M., Jani, M., Jadhav, V., Bhoir, A., &amp; Amin, P. N. (2020). Career counselling</w:t>
       </w:r>
       <w:r>
         <w:t xml:space="preserve"> </w:t>
@@ -3190,19 +3185,13 @@
           <w:iCs/>
           <w:i/>
         </w:rPr>
-        <w:t xml:space="preserve">Imparare a dirigere se stessi</w:t>
-      </w:r>
-      <w:r>
-        <w:t xml:space="preserve">. CNOS-FAP, Roma.</w:t>
-      </w:r>
-    </w:p>
-    <w:p>
-      <w:pPr>
-        <w:pStyle w:val="BodyText"/>
-        <w:jc w:val="both"/>
-      </w:pPr>
-      <w:r>
-        <w:t xml:space="preserve">Puech, R., Mačina, J., Chatain, J., Sachan, M., &amp; Kapur, M. (2025). Towards the pedagogical steering of large language models for tutoring: A case study with modeling productive failure. In</w:t>
+        <w:t xml:space="preserve">chatbot</w:t>
+      </w:r>
+      <w:r>
+        <w:t xml:space="preserve"> </w:t>
+      </w:r>
+      <w:r>
+        <w:t xml:space="preserve">using cognitive science and artificial intelligence. In H. Vasudevan, A. Michalas, N. Shekokar, &amp; M. Narvekar (Eds.),</w:t>
       </w:r>
       <w:r>
         <w:t xml:space="preserve"> </w:t>
@@ -3212,19 +3201,21 @@
           <w:iCs/>
           <w:i/>
         </w:rPr>
-        <w:t xml:space="preserve">Findings of the Association for Computational Linguistics: ACL 2025</w:t>
-      </w:r>
-      <w:r>
-        <w:t xml:space="preserve">. https://doi.org/10.18653/v1/2025.findings-acl.1348</w:t>
+        <w:t xml:space="preserve">Advanced computing technologies and applications</w:t>
+      </w:r>
+      <w:r>
+        <w:t xml:space="preserve"> </w:t>
+      </w:r>
+      <w:r>
+        <w:t xml:space="preserve">(pp. 1–9). Springer. https://doi.org/10.1007/978-981-15-3242-9_1</w:t>
       </w:r>
     </w:p>
     <w:p>
       <w:pPr>
         <w:pStyle w:val="BodyText"/>
-        <w:jc w:val="both"/>
-      </w:pPr>
-      <w:r>
-        <w:t xml:space="preserve">Antunes, L. G., Passarelli, B., &amp; Claro, S. V. (2025). Large language models as Socratic mentors: Transforming educational approaches for epistemic development.</w:t>
+      </w:pPr>
+      <w:r>
+        <w:t xml:space="preserve">Jemstedt, A., Bälter, O., Gavel, A., Glassey, R., &amp; Bosk, D. (2024). Less to produce and less to consume: The advantage of pure question-based learning.</w:t>
       </w:r>
       <w:r>
         <w:t xml:space="preserve"> </w:t>
@@ -3234,19 +3225,18 @@
           <w:iCs/>
           <w:i/>
         </w:rPr>
-        <w:t xml:space="preserve">Aracê, 7</w:t>
-      </w:r>
-      <w:r>
-        <w:t xml:space="preserve">(5), 24921–24936. https://doi.org/10.56238/arev7n5-229</w:t>
+        <w:t xml:space="preserve">Interactive Learning Environments</w:t>
+      </w:r>
+      <w:r>
+        <w:t xml:space="preserve">. https://doi.org/10.1080/10494820.2024.2362830</w:t>
       </w:r>
     </w:p>
     <w:p>
       <w:pPr>
         <w:pStyle w:val="BodyText"/>
-        <w:jc w:val="both"/>
-      </w:pPr>
-      <w:r>
-        <w:t xml:space="preserve">Bender, E. M., Gebru, T., McMillan-Major, A., &amp; Shmitchell, S. (2021). On the dangers of stochastic parrots: Can language models be too big? In</w:t>
+      </w:pPr>
+      <w:r>
+        <w:t xml:space="preserve">Kasneci, E., Seßler, K., Küchemann, S., et al. (2023). ChatGPT for good? On opportunities and challenges of large language models for education.</w:t>
       </w:r>
       <w:r>
         <w:t xml:space="preserve"> </w:t>
@@ -3256,22 +3246,18 @@
           <w:iCs/>
           <w:i/>
         </w:rPr>
-        <w:t xml:space="preserve">Proceedings of the 2021 ACM Conference on Fairness, Accountability, and Transparency</w:t>
-      </w:r>
-      <w:r>
-        <w:t xml:space="preserve"> </w:t>
-      </w:r>
-      <w:r>
-        <w:t xml:space="preserve">(pp. 610–623). https://doi.org/10.1145/3442188.3445922</w:t>
+        <w:t xml:space="preserve">Learning and Individual Differences, 103</w:t>
+      </w:r>
+      <w:r>
+        <w:t xml:space="preserve">, 102274. https://doi.org/10.1016/j.lindif.2023.102274</w:t>
       </w:r>
     </w:p>
     <w:p>
       <w:pPr>
         <w:pStyle w:val="BodyText"/>
-        <w:jc w:val="both"/>
-      </w:pPr>
-      <w:r>
-        <w:t xml:space="preserve">Branch, R. M. (2009).</w:t>
+      </w:pPr>
+      <w:r>
+        <w:t xml:space="preserve">Kuhail, M. A., Alturki, N., Alramlawi, S., &amp; Alhejori, K. (2022). Interacting with educational</w:t>
       </w:r>
       <w:r>
         <w:t xml:space="preserve"> </w:t>
@@ -3281,19 +3267,31 @@
           <w:iCs/>
           <w:i/>
         </w:rPr>
-        <w:t xml:space="preserve">Instructional design: The ADDIE approach</w:t>
-      </w:r>
-      <w:r>
-        <w:t xml:space="preserve">. Springer. https://doi.org/10.1007/978-0-387-09506-6</w:t>
+        <w:t xml:space="preserve">chatbot</w:t>
+      </w:r>
+      <w:r>
+        <w:t xml:space="preserve">s: A systematic review.</w:t>
+      </w:r>
+      <w:r>
+        <w:t xml:space="preserve"> </w:t>
+      </w:r>
+      <w:r>
+        <w:rPr>
+          <w:iCs/>
+          <w:i/>
+        </w:rPr>
+        <w:t xml:space="preserve">Education and Information Technologies, 28</w:t>
+      </w:r>
+      <w:r>
+        <w:t xml:space="preserve">(1), 973–1018. https://doi.org/10.1007/s10639-022-11177-3</w:t>
       </w:r>
     </w:p>
     <w:p>
       <w:pPr>
         <w:pStyle w:val="BodyText"/>
-        <w:jc w:val="both"/>
-      </w:pPr>
-      <w:r>
-        <w:t xml:space="preserve">Brown, T. B., Mann, B., Ryder, N., et al. (2020). Language models are few-shot learners.</w:t>
+      </w:pPr>
+      <w:r>
+        <w:t xml:space="preserve">Lewis, P., Perez, E., Piktus, A., et al. (2020). Retrieval-Augmented Generation for knowledge-intensive NLP tasks.</w:t>
       </w:r>
       <w:r>
         <w:t xml:space="preserve"> </w:t>
@@ -3306,16 +3304,36 @@
         <w:t xml:space="preserve">Advances in Neural Information Processing Systems, 33</w:t>
       </w:r>
       <w:r>
-        <w:t xml:space="preserve">, 1877–1901.</w:t>
+        <w:t xml:space="preserve">, 9459–9474.</w:t>
       </w:r>
     </w:p>
     <w:p>
       <w:pPr>
         <w:pStyle w:val="BodyText"/>
-        <w:jc w:val="both"/>
-      </w:pPr>
-      <w:r>
-        <w:t xml:space="preserve">Chang, D. H., Lin, M. P.-C., Hajian, S., &amp; Wang, Q. Q. (2023). Educational design principles of using AI</w:t>
+      </w:pPr>
+      <w:r>
+        <w:t xml:space="preserve">Liu, X., Xiao, Y., &amp; Li, D. (2025). Assessing strategic use of artificial intelligence in self-regulated learning: Instrument development and evidence from Chinese university students.</w:t>
+      </w:r>
+      <w:r>
+        <w:t xml:space="preserve"> </w:t>
+      </w:r>
+      <w:r>
+        <w:rPr>
+          <w:iCs/>
+          <w:i/>
+        </w:rPr>
+        <w:t xml:space="preserve">International Journal of Educational Technology in Higher Education, 22</w:t>
+      </w:r>
+      <w:r>
+        <w:t xml:space="preserve">, 69. https://doi.org/10.1186/s41239-025-00567-5</w:t>
+      </w:r>
+    </w:p>
+    <w:p>
+      <w:pPr>
+        <w:pStyle w:val="BodyText"/>
+      </w:pPr>
+      <w:r>
+        <w:t xml:space="preserve">Mendez, S., Johanson, K., Conley, V. M., et al. (2020).</w:t>
       </w:r>
       <w:r>
         <w:t xml:space="preserve"> </w:t>
@@ -3328,10 +3346,7 @@
         <w:t xml:space="preserve">chatbot</w:t>
       </w:r>
       <w:r>
-        <w:t xml:space="preserve"> </w:t>
-      </w:r>
-      <w:r>
-        <w:t xml:space="preserve">that supports self-regulated learning in education: Goal setting, feedback, and personalization.</w:t>
+        <w:t xml:space="preserve">s: A tool to supplement the future faculty mentoring of doctoral engineering students.</w:t>
       </w:r>
       <w:r>
         <w:t xml:space="preserve"> </w:t>
@@ -3341,41 +3356,18 @@
           <w:iCs/>
           <w:i/>
         </w:rPr>
-        <w:t xml:space="preserve">Sustainability, 15</w:t>
-      </w:r>
-      <w:r>
-        <w:t xml:space="preserve">(17), 12921. https://doi.org/10.3390/su151712921</w:t>
+        <w:t xml:space="preserve">International Journal of Doctoral Studies, 15</w:t>
+      </w:r>
+      <w:r>
+        <w:t xml:space="preserve">, 373–392. https://doi.org/10.28945/4579</w:t>
       </w:r>
     </w:p>
     <w:p>
       <w:pPr>
         <w:pStyle w:val="BodyText"/>
-        <w:jc w:val="both"/>
-      </w:pPr>
-      <w:r>
-        <w:t xml:space="preserve">Cukurova, M., Luckin, R., &amp; Kent, C. (2020). Impact of an artificial intelligence research frame on the perceived credibility of educational research evidence.</w:t>
-      </w:r>
-      <w:r>
-        <w:t xml:space="preserve"> </w:t>
-      </w:r>
-      <w:r>
-        <w:rPr>
-          <w:iCs/>
-          <w:i/>
-        </w:rPr>
-        <w:t xml:space="preserve">International Journal of Artificial Intelligence in Education, 30</w:t>
-      </w:r>
-      <w:r>
-        <w:t xml:space="preserve">(2), 205–235. https://doi.org/10.1007/s40593-019-00188-w</w:t>
-      </w:r>
-    </w:p>
-    <w:p>
-      <w:pPr>
-        <w:pStyle w:val="BodyText"/>
-        <w:jc w:val="both"/>
-      </w:pPr>
-      <w:r>
-        <w:t xml:space="preserve">D’Silva, G. M., Jani, M., Jadhav, V., Bhoir, A., &amp; Amin, P. N. (2020). Career counselling</w:t>
+      </w:pPr>
+      <w:r>
+        <w:t xml:space="preserve">Neumann, A. T., Arndt, T., Köbis, L., et al. (2021).</w:t>
       </w:r>
       <w:r>
         <w:t xml:space="preserve"> </w:t>
@@ -3388,10 +3380,7 @@
         <w:t xml:space="preserve">chatbot</w:t>
       </w:r>
       <w:r>
-        <w:t xml:space="preserve"> </w:t>
-      </w:r>
-      <w:r>
-        <w:t xml:space="preserve">using cognitive science and artificial intelligence. In H. Vasudevan, A. Michalas, N. Shekokar, &amp; M. Narvekar (Eds.),</w:t>
+        <w:t xml:space="preserve">s as a tool to scale mentoring processes: Individually supporting self-study in higher education.</w:t>
       </w:r>
       <w:r>
         <w:t xml:space="preserve"> </w:t>
@@ -3401,22 +3390,18 @@
           <w:iCs/>
           <w:i/>
         </w:rPr>
-        <w:t xml:space="preserve">Advanced computing technologies and applications</w:t>
-      </w:r>
-      <w:r>
-        <w:t xml:space="preserve"> </w:t>
-      </w:r>
-      <w:r>
-        <w:t xml:space="preserve">(pp. 1–9). Springer. https://doi.org/10.1007/978-981-15-3242-9_1</w:t>
+        <w:t xml:space="preserve">Frontiers in Artificial Intelligence, 4</w:t>
+      </w:r>
+      <w:r>
+        <w:t xml:space="preserve">, 668220. https://doi.org/10.3389/frai.2021.668220</w:t>
       </w:r>
     </w:p>
     <w:p>
       <w:pPr>
         <w:pStyle w:val="BodyText"/>
-        <w:jc w:val="both"/>
-      </w:pPr>
-      <w:r>
-        <w:t xml:space="preserve">Jemstedt, A., Bälter, O., Gavel, A., Glassey, R., &amp; Bosk, D. (2024). Less to produce and less to consume: The advantage of pure question-based learning.</w:t>
+      </w:pPr>
+      <w:r>
+        <w:t xml:space="preserve">Savickas, M. L. (2018). The career construction interview. In</w:t>
       </w:r>
       <w:r>
         <w:t xml:space="preserve"> </w:t>
@@ -3426,19 +3411,21 @@
           <w:iCs/>
           <w:i/>
         </w:rPr>
-        <w:t xml:space="preserve">Interactive Learning Environments</w:t>
-      </w:r>
-      <w:r>
-        <w:t xml:space="preserve">. https://doi.org/10.1080/10494820.2024.2362830</w:t>
+        <w:t xml:space="preserve">Career counseling</w:t>
+      </w:r>
+      <w:r>
+        <w:t xml:space="preserve"> </w:t>
+      </w:r>
+      <w:r>
+        <w:t xml:space="preserve">(2a ed., pp. 57–70). American Psychological Association. https://doi.org/10.1037/0000105-004</w:t>
       </w:r>
     </w:p>
     <w:p>
       <w:pPr>
         <w:pStyle w:val="BodyText"/>
-        <w:jc w:val="both"/>
-      </w:pPr>
-      <w:r>
-        <w:t xml:space="preserve">Kasneci, E., Seßler, K., Küchemann, S., et al. (2023). ChatGPT for good? On opportunities and challenges of large language models for education.</w:t>
+      </w:pPr>
+      <w:r>
+        <w:t xml:space="preserve">Self, J. A. (1974). Student models in computer-aided instruction.</w:t>
       </w:r>
       <w:r>
         <w:t xml:space="preserve"> </w:t>
@@ -3448,19 +3435,18 @@
           <w:iCs/>
           <w:i/>
         </w:rPr>
-        <w:t xml:space="preserve">Learning and Individual Differences, 103</w:t>
-      </w:r>
-      <w:r>
-        <w:t xml:space="preserve">, 102274. https://doi.org/10.1016/j.lindif.2023.102274</w:t>
+        <w:t xml:space="preserve">International Journal of Man-Machine Studies, 6</w:t>
+      </w:r>
+      <w:r>
+        <w:t xml:space="preserve">(2), 261–276. https://doi.org/10.1016/S0020-7373(74)80005-2</w:t>
       </w:r>
     </w:p>
     <w:p>
       <w:pPr>
         <w:pStyle w:val="BodyText"/>
-        <w:jc w:val="both"/>
-      </w:pPr>
-      <w:r>
-        <w:t xml:space="preserve">Kuhail, M. A., Alturki, N., Alramlawi, S., &amp; Alhejori, K. (2022). Interacting with educational</w:t>
+      </w:pPr>
+      <w:r>
+        <w:t xml:space="preserve">Su, L. H., Truong, D.-H., Tran, T.-Y.-L., et al. (2020). Development of an AI</w:t>
       </w:r>
       <w:r>
         <w:t xml:space="preserve"> </w:t>
@@ -3473,7 +3459,10 @@
         <w:t xml:space="preserve">chatbot</w:t>
       </w:r>
       <w:r>
-        <w:t xml:space="preserve">s: A systematic review.</w:t>
+        <w:t xml:space="preserve"> </w:t>
+      </w:r>
+      <w:r>
+        <w:t xml:space="preserve">to support admissions and career guidance for universities.</w:t>
       </w:r>
       <w:r>
         <w:t xml:space="preserve"> </w:t>
@@ -3483,19 +3472,18 @@
           <w:iCs/>
           <w:i/>
         </w:rPr>
-        <w:t xml:space="preserve">Education and Information Technologies, 28</w:t>
-      </w:r>
-      <w:r>
-        <w:t xml:space="preserve">(1), 973–1018. https://doi.org/10.1007/s10639-022-11177-3</w:t>
+        <w:t xml:space="preserve">International Journal of Emerging Multidisciplinary Research, 4</w:t>
+      </w:r>
+      <w:r>
+        <w:t xml:space="preserve">(2), 13–20. https://doi.org/10.22662/IJEMR.2020.4.2.013</w:t>
       </w:r>
     </w:p>
     <w:p>
       <w:pPr>
         <w:pStyle w:val="BodyText"/>
-        <w:jc w:val="both"/>
-      </w:pPr>
-      <w:r>
-        <w:t xml:space="preserve">Lewis, P., Perez, E., Piktus, A., et al. (2020). Retrieval-Augmented Generation for knowledge-intensive NLP tasks.</w:t>
+      </w:pPr>
+      <w:r>
+        <w:t xml:space="preserve">Susnjak, T. (2023). Beyond predictive learning analytics modelling and onto explainable artificial intelligence with prescriptive analytics and ChatGPT.</w:t>
       </w:r>
       <w:r>
         <w:t xml:space="preserve"> </w:t>
@@ -3505,19 +3493,18 @@
           <w:iCs/>
           <w:i/>
         </w:rPr>
-        <w:t xml:space="preserve">Advances in Neural Information Processing Systems, 33</w:t>
-      </w:r>
-      <w:r>
-        <w:t xml:space="preserve">, 9459–9474.</w:t>
+        <w:t xml:space="preserve">International Journal of Artificial Intelligence in Education, 34</w:t>
+      </w:r>
+      <w:r>
+        <w:t xml:space="preserve">, 452–482. https://doi.org/10.1007/s40593-023-00336-3</w:t>
       </w:r>
     </w:p>
     <w:p>
       <w:pPr>
         <w:pStyle w:val="BodyText"/>
-        <w:jc w:val="both"/>
-      </w:pPr>
-      <w:r>
-        <w:t xml:space="preserve">Liu, X., Xiao, Y., &amp; Li, D. (2025). Assessing strategic use of artificial intelligence in self-regulated learning: Instrument development and evidence from Chinese university students.</w:t>
+      </w:pPr>
+      <w:r>
+        <w:t xml:space="preserve">Tankelevitch, L., Kewenig, V., Simkute, A., et al. (2024). The metacognitive demands and opportunities of generative AI. In</w:t>
       </w:r>
       <w:r>
         <w:t xml:space="preserve"> </w:t>
@@ -3527,19 +3514,42 @@
           <w:iCs/>
           <w:i/>
         </w:rPr>
-        <w:t xml:space="preserve">International Journal of Educational Technology in Higher Education, 22</w:t>
-      </w:r>
-      <w:r>
-        <w:t xml:space="preserve">, 69. https://doi.org/10.1186/s41239-025-00567-5</w:t>
+        <w:t xml:space="preserve">Proceedings of the 2024 CHI Conference on Human Factors in Computing Systems</w:t>
+      </w:r>
+      <w:r>
+        <w:t xml:space="preserve"> </w:t>
+      </w:r>
+      <w:r>
+        <w:t xml:space="preserve">(pp. 1–24). https://doi.org/10.1145/3613904.3642902</w:t>
       </w:r>
     </w:p>
     <w:p>
       <w:pPr>
         <w:pStyle w:val="BodyText"/>
-        <w:jc w:val="both"/>
-      </w:pPr>
-      <w:r>
-        <w:t xml:space="preserve">Mendez, S., Johanson, K., Conley, V. M., et al. (2020).</w:t>
+      </w:pPr>
+      <w:r>
+        <w:t xml:space="preserve">Weizenbaum, J. (1966). ELIZA—A computer program for the study of natural language communication between man and machine.</w:t>
+      </w:r>
+      <w:r>
+        <w:t xml:space="preserve"> </w:t>
+      </w:r>
+      <w:r>
+        <w:rPr>
+          <w:iCs/>
+          <w:i/>
+        </w:rPr>
+        <w:t xml:space="preserve">Communications of the ACM, 9</w:t>
+      </w:r>
+      <w:r>
+        <w:t xml:space="preserve">(1), 36–45. https://doi.org/10.1145/365153.365168</w:t>
+      </w:r>
+    </w:p>
+    <w:p>
+      <w:pPr>
+        <w:pStyle w:val="BodyText"/>
+      </w:pPr>
+      <w:r>
+        <w:t xml:space="preserve">Wollny, S., Schneider, J., Di Mitri, D., et al. (2021). Are we there yet? A systematic literature review on</w:t>
       </w:r>
       <w:r>
         <w:t xml:space="preserve"> </w:t>
@@ -3552,42 +3562,7 @@
         <w:t xml:space="preserve">chatbot</w:t>
       </w:r>
       <w:r>
-        <w:t xml:space="preserve">s: A tool to supplement the future faculty mentoring of doctoral engineering students.</w:t>
-      </w:r>
-      <w:r>
-        <w:t xml:space="preserve"> </w:t>
-      </w:r>
-      <w:r>
-        <w:rPr>
-          <w:iCs/>
-          <w:i/>
-        </w:rPr>
-        <w:t xml:space="preserve">International Journal of Doctoral Studies, 15</w:t>
-      </w:r>
-      <w:r>
-        <w:t xml:space="preserve">, 373–392. https://doi.org/10.28945/4579</w:t>
-      </w:r>
-    </w:p>
-    <w:p>
-      <w:pPr>
-        <w:pStyle w:val="BodyText"/>
-        <w:jc w:val="both"/>
-      </w:pPr>
-      <w:r>
-        <w:t xml:space="preserve">Neumann, A. T., Arndt, T., Köbis, L., et al. (2021).</w:t>
-      </w:r>
-      <w:r>
-        <w:t xml:space="preserve"> </w:t>
-      </w:r>
-      <w:r>
-        <w:rPr>
-          <w:iCs/>
-          <w:i/>
-        </w:rPr>
-        <w:t xml:space="preserve">chatbot</w:t>
-      </w:r>
-      <w:r>
-        <w:t xml:space="preserve">s as a tool to scale mentoring processes: Individually supporting self-study in higher education.</w:t>
+        <w:t xml:space="preserve">s in education.</w:t>
       </w:r>
       <w:r>
         <w:t xml:space="preserve"> </w:t>
@@ -3600,202 +3575,12 @@
         <w:t xml:space="preserve">Frontiers in Artificial Intelligence, 4</w:t>
       </w:r>
       <w:r>
-        <w:t xml:space="preserve">, 668220. https://doi.org/10.3389/frai.2021.668220</w:t>
+        <w:t xml:space="preserve">, 654924. https://doi.org/10.3389/frai.2021.654924</w:t>
       </w:r>
     </w:p>
     <w:p>
       <w:pPr>
         <w:pStyle w:val="BodyText"/>
-        <w:jc w:val="both"/>
-      </w:pPr>
-      <w:r>
-        <w:t xml:space="preserve">Savickas, M. L. (2018). The career construction interview. In</w:t>
-      </w:r>
-      <w:r>
-        <w:t xml:space="preserve"> </w:t>
-      </w:r>
-      <w:r>
-        <w:rPr>
-          <w:iCs/>
-          <w:i/>
-        </w:rPr>
-        <w:t xml:space="preserve">Career counseling</w:t>
-      </w:r>
-      <w:r>
-        <w:t xml:space="preserve"> </w:t>
-      </w:r>
-      <w:r>
-        <w:t xml:space="preserve">(2a ed., pp. 57–70). American Psychological Association. https://doi.org/10.1037/0000105-004</w:t>
-      </w:r>
-    </w:p>
-    <w:p>
-      <w:pPr>
-        <w:pStyle w:val="BodyText"/>
-        <w:jc w:val="both"/>
-      </w:pPr>
-      <w:r>
-        <w:t xml:space="preserve">Self, J. A. (1974). Student models in computer-aided instruction.</w:t>
-      </w:r>
-      <w:r>
-        <w:t xml:space="preserve"> </w:t>
-      </w:r>
-      <w:r>
-        <w:rPr>
-          <w:iCs/>
-          <w:i/>
-        </w:rPr>
-        <w:t xml:space="preserve">International Journal of Man-Machine Studies, 6</w:t>
-      </w:r>
-      <w:r>
-        <w:t xml:space="preserve">(2), 261–276. https://doi.org/10.1016/S0020-7373(74)80005-2</w:t>
-      </w:r>
-    </w:p>
-    <w:p>
-      <w:pPr>
-        <w:pStyle w:val="BodyText"/>
-        <w:jc w:val="both"/>
-      </w:pPr>
-      <w:r>
-        <w:t xml:space="preserve">Su, L. H., Truong, D.-H., Tran, T.-Y.-L., et al. (2020). Development of an AI</w:t>
-      </w:r>
-      <w:r>
-        <w:t xml:space="preserve"> </w:t>
-      </w:r>
-      <w:r>
-        <w:rPr>
-          <w:iCs/>
-          <w:i/>
-        </w:rPr>
-        <w:t xml:space="preserve">chatbot</w:t>
-      </w:r>
-      <w:r>
-        <w:t xml:space="preserve"> </w:t>
-      </w:r>
-      <w:r>
-        <w:t xml:space="preserve">to support admissions and career guidance for universities.</w:t>
-      </w:r>
-      <w:r>
-        <w:t xml:space="preserve"> </w:t>
-      </w:r>
-      <w:r>
-        <w:rPr>
-          <w:iCs/>
-          <w:i/>
-        </w:rPr>
-        <w:t xml:space="preserve">International Journal of Emerging Multidisciplinary Research, 4</w:t>
-      </w:r>
-      <w:r>
-        <w:t xml:space="preserve">(2), 13–20. https://doi.org/10.22662/IJEMR.2020.4.2.013</w:t>
-      </w:r>
-    </w:p>
-    <w:p>
-      <w:pPr>
-        <w:pStyle w:val="BodyText"/>
-        <w:jc w:val="both"/>
-      </w:pPr>
-      <w:r>
-        <w:t xml:space="preserve">Susnjak, T. (2023). Beyond predictive learning analytics modelling and onto explainable artificial intelligence with prescriptive analytics and ChatGPT.</w:t>
-      </w:r>
-      <w:r>
-        <w:t xml:space="preserve"> </w:t>
-      </w:r>
-      <w:r>
-        <w:rPr>
-          <w:iCs/>
-          <w:i/>
-        </w:rPr>
-        <w:t xml:space="preserve">International Journal of Artificial Intelligence in Education, 34</w:t>
-      </w:r>
-      <w:r>
-        <w:t xml:space="preserve">, 452–482. https://doi.org/10.1007/s40593-023-00336-3</w:t>
-      </w:r>
-    </w:p>
-    <w:p>
-      <w:pPr>
-        <w:pStyle w:val="BodyText"/>
-        <w:jc w:val="both"/>
-      </w:pPr>
-      <w:r>
-        <w:t xml:space="preserve">Tankelevitch, L., Kewenig, V., Simkute, A., et al. (2024). The metacognitive demands and opportunities of generative AI. In</w:t>
-      </w:r>
-      <w:r>
-        <w:t xml:space="preserve"> </w:t>
-      </w:r>
-      <w:r>
-        <w:rPr>
-          <w:iCs/>
-          <w:i/>
-        </w:rPr>
-        <w:t xml:space="preserve">Proceedings of the 2024 CHI Conference on Human Factors in Computing Systems</w:t>
-      </w:r>
-      <w:r>
-        <w:t xml:space="preserve"> </w:t>
-      </w:r>
-      <w:r>
-        <w:t xml:space="preserve">(pp. 1–24). https://doi.org/10.1145/3613904.3642902</w:t>
-      </w:r>
-    </w:p>
-    <w:p>
-      <w:pPr>
-        <w:pStyle w:val="BodyText"/>
-        <w:jc w:val="both"/>
-      </w:pPr>
-      <w:r>
-        <w:t xml:space="preserve">Weizenbaum, J. (1966). ELIZA—A computer program for the study of natural language communication between man and machine.</w:t>
-      </w:r>
-      <w:r>
-        <w:t xml:space="preserve"> </w:t>
-      </w:r>
-      <w:r>
-        <w:rPr>
-          <w:iCs/>
-          <w:i/>
-        </w:rPr>
-        <w:t xml:space="preserve">Communications of the ACM, 9</w:t>
-      </w:r>
-      <w:r>
-        <w:t xml:space="preserve">(1), 36–45. https://doi.org/10.1145/365153.365168</w:t>
-      </w:r>
-    </w:p>
-    <w:p>
-      <w:pPr>
-        <w:pStyle w:val="BodyText"/>
-        <w:jc w:val="both"/>
-      </w:pPr>
-      <w:r>
-        <w:t xml:space="preserve">Wollny, S., Schneider, J., Di Mitri, D., et al. (2021). Are we there yet? A systematic literature review on</w:t>
-      </w:r>
-      <w:r>
-        <w:t xml:space="preserve"> </w:t>
-      </w:r>
-      <w:r>
-        <w:rPr>
-          <w:iCs/>
-          <w:i/>
-        </w:rPr>
-        <w:t xml:space="preserve">chatbot</w:t>
-      </w:r>
-      <w:r>
-        <w:t xml:space="preserve">s in education.</w:t>
-      </w:r>
-      <w:r>
-        <w:t xml:space="preserve"> </w:t>
-      </w:r>
-      <w:r>
-        <w:rPr>
-          <w:iCs/>
-          <w:i/>
-        </w:rPr>
-        <w:t xml:space="preserve">Frontiers in Artificial Intelligence, 4</w:t>
-      </w:r>
-      <w:r>
-        <w:t xml:space="preserve">, 654924. https://doi.org/10.3389/frai.2021.654924</w:t>
-      </w:r>
-    </w:p>
-    <w:p>
-      <w:pPr>
-        <w:pStyle w:val="BodyText"/>
-        <w:jc w:val="both"/>
       </w:pPr>
       <w:r>
         <w:t xml:space="preserve">Zawacki-Richter, O., Marín, V. I., Bond, M., &amp; Gouverneur, F. (2019). Systematic review of research on artificial intelligence applications in higher education: Where are the educators?</w:t>
@@ -4293,7 +4078,6 @@
     <w:rsid w:val="00FC693F"/>
     <w:pPr>
       <w:spacing w:after="120" w:line="360" w:lineRule="auto"/>
-      <w:jc w:val="both"/>
     </w:pPr>
     <w:rPr>
       <w:rFonts w:ascii="Times New Roman" w:hAnsi="Times New Roman"/>
@@ -4313,7 +4097,6 @@
         <w:tab w:pos="9360" w:val="right"/>
       </w:tabs>
       <w:spacing w:after="0" w:line="240" w:lineRule="auto"/>
-      <w:jc w:val="both"/>
     </w:pPr>
     <w:rPr>
       <w:rFonts w:ascii="Times New Roman" w:hAnsi="Times New Roman"/>
@@ -4342,7 +4125,6 @@
         <w:tab w:pos="9360" w:val="right"/>
       </w:tabs>
       <w:spacing w:after="0" w:line="240" w:lineRule="auto"/>
-      <w:jc w:val="both"/>
     </w:pPr>
     <w:rPr>
       <w:rFonts w:ascii="Times New Roman" w:hAnsi="Times New Roman"/>
@@ -4378,7 +4160,6 @@
       <w:bCs/>
       <w:sz w:val="28"/>
       <w:szCs w:val="28"/>
-      <w:color w:val="000000"/>
     </w:rPr>
   </w:style>
   <w:style w:styleId="Heading2" w:type="paragraph">
@@ -4402,7 +4183,6 @@
       <w:bCs/>
       <w:sz w:val="26"/>
       <w:szCs w:val="26"/>
-      <w:color w:val="000000"/>
     </w:rPr>
   </w:style>
   <w:style w:styleId="Heading3" w:type="paragraph">
@@ -4425,7 +4205,6 @@
       <w:b/>
       <w:bCs/>
       <w:sz w:val="24"/>
-      <w:color w:val="000000"/>
     </w:rPr>
   </w:style>
   <w:style w:styleId="Heading4" w:type="paragraph">
@@ -4450,7 +4229,6 @@
       <w:bCs/>
       <w:i/>
       <w:iCs/>
-      <w:color w:val="000000"/>
     </w:rPr>
   </w:style>
   <w:style w:styleId="Heading5" w:type="paragraph">
@@ -4471,7 +4249,6 @@
     </w:pPr>
     <w:rPr>
       <w:rFonts w:ascii="Times New Roman" w:asciiTheme="majorHAnsi" w:cstheme="majorBidi" w:eastAsiaTheme="majorEastAsia" w:hAnsi="Times New Roman" w:hAnsiTheme="majorHAnsi"/>
-      <w:color w:val="000000"/>
     </w:rPr>
   </w:style>
   <w:style w:styleId="Heading6" w:type="paragraph">
@@ -4494,7 +4271,6 @@
       <w:rFonts w:ascii="Times New Roman" w:asciiTheme="majorHAnsi" w:cstheme="majorBidi" w:eastAsiaTheme="majorEastAsia" w:hAnsi="Times New Roman" w:hAnsiTheme="majorHAnsi"/>
       <w:i/>
       <w:iCs/>
-      <w:color w:val="000000"/>
     </w:rPr>
   </w:style>
   <w:style w:styleId="Heading7" w:type="paragraph">
@@ -4517,7 +4293,6 @@
       <w:rFonts w:ascii="Times New Roman" w:asciiTheme="majorHAnsi" w:cstheme="majorBidi" w:eastAsiaTheme="majorEastAsia" w:hAnsi="Times New Roman" w:hAnsiTheme="majorHAnsi"/>
       <w:i/>
       <w:iCs/>
-      <w:color w:val="000000"/>
     </w:rPr>
   </w:style>
   <w:style w:styleId="Heading8" w:type="paragraph">
@@ -4540,7 +4315,6 @@
       <w:rFonts w:ascii="Times New Roman" w:asciiTheme="majorHAnsi" w:cstheme="majorBidi" w:eastAsiaTheme="majorEastAsia" w:hAnsi="Times New Roman" w:hAnsiTheme="majorHAnsi"/>
       <w:sz w:val="20"/>
       <w:szCs w:val="20"/>
-      <w:color w:val="000000"/>
     </w:rPr>
   </w:style>
   <w:style w:styleId="Heading9" w:type="paragraph">
@@ -4565,7 +4339,6 @@
       <w:iCs/>
       <w:sz w:val="20"/>
       <w:szCs w:val="20"/>
-      <w:color w:val="000000"/>
     </w:rPr>
   </w:style>
   <w:style w:default="1" w:styleId="DefaultParagraphFont" w:type="character">
@@ -4611,7 +4384,6 @@
     <w:rsid w:val="00FC693F"/>
     <w:pPr>
       <w:spacing w:after="0" w:line="240" w:lineRule="auto"/>
-      <w:jc w:val="both"/>
     </w:pPr>
     <w:rPr>
       <w:rFonts w:ascii="Times New Roman" w:hAnsi="Times New Roman"/>
@@ -4678,7 +4450,6 @@
       <w:kern w:val="28"/>
       <w:sz w:val="52"/>
       <w:szCs w:val="52"/>
-      <w:color w:val="000000"/>
     </w:rPr>
   </w:style>
   <w:style w:customStyle="1" w:styleId="TitleChar" w:type="character">
@@ -4715,7 +4486,6 @@
       <w:spacing w:val="15"/>
       <w:sz w:val="24"/>
       <w:szCs w:val="24"/>
-      <w:color w:val="000000"/>
     </w:rPr>
   </w:style>
   <w:style w:customStyle="1" w:styleId="SubtitleChar" w:type="character">
@@ -4742,7 +4512,6 @@
     <w:pPr>
       <w:ind w:left="720"/>
       <w:contextualSpacing/>
-      <w:jc w:val="both"/>
     </w:pPr>
     <w:rPr>
       <w:rFonts w:ascii="Times New Roman" w:hAnsi="Times New Roman"/>
@@ -4757,7 +4526,6 @@
     <w:rsid w:val="00AA1D8D"/>
     <w:pPr>
       <w:spacing w:after="120"/>
-      <w:jc w:val="both"/>
     </w:pPr>
     <w:rPr>
       <w:rFonts w:ascii="Times New Roman" w:hAnsi="Times New Roman"/>
@@ -4782,7 +4550,6 @@
     <w:rsid w:val="00AA1D8D"/>
     <w:pPr>
       <w:spacing w:after="120" w:line="480" w:lineRule="auto"/>
-      <w:jc w:val="both"/>
     </w:pPr>
     <w:rPr>
       <w:rFonts w:ascii="Times New Roman" w:hAnsi="Times New Roman"/>
@@ -4807,7 +4574,6 @@
     <w:rsid w:val="00AA1D8D"/>
     <w:pPr>
       <w:spacing w:after="120"/>
-      <w:jc w:val="both"/>
     </w:pPr>
     <w:rPr>
       <w:rFonts w:ascii="Times New Roman" w:hAnsi="Times New Roman"/>
@@ -4836,7 +4602,6 @@
     <w:pPr>
       <w:ind w:hanging="360" w:left="360"/>
       <w:contextualSpacing/>
-      <w:jc w:val="both"/>
     </w:pPr>
     <w:rPr>
       <w:rFonts w:ascii="Times New Roman" w:hAnsi="Times New Roman"/>
@@ -4851,7 +4616,6 @@
     <w:pPr>
       <w:ind w:hanging="360" w:left="720"/>
       <w:contextualSpacing/>
-      <w:jc w:val="both"/>
     </w:pPr>
     <w:rPr>
       <w:rFonts w:ascii="Times New Roman" w:hAnsi="Times New Roman"/>
@@ -4866,7 +4630,6 @@
     <w:pPr>
       <w:ind w:hanging="360" w:left="1080"/>
       <w:contextualSpacing/>
-      <w:jc w:val="both"/>
     </w:pPr>
     <w:rPr>
       <w:rFonts w:ascii="Times New Roman" w:hAnsi="Times New Roman"/>
@@ -4883,7 +4646,6 @@
         <w:numId w:val="1"/>
       </w:numPr>
       <w:contextualSpacing/>
-      <w:jc w:val="both"/>
     </w:pPr>
     <w:rPr>
       <w:rFonts w:ascii="Times New Roman" w:hAnsi="Times New Roman"/>
@@ -4900,7 +4662,6 @@
         <w:numId w:val="2"/>
       </w:numPr>
       <w:contextualSpacing/>
-      <w:jc w:val="both"/>
     </w:pPr>
     <w:rPr>
       <w:rFonts w:ascii="Times New Roman" w:hAnsi="Times New Roman"/>
@@ -4917,7 +4678,6 @@
         <w:numId w:val="3"/>
       </w:numPr>
       <w:contextualSpacing/>
-      <w:jc w:val="both"/>
     </w:pPr>
     <w:rPr>
       <w:rFonts w:ascii="Times New Roman" w:hAnsi="Times New Roman"/>
@@ -4934,7 +4694,6 @@
         <w:numId w:val="5"/>
       </w:numPr>
       <w:contextualSpacing/>
-      <w:jc w:val="both"/>
     </w:pPr>
     <w:rPr>
       <w:rFonts w:ascii="Times New Roman" w:hAnsi="Times New Roman"/>
@@ -4951,7 +4710,6 @@
         <w:numId w:val="6"/>
       </w:numPr>
       <w:contextualSpacing/>
-      <w:jc w:val="both"/>
     </w:pPr>
     <w:rPr>
       <w:rFonts w:ascii="Times New Roman" w:hAnsi="Times New Roman"/>
@@ -4968,7 +4726,6 @@
         <w:numId w:val="7"/>
       </w:numPr>
       <w:contextualSpacing/>
-      <w:jc w:val="both"/>
     </w:pPr>
     <w:rPr>
       <w:rFonts w:ascii="Times New Roman" w:hAnsi="Times New Roman"/>
@@ -4984,7 +4741,6 @@
       <w:spacing w:after="120"/>
       <w:ind w:left="360"/>
       <w:contextualSpacing/>
-      <w:jc w:val="both"/>
     </w:pPr>
     <w:rPr>
       <w:rFonts w:ascii="Times New Roman" w:hAnsi="Times New Roman"/>
@@ -5000,7 +4756,6 @@
       <w:spacing w:after="120"/>
       <w:ind w:left="720"/>
       <w:contextualSpacing/>
-      <w:jc w:val="both"/>
     </w:pPr>
     <w:rPr>
       <w:rFonts w:ascii="Times New Roman" w:hAnsi="Times New Roman"/>
@@ -5016,7 +4771,6 @@
       <w:spacing w:after="120"/>
       <w:ind w:left="1080"/>
       <w:contextualSpacing/>
-      <w:jc w:val="both"/>
     </w:pPr>
     <w:rPr>
       <w:rFonts w:ascii="Times New Roman" w:hAnsi="Times New Roman"/>
@@ -5038,7 +4792,6 @@
         <w:tab w:pos="3456" w:val="left"/>
         <w:tab w:pos="4032" w:val="left"/>
       </w:tabs>
-      <w:jc w:val="both"/>
     </w:pPr>
     <w:rPr>
       <w:rFonts w:ascii="Times New Roman" w:hAnsi="Times New Roman"/>
@@ -5059,9 +4812,6 @@
     </w:rPr>
   </w:style>
   <w:style w:styleId="Quote" w:type="paragraph">
-    <w:pPr>
-      <w:jc w:val="both"/>
-    </w:pPr>
     <w:name w:val="Quote"/>
     <w:basedOn w:val="Normal"/>
     <w:next w:val="Normal"/>
@@ -5178,7 +4928,6 @@
     <w:rsid w:val="00FC693F"/>
     <w:pPr>
       <w:spacing w:line="240" w:lineRule="auto"/>
-      <w:jc w:val="both"/>
     </w:pPr>
     <w:rPr>
       <w:rFonts w:ascii="Times New Roman" w:hAnsi="Times New Roman"/>
@@ -5226,7 +4975,6 @@
       </w:pBdr>
       <w:spacing w:after="280" w:before="200"/>
       <w:ind w:left="936" w:right="936"/>
-      <w:jc w:val="both"/>
     </w:pPr>
     <w:rPr>
       <w:rFonts w:ascii="Times New Roman" w:hAnsi="Times New Roman"/>
@@ -5331,7 +5079,6 @@
     </w:pPr>
     <w:rPr>
       <w:rFonts w:ascii="Times New Roman" w:hAnsi="Times New Roman"/>
-      <w:color w:val="000000"/>
     </w:rPr>
   </w:style>
   <w:style w:styleId="TableGrid" w:type="table">
@@ -16202,7 +15949,6 @@
     <w:link w:val="VerbatimChar"/>
     <w:pPr>
       <w:wordWrap w:val="off"/>
-      <w:jc w:val="both"/>
     </w:pPr>
   </w:style>
   <w:style w:type="character" w:customStyle="1" w:styleId="KeywordTok">

</xml_diff>

<commit_message>
Add decision log for session 027: revision of paragraphs in article v38 to v39
- Tool used: opencode
- Command executed: /r-pp-a (partial)
- Analyzed paragraphs: §2.1 P3–P8
- Applied modifications: 7 points and 1 frozen fix
- Final version updated to v39 with character count ~47,993
- 19 units frozen from Abstract to §2.1 P8, remaining sections open for further work
</commit_message>
<xml_diff>
--- a/articles/current.docx
+++ b/articles/current.docx
@@ -733,7 +733,7 @@
         <w:t xml:space="preserve"> </w:t>
       </w:r>
       <w:r>
-        <w:t xml:space="preserve">di Savickas oppure il modulo di</w:t>
+        <w:t xml:space="preserve">di Savickas (2018) oppure il modulo di</w:t>
       </w:r>
       <w:r>
         <w:t xml:space="preserve"> </w:t>
@@ -749,7 +749,7 @@
         <w:t xml:space="preserve"> </w:t>
       </w:r>
       <w:r>
-        <w:t xml:space="preserve">(PQBL) di Jemstedt e Bälter. La scelta determina l’interfaccia e il percorso di interazione che il sistema attiva.</w:t>
+        <w:t xml:space="preserve">(PQBL; Jemstedt et al., 2024). La scelta determina l’interfaccia e il percorso di interazione che il sistema attiva.</w:t>
       </w:r>
     </w:p>
     <w:p>
@@ -765,7 +765,7 @@
         <w:pStyle w:val="BodyText"/>
       </w:pPr>
       <w:r>
-        <w:t xml:space="preserve">Accanto al QSA è integrato il QSAr, una versione ridotta del Questionario sulle Strategie di Apprendimento. Esso consente di ottenere una rappresentazione più sintetica delle principali modalità con cui lo studente affronta il proprio apprendimento. Anche in questo caso, Counselorbot restituisce il profilo in forma comprensibile, evidenzia i punti di forza e le aree suscettibili di sviluppo e guida l’utente nella riflessione sulle possibili strategie di miglioramento.</w:t>
+        <w:t xml:space="preserve">Accanto al QSA è disponibile anche il QSAr, una versione ridotta a 46 item (contro i 100 del QSA) che offre una rappresentazione più sintetica delle principali modalità di apprendimento (Pellerey et al., 2013). Anche per il QSAr, Counselorbot restituisce il profilo in forma comprensibile, evidenzia i punti di forza e le aree di miglioramento e guida l’utente nella riflessione sulle strategie possibili.</w:t>
       </w:r>
     </w:p>
     <w:p>
@@ -773,7 +773,7 @@
         <w:pStyle w:val="BodyText"/>
       </w:pPr>
       <w:r>
-        <w:t xml:space="preserve">Un ulteriore strumento è lo</w:t>
+        <w:t xml:space="preserve">Lo</w:t>
       </w:r>
       <w:r>
         <w:t xml:space="preserve"> </w:t>
@@ -789,7 +789,7 @@
         <w:t xml:space="preserve"> </w:t>
       </w:r>
       <w:r>
-        <w:t xml:space="preserve">(ZTPI), attraverso il quale viene analizzato il rapporto dell’individuo con le dimensioni temporali del passato, del presente e del futuro. Le prospettive temporali possono incidere sulla capacità progettuale, sulle decisioni e sull’atteggiamento assunto verso il percorso formativo e professionale. Counselorbot supporta l’utente nell’interpretazione del proprio profilo temporale e lo aiuta a individuare le relazioni tra orientamento temporale, obiettivi personali e scelte future.</w:t>
+        <w:t xml:space="preserve">(ZTPI; Zimbardo &amp; Boyd, 1999) analizza il rapporto dell’individuo con le dimensioni temporali di passato, presente e futuro. Le prospettive temporali incidono sulla capacità progettuale, sulle decisioni e sull’atteggiamento verso il percorso formativo e professionale. Counselorbot supporta l’utente nell’interpretazione del proprio profilo temporale, aiutandolo a connettere l’orientamento temporale emerso con gli obiettivi personali e le scelte future.</w:t>
       </w:r>
     </w:p>
     <w:p>
@@ -797,7 +797,20 @@
         <w:pStyle w:val="BodyText"/>
       </w:pPr>
       <w:r>
-        <w:t xml:space="preserve">Per QSA, QSAr e ZTPI, l’interfaccia richiede l’inserimento dei risultati e restituisce una rappresentazione grafica del profilo. Il grafico a barre utilizza una codifica cromatica nella quale il verde identifica i punti di forza, il giallo i risultati collocati nella fascia intermedia e il rosso le possibili aree di crescita. La visualizzazione grafica non sostituisce l’interpretazione, ma offre una prima rappresentazione sintetica del profilo, che viene successivamente approfondita attraverso il dialogo guidato.</w:t>
+        <w:t xml:space="preserve">Per QSA, QSAr e ZTPI, l’interfaccia richiede l’inserimento dei risultati e restituisce il profilo nello stesso formato del portale</w:t>
+      </w:r>
+      <w:r>
+        <w:t xml:space="preserve"> </w:t>
+      </w:r>
+      <w:r>
+        <w:rPr>
+          <w:iCs/>
+          <w:i/>
+        </w:rPr>
+        <w:t xml:space="preserve">Competenze strategiche</w:t>
+      </w:r>
+      <w:r>
+        <w:t xml:space="preserve">: un grafico a barre con codifica cromatica in cui il verde identifica i punti di forza, il giallo i risultati intermedi e il rosso le possibili aree di crescita. Questa visualizzazione offre una prima sintesi che viene utilizzata per il dialogo assistito.</w:t>
       </w:r>
     </w:p>
     <w:p>
@@ -805,7 +818,7 @@
         <w:pStyle w:val="BodyText"/>
       </w:pPr>
       <w:r>
-        <w:t xml:space="preserve">Ai questionari si affiancano due strumenti aggiuntivi, caratterizzati da finalità e modalità di funzionamento differenti. Il primo è la</w:t>
+        <w:t xml:space="preserve">Ai questionari si affiancano due strumenti di natura differente. Il primo è la</w:t>
       </w:r>
       <w:r>
         <w:t xml:space="preserve"> </w:t>
@@ -821,7 +834,7 @@
         <w:t xml:space="preserve"> </w:t>
       </w:r>
       <w:r>
-        <w:t xml:space="preserve">di Savickas, un colloquio narrativo finalizzato a esplorare le esperienze, gli interessi, i modelli di riferimento e le aspirazioni dell’utente. Dopo la selezione dello strumento, il sistema avvia il colloquio e propone cinque domande qualitative, alle quali il modello linguistico può far seguire ulteriori richieste di approfondimento. Al termine dell’interazione, Counselorbot elabora una sintesi narrativa orientata alla ricostruzione dell’identità professionale e all’individuazione dei principali temi di vita emersi.</w:t>
+        <w:t xml:space="preserve">di Savickas (2018), un colloquio narrativo che esplora esperienze, interessi, modelli di riferimento e aspirazioni dell’utente. Dopo la selezione, il sistema avvia il colloquio proponendo cinque domande qualitative, alle quali il modello linguistico può far seguire richieste di approfondimento. Al termine, Counselorbot elabora una sintesi narrativa che ricostruisce l’identità professionale e individua i principali temi di vita emersi.</w:t>
       </w:r>
     </w:p>
     <w:p>
@@ -829,7 +842,7 @@
         <w:pStyle w:val="BodyText"/>
       </w:pPr>
       <w:r>
-        <w:t xml:space="preserve">Il secondo strumento aggiuntivo è il modulo di</w:t>
+        <w:t xml:space="preserve">Il secondo è il modulo di</w:t>
       </w:r>
       <w:r>
         <w:t xml:space="preserve"> </w:t>
@@ -839,13 +852,13 @@
           <w:iCs/>
           <w:i/>
         </w:rPr>
-        <w:t xml:space="preserve">Question-Based Learning</w:t>
+        <w:t xml:space="preserve">Pure Question-Based Learning</w:t>
       </w:r>
       <w:r>
         <w:t xml:space="preserve"> </w:t>
       </w:r>
       <w:r>
-        <w:t xml:space="preserve">(PQBL), basato sulla metodologia proposta da Jemstedt e Bälter. In questo caso, l’interfaccia richiede il caricamento di un documento didattico in formato PDF. Il sistema ne trasforma il contenuto in un percorso interattivo fondato su domande e feedback. Il testo non viene quindi proposto soltanto come materiale da leggere, ma diventa la base di un’attività di apprendimento attivo, nella quale l’utente è chiamato a recuperare, rielaborare e applicare le informazioni contenute nel documento.</w:t>
+        <w:t xml:space="preserve">(PQBL; Jemstedt et al., 2024). L’interfaccia richiede il caricamento di un documento didattico in formato PDF. Il sistema trasforma il contenuto in un percorso interattivo fondato su domande e feedback, trasformando il testo da materiale di lettura passiva a base per un’attività nella quale l’utente recupera, rielabora e applica le informazioni.</w:t>
       </w:r>
     </w:p>
     <w:p>
@@ -853,7 +866,7 @@
         <w:pStyle w:val="BodyText"/>
       </w:pPr>
       <w:r>
-        <w:t xml:space="preserve">L’architettura modulare di Counselorbot è stata progettata in modo da consentire la futura integrazione di ulteriori questionari, interviste e strumenti di supporto all’orientamento e all’apprendimento.</w:t>
+        <w:t xml:space="preserve">L’architettura modulare di Counselorbot consente l’integrazione futura di ulteriori questionari, interviste e strumenti per l’orientamento e l’apprendimento.</w:t>
       </w:r>
     </w:p>
     <w:bookmarkEnd w:id="25"/>

</xml_diff>

<commit_message>
feat: Revise article v40 with updates to sections 3.1 and 3.2, including paragraph splits and content compression
</commit_message>
<xml_diff>
--- a/articles/current.docx
+++ b/articles/current.docx
@@ -8,7 +8,54 @@
         <w:pStyle w:val="Heading1"/>
       </w:pPr>
       <w:r>
+        <w:rPr>
+          <w:color w:val="000000"/>
+        </w:rPr>
         <w:t xml:space="preserve">Counselorbot: un</w:t>
+      </w:r>
+      <w:r>
+        <w:rPr>
+          <w:color w:val="000000"/>
+        </w:rPr>
+        <w:t xml:space="preserve"> </w:t>
+      </w:r>
+      <w:r>
+        <w:rPr>
+          <w:iCs/>
+          <w:i/>
+          <w:color w:val="000000"/>
+        </w:rPr>
+        <w:t xml:space="preserve">chatbot</w:t>
+      </w:r>
+      <w:r>
+        <w:rPr>
+          <w:color w:val="000000"/>
+        </w:rPr>
+        <w:t xml:space="preserve"> </w:t>
+      </w:r>
+      <w:r>
+        <w:rPr>
+          <w:color w:val="000000"/>
+        </w:rPr>
+        <w:t xml:space="preserve">per l’orientamento</w:t>
+      </w:r>
+    </w:p>
+    <w:p>
+      <w:pPr>
+        <w:pStyle w:val="FirstParagraph"/>
+        <w:jc w:val="both"/>
+      </w:pPr>
+      <w:r>
+        <w:t xml:space="preserve">Abstract (italiano)</w:t>
+      </w:r>
+    </w:p>
+    <w:p>
+      <w:pPr>
+        <w:pStyle w:val="BodyText"/>
+        <w:jc w:val="both"/>
+      </w:pPr>
+      <w:r>
+        <w:t xml:space="preserve">L’articolo presenta Counselorbot, un</w:t>
       </w:r>
       <w:r>
         <w:t xml:space="preserve"> </w:t>
@@ -24,23 +71,34 @@
         <w:t xml:space="preserve"> </w:t>
       </w:r>
       <w:r>
-        <w:t xml:space="preserve">per l’orientamento</w:t>
+        <w:t xml:space="preserve">basato su LLM a supporto della riflessione assistita sui risultati dell’autovalutazione delle competenze strategiche degli studenti. Il lavoro descrive l’architettura ibrida del sistema — che combina passi guidati deterministici con la flessibilità di un LLM — e il framework delle competenze strategiche su cui si basa. La valutazione, condotta su 34 partecipanti confrontando due versioni (CB-SBS e CB-C), suggerisce tendenze positive in 9 dimensioni su 10, con incrementi in facilità d’uso (Δ = +0,79) e fiducia (Δ = +0,65). Il lavoro si colloca nella fase di test del modello ADDIE e discute limiti e direzioni di sviluppo.</w:t>
       </w:r>
     </w:p>
     <w:p>
       <w:pPr>
-        <w:pStyle w:val="FirstParagraph"/>
-      </w:pPr>
-      <w:r>
-        <w:t xml:space="preserve">Abstract (italiano)</w:t>
+        <w:pStyle w:val="BodyText"/>
+        <w:jc w:val="both"/>
+      </w:pPr>
+      <w:r>
+        <w:t xml:space="preserve">Abstract (inglese)</w:t>
       </w:r>
     </w:p>
     <w:p>
       <w:pPr>
         <w:pStyle w:val="BodyText"/>
-      </w:pPr>
-      <w:r>
-        <w:t xml:space="preserve">L’articolo presenta Counselorbot, un</w:t>
+        <w:jc w:val="both"/>
+      </w:pPr>
+      <w:r>
+        <w:t xml:space="preserve">This paper presents Counselorbot, an LLM-based conversational assistant supporting students’ assisted reflection on their strategic-competences self-assessment. The paper describes the hybrid architecture — combining deterministic guided steps with LLM flexibility — and the strategic competences framework it builds on. The evaluation, carried out on 34 participants comparing two versions (CB-SBS and CB-C), suggests positive trends in 9 out of 10 dimensions, with increases in ease of use (Δ = +0.79) and trust (Δ = +0.65). The study is positioned within the test phase of the ADDIE model and discusses limitations and future directions.</w:t>
+      </w:r>
+    </w:p>
+    <w:p>
+      <w:pPr>
+        <w:pStyle w:val="BodyText"/>
+        <w:jc w:val="both"/>
+      </w:pPr>
+      <w:r>
+        <w:t xml:space="preserve">Parole chiave: autovalutazione; competenze strategiche; LLM;</w:t>
       </w:r>
       <w:r>
         <w:t xml:space="preserve"> </w:t>
@@ -56,31 +114,16 @@
         <w:t xml:space="preserve"> </w:t>
       </w:r>
       <w:r>
-        <w:t xml:space="preserve">basato su LLM a supporto della riflessione assistita sui risultati dell’autovalutazione delle competenze strategiche degli studenti. Il lavoro descrive l’architettura ibrida del sistema — che combina passi guidati deterministici con la flessibilità di un LLM — e il framework delle competenze strategiche su cui si basa. La valutazione, condotta su 34 partecipanti confrontando due versioni (CB-SBS e CB-C), suggerisce tendenze positive in 9 dimensioni su 10, con incrementi in facilità d’uso (Δ = +0,79) e fiducia (Δ = +0,65). Il lavoro si colloca nella fase di test del modello ADDIE e discute limiti e direzioni di sviluppo.</w:t>
+        <w:t xml:space="preserve">educativo; QSA; intelligenza artificiale generativa; ADDIE</w:t>
       </w:r>
     </w:p>
     <w:p>
       <w:pPr>
         <w:pStyle w:val="BodyText"/>
-      </w:pPr>
-      <w:r>
-        <w:t xml:space="preserve">Abstract (inglese)</w:t>
-      </w:r>
-    </w:p>
-    <w:p>
-      <w:pPr>
-        <w:pStyle w:val="BodyText"/>
-      </w:pPr>
-      <w:r>
-        <w:t xml:space="preserve">This paper presents Counselorbot, an LLM-based conversational assistant supporting students’ assisted reflection on their strategic-competences self-assessment. The paper describes the hybrid architecture — combining deterministic guided steps with LLM flexibility — and the strategic competences framework it builds on. The evaluation, carried out on 34 participants comparing two versions (CB-SBS and CB-C), suggests positive trends in 9 out of 10 dimensions, with increases in ease of use (Δ = +0.79) and trust (Δ = +0.65). The study is positioned within the test phase of the ADDIE model and discusses limitations and future directions.</w:t>
-      </w:r>
-    </w:p>
-    <w:p>
-      <w:pPr>
-        <w:pStyle w:val="BodyText"/>
-      </w:pPr>
-      <w:r>
-        <w:t xml:space="preserve">Parole chiave: autovalutazione; competenze strategiche; LLM;</w:t>
+        <w:jc w:val="both"/>
+      </w:pPr>
+      <w:r>
+        <w:t xml:space="preserve">Keywords: self-assessment; strategic competences; LLM; educational</w:t>
       </w:r>
       <w:r>
         <w:t xml:space="preserve"> </w:t>
@@ -93,18 +136,84 @@
         <w:t xml:space="preserve">chatbot</w:t>
       </w:r>
       <w:r>
-        <w:t xml:space="preserve"> </w:t>
-      </w:r>
-      <w:r>
-        <w:t xml:space="preserve">educativo; QSA; intelligenza artificiale generativa; ADDIE</w:t>
+        <w:t xml:space="preserve">; QSA; generative AI; ADDIE</w:t>
       </w:r>
     </w:p>
     <w:p>
       <w:pPr>
         <w:pStyle w:val="BodyText"/>
-      </w:pPr>
-      <w:r>
-        <w:t xml:space="preserve">Keywords: self-assessment; strategic competences; LLM; educational</w:t>
+        <w:jc w:val="both"/>
+      </w:pPr>
+      <w:r>
+        <w:t xml:space="preserve">Nota biografica [da completare: max 300 battute]</w:t>
+      </w:r>
+    </w:p>
+    <w:bookmarkStart w:id="20" w:name="introduzione"/>
+    <w:p>
+      <w:pPr>
+        <w:pStyle w:val="Heading2"/>
+      </w:pPr>
+      <w:r>
+        <w:rPr>
+          <w:color w:val="000000"/>
+        </w:rPr>
+        <w:t xml:space="preserve">Introduzione</w:t>
+      </w:r>
+    </w:p>
+    <w:p>
+      <w:pPr>
+        <w:pStyle w:val="FirstParagraph"/>
+        <w:jc w:val="both"/>
+      </w:pPr>
+      <w:r>
+        <w:t xml:space="preserve">Nel panorama dell’orientamento scolastico e professionale, i questionari di autovalutazione occupano un ruolo importante (Pellerey et al., 2013). Presentano allo studente una serie di affermazioni — su stili di studio, strategie, concentrazione, emozioni, studio in gruppo — chiedendo il grado di accordo. Al termine, restituiscono un profilo che sintetizza i risultati in fattori e brevi commenti. Questo esito può essere oggetto di riflessione personale o di discussione con un tutor, con il docente o con un orientatore; tale accompagnamento trova però un limite strutturale nella disponibilità di chi lo svolge. Inoltre, la letteratura evidenzia come la mancanza di supporto riduca l’efficacia di questi strumenti e la capacità di tradurre le indicazioni ricevute in azioni concrete (Wollny et al., 2021).</w:t>
+      </w:r>
+    </w:p>
+    <w:p>
+      <w:pPr>
+        <w:pStyle w:val="BodyText"/>
+        <w:jc w:val="both"/>
+      </w:pPr>
+      <w:r>
+        <w:t xml:space="preserve">Per rispondere a questa esigenza, i recenti assistenti conversazionali basati su</w:t>
+      </w:r>
+      <w:r>
+        <w:t xml:space="preserve"> </w:t>
+      </w:r>
+      <w:r>
+        <w:rPr>
+          <w:iCs/>
+          <w:i/>
+        </w:rPr>
+        <w:t xml:space="preserve">Large Language Model</w:t>
+      </w:r>
+      <w:r>
+        <w:t xml:space="preserve"> </w:t>
+      </w:r>
+      <w:r>
+        <w:t xml:space="preserve">(LLM) possono costituire un nuovo strumento di supporto per i processi di orientamento, svolgendo alcune funzioni finora di esclusiva competenza umana.</w:t>
+      </w:r>
+    </w:p>
+    <w:p>
+      <w:pPr>
+        <w:pStyle w:val="BodyText"/>
+        <w:jc w:val="both"/>
+      </w:pPr>
+      <w:r>
+        <w:t xml:space="preserve">Per verificare questa ipotesi è stato sviluppato</w:t>
+      </w:r>
+      <w:r>
+        <w:t xml:space="preserve"> </w:t>
+      </w:r>
+      <w:r>
+        <w:rPr>
+          <w:iCs/>
+          <w:i/>
+        </w:rPr>
+        <w:t xml:space="preserve">Counselorbot</w:t>
+      </w:r>
+      <w:r>
+        <w:t xml:space="preserve">, un</w:t>
       </w:r>
       <w:r>
         <w:t xml:space="preserve"> </w:t>
@@ -117,40 +226,10 @@
         <w:t xml:space="preserve">chatbot</w:t>
       </w:r>
       <w:r>
-        <w:t xml:space="preserve">; QSA; generative AI; ADDIE</w:t>
-      </w:r>
-    </w:p>
-    <w:p>
-      <w:pPr>
-        <w:pStyle w:val="BodyText"/>
-      </w:pPr>
-      <w:r>
-        <w:t xml:space="preserve">Nota biografica [da completare: max 300 battute]</w:t>
-      </w:r>
-    </w:p>
-    <w:bookmarkStart w:id="20" w:name="introduzione"/>
-    <w:p>
-      <w:pPr>
-        <w:pStyle w:val="Heading2"/>
-      </w:pPr>
-      <w:r>
-        <w:t xml:space="preserve">Introduzione</w:t>
-      </w:r>
-    </w:p>
-    <w:p>
-      <w:pPr>
-        <w:pStyle w:val="FirstParagraph"/>
-      </w:pPr>
-      <w:r>
-        <w:t xml:space="preserve">Nel panorama dell’orientamento scolastico e professionale, i questionari di autovalutazione occupano un ruolo importante (Pellerey et al., 2013). Presentano allo studente una serie di affermazioni — su stili di studio, strategie, concentrazione, emozioni, studio in gruppo — chiedendo il grado di accordo. Al termine, restituiscono un profilo che sintetizza i risultati in fattori e brevi commenti. Questo esito può essere oggetto di riflessione personale o di discussione con un tutor, con il docente o con un orientatore; tale accompagnamento trova però un limite strutturale nella disponibilità di chi lo svolge. Inoltre, la letteratura evidenzia come la mancanza di supporto riduca l’efficacia di questi strumenti e la capacità di tradurre le indicazioni ricevute in azioni concrete (Wollny et al., 2021).</w:t>
-      </w:r>
-    </w:p>
-    <w:p>
-      <w:pPr>
-        <w:pStyle w:val="BodyText"/>
-      </w:pPr>
-      <w:r>
-        <w:t xml:space="preserve">Per rispondere a questa esigenza, i recenti assistenti conversazionali basati su</w:t>
+        <w:t xml:space="preserve"> </w:t>
+      </w:r>
+      <w:r>
+        <w:t xml:space="preserve">implementato in due versioni. La prima, denominata</w:t>
       </w:r>
       <w:r>
         <w:t xml:space="preserve"> </w:t>
@@ -160,21 +239,79 @@
           <w:iCs/>
           <w:i/>
         </w:rPr>
-        <w:t xml:space="preserve">Large Language Model</w:t>
+        <w:t xml:space="preserve">Counselorbot-Conversation</w:t>
       </w:r>
       <w:r>
         <w:t xml:space="preserve"> </w:t>
       </w:r>
       <w:r>
-        <w:t xml:space="preserve">(LLM) possono costituire un nuovo strumento di supporto per i processi di orientamento, svolgendo alcune funzioni finora di esclusiva competenza umana.</w:t>
+        <w:t xml:space="preserve">(CB-C), adotta un approccio puramente conversazionale; la seconda, denominata</w:t>
+      </w:r>
+      <w:r>
+        <w:t xml:space="preserve"> </w:t>
+      </w:r>
+      <w:r>
+        <w:rPr>
+          <w:iCs/>
+          <w:i/>
+        </w:rPr>
+        <w:t xml:space="preserve">Counselorbot-Step-by-Step</w:t>
+      </w:r>
+      <w:r>
+        <w:t xml:space="preserve"> </w:t>
+      </w:r>
+      <w:r>
+        <w:t xml:space="preserve">(CB-SBS), presenta un’architettura strutturata in passi prestabiliti.</w:t>
       </w:r>
     </w:p>
     <w:p>
       <w:pPr>
         <w:pStyle w:val="BodyText"/>
-      </w:pPr>
-      <w:r>
-        <w:t xml:space="preserve">Per verificare questa ipotesi è stato sviluppato</w:t>
+        <w:jc w:val="both"/>
+      </w:pPr>
+      <w:r>
+        <w:t xml:space="preserve">Le domande di ricerca sono due: D1) si può costruire un</w:t>
+      </w:r>
+      <w:r>
+        <w:t xml:space="preserve"> </w:t>
+      </w:r>
+      <w:r>
+        <w:rPr>
+          <w:iCs/>
+          <w:i/>
+        </w:rPr>
+        <w:t xml:space="preserve">chatbot mentoring</w:t>
+      </w:r>
+      <w:r>
+        <w:t xml:space="preserve"> </w:t>
+      </w:r>
+      <w:r>
+        <w:t xml:space="preserve">— assistente che sostiene lo studente in un percorso riflessivo e formativo — efficace? D2) quale architettura conversazionale è più efficace, una guidata o una libera? La ricerca ha tuttavia carattere ancora esplorativo.</w:t>
+      </w:r>
+    </w:p>
+    <w:p>
+      <w:pPr>
+        <w:pStyle w:val="BodyText"/>
+        <w:jc w:val="both"/>
+      </w:pPr>
+      <w:r>
+        <w:t xml:space="preserve">Il lavoro si articola in sei paragrafi. Il §1 presenta il quadro teorico e lo stato dell’arte sui</w:t>
+      </w:r>
+      <w:r>
+        <w:t xml:space="preserve"> </w:t>
+      </w:r>
+      <w:r>
+        <w:rPr>
+          <w:iCs/>
+          <w:i/>
+        </w:rPr>
+        <w:t xml:space="preserve">chatbot</w:t>
+      </w:r>
+      <w:r>
+        <w:t xml:space="preserve"> </w:t>
+      </w:r>
+      <w:r>
+        <w:t xml:space="preserve">in educazione; il §2 descrive la progettazione e l’architettura di</w:t>
       </w:r>
       <w:r>
         <w:t xml:space="preserve"> </w:t>
@@ -187,7 +324,41 @@
         <w:t xml:space="preserve">Counselorbot</w:t>
       </w:r>
       <w:r>
-        <w:t xml:space="preserve">, un</w:t>
+        <w:t xml:space="preserve">. Il §3 illustra la metodologia di valutazione del sistema, i cui risultati sono presentati al §4. Il §5 discute le implicazioni dei risultati, mentre il §6 conclude con i limiti dello studio e le direzioni di sviluppo futuro.</w:t>
+      </w:r>
+    </w:p>
+    <w:bookmarkEnd w:id="20"/>
+    <w:bookmarkStart w:id="24" w:name="quadro-teorico-e-stato-dellarte"/>
+    <w:p>
+      <w:pPr>
+        <w:pStyle w:val="Heading2"/>
+      </w:pPr>
+      <w:r>
+        <w:rPr>
+          <w:color w:val="000000"/>
+        </w:rPr>
+        <w:t xml:space="preserve">1. Quadro teorico e stato dell’arte</w:t>
+      </w:r>
+    </w:p>
+    <w:bookmarkStart w:id="21" w:name="Xbd16a6b799e5d341a161fc0a5f7041e984aa183"/>
+    <w:p>
+      <w:pPr>
+        <w:pStyle w:val="Heading3"/>
+      </w:pPr>
+      <w:r>
+        <w:rPr>
+          <w:color w:val="000000"/>
+        </w:rPr>
+        <w:t xml:space="preserve">1.1 Large Language Models in educazione: potenzialità e rischi</w:t>
+      </w:r>
+    </w:p>
+    <w:p>
+      <w:pPr>
+        <w:pStyle w:val="FirstParagraph"/>
+        <w:jc w:val="both"/>
+      </w:pPr>
+      <w:r>
+        <w:t xml:space="preserve">Gli LLM — grandi reti neurali specializzate nel linguaggio (Brown et al., 2020) — costituiscono la famiglia più diffusa di strumenti di intelligenza artificiale generativa (GenAI) e sono il motore dei moderni</w:t>
       </w:r>
       <w:r>
         <w:t xml:space="preserve"> </w:t>
@@ -200,26 +371,26 @@
         <w:t xml:space="preserve">chatbot</w:t>
       </w:r>
       <w:r>
-        <w:t xml:space="preserve"> </w:t>
-      </w:r>
-      <w:r>
-        <w:t xml:space="preserve">implementato in due versioni. La prima, denominata</w:t>
-      </w:r>
-      <w:r>
-        <w:t xml:space="preserve"> </w:t>
+        <w:t xml:space="preserve">. Grazie alla capacità di produrre output adattivi e coerenti in linguaggio naturale, essi permettono di superare i limiti dei sistemi del passato basati su regole (</w:t>
       </w:r>
       <w:r>
         <w:rPr>
           <w:iCs/>
           <w:i/>
         </w:rPr>
-        <w:t xml:space="preserve">Counselorbot-Conversation</w:t>
-      </w:r>
-      <w:r>
-        <w:t xml:space="preserve"> </w:t>
-      </w:r>
-      <w:r>
-        <w:t xml:space="preserve">(CB-C), adotta un approccio puramente conversazionale; la seconda, denominata</w:t>
+        <w:t xml:space="preserve">rule-based</w:t>
+      </w:r>
+      <w:r>
+        <w:t xml:space="preserve">), come ELIZA (Weizenbaum, 1966), e di rispondere a domande non previste dalla programmazione (Brown et al., 2020; Kasneci et al., 2023).</w:t>
+      </w:r>
+    </w:p>
+    <w:p>
+      <w:pPr>
+        <w:pStyle w:val="BodyText"/>
+        <w:jc w:val="both"/>
+      </w:pPr>
+      <w:r>
+        <w:t xml:space="preserve">Tuttavia, l’integrazione di queste tecnologie introduce una serie di rischi di natura tecnica, contenutistica, di accettazione e di dipendenza. Sul piano tecnico, l’esecuzione di questi modelli pone vincoli di affidabilità, latenza e ampiezza del contesto, che possono incidere sulla continuità e sulla tempestività delle risposte. Sul piano dei contenuti, gli LLM possono produrre risposte inaccurate o inventate — le cosiddette</w:t>
       </w:r>
       <w:r>
         <w:t xml:space="preserve"> </w:t>
@@ -229,45 +400,35 @@
           <w:iCs/>
           <w:i/>
         </w:rPr>
-        <w:t xml:space="preserve">Counselorbot-Step-by-Step</w:t>
+        <w:t xml:space="preserve">allucinazioni</w:t>
       </w:r>
       <w:r>
         <w:t xml:space="preserve"> </w:t>
       </w:r>
       <w:r>
-        <w:t xml:space="preserve">(CB-SBS), presenta un’architettura strutturata in passi prestabiliti.</w:t>
+        <w:t xml:space="preserve">— e riprodurre bias di genere e demografici o veicolare informazioni stereotipate (Bender et al., 2021; Tankelevitch et al., 2024). Sul piano dell’accettazione, le indicazioni fornite da un sistema artificiale tendono a essere ritenute meno credibili rispetto a quelle di un operatore umano (Cukurova et al., 2020). Infine, un affidamento sproporzionato a tali strumenti per la risoluzione di problemi o la generazione di testi rischia di creare una dipendenza eccessiva, compromettendo lo sviluppo di abilità critiche come l’analisi, la sintesi e la creatività.</w:t>
+      </w:r>
+    </w:p>
+    <w:bookmarkEnd w:id="21"/>
+    <w:bookmarkStart w:id="22" w:name="X7e4dc5fa5ba1b52309736d98c86658002441900"/>
+    <w:p>
+      <w:pPr>
+        <w:pStyle w:val="Heading3"/>
+      </w:pPr>
+      <w:r>
+        <w:rPr>
+          <w:color w:val="000000"/>
+        </w:rPr>
+        <w:t xml:space="preserve">1.2 Chatbot educativi e tutoraggio socratico: autoregolazione, metacognizione e agency epistemica</w:t>
       </w:r>
     </w:p>
     <w:p>
       <w:pPr>
-        <w:pStyle w:val="BodyText"/>
-      </w:pPr>
-      <w:r>
-        <w:t xml:space="preserve">Le domande di ricerca sono due: D1) si può costruire un</w:t>
-      </w:r>
-      <w:r>
-        <w:t xml:space="preserve"> </w:t>
-      </w:r>
-      <w:r>
-        <w:rPr>
-          <w:iCs/>
-          <w:i/>
-        </w:rPr>
-        <w:t xml:space="preserve">chatbot mentoring</w:t>
-      </w:r>
-      <w:r>
-        <w:t xml:space="preserve"> </w:t>
-      </w:r>
-      <w:r>
-        <w:t xml:space="preserve">— assistente che sostiene lo studente in un percorso riflessivo e formativo — efficace? D2) quale architettura conversazionale è più efficace, una guidata o una libera? La ricerca ha tuttavia carattere ancora esplorativo.</w:t>
-      </w:r>
-    </w:p>
-    <w:p>
-      <w:pPr>
-        <w:pStyle w:val="BodyText"/>
-      </w:pPr>
-      <w:r>
-        <w:t xml:space="preserve">Il lavoro si articola in sei paragrafi. Il §1 presenta il quadro teorico e lo stato dell’arte sui</w:t>
+        <w:pStyle w:val="FirstParagraph"/>
+        <w:jc w:val="both"/>
+      </w:pPr>
+      <w:r>
+        <w:t xml:space="preserve">La letteratura scientifica evidenzia il potenziale dei</w:t>
       </w:r>
       <w:r>
         <w:t xml:space="preserve"> </w:t>
@@ -283,7 +444,138 @@
         <w:t xml:space="preserve"> </w:t>
       </w:r>
       <w:r>
-        <w:t xml:space="preserve">in educazione; il §2 descrive la progettazione e l’architettura di</w:t>
+        <w:t xml:space="preserve">educativi, le cui funzioni spaziano dall’orientamento informativo (</w:t>
+      </w:r>
+      <w:r>
+        <w:rPr>
+          <w:iCs/>
+          <w:i/>
+        </w:rPr>
+        <w:t xml:space="preserve">informational</w:t>
+      </w:r>
+      <w:r>
+        <w:t xml:space="preserve">) al</w:t>
+      </w:r>
+      <w:r>
+        <w:t xml:space="preserve"> </w:t>
+      </w:r>
+      <w:r>
+        <w:rPr>
+          <w:iCs/>
+          <w:i/>
+        </w:rPr>
+        <w:t xml:space="preserve">tutoring</w:t>
+      </w:r>
+      <w:r>
+        <w:t xml:space="preserve"> </w:t>
+      </w:r>
+      <w:r>
+        <w:t xml:space="preserve">disciplinare e al</w:t>
+      </w:r>
+      <w:r>
+        <w:t xml:space="preserve"> </w:t>
+      </w:r>
+      <w:r>
+        <w:rPr>
+          <w:iCs/>
+          <w:i/>
+        </w:rPr>
+        <w:t xml:space="preserve">mentoring</w:t>
+      </w:r>
+      <w:r>
+        <w:t xml:space="preserve"> </w:t>
+      </w:r>
+      <w:r>
+        <w:t xml:space="preserve">formativo (Kuhail et al., 2022; Wollny et al., 2021; Zawacki-Richter et al., 2019). Gli LLM, in particolare, possono essere condizionati nell’interazione tramite vincoli di alto livello noti come</w:t>
+      </w:r>
+      <w:r>
+        <w:t xml:space="preserve"> </w:t>
+      </w:r>
+      <w:r>
+        <w:rPr>
+          <w:iCs/>
+          <w:i/>
+        </w:rPr>
+        <w:t xml:space="preserve">system prompt</w:t>
+      </w:r>
+      <w:r>
+        <w:t xml:space="preserve"> </w:t>
+      </w:r>
+      <w:r>
+        <w:t xml:space="preserve">e</w:t>
+      </w:r>
+      <w:r>
+        <w:t xml:space="preserve"> </w:t>
+      </w:r>
+      <w:r>
+        <w:rPr>
+          <w:iCs/>
+          <w:i/>
+        </w:rPr>
+        <w:t xml:space="preserve">meta-prompt</w:t>
+      </w:r>
+      <w:r>
+        <w:t xml:space="preserve">. Tali istruzioni, ricevute dal modello prima del dialogo con l’utente, ne definiscono il ruolo, il comportamento e le modalità di interazione. Inoltre, mediante tecniche di recupero semantico, è possibile integrare nei prompt informazioni pertinenti estratte da documenti validati, migliorando l’accuratezza e l’affidabilità delle risposte (Kasneci et al., 2023). Tali sistemi sono dunque in grado di svolgere compiti finora di esclusiva competenza dell’operatore umano, rendendo i processi di orientamento più scalabili e sostenibili (Neumann et al., 2021). Ad esempio, impiegati come</w:t>
+      </w:r>
+      <w:r>
+        <w:t xml:space="preserve"> </w:t>
+      </w:r>
+      <w:r>
+        <w:rPr>
+          <w:iCs/>
+          <w:i/>
+        </w:rPr>
+        <w:t xml:space="preserve">tutor socratici</w:t>
+      </w:r>
+      <w:r>
+        <w:t xml:space="preserve"> </w:t>
+      </w:r>
+      <w:r>
+        <w:t xml:space="preserve">— secondo un modello dialogico nel quale l’intelligenza artificiale guida lo studente attraverso domande progressive, anziché fornire risposte dirette — possono sostenere lo sviluppo della metacognizione e dell’</w:t>
+      </w:r>
+      <w:r>
+        <w:rPr>
+          <w:iCs/>
+          <w:i/>
+        </w:rPr>
+        <w:t xml:space="preserve">agency</w:t>
+      </w:r>
+      <w:r>
+        <w:t xml:space="preserve"> </w:t>
+      </w:r>
+      <w:r>
+        <w:t xml:space="preserve">epistemica, intesa come la capacità dello studente di assumere un ruolo attivo, consapevole e responsabile nella costruzione della propria conoscenza (Antunes et al., 2025; Chang et al., 2023).</w:t>
+      </w:r>
+    </w:p>
+    <w:p>
+      <w:pPr>
+        <w:pStyle w:val="BodyText"/>
+        <w:jc w:val="both"/>
+      </w:pPr>
+      <w:r>
+        <w:t xml:space="preserve">Tuttavia, è necessario che gli studenti sviluppino un senso critico verso l’AI che permetta loro di valutarne l’attendibilità e la pertinenza, al fine di integrare in modo proficuo questa interazione nel proprio percorso di apprendimento (Tankelevitch et al., 2024). Tale competenza assume particolare rilevanza, poiché le strategie di autovalutazione supportate dall’AI risultano ancora tra quelle meno conosciute dagli studenti (Liu et al., 2025).</w:t>
+      </w:r>
+    </w:p>
+    <w:bookmarkEnd w:id="22"/>
+    <w:bookmarkStart w:id="23" w:name="X02dcbc75d18e72b99aacf4db1c376484a80288e"/>
+    <w:p>
+      <w:pPr>
+        <w:pStyle w:val="Heading3"/>
+      </w:pPr>
+      <w:r>
+        <w:rPr>
+          <w:color w:val="000000"/>
+        </w:rPr>
+        <w:t xml:space="preserve">1.3 Il framework delle competenze strategiche come impalcatura semantica</w:t>
+      </w:r>
+    </w:p>
+    <w:p>
+      <w:pPr>
+        <w:pStyle w:val="FirstParagraph"/>
+        <w:jc w:val="both"/>
+      </w:pPr>
+      <w:r>
+        <w:t xml:space="preserve">Per comprendere meglio l’idea di</w:t>
       </w:r>
       <w:r>
         <w:t xml:space="preserve"> </w:t>
@@ -296,34 +588,10 @@
         <w:t xml:space="preserve">Counselorbot</w:t>
       </w:r>
       <w:r>
-        <w:t xml:space="preserve">. Il §3 illustra la metodologia di valutazione del sistema, i cui risultati sono presentati al §4. Il §5 discute le implicazioni dei risultati, mentre il §6 conclude con i limiti dello studio e le direzioni di sviluppo futuro.</w:t>
-      </w:r>
-    </w:p>
-    <w:bookmarkEnd w:id="20"/>
-    <w:bookmarkStart w:id="24" w:name="quadro-teorico-e-stato-dellarte"/>
-    <w:p>
-      <w:pPr>
-        <w:pStyle w:val="Heading2"/>
-      </w:pPr>
-      <w:r>
-        <w:t xml:space="preserve">1. Quadro teorico e stato dell’arte</w:t>
-      </w:r>
-    </w:p>
-    <w:bookmarkStart w:id="21" w:name="Xbd16a6b799e5d341a161fc0a5f7041e984aa183"/>
-    <w:p>
-      <w:pPr>
-        <w:pStyle w:val="Heading3"/>
-      </w:pPr>
-      <w:r>
-        <w:t xml:space="preserve">1.1 Large Language Models in educazione: potenzialità e rischi</w:t>
-      </w:r>
-    </w:p>
-    <w:p>
-      <w:pPr>
-        <w:pStyle w:val="FirstParagraph"/>
-      </w:pPr>
-      <w:r>
-        <w:t xml:space="preserve">Gli LLM — grandi reti neurali specializzate nel linguaggio (Brown et al., 2020) — costituiscono la famiglia più diffusa di strumenti di intelligenza artificiale generativa (GenAI) e sono il motore dei moderni</w:t>
+        <w:t xml:space="preserve"> </w:t>
+      </w:r>
+      <w:r>
+        <w:t xml:space="preserve">è opportuno accennare al portale</w:t>
       </w:r>
       <w:r>
         <w:t xml:space="preserve"> </w:t>
@@ -333,28 +601,38 @@
           <w:iCs/>
           <w:i/>
         </w:rPr>
-        <w:t xml:space="preserve">chatbot</w:t>
-      </w:r>
-      <w:r>
-        <w:t xml:space="preserve">. Grazie alla capacità di produrre output adattivi e coerenti in linguaggio naturale, essi permettono di superare i limiti dei sistemi del passato basati su regole (</w:t>
+        <w:t xml:space="preserve">Competenze strategiche</w:t>
+      </w:r>
+      <w:r>
+        <w:t xml:space="preserve">. Il sito raccoglie strumenti di autovalutazione rivolti a studenti, docenti, ricercatori e operatori dell’orientamento e della formazione. Questi strumenti aiutano a riflettere sulle proprie modalità di apprendimento, sulle strategie di studio, sulla motivazione, sulla gestione delle emozioni e sulla progettualità personale.</w:t>
+      </w:r>
+    </w:p>
+    <w:p>
+      <w:pPr>
+        <w:pStyle w:val="BodyText"/>
+        <w:jc w:val="both"/>
+      </w:pPr>
+      <w:r>
+        <w:t xml:space="preserve">Alla base del portale vi è il costrutto di competenza strategica, sviluppato dal gruppo di ricerca coordinato da Pellerey (Pellerey et al., 2013) e radicato nella nozione aristotelico-tomista di abito (</w:t>
       </w:r>
       <w:r>
         <w:rPr>
           <w:iCs/>
           <w:i/>
         </w:rPr>
-        <w:t xml:space="preserve">rule-based</w:t>
-      </w:r>
-      <w:r>
-        <w:t xml:space="preserve">), come ELIZA (Weizenbaum, 1966), e di rispondere a domande non previste dalla programmazione (Brown et al., 2020; Kasneci et al., 2023).</w:t>
+        <w:t xml:space="preserve">habitus</w:t>
+      </w:r>
+      <w:r>
+        <w:t xml:space="preserve">). Tale costrutto indica l’insieme delle abilità cognitive, metacognitive, affettivo-motivazionali e volitive che permettono allo studente di pianificare, monitorare e regolare il proprio apprendimento.</w:t>
       </w:r>
     </w:p>
     <w:p>
       <w:pPr>
         <w:pStyle w:val="BodyText"/>
-      </w:pPr>
-      <w:r>
-        <w:t xml:space="preserve">Tuttavia, l’integrazione di queste tecnologie introduce una serie di rischi di natura tecnica, contenutistica, di accettazione e di dipendenza. Sul piano tecnico, l’esecuzione di questi modelli pone vincoli di affidabilità, latenza e ampiezza del contesto, che possono incidere sulla continuità e sulla tempestività delle risposte. Sul piano dei contenuti, gli LLM possono produrre risposte inaccurate o inventate — le cosiddette</w:t>
+        <w:jc w:val="both"/>
+      </w:pPr>
+      <w:r>
+        <w:t xml:space="preserve">Tale costrutto si declina operativamente in una batteria di questionari disponibili nel portale: il</w:t>
       </w:r>
       <w:r>
         <w:t xml:space="preserve"> </w:t>
@@ -364,31 +642,13 @@
           <w:iCs/>
           <w:i/>
         </w:rPr>
-        <w:t xml:space="preserve">allucinazioni</w:t>
+        <w:t xml:space="preserve">Questionario sulle Strategie di Apprendimento</w:t>
       </w:r>
       <w:r>
         <w:t xml:space="preserve"> </w:t>
       </w:r>
       <w:r>
-        <w:t xml:space="preserve">— e riprodurre bias di genere e demografici o veicolare informazioni stereotipate (Bender et al., 2021; Tankelevitch et al., 2024). Sul piano dell’accettazione, le indicazioni fornite da un sistema artificiale tendono a essere ritenute meno credibili rispetto a quelle di un operatore umano (Cukurova et al., 2020). Infine, un affidamento sproporzionato a tali strumenti per la risoluzione di problemi o la generazione di testi rischia di creare una dipendenza eccessiva, compromettendo lo sviluppo di abilità critiche come l’analisi, la sintesi e la creatività.</w:t>
-      </w:r>
-    </w:p>
-    <w:bookmarkEnd w:id="21"/>
-    <w:bookmarkStart w:id="22" w:name="X7e4dc5fa5ba1b52309736d98c86658002441900"/>
-    <w:p>
-      <w:pPr>
-        <w:pStyle w:val="Heading3"/>
-      </w:pPr>
-      <w:r>
-        <w:t xml:space="preserve">1.2 Chatbot educativi e tutoraggio socratico: autoregolazione, metacognizione e agency epistemica</w:t>
-      </w:r>
-    </w:p>
-    <w:p>
-      <w:pPr>
-        <w:pStyle w:val="FirstParagraph"/>
-      </w:pPr>
-      <w:r>
-        <w:t xml:space="preserve">La letteratura scientifica evidenzia il potenziale dei</w:t>
+        <w:t xml:space="preserve">(QSA); il QSAr, versione ridotta del QSA; il</w:t>
       </w:r>
       <w:r>
         <w:t xml:space="preserve"> </w:t>
@@ -398,23 +658,29 @@
           <w:iCs/>
           <w:i/>
         </w:rPr>
-        <w:t xml:space="preserve">chatbot</w:t>
+        <w:t xml:space="preserve">Questionario sulla Percezione delle proprie Competenze Strategiche</w:t>
       </w:r>
       <w:r>
         <w:t xml:space="preserve"> </w:t>
       </w:r>
       <w:r>
-        <w:t xml:space="preserve">educativi, le cui funzioni spaziano dall’orientamento informativo (</w:t>
+        <w:t xml:space="preserve">(QPCS); il</w:t>
+      </w:r>
+      <w:r>
+        <w:t xml:space="preserve"> </w:t>
       </w:r>
       <w:r>
         <w:rPr>
           <w:iCs/>
           <w:i/>
         </w:rPr>
-        <w:t xml:space="preserve">informational</w:t>
-      </w:r>
-      <w:r>
-        <w:t xml:space="preserve">) al</w:t>
+        <w:t xml:space="preserve">Questionario di Percezione delle proprie Competenze e Convinzioni</w:t>
+      </w:r>
+      <w:r>
+        <w:t xml:space="preserve"> </w:t>
+      </w:r>
+      <w:r>
+        <w:t xml:space="preserve">(QPCC); lo</w:t>
       </w:r>
       <w:r>
         <w:t xml:space="preserve"> </w:t>
@@ -424,13 +690,13 @@
           <w:iCs/>
           <w:i/>
         </w:rPr>
-        <w:t xml:space="preserve">tutoring</w:t>
+        <w:t xml:space="preserve">Zimbardo Time Perspective Inventory</w:t>
       </w:r>
       <w:r>
         <w:t xml:space="preserve"> </w:t>
       </w:r>
       <w:r>
-        <w:t xml:space="preserve">disciplinare e al</w:t>
+        <w:t xml:space="preserve">(ZTPI), dedicato alla prospettiva temporale; e il</w:t>
       </w:r>
       <w:r>
         <w:t xml:space="preserve"> </w:t>
@@ -440,13 +706,616 @@
           <w:iCs/>
           <w:i/>
         </w:rPr>
-        <w:t xml:space="preserve">mentoring</w:t>
+        <w:t xml:space="preserve">Questionario di Adattabilità Professionale</w:t>
       </w:r>
       <w:r>
         <w:t xml:space="preserve"> </w:t>
       </w:r>
       <w:r>
-        <w:t xml:space="preserve">formativo (Kuhail et al., 2022; Wollny et al., 2021; Zawacki-Richter et al., 2019). Gli LLM, in particolare, possono essere condizionati nell’interazione tramite vincoli di alto livello noti come</w:t>
+        <w:t xml:space="preserve">(QAP).</w:t>
+      </w:r>
+    </w:p>
+    <w:bookmarkEnd w:id="23"/>
+    <w:bookmarkEnd w:id="24"/>
+    <w:bookmarkStart w:id="33" w:name="progettazione-di-counselorbot"/>
+    <w:p>
+      <w:pPr>
+        <w:pStyle w:val="Heading2"/>
+      </w:pPr>
+      <w:r>
+        <w:rPr>
+          <w:color w:val="000000"/>
+        </w:rPr>
+        <w:t xml:space="preserve">2. Progettazione di Counselorbot</w:t>
+      </w:r>
+    </w:p>
+    <w:p>
+      <w:pPr>
+        <w:pStyle w:val="FirstParagraph"/>
+        <w:jc w:val="both"/>
+      </w:pPr>
+      <w:r>
+        <w:t xml:space="preserve">Counselorbot prende avvio dal framework delle competenze strategiche illustrato nel §1.3 e ne integra gli strumenti in un sistema multifunzionale dedicato all’orientamento formativo e professionale e alla riflessione assistita sui risultati dell’autovalutazione. La piattaforma accomuna strumenti differenti mediante un’interazione conversazionale strutturata, attraverso la quale l’utente viene accompagnato nell’interpretazione del proprio profilo, nella riflessione sulle esperienze e nell’individuazione di strategie utili al proprio percorso.</w:t>
+      </w:r>
+    </w:p>
+    <w:bookmarkStart w:id="25" w:name="strumenti-disponibili-in-counselorbot"/>
+    <w:p>
+      <w:pPr>
+        <w:pStyle w:val="Heading3"/>
+      </w:pPr>
+      <w:r>
+        <w:rPr>
+          <w:color w:val="000000"/>
+        </w:rPr>
+        <w:t xml:space="preserve">2.1 Strumenti disponibili in Counselorbot</w:t>
+      </w:r>
+    </w:p>
+    <w:p>
+      <w:pPr>
+        <w:pStyle w:val="FirstParagraph"/>
+        <w:jc w:val="both"/>
+      </w:pPr>
+      <w:r>
+        <w:t xml:space="preserve">Nella schermata iniziale, Counselorbot presenta un selettore attraverso il quale l’utente può scegliere uno dei questionari del portale</w:t>
+      </w:r>
+      <w:r>
+        <w:t xml:space="preserve"> </w:t>
+      </w:r>
+      <w:r>
+        <w:rPr>
+          <w:iCs/>
+          <w:i/>
+        </w:rPr>
+        <w:t xml:space="preserve">Competenze strategiche</w:t>
+      </w:r>
+      <w:r>
+        <w:t xml:space="preserve"> </w:t>
+      </w:r>
+      <w:r>
+        <w:t xml:space="preserve">(QSA, QSAr, QPCS, QPCC, ZTPI, QAP), la</w:t>
+      </w:r>
+      <w:r>
+        <w:t xml:space="preserve"> </w:t>
+      </w:r>
+      <w:r>
+        <w:rPr>
+          <w:iCs/>
+          <w:i/>
+        </w:rPr>
+        <w:t xml:space="preserve">Career Counseling Interview</w:t>
+      </w:r>
+      <w:r>
+        <w:t xml:space="preserve"> </w:t>
+      </w:r>
+      <w:r>
+        <w:t xml:space="preserve">di Savickas (2018) oppure il modulo di</w:t>
+      </w:r>
+      <w:r>
+        <w:t xml:space="preserve"> </w:t>
+      </w:r>
+      <w:r>
+        <w:rPr>
+          <w:iCs/>
+          <w:i/>
+        </w:rPr>
+        <w:t xml:space="preserve">Pure Question-Based Learning</w:t>
+      </w:r>
+      <w:r>
+        <w:t xml:space="preserve"> </w:t>
+      </w:r>
+      <w:r>
+        <w:t xml:space="preserve">(PQBL; Jemstedt et al., 2024). La scelta determina l’interfaccia e il percorso di interazione che il sistema attiva.</w:t>
+      </w:r>
+    </w:p>
+    <w:p>
+      <w:pPr>
+        <w:pStyle w:val="BodyText"/>
+        <w:jc w:val="both"/>
+      </w:pPr>
+      <w:r>
+        <w:t xml:space="preserve">Il QSA, finalizzato ad analizzare le modalità attraverso cui lo studente affronta, organizza e regola il proprio percorso formativo, è il primo degli strumenti integrati. Counselorbot accompagna l’utente nell’interpretazione dei risultati attraverso undici passi guidati, ciascuno dedicato a una specifica dimensione. Per ogni fattore, il sistema illustra il significato del punteggio, formula domande di approfondimento e propone strategie coerenti con il profilo emerso.</w:t>
+      </w:r>
+    </w:p>
+    <w:p>
+      <w:pPr>
+        <w:pStyle w:val="BodyText"/>
+        <w:jc w:val="both"/>
+      </w:pPr>
+      <w:r>
+        <w:t xml:space="preserve">Accanto al QSA è disponibile anche il QSAr, una versione ridotta a 46 item (contro i 100 del QSA) che offre una rappresentazione più sintetica delle principali modalità di apprendimento (Pellerey et al., 2013). Anche per il QSAr, Counselorbot restituisce il profilo in forma comprensibile, evidenzia i punti di forza e le aree di miglioramento e guida l’utente nella riflessione sulle strategie possibili.</w:t>
+      </w:r>
+    </w:p>
+    <w:p>
+      <w:pPr>
+        <w:pStyle w:val="BodyText"/>
+        <w:jc w:val="both"/>
+      </w:pPr>
+      <w:r>
+        <w:t xml:space="preserve">Lo</w:t>
+      </w:r>
+      <w:r>
+        <w:t xml:space="preserve"> </w:t>
+      </w:r>
+      <w:r>
+        <w:rPr>
+          <w:iCs/>
+          <w:i/>
+        </w:rPr>
+        <w:t xml:space="preserve">Zimbardo Time Perspective Inventory</w:t>
+      </w:r>
+      <w:r>
+        <w:t xml:space="preserve"> </w:t>
+      </w:r>
+      <w:r>
+        <w:t xml:space="preserve">(ZTPI; Zimbardo &amp; Boyd, 1999) analizza il rapporto dell’individuo con le dimensioni temporali di passato, presente e futuro. Le prospettive temporali incidono sulla capacità progettuale, sulle decisioni e sull’atteggiamento verso il percorso formativo e professionale. Counselorbot supporta l’utente nell’interpretazione del proprio profilo temporale, aiutandolo a connettere l’orientamento temporale emerso con gli obiettivi personali e le scelte future.</w:t>
+      </w:r>
+    </w:p>
+    <w:p>
+      <w:pPr>
+        <w:pStyle w:val="BodyText"/>
+        <w:jc w:val="both"/>
+      </w:pPr>
+      <w:r>
+        <w:t xml:space="preserve">Per QSA, QSAr e ZTPI, l’interfaccia richiede l’inserimento dei risultati e restituisce il profilo nello stesso formato del portale</w:t>
+      </w:r>
+      <w:r>
+        <w:t xml:space="preserve"> </w:t>
+      </w:r>
+      <w:r>
+        <w:rPr>
+          <w:iCs/>
+          <w:i/>
+        </w:rPr>
+        <w:t xml:space="preserve">Competenze strategiche</w:t>
+      </w:r>
+      <w:r>
+        <w:t xml:space="preserve">: un grafico a barre con codifica cromatica in cui il verde identifica i punti di forza, il giallo i risultati intermedi e il rosso le possibili aree di crescita. Questa visualizzazione offre una prima sintesi che viene utilizzata per il dialogo assistito.</w:t>
+      </w:r>
+    </w:p>
+    <w:p>
+      <w:pPr>
+        <w:pStyle w:val="BodyText"/>
+        <w:jc w:val="both"/>
+      </w:pPr>
+      <w:r>
+        <w:t xml:space="preserve">Ai questionari si affiancano due strumenti di natura differente. Il primo è la</w:t>
+      </w:r>
+      <w:r>
+        <w:t xml:space="preserve"> </w:t>
+      </w:r>
+      <w:r>
+        <w:rPr>
+          <w:iCs/>
+          <w:i/>
+        </w:rPr>
+        <w:t xml:space="preserve">Career Counseling Interview</w:t>
+      </w:r>
+      <w:r>
+        <w:t xml:space="preserve"> </w:t>
+      </w:r>
+      <w:r>
+        <w:t xml:space="preserve">di Savickas (2018), un colloquio narrativo che esplora esperienze, interessi, modelli di riferimento e aspirazioni dell’utente. Dopo la selezione, il sistema avvia il colloquio proponendo cinque domande qualitative, alle quali il modello linguistico può far seguire richieste di approfondimento. Al termine, Counselorbot elabora una sintesi narrativa che ricostruisce l’identità professionale e individua i principali temi di vita emersi.</w:t>
+      </w:r>
+    </w:p>
+    <w:p>
+      <w:pPr>
+        <w:pStyle w:val="BodyText"/>
+        <w:jc w:val="both"/>
+      </w:pPr>
+      <w:r>
+        <w:t xml:space="preserve">Il secondo è il modulo di</w:t>
+      </w:r>
+      <w:r>
+        <w:t xml:space="preserve"> </w:t>
+      </w:r>
+      <w:r>
+        <w:rPr>
+          <w:iCs/>
+          <w:i/>
+        </w:rPr>
+        <w:t xml:space="preserve">Pure Question-Based Learning</w:t>
+      </w:r>
+      <w:r>
+        <w:t xml:space="preserve"> </w:t>
+      </w:r>
+      <w:r>
+        <w:t xml:space="preserve">(PQBL; Jemstedt et al., 2024). L’interfaccia richiede il caricamento di un documento didattico in formato PDF. Il sistema trasforma il contenuto in un percorso interattivo fondato su domande e feedback, trasformando il testo da materiale di lettura passiva a base per un’attività nella quale l’utente recupera, rielabora e applica le informazioni.</w:t>
+      </w:r>
+    </w:p>
+    <w:p>
+      <w:pPr>
+        <w:pStyle w:val="BodyText"/>
+        <w:jc w:val="both"/>
+      </w:pPr>
+      <w:r>
+        <w:t xml:space="preserve">L’architettura modulare di Counselorbot consente l’integrazione futura di ulteriori questionari, interviste e strumenti per l’orientamento e l’apprendimento.</w:t>
+      </w:r>
+    </w:p>
+    <w:bookmarkEnd w:id="25"/>
+    <w:bookmarkStart w:id="26" w:name="passi-guidati-e-flussi-di-interazione"/>
+    <w:p>
+      <w:pPr>
+        <w:pStyle w:val="Heading3"/>
+      </w:pPr>
+      <w:r>
+        <w:rPr>
+          <w:color w:val="000000"/>
+        </w:rPr>
+        <w:t xml:space="preserve">2.2 Passi guidati e flussi di interazione</w:t>
+      </w:r>
+    </w:p>
+    <w:p>
+      <w:pPr>
+        <w:pStyle w:val="FirstParagraph"/>
+        <w:jc w:val="both"/>
+      </w:pPr>
+      <w:r>
+        <w:t xml:space="preserve">Il principio organizzativo centrale di Counselorbot è rappresentato dai passi guidati (</w:t>
+      </w:r>
+      <w:r>
+        <w:rPr>
+          <w:iCs/>
+          <w:i/>
+        </w:rPr>
+        <w:t xml:space="preserve">guided steps</w:t>
+      </w:r>
+      <w:r>
+        <w:t xml:space="preserve">), ossia sequenze predefinite che determinano l’ordine delle diverse fasi del dialogo. A ciascun passo è associato uno specifico meta-prompt, nel quale vengono definiti l’obiettivo della fase, le informazioni da prendere in considerazione e il tipo di risposta che il modello linguistico deve produrre. Questa struttura permette di affrontare sistematicamente tutti gli ambiti previsti dallo strumento selezionato, riducendo il rischio che alcune dimensioni vengano trascurate.</w:t>
+      </w:r>
+    </w:p>
+    <w:p>
+      <w:pPr>
+        <w:pStyle w:val="BodyText"/>
+        <w:jc w:val="both"/>
+      </w:pPr>
+      <w:r>
+        <w:t xml:space="preserve">All’interno di ciascun passo, tuttavia, il modello linguistico mantiene la flessibilità necessaria per adattare il linguaggio, gli esempi, le domande e il livello di approfondimento alle risposte dell’utente. Counselorbot realizza così una modalità di interazione ibrida, nella quale il controllo deterministico del percorso si combina con l’adattività conversazionale dell’LLM. L’interfaccia conversazionale presenta progressivamente le domande, le interpretazioni e le strategie associate a ciascun passo. L’utente può chiedere chiarimenti, richiedere esempi o soffermarsi su uno specifico argomento prima di proseguire.</w:t>
+      </w:r>
+    </w:p>
+    <w:p>
+      <w:pPr>
+        <w:pStyle w:val="BodyText"/>
+        <w:jc w:val="both"/>
+      </w:pPr>
+      <w:r>
+        <w:t xml:space="preserve">Poiché gli strumenti integrati presentano caratteristiche differenti, il sistema non applica un unico flusso indistinto, ma adotta percorsi specifici per i questionari, per la</w:t>
+      </w:r>
+      <w:r>
+        <w:t xml:space="preserve"> </w:t>
+      </w:r>
+      <w:r>
+        <w:rPr>
+          <w:iCs/>
+          <w:i/>
+        </w:rPr>
+        <w:t xml:space="preserve">Career Counseling Interview</w:t>
+      </w:r>
+      <w:r>
+        <w:t xml:space="preserve"> </w:t>
+      </w:r>
+      <w:r>
+        <w:t xml:space="preserve">e per il</w:t>
+      </w:r>
+      <w:r>
+        <w:t xml:space="preserve"> </w:t>
+      </w:r>
+      <w:r>
+        <w:rPr>
+          <w:iCs/>
+          <w:i/>
+        </w:rPr>
+        <w:t xml:space="preserve">Question-Based Learning</w:t>
+      </w:r>
+      <w:r>
+        <w:t xml:space="preserve">. Nel caso dei questionari QSA, QSAr e ZTPI, il percorso ha inizio con l’inserimento dei punteggi. Il sistema elabora quindi il profilo e ne presenta una prima visualizzazione grafica. Successivamente prende avvio l’analisi guidata dei risultati, durante la quale l’utente può approfondire liberamente ciascun fattore prima di passare al successivo. L’interpretazione dei questionari si sviluppa secondo due modalità complementari. La prima è analitica ed è dedicata all’esame progressivo dei singoli fattori. Per ciascuna dimensione, Counselorbot presenta il risultato, ne chiarisce il significato, formula eventuali domande di approfondimento e propone strategie personalizzate. La seconda modalità è sintetica e mette in relazione le diverse componenti del profilo, facendo emergere le connessioni tra aspetti cognitivi, metacognitivi, affettivi, motivazionali e volitivi. In questo modo, il sistema non si limita a restituire una serie di punteggi isolati, ma favorisce la costruzione di una rappresentazione unitaria del funzionamento dello studente. Al termine dell’analisi, Counselorbot propone una sintesi complessiva dei principali punti di forza, delle aree suscettibili di sviluppo e delle strategie emerse durante il dialogo. L’utente può quindi selezionare e salvare le indicazioni considerate maggiormente significative.</w:t>
+      </w:r>
+    </w:p>
+    <w:p>
+      <w:pPr>
+        <w:pStyle w:val="BodyText"/>
+        <w:jc w:val="both"/>
+      </w:pPr>
+      <w:r>
+        <w:t xml:space="preserve">La</w:t>
+      </w:r>
+      <w:r>
+        <w:t xml:space="preserve"> </w:t>
+      </w:r>
+      <w:r>
+        <w:rPr>
+          <w:iCs/>
+          <w:i/>
+        </w:rPr>
+        <w:t xml:space="preserve">Career Counseling Interview</w:t>
+      </w:r>
+      <w:r>
+        <w:t xml:space="preserve"> </w:t>
+      </w:r>
+      <w:r>
+        <w:t xml:space="preserve">segue invece un percorso qualitativo e narrativo. In questo modulo non vengono inseriti punteggi e non viene elaborato un profilo psicometrico. Il sistema presenta progressivamente le cinque domande previste dal protocollo, analizza le risposte dell’utente e può formulare ulteriori domande per approfondire gli elementi più significativi. Pur mantenendo la sequenza generale stabilita, il modello linguistico adatta il dialogo ai contenuti emersi. Al termine dell’intervista, Counselorbot individua i temi ricorrenti e li integra in una sintesi narrativa relativa agli interessi, ai modelli di riferimento, alle aspirazioni e alla costruzione dell’identità professionale.</w:t>
+      </w:r>
+    </w:p>
+    <w:p>
+      <w:pPr>
+        <w:pStyle w:val="BodyText"/>
+        <w:jc w:val="both"/>
+      </w:pPr>
+      <w:r>
+        <w:t xml:space="preserve">Il modulo di</w:t>
+      </w:r>
+      <w:r>
+        <w:t xml:space="preserve"> </w:t>
+      </w:r>
+      <w:r>
+        <w:rPr>
+          <w:iCs/>
+          <w:i/>
+        </w:rPr>
+        <w:t xml:space="preserve">Question-Based Learning</w:t>
+      </w:r>
+      <w:r>
+        <w:t xml:space="preserve"> </w:t>
+      </w:r>
+      <w:r>
+        <w:t xml:space="preserve">segue un terzo flusso, specificamente orientato all’apprendimento attivo. Dopo il caricamento del documento in formato PDF, il sistema ne analizza e segmenta il contenuto, genera una sequenza di domande e le presenta progressivamente all’utente. Dopo ciascuna risposta, Counselorbot restituisce un feedback, propone eventuali chiarimenti e può adattare la difficoltà o il livello di approfondimento delle domande successive. Il percorso rimane ancorato ai contenuti del documento e si conclude con una sintesi dell’attività svolta e degli aspetti principali affrontati.</w:t>
+      </w:r>
+    </w:p>
+    <w:bookmarkEnd w:id="26"/>
+    <w:bookmarkStart w:id="27" w:name="infrastruttura-hardware"/>
+    <w:p>
+      <w:pPr>
+        <w:pStyle w:val="Heading3"/>
+      </w:pPr>
+      <w:r>
+        <w:rPr>
+          <w:color w:val="000000"/>
+        </w:rPr>
+        <w:t xml:space="preserve">2.3 Infrastruttura hardware</w:t>
+      </w:r>
+    </w:p>
+    <w:p>
+      <w:pPr>
+        <w:pStyle w:val="FirstParagraph"/>
+        <w:jc w:val="both"/>
+      </w:pPr>
+      <w:r>
+        <w:t xml:space="preserve">Counselorbot è eseguito su una workstation ad alte prestazioni, configurata per gestire localmente modelli linguistici e carichi computazionali intensivi. La macchina è dotata di un processore AMD Ryzen Threadripper 7980X con 64 core e 128 thread, di 256 GB di memoria RAM e di una GPU NVIDIA RTX 5090. La realizzazione dell’infrastruttura ha richiesto un investimento iniziale di circa 13.000 euro. La scelta di un’infrastruttura locale risponde innanzitutto all’esigenza di tutelare la riservatezza dei dati, poiché consente di ridurre il trasferimento delle conversazioni e delle informazioni degli utenti verso servizi esterni. Inoltre, permette di mantenere una maggiore indipendenza dai provider commerciali di intelligenza artificiale, evitando che il funzionamento del sistema dipenda esclusivamente dalla disponibilità, dai costi o dalle modifiche delle API esterne. Infine, l’investimento iniziale può contribuire alla sostenibilità economica nel medio e lungo periodo, soprattutto in presenza di un numero elevato di interazioni.</w:t>
+      </w:r>
+    </w:p>
+    <w:bookmarkEnd w:id="27"/>
+    <w:bookmarkStart w:id="31" w:name="software"/>
+    <w:p>
+      <w:pPr>
+        <w:pStyle w:val="Heading3"/>
+      </w:pPr>
+      <w:r>
+        <w:rPr>
+          <w:color w:val="000000"/>
+        </w:rPr>
+        <w:t xml:space="preserve">2.4 Software</w:t>
+      </w:r>
+    </w:p>
+    <w:p>
+      <w:pPr>
+        <w:pStyle w:val="FirstParagraph"/>
+        <w:jc w:val="both"/>
+      </w:pPr>
+      <w:r>
+        <w:t xml:space="preserve">Il software di Counselorbot comprende il sistema di gestione dei modelli linguistici, i meccanismi di recupero delle conoscenze e della memoria e le funzioni di registrazione e analisi delle interazioni.</w:t>
+      </w:r>
+    </w:p>
+    <w:bookmarkStart w:id="28" w:name="modelli-linguistici"/>
+    <w:p>
+      <w:pPr>
+        <w:pStyle w:val="Heading4"/>
+      </w:pPr>
+      <w:r>
+        <w:rPr>
+          <w:color w:val="000000"/>
+        </w:rPr>
+        <w:t xml:space="preserve">2.4.1 Modelli linguistici</w:t>
+      </w:r>
+    </w:p>
+    <w:p>
+      <w:pPr>
+        <w:pStyle w:val="FirstParagraph"/>
+        <w:jc w:val="both"/>
+      </w:pPr>
+      <w:r>
+        <w:t xml:space="preserve">Per la gestione dei modelli linguistici, Counselorbot utilizza Ollama, uno strumento che consente l’esecuzione locale ed efficiente di modelli open-source. Durante la fase di sviluppo, la scelta si è orientata verso modelli con un numero di parametri inferiore a 15 miliardi, per garantire un equilibrio ottimale tra prestazioni e sostenibilità dell’infrastruttura locale. Sono stati testati modelli appartenenti a diverse famiglie, tra cui Gemma (nelle varianti da 2B, 4B e 12B parametri), DeepSeek-R1-Distill 8B e Qwen 3.5 9B.</w:t>
+      </w:r>
+    </w:p>
+    <w:bookmarkEnd w:id="28"/>
+    <w:bookmarkStart w:id="29" w:name="Xc64cd9a05b3a0c767b472b6f7103b658ac68a3e"/>
+    <w:p>
+      <w:pPr>
+        <w:pStyle w:val="Heading4"/>
+      </w:pPr>
+      <w:r>
+        <w:rPr>
+          <w:color w:val="000000"/>
+        </w:rPr>
+        <w:t xml:space="preserve">2.4.2 Recupero delle conoscenze e gestione della memoria</w:t>
+      </w:r>
+    </w:p>
+    <w:p>
+      <w:pPr>
+        <w:pStyle w:val="FirstParagraph"/>
+        <w:jc w:val="both"/>
+      </w:pPr>
+      <w:r>
+        <w:t xml:space="preserve">Counselorbot utilizza diversi meccanismi per recuperare le informazioni rilevanti e mantenere la continuità delle interazioni. Tali meccanismi comprendono la memoria di sessione, la base di conoscenza, il grafo della conoscenza e una memoria condivisa delle risposte. La memoria di sessione conserva le informazioni emerse nel corso della singola conversazione. In questo modo, il sistema può ricordare i risultati, le risposte dell’utente e le strategie già discusse, evitando ripetizioni e garantendo coerenza tra le diverse fasi del percorso. La base di conoscenza contiene strategie educative e contenuti teorici precedentemente selezionati e approvati. Le strategie sono associate ai fattori dei questionari e indicizzate attraverso parole chiave e rappresentazioni semantiche. Quando viene analizzata una determinata dimensione, il sistema recupera automaticamente i contenuti maggiormente pertinenti rispetto al fattore, al punteggio e alle informazioni fornite dallo studente. Le informazioni recuperate vengono inserite nel contesto del modello linguistico e impiegate per generare la risposta. Questa soluzione consente agli amministratori di ampliare o aggiornare la base di conoscenza senza dover intervenire manualmente sui prompt. Il grafo della conoscenza collega tra loro gli strumenti, i fattori, le strategie e i riferimenti teorici. Tale struttura permette di estendere la ricerca documentale anche ai concetti semanticamente vicini, superando una corrispondenza esclusivamente letterale tra i termini utilizzati dall’utente e quelli presenti nei contenuti indicizzati. A questi meccanismi si aggiunge una memoria condivisa delle risposte. Quando un utente valuta positivamente una risposta dell’assistente, questa può essere conservata e utilizzata come riferimento per domande analoghe formulate in sessioni successive. Le risposte precedenti non vengono necessariamente riproposte in forma identica, ma possono essere recuperate come esempi utili alla produzione di nuove risposte. Si introduce così un meccanismo di apprendimento collettivo, nel quale le interazioni considerate efficaci contribuiscono progressivamente al miglioramento del sistema. La memoria condivisa rimane tuttavia distinta dalla base di conoscenza validata: quest’ultima contiene materiali selezionati dagli amministratori, mentre la memoria condivisa deriva dalla valutazione delle risposte generate durante l’utilizzo.</w:t>
+      </w:r>
+    </w:p>
+    <w:bookmarkEnd w:id="29"/>
+    <w:bookmarkStart w:id="30" w:name="X2bc7d88a141625ea69f5b759b49be79527dd3a2"/>
+    <w:p>
+      <w:pPr>
+        <w:pStyle w:val="Heading4"/>
+      </w:pPr>
+      <w:r>
+        <w:rPr>
+          <w:color w:val="000000"/>
+        </w:rPr>
+        <w:t xml:space="preserve">2.4.3 Gestione delle interazioni e anonimizzazione</w:t>
+      </w:r>
+    </w:p>
+    <w:p>
+      <w:pPr>
+        <w:pStyle w:val="FirstParagraph"/>
+        <w:jc w:val="both"/>
+      </w:pPr>
+      <w:r>
+        <w:t xml:space="preserve">Le interazioni vengono registrate in un archivio consultabile dagli amministratori. Tale archivio permette di monitorare l’utilizzo del sistema, individuare domande ricorrenti, identificare eventuali difficoltà nei percorsi guidati e rilevare le aree nelle quali le risposte richiedono ulteriori miglioramenti. È inoltre in fase di progettazione un sistema di anonimizzazione che consenta di analizzare i contenuti delle conversazioni senza esporre i dati personali degli studenti. L’obiettivo è rendere possibile lo studio aggregato delle strategie maggiormente discusse, dei fattori percepiti come critici e dell’efficacia attribuita dagli utenti alle risposte del sistema. Questi dati potranno essere utilizzati per valutare l’impatto di Counselorbot, perfezionare i protocolli di interazione e studiare l’impiego del sistema su scala più ampia.</w:t>
+      </w:r>
+    </w:p>
+    <w:bookmarkEnd w:id="30"/>
+    <w:bookmarkEnd w:id="31"/>
+    <w:bookmarkStart w:id="32" w:name="struttura-del-sistema"/>
+    <w:p>
+      <w:pPr>
+        <w:pStyle w:val="Heading3"/>
+      </w:pPr>
+      <w:r>
+        <w:rPr>
+          <w:color w:val="000000"/>
+        </w:rPr>
+        <w:t xml:space="preserve">2.5 Struttura del sistema</w:t>
+      </w:r>
+    </w:p>
+    <w:p>
+      <w:pPr>
+        <w:pStyle w:val="FirstParagraph"/>
+        <w:jc w:val="both"/>
+      </w:pPr>
+      <w:r>
+        <w:t xml:space="preserve">L’architettura applicativa di Counselorbot si articola in quattro componenti principali: frontend, backend, database e livello di astrazione dei modelli linguistici. Il frontend costituisce il livello con cui l’utente interagisce direttamente. Comprende il selettore degli strumenti, i moduli per l’inserimento dei risultati, il caricamento dei documenti, la visualizzazione grafica del profilo, l’interfaccia conversazionale, la navigazione tra i passi guidati e le funzioni di salvataggio delle strategie. La sua organizzazione modulare permette di associare a ciascuno strumento una specifica interfaccia, mantenendo al tempo stesso un’esperienza d’uso coerente all’interno della piattaforma. Il backend gestisce la logica applicativa e coordina le differenti componenti del sistema. Esso espone i servizi relativi alla chat, ai questionari, ai passi guidati, alla memoria, alla base di conoscenza e alle funzioni amministrative. Durante l’interazione, il backend individua il passo corrente, seleziona il meta-prompt corrispondente, recupera le informazioni pertinenti e costruisce il contesto da inviare al modello linguistico. Successivamente riceve la risposta generata, la restituisce all’interfaccia e aggiorna la memoria della sessione. Il database relazionale conserva le configurazioni necessarie al funzionamento della piattaforma. Al suo interno sono registrati gli strumenti disponibili, la struttura dei questionari, i fattori, gli item, le scale, le stanine, i prompt, i meta-prompt, i passi guidati, le strategie, le configurazioni dei modelli, la memoria delle sessioni e le interazioni archiviate. Counselorbot non si limita quindi a ricevere punteggi esterni, ma dispone di una rappresentazione strutturata dei questionari e può interpretarli in relazione alle loro caratteristiche. Il livello di astrazione dei modelli linguistici mette infine in comunicazione il backend con i diversi provider di intelligenza artificiale. Attraverso un’interfaccia comune, esso gestisce l’invio dei prompt, la ricezione delle risposte e i parametri di generazione. Questa componente rende Counselorbot indipendente dal singolo modello e consente di utilizzare sia modelli eseguiti localmente mediante Ollama sia eventuali servizi remoti. L’organizzazione complessiva separa dunque i contenuti educativi, la logica dei percorsi, l’interfaccia utente e il modello linguistico. Tale separazione permette di aggiornare ed estendere Counselorbot intervenendo sulle singole componenti, senza dover riprogettare l’intero sistema.</w:t>
+      </w:r>
+    </w:p>
+    <w:bookmarkEnd w:id="32"/>
+    <w:bookmarkEnd w:id="33"/>
+    <w:bookmarkStart w:id="38" w:name="metodologia-di-valutazione"/>
+    <w:p>
+      <w:pPr>
+        <w:pStyle w:val="Heading2"/>
+      </w:pPr>
+      <w:r>
+        <w:rPr>
+          <w:color w:val="000000"/>
+        </w:rPr>
+        <w:t xml:space="preserve">3. Metodologia di valutazione</w:t>
+      </w:r>
+    </w:p>
+    <w:bookmarkStart w:id="34" w:name="disegno-della-ricerca"/>
+    <w:p>
+      <w:pPr>
+        <w:pStyle w:val="Heading3"/>
+      </w:pPr>
+      <w:r>
+        <w:rPr>
+          <w:color w:val="000000"/>
+        </w:rPr>
+        <w:t xml:space="preserve">3.1 Disegno della ricerca</w:t>
+      </w:r>
+    </w:p>
+    <w:p>
+      <w:pPr>
+        <w:pStyle w:val="FirstParagraph"/>
+        <w:jc w:val="both"/>
+      </w:pPr>
+      <w:r>
+        <w:t xml:space="preserve">Per valutare il sistema descritto nel § 2 è stato adottato un disegno di ricerca articolato secondo il modello ADDIE (Branch, 2009). L’acronimo identifica cinque fasi iterative:</w:t>
+      </w:r>
+      <w:r>
+        <w:t xml:space="preserve"> </w:t>
+      </w:r>
+      <w:r>
+        <w:rPr>
+          <w:iCs/>
+          <w:i/>
+        </w:rPr>
+        <w:t xml:space="preserve">Analysis</w:t>
+      </w:r>
+      <w:r>
+        <w:t xml:space="preserve">, relativa all’analisi dei bisogni formativi e del contesto;</w:t>
+      </w:r>
+      <w:r>
+        <w:t xml:space="preserve"> </w:t>
+      </w:r>
+      <w:r>
+        <w:rPr>
+          <w:iCs/>
+          <w:i/>
+        </w:rPr>
+        <w:t xml:space="preserve">Design</w:t>
+      </w:r>
+      <w:r>
+        <w:t xml:space="preserve">, dedicata alla progettazione dell’architettura e delle modalità di interazione;</w:t>
+      </w:r>
+      <w:r>
+        <w:t xml:space="preserve"> </w:t>
+      </w:r>
+      <w:r>
+        <w:rPr>
+          <w:iCs/>
+          <w:i/>
+        </w:rPr>
+        <w:t xml:space="preserve">Development</w:t>
+      </w:r>
+      <w:r>
+        <w:t xml:space="preserve">, riguardante la realizzazione del sistema;</w:t>
+      </w:r>
+      <w:r>
+        <w:t xml:space="preserve"> </w:t>
+      </w:r>
+      <w:r>
+        <w:rPr>
+          <w:iCs/>
+          <w:i/>
+        </w:rPr>
+        <w:t xml:space="preserve">Implementation</w:t>
+      </w:r>
+      <w:r>
+        <w:t xml:space="preserve">, riferita al rilascio e all’utilizzo del sistema; ed</w:t>
+      </w:r>
+      <w:r>
+        <w:t xml:space="preserve"> </w:t>
+      </w:r>
+      <w:r>
+        <w:rPr>
+          <w:iCs/>
+          <w:i/>
+        </w:rPr>
+        <w:t xml:space="preserve">Evaluation</w:t>
+      </w:r>
+      <w:r>
+        <w:t xml:space="preserve">, finalizzata alla valutazione del suo funzionamento e dei risultati ottenuti. Il lavoro presentato in questo articolo si colloca nella fase di</w:t>
+      </w:r>
+      <w:r>
+        <w:t xml:space="preserve"> </w:t>
+      </w:r>
+      <w:r>
+        <w:rPr>
+          <w:iCs/>
+          <w:i/>
+        </w:rPr>
+        <w:t xml:space="preserve">Evaluation</w:t>
+      </w:r>
+      <w:r>
+        <w:t xml:space="preserve"> </w:t>
+      </w:r>
+      <w:r>
+        <w:t xml:space="preserve">del secondo ciclo di sviluppo. Il primo ciclo ha portato alla realizzazione di CB-C, una versione basata su un’architettura RAG (</w:t>
+      </w:r>
+      <w:r>
+        <w:rPr>
+          <w:iCs/>
+          <w:i/>
+        </w:rPr>
+        <w:t xml:space="preserve">Retrieval-Augmented Generation</w:t>
+      </w:r>
+      <w:r>
+        <w:t xml:space="preserve">) e su un</w:t>
       </w:r>
       <w:r>
         <w:t xml:space="preserve"> </w:t>
@@ -459,774 +1328,6 @@
         <w:t xml:space="preserve">system prompt</w:t>
       </w:r>
       <w:r>
-        <w:t xml:space="preserve"> </w:t>
-      </w:r>
-      <w:r>
-        <w:t xml:space="preserve">e</w:t>
-      </w:r>
-      <w:r>
-        <w:t xml:space="preserve"> </w:t>
-      </w:r>
-      <w:r>
-        <w:rPr>
-          <w:iCs/>
-          <w:i/>
-        </w:rPr>
-        <w:t xml:space="preserve">meta-prompt</w:t>
-      </w:r>
-      <w:r>
-        <w:t xml:space="preserve">. Tali istruzioni, ricevute dal modello prima del dialogo con l’utente, ne definiscono il ruolo, il comportamento e le modalità di interazione. Inoltre, mediante tecniche di recupero semantico, è possibile integrare nei prompt informazioni pertinenti estratte da documenti validati, migliorando l’accuratezza e l’affidabilità delle risposte (Kasneci et al., 2023). Tali sistemi sono dunque in grado di svolgere compiti finora di esclusiva competenza dell’operatore umano, rendendo i processi di orientamento più scalabili e sostenibili (Neumann et al., 2021). Ad esempio, impiegati come</w:t>
-      </w:r>
-      <w:r>
-        <w:t xml:space="preserve"> </w:t>
-      </w:r>
-      <w:r>
-        <w:rPr>
-          <w:iCs/>
-          <w:i/>
-        </w:rPr>
-        <w:t xml:space="preserve">tutor socratici</w:t>
-      </w:r>
-      <w:r>
-        <w:t xml:space="preserve"> </w:t>
-      </w:r>
-      <w:r>
-        <w:t xml:space="preserve">— secondo un modello dialogico nel quale l’intelligenza artificiale guida lo studente attraverso domande progressive, anziché fornire risposte dirette — possono sostenere lo sviluppo della metacognizione e dell’</w:t>
-      </w:r>
-      <w:r>
-        <w:rPr>
-          <w:iCs/>
-          <w:i/>
-        </w:rPr>
-        <w:t xml:space="preserve">agency</w:t>
-      </w:r>
-      <w:r>
-        <w:t xml:space="preserve"> </w:t>
-      </w:r>
-      <w:r>
-        <w:t xml:space="preserve">epistemica, intesa come la capacità dello studente di assumere un ruolo attivo, consapevole e responsabile nella costruzione della propria conoscenza (Antunes et al., 2025; Chang et al., 2023).</w:t>
-      </w:r>
-    </w:p>
-    <w:p>
-      <w:pPr>
-        <w:pStyle w:val="BodyText"/>
-      </w:pPr>
-      <w:r>
-        <w:t xml:space="preserve">Tuttavia, è necessario che gli studenti sviluppino un senso critico verso l’AI che permetta loro di valutarne l’attendibilità e la pertinenza, al fine di integrare in modo proficuo questa interazione nel proprio percorso di apprendimento (Tankelevitch et al., 2024). Tale competenza assume particolare rilevanza, poiché le strategie di autovalutazione supportate dall’AI risultano ancora tra quelle meno conosciute dagli studenti (Liu et al., 2025).</w:t>
-      </w:r>
-    </w:p>
-    <w:bookmarkEnd w:id="22"/>
-    <w:bookmarkStart w:id="23" w:name="X02dcbc75d18e72b99aacf4db1c376484a80288e"/>
-    <w:p>
-      <w:pPr>
-        <w:pStyle w:val="Heading3"/>
-      </w:pPr>
-      <w:r>
-        <w:t xml:space="preserve">1.3 Il framework delle competenze strategiche come impalcatura semantica</w:t>
-      </w:r>
-    </w:p>
-    <w:p>
-      <w:pPr>
-        <w:pStyle w:val="FirstParagraph"/>
-      </w:pPr>
-      <w:r>
-        <w:t xml:space="preserve">Per comprendere meglio l’idea di</w:t>
-      </w:r>
-      <w:r>
-        <w:t xml:space="preserve"> </w:t>
-      </w:r>
-      <w:r>
-        <w:rPr>
-          <w:iCs/>
-          <w:i/>
-        </w:rPr>
-        <w:t xml:space="preserve">Counselorbot</w:t>
-      </w:r>
-      <w:r>
-        <w:t xml:space="preserve"> </w:t>
-      </w:r>
-      <w:r>
-        <w:t xml:space="preserve">è opportuno accennare al portale</w:t>
-      </w:r>
-      <w:r>
-        <w:t xml:space="preserve"> </w:t>
-      </w:r>
-      <w:r>
-        <w:rPr>
-          <w:iCs/>
-          <w:i/>
-        </w:rPr>
-        <w:t xml:space="preserve">Competenze strategiche</w:t>
-      </w:r>
-      <w:r>
-        <w:t xml:space="preserve">. Il sito raccoglie strumenti di autovalutazione rivolti a studenti, docenti, ricercatori e operatori dell’orientamento e della formazione. Questi strumenti aiutano a riflettere sulle proprie modalità di apprendimento, sulle strategie di studio, sulla motivazione, sulla gestione delle emozioni e sulla progettualità personale.</w:t>
-      </w:r>
-    </w:p>
-    <w:p>
-      <w:pPr>
-        <w:pStyle w:val="BodyText"/>
-      </w:pPr>
-      <w:r>
-        <w:t xml:space="preserve">Alla base del portale vi è il costrutto di competenza strategica, sviluppato dal gruppo di ricerca coordinato da Pellerey (Pellerey et al., 2013) e radicato nella nozione aristotelico-tomista di abito (</w:t>
-      </w:r>
-      <w:r>
-        <w:rPr>
-          <w:iCs/>
-          <w:i/>
-        </w:rPr>
-        <w:t xml:space="preserve">habitus</w:t>
-      </w:r>
-      <w:r>
-        <w:t xml:space="preserve">). Tale costrutto indica l’insieme delle abilità cognitive, metacognitive, affettivo-motivazionali e volitive che permettono allo studente di pianificare, monitorare e regolare il proprio apprendimento.</w:t>
-      </w:r>
-    </w:p>
-    <w:p>
-      <w:pPr>
-        <w:pStyle w:val="BodyText"/>
-      </w:pPr>
-      <w:r>
-        <w:t xml:space="preserve">Tale costrutto si declina operativamente in una batteria di questionari disponibili nel portale: il</w:t>
-      </w:r>
-      <w:r>
-        <w:t xml:space="preserve"> </w:t>
-      </w:r>
-      <w:r>
-        <w:rPr>
-          <w:iCs/>
-          <w:i/>
-        </w:rPr>
-        <w:t xml:space="preserve">Questionario sulle Strategie di Apprendimento</w:t>
-      </w:r>
-      <w:r>
-        <w:t xml:space="preserve"> </w:t>
-      </w:r>
-      <w:r>
-        <w:t xml:space="preserve">(QSA); il QSAr, versione ridotta del QSA; il</w:t>
-      </w:r>
-      <w:r>
-        <w:t xml:space="preserve"> </w:t>
-      </w:r>
-      <w:r>
-        <w:rPr>
-          <w:iCs/>
-          <w:i/>
-        </w:rPr>
-        <w:t xml:space="preserve">Questionario sulla Percezione delle proprie Competenze Strategiche</w:t>
-      </w:r>
-      <w:r>
-        <w:t xml:space="preserve"> </w:t>
-      </w:r>
-      <w:r>
-        <w:t xml:space="preserve">(QPCS); il</w:t>
-      </w:r>
-      <w:r>
-        <w:t xml:space="preserve"> </w:t>
-      </w:r>
-      <w:r>
-        <w:rPr>
-          <w:iCs/>
-          <w:i/>
-        </w:rPr>
-        <w:t xml:space="preserve">Questionario di Percezione delle proprie Competenze e Convinzioni</w:t>
-      </w:r>
-      <w:r>
-        <w:t xml:space="preserve"> </w:t>
-      </w:r>
-      <w:r>
-        <w:t xml:space="preserve">(QPCC); lo</w:t>
-      </w:r>
-      <w:r>
-        <w:t xml:space="preserve"> </w:t>
-      </w:r>
-      <w:r>
-        <w:rPr>
-          <w:iCs/>
-          <w:i/>
-        </w:rPr>
-        <w:t xml:space="preserve">Zimbardo Time Perspective Inventory</w:t>
-      </w:r>
-      <w:r>
-        <w:t xml:space="preserve"> </w:t>
-      </w:r>
-      <w:r>
-        <w:t xml:space="preserve">(ZTPI), dedicato alla prospettiva temporale; e il</w:t>
-      </w:r>
-      <w:r>
-        <w:t xml:space="preserve"> </w:t>
-      </w:r>
-      <w:r>
-        <w:rPr>
-          <w:iCs/>
-          <w:i/>
-        </w:rPr>
-        <w:t xml:space="preserve">Questionario di Adattabilità Professionale</w:t>
-      </w:r>
-      <w:r>
-        <w:t xml:space="preserve"> </w:t>
-      </w:r>
-      <w:r>
-        <w:t xml:space="preserve">(QAP).</w:t>
-      </w:r>
-    </w:p>
-    <w:bookmarkEnd w:id="23"/>
-    <w:bookmarkEnd w:id="24"/>
-    <w:bookmarkStart w:id="33" w:name="progettazione-di-counselorbot"/>
-    <w:p>
-      <w:pPr>
-        <w:pStyle w:val="Heading2"/>
-      </w:pPr>
-      <w:r>
-        <w:t xml:space="preserve">2. Progettazione di Counselorbot</w:t>
-      </w:r>
-    </w:p>
-    <w:p>
-      <w:pPr>
-        <w:pStyle w:val="FirstParagraph"/>
-      </w:pPr>
-      <w:r>
-        <w:t xml:space="preserve">Counselorbot prende avvio dal framework delle competenze strategiche illustrato nel §1.3 e ne integra gli strumenti in un sistema multifunzionale dedicato all’orientamento formativo e professionale e alla riflessione assistita sui risultati dell’autovalutazione. La piattaforma accomuna strumenti differenti mediante un’interazione conversazionale strutturata, attraverso la quale l’utente viene accompagnato nell’interpretazione del proprio profilo, nella riflessione sulle esperienze e nell’individuazione di strategie utili al proprio percorso.</w:t>
-      </w:r>
-    </w:p>
-    <w:bookmarkStart w:id="25" w:name="strumenti-disponibili-in-counselorbot"/>
-    <w:p>
-      <w:pPr>
-        <w:pStyle w:val="Heading3"/>
-      </w:pPr>
-      <w:r>
-        <w:t xml:space="preserve">2.1 Strumenti disponibili in Counselorbot</w:t>
-      </w:r>
-    </w:p>
-    <w:p>
-      <w:pPr>
-        <w:pStyle w:val="FirstParagraph"/>
-      </w:pPr>
-      <w:r>
-        <w:t xml:space="preserve">Nella schermata iniziale, Counselorbot presenta un selettore attraverso il quale l’utente può scegliere uno dei questionari del portale</w:t>
-      </w:r>
-      <w:r>
-        <w:t xml:space="preserve"> </w:t>
-      </w:r>
-      <w:r>
-        <w:rPr>
-          <w:iCs/>
-          <w:i/>
-        </w:rPr>
-        <w:t xml:space="preserve">Competenze strategiche</w:t>
-      </w:r>
-      <w:r>
-        <w:t xml:space="preserve"> </w:t>
-      </w:r>
-      <w:r>
-        <w:t xml:space="preserve">(QSA, QSAr, QPCS, QPCC, ZTPI, QAP), la</w:t>
-      </w:r>
-      <w:r>
-        <w:t xml:space="preserve"> </w:t>
-      </w:r>
-      <w:r>
-        <w:rPr>
-          <w:iCs/>
-          <w:i/>
-        </w:rPr>
-        <w:t xml:space="preserve">Career Counseling Interview</w:t>
-      </w:r>
-      <w:r>
-        <w:t xml:space="preserve"> </w:t>
-      </w:r>
-      <w:r>
-        <w:t xml:space="preserve">di Savickas (2018) oppure il modulo di</w:t>
-      </w:r>
-      <w:r>
-        <w:t xml:space="preserve"> </w:t>
-      </w:r>
-      <w:r>
-        <w:rPr>
-          <w:iCs/>
-          <w:i/>
-        </w:rPr>
-        <w:t xml:space="preserve">Pure Question-Based Learning</w:t>
-      </w:r>
-      <w:r>
-        <w:t xml:space="preserve"> </w:t>
-      </w:r>
-      <w:r>
-        <w:t xml:space="preserve">(PQBL; Jemstedt et al., 2024). La scelta determina l’interfaccia e il percorso di interazione che il sistema attiva.</w:t>
-      </w:r>
-    </w:p>
-    <w:p>
-      <w:pPr>
-        <w:pStyle w:val="BodyText"/>
-      </w:pPr>
-      <w:r>
-        <w:t xml:space="preserve">Il QSA, finalizzato ad analizzare le modalità attraverso cui lo studente affronta, organizza e regola il proprio percorso formativo, è il primo degli strumenti integrati. Counselorbot accompagna l’utente nell’interpretazione dei risultati attraverso undici passi guidati, ciascuno dedicato a una specifica dimensione. Per ogni fattore, il sistema illustra il significato del punteggio, formula domande di approfondimento e propone strategie coerenti con il profilo emerso.</w:t>
-      </w:r>
-    </w:p>
-    <w:p>
-      <w:pPr>
-        <w:pStyle w:val="BodyText"/>
-      </w:pPr>
-      <w:r>
-        <w:t xml:space="preserve">Accanto al QSA è disponibile anche il QSAr, una versione ridotta a 46 item (contro i 100 del QSA) che offre una rappresentazione più sintetica delle principali modalità di apprendimento (Pellerey et al., 2013). Anche per il QSAr, Counselorbot restituisce il profilo in forma comprensibile, evidenzia i punti di forza e le aree di miglioramento e guida l’utente nella riflessione sulle strategie possibili.</w:t>
-      </w:r>
-    </w:p>
-    <w:p>
-      <w:pPr>
-        <w:pStyle w:val="BodyText"/>
-      </w:pPr>
-      <w:r>
-        <w:t xml:space="preserve">Lo</w:t>
-      </w:r>
-      <w:r>
-        <w:t xml:space="preserve"> </w:t>
-      </w:r>
-      <w:r>
-        <w:rPr>
-          <w:iCs/>
-          <w:i/>
-        </w:rPr>
-        <w:t xml:space="preserve">Zimbardo Time Perspective Inventory</w:t>
-      </w:r>
-      <w:r>
-        <w:t xml:space="preserve"> </w:t>
-      </w:r>
-      <w:r>
-        <w:t xml:space="preserve">(ZTPI; Zimbardo &amp; Boyd, 1999) analizza il rapporto dell’individuo con le dimensioni temporali di passato, presente e futuro. Le prospettive temporali incidono sulla capacità progettuale, sulle decisioni e sull’atteggiamento verso il percorso formativo e professionale. Counselorbot supporta l’utente nell’interpretazione del proprio profilo temporale, aiutandolo a connettere l’orientamento temporale emerso con gli obiettivi personali e le scelte future.</w:t>
-      </w:r>
-    </w:p>
-    <w:p>
-      <w:pPr>
-        <w:pStyle w:val="BodyText"/>
-      </w:pPr>
-      <w:r>
-        <w:t xml:space="preserve">Per QSA, QSAr e ZTPI, l’interfaccia richiede l’inserimento dei risultati e restituisce il profilo nello stesso formato del portale</w:t>
-      </w:r>
-      <w:r>
-        <w:t xml:space="preserve"> </w:t>
-      </w:r>
-      <w:r>
-        <w:rPr>
-          <w:iCs/>
-          <w:i/>
-        </w:rPr>
-        <w:t xml:space="preserve">Competenze strategiche</w:t>
-      </w:r>
-      <w:r>
-        <w:t xml:space="preserve">: un grafico a barre con codifica cromatica in cui il verde identifica i punti di forza, il giallo i risultati intermedi e il rosso le possibili aree di crescita. Questa visualizzazione offre una prima sintesi che viene utilizzata per il dialogo assistito.</w:t>
-      </w:r>
-    </w:p>
-    <w:p>
-      <w:pPr>
-        <w:pStyle w:val="BodyText"/>
-      </w:pPr>
-      <w:r>
-        <w:t xml:space="preserve">Ai questionari si affiancano due strumenti di natura differente. Il primo è la</w:t>
-      </w:r>
-      <w:r>
-        <w:t xml:space="preserve"> </w:t>
-      </w:r>
-      <w:r>
-        <w:rPr>
-          <w:iCs/>
-          <w:i/>
-        </w:rPr>
-        <w:t xml:space="preserve">Career Counseling Interview</w:t>
-      </w:r>
-      <w:r>
-        <w:t xml:space="preserve"> </w:t>
-      </w:r>
-      <w:r>
-        <w:t xml:space="preserve">di Savickas (2018), un colloquio narrativo che esplora esperienze, interessi, modelli di riferimento e aspirazioni dell’utente. Dopo la selezione, il sistema avvia il colloquio proponendo cinque domande qualitative, alle quali il modello linguistico può far seguire richieste di approfondimento. Al termine, Counselorbot elabora una sintesi narrativa che ricostruisce l’identità professionale e individua i principali temi di vita emersi.</w:t>
-      </w:r>
-    </w:p>
-    <w:p>
-      <w:pPr>
-        <w:pStyle w:val="BodyText"/>
-      </w:pPr>
-      <w:r>
-        <w:t xml:space="preserve">Il secondo è il modulo di</w:t>
-      </w:r>
-      <w:r>
-        <w:t xml:space="preserve"> </w:t>
-      </w:r>
-      <w:r>
-        <w:rPr>
-          <w:iCs/>
-          <w:i/>
-        </w:rPr>
-        <w:t xml:space="preserve">Pure Question-Based Learning</w:t>
-      </w:r>
-      <w:r>
-        <w:t xml:space="preserve"> </w:t>
-      </w:r>
-      <w:r>
-        <w:t xml:space="preserve">(PQBL; Jemstedt et al., 2024). L’interfaccia richiede il caricamento di un documento didattico in formato PDF. Il sistema trasforma il contenuto in un percorso interattivo fondato su domande e feedback, trasformando il testo da materiale di lettura passiva a base per un’attività nella quale l’utente recupera, rielabora e applica le informazioni.</w:t>
-      </w:r>
-    </w:p>
-    <w:p>
-      <w:pPr>
-        <w:pStyle w:val="BodyText"/>
-      </w:pPr>
-      <w:r>
-        <w:t xml:space="preserve">L’architettura modulare di Counselorbot consente l’integrazione futura di ulteriori questionari, interviste e strumenti per l’orientamento e l’apprendimento.</w:t>
-      </w:r>
-    </w:p>
-    <w:bookmarkEnd w:id="25"/>
-    <w:bookmarkStart w:id="26" w:name="passi-guidati-e-flussi-di-interazione"/>
-    <w:p>
-      <w:pPr>
-        <w:pStyle w:val="Heading3"/>
-      </w:pPr>
-      <w:r>
-        <w:t xml:space="preserve">2.2 Passi guidati e flussi di interazione</w:t>
-      </w:r>
-    </w:p>
-    <w:p>
-      <w:pPr>
-        <w:pStyle w:val="FirstParagraph"/>
-      </w:pPr>
-      <w:r>
-        <w:t xml:space="preserve">Il principio organizzativo centrale di Counselorbot è rappresentato dai passi guidati (</w:t>
-      </w:r>
-      <w:r>
-        <w:rPr>
-          <w:iCs/>
-          <w:i/>
-        </w:rPr>
-        <w:t xml:space="preserve">guided steps</w:t>
-      </w:r>
-      <w:r>
-        <w:t xml:space="preserve">), ossia sequenze predefinite che determinano l’ordine delle diverse fasi del dialogo. A ciascun passo è associato uno specifico meta-prompt, nel quale vengono definiti l’obiettivo della fase, le informazioni da prendere in considerazione e il tipo di risposta che il modello linguistico deve produrre. Questa struttura permette di affrontare sistematicamente tutti gli ambiti previsti dallo strumento selezionato, riducendo il rischio che alcune dimensioni vengano trascurate.</w:t>
-      </w:r>
-    </w:p>
-    <w:p>
-      <w:pPr>
-        <w:pStyle w:val="BodyText"/>
-      </w:pPr>
-      <w:r>
-        <w:t xml:space="preserve">All’interno di ciascun passo, tuttavia, il modello linguistico mantiene la flessibilità necessaria per adattare il linguaggio, gli esempi, le domande e il livello di approfondimento alle risposte dell’utente. Counselorbot realizza così una modalità di interazione ibrida, nella quale il controllo deterministico del percorso si combina con l’adattività conversazionale dell’LLM. L’interfaccia conversazionale presenta progressivamente le domande, le interpretazioni e le strategie associate a ciascun passo. L’utente può chiedere chiarimenti, richiedere esempi o soffermarsi su uno specifico argomento prima di proseguire.</w:t>
-      </w:r>
-    </w:p>
-    <w:p>
-      <w:pPr>
-        <w:pStyle w:val="BodyText"/>
-      </w:pPr>
-      <w:r>
-        <w:t xml:space="preserve">Poiché gli strumenti integrati presentano caratteristiche differenti, il sistema non applica un unico flusso indistinto, ma adotta percorsi specifici per i questionari, per la</w:t>
-      </w:r>
-      <w:r>
-        <w:t xml:space="preserve"> </w:t>
-      </w:r>
-      <w:r>
-        <w:rPr>
-          <w:iCs/>
-          <w:i/>
-        </w:rPr>
-        <w:t xml:space="preserve">Career Counseling Interview</w:t>
-      </w:r>
-      <w:r>
-        <w:t xml:space="preserve"> </w:t>
-      </w:r>
-      <w:r>
-        <w:t xml:space="preserve">e per il</w:t>
-      </w:r>
-      <w:r>
-        <w:t xml:space="preserve"> </w:t>
-      </w:r>
-      <w:r>
-        <w:rPr>
-          <w:iCs/>
-          <w:i/>
-        </w:rPr>
-        <w:t xml:space="preserve">Question-Based Learning</w:t>
-      </w:r>
-      <w:r>
-        <w:t xml:space="preserve">. Nel caso dei questionari QSA, QSAr e ZTPI, il percorso ha inizio con l’inserimento dei punteggi. Il sistema elabora quindi il profilo e ne presenta una prima visualizzazione grafica. Successivamente prende avvio l’analisi guidata dei risultati, durante la quale l’utente può approfondire liberamente ciascun fattore prima di passare al successivo. L’interpretazione dei questionari si sviluppa secondo due modalità complementari. La prima è analitica ed è dedicata all’esame progressivo dei singoli fattori. Per ciascuna dimensione, Counselorbot presenta il risultato, ne chiarisce il significato, formula eventuali domande di approfondimento e propone strategie personalizzate. La seconda modalità è sintetica e mette in relazione le diverse componenti del profilo, facendo emergere le connessioni tra aspetti cognitivi, metacognitivi, affettivi, motivazionali e volitivi. In questo modo, il sistema non si limita a restituire una serie di punteggi isolati, ma favorisce la costruzione di una rappresentazione unitaria del funzionamento dello studente. Al termine dell’analisi, Counselorbot propone una sintesi complessiva dei principali punti di forza, delle aree suscettibili di sviluppo e delle strategie emerse durante il dialogo. L’utente può quindi selezionare e salvare le indicazioni considerate maggiormente significative.</w:t>
-      </w:r>
-    </w:p>
-    <w:p>
-      <w:pPr>
-        <w:pStyle w:val="BodyText"/>
-      </w:pPr>
-      <w:r>
-        <w:t xml:space="preserve">La</w:t>
-      </w:r>
-      <w:r>
-        <w:t xml:space="preserve"> </w:t>
-      </w:r>
-      <w:r>
-        <w:rPr>
-          <w:iCs/>
-          <w:i/>
-        </w:rPr>
-        <w:t xml:space="preserve">Career Counseling Interview</w:t>
-      </w:r>
-      <w:r>
-        <w:t xml:space="preserve"> </w:t>
-      </w:r>
-      <w:r>
-        <w:t xml:space="preserve">segue invece un percorso qualitativo e narrativo. In questo modulo non vengono inseriti punteggi e non viene elaborato un profilo psicometrico. Il sistema presenta progressivamente le cinque domande previste dal protocollo, analizza le risposte dell’utente e può formulare ulteriori domande per approfondire gli elementi più significativi. Pur mantenendo la sequenza generale stabilita, il modello linguistico adatta il dialogo ai contenuti emersi. Al termine dell’intervista, Counselorbot individua i temi ricorrenti e li integra in una sintesi narrativa relativa agli interessi, ai modelli di riferimento, alle aspirazioni e alla costruzione dell’identità professionale.</w:t>
-      </w:r>
-    </w:p>
-    <w:p>
-      <w:pPr>
-        <w:pStyle w:val="BodyText"/>
-      </w:pPr>
-      <w:r>
-        <w:t xml:space="preserve">Il modulo di</w:t>
-      </w:r>
-      <w:r>
-        <w:t xml:space="preserve"> </w:t>
-      </w:r>
-      <w:r>
-        <w:rPr>
-          <w:iCs/>
-          <w:i/>
-        </w:rPr>
-        <w:t xml:space="preserve">Question-Based Learning</w:t>
-      </w:r>
-      <w:r>
-        <w:t xml:space="preserve"> </w:t>
-      </w:r>
-      <w:r>
-        <w:t xml:space="preserve">segue un terzo flusso, specificamente orientato all’apprendimento attivo. Dopo il caricamento del documento in formato PDF, il sistema ne analizza e segmenta il contenuto, genera una sequenza di domande e le presenta progressivamente all’utente. Dopo ciascuna risposta, Counselorbot restituisce un feedback, propone eventuali chiarimenti e può adattare la difficoltà o il livello di approfondimento delle domande successive. Il percorso rimane ancorato ai contenuti del documento e si conclude con una sintesi dell’attività svolta e degli aspetti principali affrontati.</w:t>
-      </w:r>
-    </w:p>
-    <w:bookmarkEnd w:id="26"/>
-    <w:bookmarkStart w:id="27" w:name="infrastruttura-hardware"/>
-    <w:p>
-      <w:pPr>
-        <w:pStyle w:val="Heading3"/>
-      </w:pPr>
-      <w:r>
-        <w:t xml:space="preserve">2.3 Infrastruttura hardware</w:t>
-      </w:r>
-    </w:p>
-    <w:p>
-      <w:pPr>
-        <w:pStyle w:val="FirstParagraph"/>
-      </w:pPr>
-      <w:r>
-        <w:t xml:space="preserve">Counselorbot è eseguito su una workstation ad alte prestazioni, configurata per gestire localmente modelli linguistici e carichi computazionali intensivi. La macchina è dotata di un processore AMD Ryzen Threadripper 7980X con 64 core e 128 thread, di 256 GB di memoria RAM e di una GPU NVIDIA RTX 5090. La realizzazione dell’infrastruttura ha richiesto un investimento iniziale di circa 13.000 euro. La scelta di un’infrastruttura locale risponde innanzitutto all’esigenza di tutelare la riservatezza dei dati, poiché consente di ridurre il trasferimento delle conversazioni e delle informazioni degli utenti verso servizi esterni. Inoltre, permette di mantenere una maggiore indipendenza dai provider commerciali di intelligenza artificiale, evitando che il funzionamento del sistema dipenda esclusivamente dalla disponibilità, dai costi o dalle modifiche delle API esterne. Infine, l’investimento iniziale può contribuire alla sostenibilità economica nel medio e lungo periodo, soprattutto in presenza di un numero elevato di interazioni.</w:t>
-      </w:r>
-    </w:p>
-    <w:bookmarkEnd w:id="27"/>
-    <w:bookmarkStart w:id="31" w:name="software"/>
-    <w:p>
-      <w:pPr>
-        <w:pStyle w:val="Heading3"/>
-      </w:pPr>
-      <w:r>
-        <w:t xml:space="preserve">2.4 Software</w:t>
-      </w:r>
-    </w:p>
-    <w:p>
-      <w:pPr>
-        <w:pStyle w:val="FirstParagraph"/>
-      </w:pPr>
-      <w:r>
-        <w:t xml:space="preserve">Il software di Counselorbot comprende il sistema di gestione dei modelli linguistici, i meccanismi di recupero delle conoscenze e della memoria e le funzioni di registrazione e analisi delle interazioni.</w:t>
-      </w:r>
-    </w:p>
-    <w:bookmarkStart w:id="28" w:name="modelli-linguistici"/>
-    <w:p>
-      <w:pPr>
-        <w:pStyle w:val="Heading4"/>
-      </w:pPr>
-      <w:r>
-        <w:t xml:space="preserve">2.4.1 Modelli linguistici</w:t>
-      </w:r>
-    </w:p>
-    <w:p>
-      <w:pPr>
-        <w:pStyle w:val="FirstParagraph"/>
-      </w:pPr>
-      <w:r>
-        <w:t xml:space="preserve">Per la gestione dei modelli linguistici, Counselorbot utilizza Ollama, uno strumento che consente l’esecuzione locale ed efficiente di modelli open-source. Durante la fase di sviluppo, la scelta si è orientata verso modelli con un numero di parametri inferiore a 15 miliardi, per garantire un equilibrio ottimale tra prestazioni e sostenibilità dell’infrastruttura locale. Sono stati testati modelli appartenenti a diverse famiglie, tra cui Gemma (nelle varianti da 2B, 4B e 12B parametri), DeepSeek-R1-Distill 8B e Qwen 3.5 9B.</w:t>
-      </w:r>
-    </w:p>
-    <w:bookmarkEnd w:id="28"/>
-    <w:bookmarkStart w:id="29" w:name="Xc64cd9a05b3a0c767b472b6f7103b658ac68a3e"/>
-    <w:p>
-      <w:pPr>
-        <w:pStyle w:val="Heading4"/>
-      </w:pPr>
-      <w:r>
-        <w:t xml:space="preserve">2.4.2 Recupero delle conoscenze e gestione della memoria</w:t>
-      </w:r>
-    </w:p>
-    <w:p>
-      <w:pPr>
-        <w:pStyle w:val="FirstParagraph"/>
-      </w:pPr>
-      <w:r>
-        <w:t xml:space="preserve">Counselorbot utilizza diversi meccanismi per recuperare le informazioni rilevanti e mantenere la continuità delle interazioni. Tali meccanismi comprendono la memoria di sessione, la base di conoscenza, il grafo della conoscenza e una memoria condivisa delle risposte. La memoria di sessione conserva le informazioni emerse nel corso della singola conversazione. In questo modo, il sistema può ricordare i risultati, le risposte dell’utente e le strategie già discusse, evitando ripetizioni e garantendo coerenza tra le diverse fasi del percorso. La base di conoscenza contiene strategie educative e contenuti teorici precedentemente selezionati e approvati. Le strategie sono associate ai fattori dei questionari e indicizzate attraverso parole chiave e rappresentazioni semantiche. Quando viene analizzata una determinata dimensione, il sistema recupera automaticamente i contenuti maggiormente pertinenti rispetto al fattore, al punteggio e alle informazioni fornite dallo studente. Le informazioni recuperate vengono inserite nel contesto del modello linguistico e impiegate per generare la risposta. Questa soluzione consente agli amministratori di ampliare o aggiornare la base di conoscenza senza dover intervenire manualmente sui prompt. Il grafo della conoscenza collega tra loro gli strumenti, i fattori, le strategie e i riferimenti teorici. Tale struttura permette di estendere la ricerca documentale anche ai concetti semanticamente vicini, superando una corrispondenza esclusivamente letterale tra i termini utilizzati dall’utente e quelli presenti nei contenuti indicizzati. A questi meccanismi si aggiunge una memoria condivisa delle risposte. Quando un utente valuta positivamente una risposta dell’assistente, questa può essere conservata e utilizzata come riferimento per domande analoghe formulate in sessioni successive. Le risposte precedenti non vengono necessariamente riproposte in forma identica, ma possono essere recuperate come esempi utili alla produzione di nuove risposte. Si introduce così un meccanismo di apprendimento collettivo, nel quale le interazioni considerate efficaci contribuiscono progressivamente al miglioramento del sistema. La memoria condivisa rimane tuttavia distinta dalla base di conoscenza validata: quest’ultima contiene materiali selezionati dagli amministratori, mentre la memoria condivisa deriva dalla valutazione delle risposte generate durante l’utilizzo.</w:t>
-      </w:r>
-    </w:p>
-    <w:bookmarkEnd w:id="29"/>
-    <w:bookmarkStart w:id="30" w:name="X2bc7d88a141625ea69f5b759b49be79527dd3a2"/>
-    <w:p>
-      <w:pPr>
-        <w:pStyle w:val="Heading4"/>
-      </w:pPr>
-      <w:r>
-        <w:t xml:space="preserve">2.4.3 Gestione delle interazioni e anonimizzazione</w:t>
-      </w:r>
-    </w:p>
-    <w:p>
-      <w:pPr>
-        <w:pStyle w:val="FirstParagraph"/>
-      </w:pPr>
-      <w:r>
-        <w:t xml:space="preserve">Le interazioni vengono registrate in un archivio consultabile dagli amministratori. Tale archivio permette di monitorare l’utilizzo del sistema, individuare domande ricorrenti, identificare eventuali difficoltà nei percorsi guidati e rilevare le aree nelle quali le risposte richiedono ulteriori miglioramenti. È inoltre in fase di progettazione un sistema di anonimizzazione che consenta di analizzare i contenuti delle conversazioni senza esporre i dati personali degli studenti. L’obiettivo è rendere possibile lo studio aggregato delle strategie maggiormente discusse, dei fattori percepiti come critici e dell’efficacia attribuita dagli utenti alle risposte del sistema. Questi dati potranno essere utilizzati per valutare l’impatto di Counselorbot, perfezionare i protocolli di interazione e studiare l’impiego del sistema su scala più ampia.</w:t>
-      </w:r>
-    </w:p>
-    <w:bookmarkEnd w:id="30"/>
-    <w:bookmarkEnd w:id="31"/>
-    <w:bookmarkStart w:id="32" w:name="struttura-del-sistema"/>
-    <w:p>
-      <w:pPr>
-        <w:pStyle w:val="Heading3"/>
-      </w:pPr>
-      <w:r>
-        <w:t xml:space="preserve">2.5 Struttura del sistema</w:t>
-      </w:r>
-    </w:p>
-    <w:p>
-      <w:pPr>
-        <w:pStyle w:val="FirstParagraph"/>
-      </w:pPr>
-      <w:r>
-        <w:t xml:space="preserve">L’architettura applicativa di Counselorbot si articola in quattro componenti principali: frontend, backend, database e livello di astrazione dei modelli linguistici. Il frontend costituisce il livello con cui l’utente interagisce direttamente. Comprende il selettore degli strumenti, i moduli per l’inserimento dei risultati, il caricamento dei documenti, la visualizzazione grafica del profilo, l’interfaccia conversazionale, la navigazione tra i passi guidati e le funzioni di salvataggio delle strategie. La sua organizzazione modulare permette di associare a ciascuno strumento una specifica interfaccia, mantenendo al tempo stesso un’esperienza d’uso coerente all’interno della piattaforma. Il backend gestisce la logica applicativa e coordina le differenti componenti del sistema. Esso espone i servizi relativi alla chat, ai questionari, ai passi guidati, alla memoria, alla base di conoscenza e alle funzioni amministrative. Durante l’interazione, il backend individua il passo corrente, seleziona il meta-prompt corrispondente, recupera le informazioni pertinenti e costruisce il contesto da inviare al modello linguistico. Successivamente riceve la risposta generata, la restituisce all’interfaccia e aggiorna la memoria della sessione. Il database relazionale conserva le configurazioni necessarie al funzionamento della piattaforma. Al suo interno sono registrati gli strumenti disponibili, la struttura dei questionari, i fattori, gli item, le scale, le stanine, i prompt, i meta-prompt, i passi guidati, le strategie, le configurazioni dei modelli, la memoria delle sessioni e le interazioni archiviate. Counselorbot non si limita quindi a ricevere punteggi esterni, ma dispone di una rappresentazione strutturata dei questionari e può interpretarli in relazione alle loro caratteristiche. Il livello di astrazione dei modelli linguistici mette infine in comunicazione il backend con i diversi provider di intelligenza artificiale. Attraverso un’interfaccia comune, esso gestisce l’invio dei prompt, la ricezione delle risposte e i parametri di generazione. Questa componente rende Counselorbot indipendente dal singolo modello e consente di utilizzare sia modelli eseguiti localmente mediante Ollama sia eventuali servizi remoti. L’organizzazione complessiva separa dunque i contenuti educativi, la logica dei percorsi, l’interfaccia utente e il modello linguistico. Tale separazione permette di aggiornare ed estendere Counselorbot intervenendo sulle singole componenti, senza dover riprogettare l’intero sistema.</w:t>
-      </w:r>
-    </w:p>
-    <w:bookmarkEnd w:id="32"/>
-    <w:bookmarkEnd w:id="33"/>
-    <w:bookmarkStart w:id="38" w:name="metodologia-di-valutazione"/>
-    <w:p>
-      <w:pPr>
-        <w:pStyle w:val="Heading2"/>
-      </w:pPr>
-      <w:r>
-        <w:t xml:space="preserve">3. Metodologia di valutazione</w:t>
-      </w:r>
-    </w:p>
-    <w:bookmarkStart w:id="34" w:name="disegno-della-ricerca"/>
-    <w:p>
-      <w:pPr>
-        <w:pStyle w:val="Heading3"/>
-      </w:pPr>
-      <w:r>
-        <w:t xml:space="preserve">3.1 Disegno della ricerca</w:t>
-      </w:r>
-    </w:p>
-    <w:p>
-      <w:pPr>
-        <w:pStyle w:val="FirstParagraph"/>
-      </w:pPr>
-      <w:r>
-        <w:t xml:space="preserve">Per valutare il sistema descritto nel § 2 è stato adottato un disegno di ricerca articolato secondo il modello ADDIE (Branch, 2009). L’acronimo identifica cinque fasi iterative:</w:t>
-      </w:r>
-      <w:r>
-        <w:t xml:space="preserve"> </w:t>
-      </w:r>
-      <w:r>
-        <w:rPr>
-          <w:iCs/>
-          <w:i/>
-        </w:rPr>
-        <w:t xml:space="preserve">Analysis</w:t>
-      </w:r>
-      <w:r>
-        <w:t xml:space="preserve">, relativa all’analisi dei bisogni formativi e del contesto;</w:t>
-      </w:r>
-      <w:r>
-        <w:t xml:space="preserve"> </w:t>
-      </w:r>
-      <w:r>
-        <w:rPr>
-          <w:iCs/>
-          <w:i/>
-        </w:rPr>
-        <w:t xml:space="preserve">Design</w:t>
-      </w:r>
-      <w:r>
-        <w:t xml:space="preserve">, dedicata alla progettazione dell’architettura e delle modalità di interazione;</w:t>
-      </w:r>
-      <w:r>
-        <w:t xml:space="preserve"> </w:t>
-      </w:r>
-      <w:r>
-        <w:rPr>
-          <w:iCs/>
-          <w:i/>
-        </w:rPr>
-        <w:t xml:space="preserve">Development</w:t>
-      </w:r>
-      <w:r>
-        <w:t xml:space="preserve">, riguardante la realizzazione del sistema;</w:t>
-      </w:r>
-      <w:r>
-        <w:t xml:space="preserve"> </w:t>
-      </w:r>
-      <w:r>
-        <w:rPr>
-          <w:iCs/>
-          <w:i/>
-        </w:rPr>
-        <w:t xml:space="preserve">Implementation</w:t>
-      </w:r>
-      <w:r>
-        <w:t xml:space="preserve">, riferita al rilascio e all’utilizzo del sistema; ed</w:t>
-      </w:r>
-      <w:r>
-        <w:t xml:space="preserve"> </w:t>
-      </w:r>
-      <w:r>
-        <w:rPr>
-          <w:iCs/>
-          <w:i/>
-        </w:rPr>
-        <w:t xml:space="preserve">Evaluation</w:t>
-      </w:r>
-      <w:r>
-        <w:t xml:space="preserve">, finalizzata alla valutazione del suo funzionamento e dei risultati ottenuti. Il lavoro presentato in questo articolo si colloca nella fase di</w:t>
-      </w:r>
-      <w:r>
-        <w:t xml:space="preserve"> </w:t>
-      </w:r>
-      <w:r>
-        <w:rPr>
-          <w:iCs/>
-          <w:i/>
-        </w:rPr>
-        <w:t xml:space="preserve">Evaluation</w:t>
-      </w:r>
-      <w:r>
-        <w:t xml:space="preserve"> </w:t>
-      </w:r>
-      <w:r>
-        <w:t xml:space="preserve">del secondo ciclo di sviluppo. Il primo ciclo ha portato alla realizzazione di CB-C, una versione basata su un’architettura RAG (</w:t>
-      </w:r>
-      <w:r>
-        <w:rPr>
-          <w:iCs/>
-          <w:i/>
-        </w:rPr>
-        <w:t xml:space="preserve">Retrieval-Augmented Generation</w:t>
-      </w:r>
-      <w:r>
-        <w:t xml:space="preserve">) e su un</w:t>
-      </w:r>
-      <w:r>
-        <w:t xml:space="preserve"> </w:t>
-      </w:r>
-      <w:r>
-        <w:rPr>
-          <w:iCs/>
-          <w:i/>
-        </w:rPr>
-        <w:t xml:space="preserve">system prompt</w:t>
-      </w:r>
-      <w:r>
         <w:t xml:space="preserve">. In tale configurazione, il modello linguistico rispondeva alle domande dello studente recuperando le informazioni pertinenti da documenti indicizzati in una memoria vettoriale, senza seguire una sequenza di interazione prestabilita. I risultati del primo ciclo, discussi nel § 4, hanno evidenziato alcune criticità, in particolare nella coerenza delle analisi prodotte e nelle modalità di inserimento manuale dei dati. Tali risultati hanno orientato un successivo processo di ottimizzazione e la progettazione di una nuova versione del sistema. Il secondo ciclo ha quindi condotto allo sviluppo di CB-SBS, che introduce una procedura guidata per passi, un grafo della conoscenza, l’indicizzazione semantica delle strategie e un’interfaccia ottimizzata per l’inserimento e la visualizzazione dei profili. In particolare, l’inserimento manuale dei punteggi — segnalato come critico nella prima fase — è stato sostituito da un form iniziale e dal caricamento diretto dei PDF degli esiti; la memoria di sessione è stata rivista tramite sintesi dinamica del dialogo e iniezione costante dei punteggi a ogni turno; ed è stato introdotto un limite di token per contenere l’estensione degli interventi del LLM. La valutazione presentata in questo studio adotta un disegno comparativo</w:t>
       </w:r>
       <w:r>
@@ -1253,12 +1354,16 @@
         <w:pStyle w:val="Heading3"/>
       </w:pPr>
       <w:r>
+        <w:rPr>
+          <w:color w:val="000000"/>
+        </w:rPr>
         <w:t xml:space="preserve">3.2 Partecipanti e procedura</w:t>
       </w:r>
     </w:p>
     <w:p>
       <w:pPr>
         <w:pStyle w:val="FirstParagraph"/>
+        <w:jc w:val="both"/>
       </w:pPr>
       <w:r>
         <w:t xml:space="preserve">Al momento della stesura dell’articolo, la raccolta dei dati è ancora in corso. Hanno completato la procedura 34 partecipanti: 7 hanno utilizzato la versione CB-SBS, mentre 27 hanno interagito con la versione precedente, CB-C. Il campione presenta una composizione eterogenea sia per età, compresa tra 14 e 53 anni, sia per livello di istruzione, che varia dalla scuola secondaria di primo grado alla laurea magistrale. La procedura prevedeva inizialmente la compilazione del Questionario sulle Strategie di Apprendimento (QSA). Successivamente, i partecipanti visualizzavano il proprio profilo e avviavano un’interazione con il chatbot articolata nell’analisi dei singoli fattori del questionario. Al termine del percorso veniva somministrato il questionario di gradimento.</w:t>
@@ -1271,12 +1376,16 @@
         <w:pStyle w:val="Heading3"/>
       </w:pPr>
       <w:r>
+        <w:rPr>
+          <w:color w:val="000000"/>
+        </w:rPr>
         <w:t xml:space="preserve">3.3 Strumenti e metriche</w:t>
       </w:r>
     </w:p>
     <w:p>
       <w:pPr>
         <w:pStyle w:val="FirstParagraph"/>
+        <w:jc w:val="both"/>
       </w:pPr>
       <w:r>
         <w:t xml:space="preserve">Il questionario di gradimento è composto da dieci item relativi ad altrettanti aspetti dell’esperienza di utilizzo: utilità percepita, pertinenza delle risposte, chiarezza delle spiegazioni, adeguatezza del livello di dettaglio, facilità d’uso dell’interfaccia, velocità di risposta, fiducia nelle informazioni ricevute, capacità del sistema di stimolare la riflessione su di sé, coinvolgimento complessivo e intenzione di riutilizzare il chatbot o di raccomandarlo ad altri. Per ciascun item viene calcolata la media aritmetica, separatamente per le due versioni del sistema. Gli item vengono analizzati singolarmente e non sono aggregati in sottoscale. Il questionario raccoglie inoltre informazioni sociodemografiche relative a età, sesso, titolo di studio, tipo di istituto frequentato e provenienza geografica. Nella versione estesa sono presenti anche due domande aperte, finalizzate a raccogliere osservazioni sull’esperienza e suggerimenti per il miglioramento del sistema. Le risposte vengono analizzate qualitativamente mediante una categorizzazione tematica.</w:t>
@@ -1289,12 +1398,16 @@
         <w:pStyle w:val="Heading3"/>
       </w:pPr>
       <w:r>
+        <w:rPr>
+          <w:color w:val="000000"/>
+        </w:rPr>
         <w:t xml:space="preserve">3.4 Selezione e valutazione del modello linguistico locale</w:t>
       </w:r>
     </w:p>
     <w:p>
       <w:pPr>
         <w:pStyle w:val="FirstParagraph"/>
+        <w:jc w:val="both"/>
       </w:pPr>
       <w:r>
         <w:t xml:space="preserve">La selezione del modello linguistico locale è stata articolata in due fasi. In una prima fase sono stati esaminati i risultati pubblicamente disponibili di alcuni benchmark utilizzati per confrontare le prestazioni dei modelli linguistici in compiti di conoscenza generale, ragionamento avanzato e generazione di codice. In particolare, sono stati considerati i risultati ottenuti in MMLU-Pro, GPQA Diamond e LiveCodeBench. L’analisi di tali benchmark ha permesso di individuare i modelli con le prestazioni complessivamente più elevate tra quelli compatibili con i requisiti dell’infrastruttura locale.</w:t>
@@ -1323,7 +1436,7 @@
           <w:p>
             <w:pPr>
               <w:pStyle w:val="Compact"/>
-              <w:jc w:val="left"/>
+              <w:jc w:val="both"/>
             </w:pPr>
             <w:r>
               <w:rPr>
@@ -1339,7 +1452,7 @@
           <w:p>
             <w:pPr>
               <w:pStyle w:val="Compact"/>
-              <w:jc w:val="left"/>
+              <w:jc w:val="both"/>
             </w:pPr>
             <w:r>
               <w:rPr>
@@ -1355,7 +1468,7 @@
           <w:p>
             <w:pPr>
               <w:pStyle w:val="Compact"/>
-              <w:jc w:val="left"/>
+              <w:jc w:val="both"/>
             </w:pPr>
             <w:r>
               <w:rPr>
@@ -1371,7 +1484,7 @@
           <w:p>
             <w:pPr>
               <w:pStyle w:val="Compact"/>
-              <w:jc w:val="left"/>
+              <w:jc w:val="both"/>
             </w:pPr>
             <w:r>
               <w:rPr>
@@ -1387,7 +1500,7 @@
           <w:p>
             <w:pPr>
               <w:pStyle w:val="Compact"/>
-              <w:jc w:val="left"/>
+              <w:jc w:val="both"/>
             </w:pPr>
             <w:r>
               <w:rPr>
@@ -1405,7 +1518,7 @@
           <w:p>
             <w:pPr>
               <w:pStyle w:val="Compact"/>
-              <w:jc w:val="left"/>
+              <w:jc w:val="both"/>
             </w:pPr>
             <w:r>
               <w:t xml:space="preserve">Gemma 4 4B</w:t>
@@ -1417,7 +1530,7 @@
           <w:p>
             <w:pPr>
               <w:pStyle w:val="Compact"/>
-              <w:jc w:val="left"/>
+              <w:jc w:val="both"/>
             </w:pPr>
             <w:r>
               <w:t xml:space="preserve">4B</w:t>
@@ -1429,7 +1542,7 @@
           <w:p>
             <w:pPr>
               <w:pStyle w:val="Compact"/>
-              <w:jc w:val="left"/>
+              <w:jc w:val="both"/>
             </w:pPr>
             <w:r>
               <w:t xml:space="preserve">69,4%</w:t>
@@ -1441,7 +1554,7 @@
           <w:p>
             <w:pPr>
               <w:pStyle w:val="Compact"/>
-              <w:jc w:val="left"/>
+              <w:jc w:val="both"/>
             </w:pPr>
             <w:r>
               <w:t xml:space="preserve">58,6%</w:t>
@@ -1453,7 +1566,7 @@
           <w:p>
             <w:pPr>
               <w:pStyle w:val="Compact"/>
-              <w:jc w:val="left"/>
+              <w:jc w:val="both"/>
             </w:pPr>
             <w:r>
               <w:t xml:space="preserve">52,0%</w:t>
@@ -1467,7 +1580,7 @@
           <w:p>
             <w:pPr>
               <w:pStyle w:val="Compact"/>
-              <w:jc w:val="left"/>
+              <w:jc w:val="both"/>
             </w:pPr>
             <w:r>
               <w:t xml:space="preserve">Gemma 4 2B</w:t>
@@ -1479,7 +1592,7 @@
           <w:p>
             <w:pPr>
               <w:pStyle w:val="Compact"/>
-              <w:jc w:val="left"/>
+              <w:jc w:val="both"/>
             </w:pPr>
             <w:r>
               <w:t xml:space="preserve">2B</w:t>
@@ -1491,7 +1604,7 @@
           <w:p>
             <w:pPr>
               <w:pStyle w:val="Compact"/>
-              <w:jc w:val="left"/>
+              <w:jc w:val="both"/>
             </w:pPr>
             <w:r>
               <w:t xml:space="preserve">60,0%</w:t>
@@ -1503,7 +1616,7 @@
           <w:p>
             <w:pPr>
               <w:pStyle w:val="Compact"/>
-              <w:jc w:val="left"/>
+              <w:jc w:val="both"/>
             </w:pPr>
             <w:r>
               <w:t xml:space="preserve">43,4%</w:t>
@@ -1515,7 +1628,7 @@
           <w:p>
             <w:pPr>
               <w:pStyle w:val="Compact"/>
-              <w:jc w:val="left"/>
+              <w:jc w:val="both"/>
             </w:pPr>
             <w:r>
               <w:t xml:space="preserve">44,0%</w:t>
@@ -1529,7 +1642,7 @@
           <w:p>
             <w:pPr>
               <w:pStyle w:val="Compact"/>
-              <w:jc w:val="left"/>
+              <w:jc w:val="both"/>
             </w:pPr>
             <w:r>
               <w:t xml:space="preserve">Gemma 4 12B</w:t>
@@ -1541,7 +1654,7 @@
           <w:p>
             <w:pPr>
               <w:pStyle w:val="Compact"/>
-              <w:jc w:val="left"/>
+              <w:jc w:val="both"/>
             </w:pPr>
             <w:r>
               <w:t xml:space="preserve">12B</w:t>
@@ -1553,7 +1666,7 @@
           <w:p>
             <w:pPr>
               <w:pStyle w:val="Compact"/>
-              <w:jc w:val="left"/>
+              <w:jc w:val="both"/>
             </w:pPr>
             <w:r>
               <w:t xml:space="preserve">77,2%</w:t>
@@ -1565,7 +1678,7 @@
           <w:p>
             <w:pPr>
               <w:pStyle w:val="Compact"/>
-              <w:jc w:val="left"/>
+              <w:jc w:val="both"/>
             </w:pPr>
             <w:r>
               <w:t xml:space="preserve">78,8%</w:t>
@@ -1577,7 +1690,7 @@
           <w:p>
             <w:pPr>
               <w:pStyle w:val="Compact"/>
-              <w:jc w:val="left"/>
+              <w:jc w:val="both"/>
             </w:pPr>
             <w:r>
               <w:t xml:space="preserve">72,0%</w:t>
@@ -1591,7 +1704,7 @@
           <w:p>
             <w:pPr>
               <w:pStyle w:val="Compact"/>
-              <w:jc w:val="left"/>
+              <w:jc w:val="both"/>
             </w:pPr>
             <w:r>
               <w:t xml:space="preserve">DeepSeek-R1-Distill 8B</w:t>
@@ -1603,7 +1716,7 @@
           <w:p>
             <w:pPr>
               <w:pStyle w:val="Compact"/>
-              <w:jc w:val="left"/>
+              <w:jc w:val="both"/>
             </w:pPr>
             <w:r>
               <w:t xml:space="preserve">8B</w:t>
@@ -1615,7 +1728,7 @@
           <w:p>
             <w:pPr>
               <w:pStyle w:val="Compact"/>
-              <w:jc w:val="left"/>
+              <w:jc w:val="both"/>
             </w:pPr>
             <w:r>
               <w:t xml:space="preserve">—</w:t>
@@ -1627,7 +1740,7 @@
           <w:p>
             <w:pPr>
               <w:pStyle w:val="Compact"/>
-              <w:jc w:val="left"/>
+              <w:jc w:val="both"/>
             </w:pPr>
             <w:r>
               <w:t xml:space="preserve">49,0%</w:t>
@@ -1639,7 +1752,7 @@
           <w:p>
             <w:pPr>
               <w:pStyle w:val="Compact"/>
-              <w:jc w:val="left"/>
+              <w:jc w:val="both"/>
             </w:pPr>
             <w:r>
               <w:t xml:space="preserve">39,6%</w:t>
@@ -1653,7 +1766,7 @@
           <w:p>
             <w:pPr>
               <w:pStyle w:val="Compact"/>
-              <w:jc w:val="left"/>
+              <w:jc w:val="both"/>
             </w:pPr>
             <w:r>
               <w:t xml:space="preserve">Qwen 3.5 9B</w:t>
@@ -1665,7 +1778,7 @@
           <w:p>
             <w:pPr>
               <w:pStyle w:val="Compact"/>
-              <w:jc w:val="left"/>
+              <w:jc w:val="both"/>
             </w:pPr>
             <w:r>
               <w:t xml:space="preserve">9B</w:t>
@@ -1677,7 +1790,7 @@
           <w:p>
             <w:pPr>
               <w:pStyle w:val="Compact"/>
-              <w:jc w:val="left"/>
+              <w:jc w:val="both"/>
             </w:pPr>
             <w:r>
               <w:t xml:space="preserve">82,5%</w:t>
@@ -1689,7 +1802,7 @@
           <w:p>
             <w:pPr>
               <w:pStyle w:val="Compact"/>
-              <w:jc w:val="left"/>
+              <w:jc w:val="both"/>
             </w:pPr>
             <w:r>
               <w:t xml:space="preserve">81,7%</w:t>
@@ -1701,7 +1814,7 @@
           <w:p>
             <w:pPr>
               <w:pStyle w:val="Compact"/>
-              <w:jc w:val="left"/>
+              <w:jc w:val="both"/>
             </w:pPr>
             <w:r>
               <w:t xml:space="preserve">65,6%</w:t>
@@ -1713,6 +1826,7 @@
     <w:p>
       <w:pPr>
         <w:pStyle w:val="BodyText"/>
+        <w:jc w:val="both"/>
       </w:pPr>
       <w:r>
         <w:t xml:space="preserve">La scelta dei modelli candidati non è stata tuttavia determinata esclusivamente dai punteggi ottenuti nei benchmark. Sono stati considerati anche il numero di parametri e la compatibilità con l’hardware disponibile, privilegiando modelli con meno di 15 miliardi di parametri, in grado di garantire un equilibrio tra prestazioni, velocità di esecuzione e sostenibilità computazionale.</w:t>
@@ -1721,6 +1835,7 @@
     <w:p>
       <w:pPr>
         <w:pStyle w:val="BodyText"/>
+        <w:jc w:val="both"/>
       </w:pPr>
       <w:r>
         <w:t xml:space="preserve">Nella seconda fase, i modelli selezionati sulla base dei benchmark sono stati installati e testati direttamente sulla macchina locale descritta nel § 2.3. La valutazione è stata condotta sull’intero flusso degli undici passi previsti per l’analisi del QSA.</w:t>
@@ -1729,6 +1844,7 @@
     <w:p>
       <w:pPr>
         <w:pStyle w:val="BodyText"/>
+        <w:jc w:val="both"/>
       </w:pPr>
       <w:r>
         <w:t xml:space="preserve">Per ciascun modello sono state esaminate la capacità di rispettare la sequenza prestabilita, la copertura di tutti i fattori del questionario, la coerenza delle interpretazioni formulate e la pertinenza pedagogica delle strategie proposte. Tali criteri sono stati aggregati in un punteggio complessivo di qualità (da 0 a 1) che sintetizza copertura dei fattori, correttezza interpretativa rispetto ai punteggi, pertinenza pedagogica dei consigli e aderenza al formato richiesto. Sono stati inoltre rilevati due indicatori tecnici: la velocità media di generazione, espressa in token al secondo, e il Time to First Token (TTFT), corrispondente al tempo intercorrente tra l’invio della richiesta e la produzione del primo token della risposta. La valutazione dei criteri qualitativi e l’attribuzione del punteggio di qualità sono state eseguite in modalità automatica tramite Opus 4.8.</w:t>
@@ -1742,6 +1858,9 @@
         <w:pStyle w:val="Heading2"/>
       </w:pPr>
       <w:r>
+        <w:rPr>
+          <w:color w:val="000000"/>
+        </w:rPr>
         <w:t xml:space="preserve">4. Risultati</w:t>
       </w:r>
     </w:p>
@@ -1751,12 +1870,16 @@
         <w:pStyle w:val="Heading3"/>
       </w:pPr>
       <w:r>
+        <w:rPr>
+          <w:color w:val="000000"/>
+        </w:rPr>
         <w:t xml:space="preserve">4.1 Selezione del modello locale</w:t>
       </w:r>
     </w:p>
     <w:p>
       <w:pPr>
         <w:pStyle w:val="FirstParagraph"/>
+        <w:jc w:val="both"/>
       </w:pPr>
       <w:r>
         <w:t xml:space="preserve">La tabella seguente presenta i risultati della valutazione locale dei modelli, condotta riproducendo l’intero flusso degli undici passi del QSA con gli stessi</w:t>
@@ -1801,7 +1924,7 @@
           <w:p>
             <w:pPr>
               <w:pStyle w:val="Compact"/>
-              <w:jc w:val="left"/>
+              <w:jc w:val="both"/>
             </w:pPr>
             <w:r>
               <w:t xml:space="preserve">Modello</w:t>
@@ -1813,7 +1936,7 @@
           <w:p>
             <w:pPr>
               <w:pStyle w:val="Compact"/>
-              <w:jc w:val="left"/>
+              <w:jc w:val="both"/>
             </w:pPr>
             <w:r>
               <w:t xml:space="preserve">Parametri</w:t>
@@ -1825,7 +1948,7 @@
           <w:p>
             <w:pPr>
               <w:pStyle w:val="Compact"/>
-              <w:jc w:val="left"/>
+              <w:jc w:val="both"/>
             </w:pPr>
             <w:r>
               <w:t xml:space="preserve">Qualità</w:t>
@@ -1837,7 +1960,7 @@
           <w:p>
             <w:pPr>
               <w:pStyle w:val="Compact"/>
-              <w:jc w:val="left"/>
+              <w:jc w:val="both"/>
             </w:pPr>
             <w:r>
               <w:t xml:space="preserve">Token/s</w:t>
@@ -1849,7 +1972,7 @@
           <w:p>
             <w:pPr>
               <w:pStyle w:val="Compact"/>
-              <w:jc w:val="left"/>
+              <w:jc w:val="both"/>
             </w:pPr>
             <w:r>
               <w:t xml:space="preserve">TTFT</w:t>
@@ -1863,7 +1986,7 @@
           <w:p>
             <w:pPr>
               <w:pStyle w:val="Compact"/>
-              <w:jc w:val="left"/>
+              <w:jc w:val="both"/>
             </w:pPr>
             <w:r>
               <w:t xml:space="preserve">Gemma 4 4B</w:t>
@@ -1875,7 +1998,7 @@
           <w:p>
             <w:pPr>
               <w:pStyle w:val="Compact"/>
-              <w:jc w:val="left"/>
+              <w:jc w:val="both"/>
             </w:pPr>
             <w:r>
               <w:t xml:space="preserve">4B</w:t>
@@ -1887,7 +2010,7 @@
           <w:p>
             <w:pPr>
               <w:pStyle w:val="Compact"/>
-              <w:jc w:val="left"/>
+              <w:jc w:val="both"/>
             </w:pPr>
             <w:r>
               <w:t xml:space="preserve">0,83</w:t>
@@ -1899,7 +2022,7 @@
           <w:p>
             <w:pPr>
               <w:pStyle w:val="Compact"/>
-              <w:jc w:val="left"/>
+              <w:jc w:val="both"/>
             </w:pPr>
             <w:r>
               <w:t xml:space="preserve">472</w:t>
@@ -1911,7 +2034,7 @@
           <w:p>
             <w:pPr>
               <w:pStyle w:val="Compact"/>
-              <w:jc w:val="left"/>
+              <w:jc w:val="both"/>
             </w:pPr>
             <w:r>
               <w:t xml:space="preserve">4,5 s</w:t>
@@ -1925,7 +2048,7 @@
           <w:p>
             <w:pPr>
               <w:pStyle w:val="Compact"/>
-              <w:jc w:val="left"/>
+              <w:jc w:val="both"/>
             </w:pPr>
             <w:r>
               <w:t xml:space="preserve">Gemma 4 2B</w:t>
@@ -1937,7 +2060,7 @@
           <w:p>
             <w:pPr>
               <w:pStyle w:val="Compact"/>
-              <w:jc w:val="left"/>
+              <w:jc w:val="both"/>
             </w:pPr>
             <w:r>
               <w:t xml:space="preserve">2B</w:t>
@@ -1949,7 +2072,7 @@
           <w:p>
             <w:pPr>
               <w:pStyle w:val="Compact"/>
-              <w:jc w:val="left"/>
+              <w:jc w:val="both"/>
             </w:pPr>
             <w:r>
               <w:t xml:space="preserve">0,76</w:t>
@@ -1961,7 +2084,7 @@
           <w:p>
             <w:pPr>
               <w:pStyle w:val="Compact"/>
-              <w:jc w:val="left"/>
+              <w:jc w:val="both"/>
             </w:pPr>
             <w:r>
               <w:t xml:space="preserve">768</w:t>
@@ -1973,7 +2096,7 @@
           <w:p>
             <w:pPr>
               <w:pStyle w:val="Compact"/>
-              <w:jc w:val="left"/>
+              <w:jc w:val="both"/>
             </w:pPr>
             <w:r>
               <w:t xml:space="preserve">3,4 s</w:t>
@@ -1987,7 +2110,7 @@
           <w:p>
             <w:pPr>
               <w:pStyle w:val="Compact"/>
-              <w:jc w:val="left"/>
+              <w:jc w:val="both"/>
             </w:pPr>
             <w:r>
               <w:t xml:space="preserve">Gemma 4 12B</w:t>
@@ -1999,7 +2122,7 @@
           <w:p>
             <w:pPr>
               <w:pStyle w:val="Compact"/>
-              <w:jc w:val="left"/>
+              <w:jc w:val="both"/>
             </w:pPr>
             <w:r>
               <w:t xml:space="preserve">12B</w:t>
@@ -2011,7 +2134,7 @@
           <w:p>
             <w:pPr>
               <w:pStyle w:val="Compact"/>
-              <w:jc w:val="left"/>
+              <w:jc w:val="both"/>
             </w:pPr>
             <w:r>
               <w:t xml:space="preserve">0,74</w:t>
@@ -2023,7 +2146,7 @@
           <w:p>
             <w:pPr>
               <w:pStyle w:val="Compact"/>
-              <w:jc w:val="left"/>
+              <w:jc w:val="both"/>
             </w:pPr>
             <w:r>
               <w:t xml:space="preserve">374</w:t>
@@ -2035,7 +2158,7 @@
           <w:p>
             <w:pPr>
               <w:pStyle w:val="Compact"/>
-              <w:jc w:val="left"/>
+              <w:jc w:val="both"/>
             </w:pPr>
             <w:r>
               <w:t xml:space="preserve">12,3 s</w:t>
@@ -2049,7 +2172,7 @@
           <w:p>
             <w:pPr>
               <w:pStyle w:val="Compact"/>
-              <w:jc w:val="left"/>
+              <w:jc w:val="both"/>
             </w:pPr>
             <w:r>
               <w:t xml:space="preserve">DeepSeek-R1-Distill 8B</w:t>
@@ -2061,7 +2184,7 @@
           <w:p>
             <w:pPr>
               <w:pStyle w:val="Compact"/>
-              <w:jc w:val="left"/>
+              <w:jc w:val="both"/>
             </w:pPr>
             <w:r>
               <w:t xml:space="preserve">8B</w:t>
@@ -2073,7 +2196,7 @@
           <w:p>
             <w:pPr>
               <w:pStyle w:val="Compact"/>
-              <w:jc w:val="left"/>
+              <w:jc w:val="both"/>
             </w:pPr>
             <w:r>
               <w:t xml:space="preserve">0,62</w:t>
@@ -2085,7 +2208,7 @@
           <w:p>
             <w:pPr>
               <w:pStyle w:val="Compact"/>
-              <w:jc w:val="left"/>
+              <w:jc w:val="both"/>
             </w:pPr>
             <w:r>
               <w:t xml:space="preserve">555</w:t>
@@ -2097,7 +2220,7 @@
           <w:p>
             <w:pPr>
               <w:pStyle w:val="Compact"/>
-              <w:jc w:val="left"/>
+              <w:jc w:val="both"/>
             </w:pPr>
             <w:r>
               <w:t xml:space="preserve">7,9 s</w:t>
@@ -2111,7 +2234,7 @@
           <w:p>
             <w:pPr>
               <w:pStyle w:val="Compact"/>
-              <w:jc w:val="left"/>
+              <w:jc w:val="both"/>
             </w:pPr>
             <w:r>
               <w:t xml:space="preserve">Qwen 3.5 9B</w:t>
@@ -2123,7 +2246,7 @@
           <w:p>
             <w:pPr>
               <w:pStyle w:val="Compact"/>
-              <w:jc w:val="left"/>
+              <w:jc w:val="both"/>
             </w:pPr>
             <w:r>
               <w:t xml:space="preserve">9B</w:t>
@@ -2135,7 +2258,7 @@
           <w:p>
             <w:pPr>
               <w:pStyle w:val="Compact"/>
-              <w:jc w:val="left"/>
+              <w:jc w:val="both"/>
             </w:pPr>
             <w:r>
               <w:t xml:space="preserve">0,45</w:t>
@@ -2147,7 +2270,7 @@
           <w:p>
             <w:pPr>
               <w:pStyle w:val="Compact"/>
-              <w:jc w:val="left"/>
+              <w:jc w:val="both"/>
             </w:pPr>
             <w:r>
               <w:t xml:space="preserve">186</w:t>
@@ -2159,7 +2282,7 @@
           <w:p>
             <w:pPr>
               <w:pStyle w:val="Compact"/>
-              <w:jc w:val="left"/>
+              <w:jc w:val="both"/>
             </w:pPr>
             <w:r>
               <w:t xml:space="preserve">11,3 s</w:t>
@@ -2171,6 +2294,7 @@
     <w:p>
       <w:pPr>
         <w:pStyle w:val="BodyText"/>
+        <w:jc w:val="both"/>
       </w:pPr>
       <w:r>
         <w:t xml:space="preserve">Tutti i modelli hanno mantenuto piena affidabilità di connessione lungo l’intero flusso. Gemma 4 4B ha ottenuto la qualità più alta (0,83), rispettando la sequenza prestabilita e fornendo interpretazioni coerenti con i punteggi in nove degli undici passi, a fronte di una velocità di generazione (472 token/s) e di un TTFT (4,5 s) adeguati all’uso interattivo. Gemma 4 12B, pur completo nella profondità d’analisi, ha registrato un TTFT sensibilmente superiore (12,3 s); DeepSeek-R1-Distill 8B ha alternato risposte eccellenti e scadenti a seconda del passo, mentre Qwen 3.5 9B ha riportato la qualità più bassa (0,45) nonostante il maggior numero di parametri. Sulla base di questo equilibrio tra qualità, velocità e sostenibilità computazionale, Gemma 4 4B è stato selezionato per l’istanza CB-SBS.</w:t>
@@ -2183,12 +2307,16 @@
         <w:pStyle w:val="Heading3"/>
       </w:pPr>
       <w:r>
+        <w:rPr>
+          <w:color w:val="000000"/>
+        </w:rPr>
         <w:t xml:space="preserve">4.2 Esperienza utente</w:t>
       </w:r>
     </w:p>
     <w:p>
       <w:pPr>
         <w:pStyle w:val="FirstParagraph"/>
+        <w:jc w:val="both"/>
       </w:pPr>
       <w:r>
         <w:t xml:space="preserve">La versione CB-SBS presenta valutazioni tendenzialmente superiori alla precedente in 9 dimensioni su 10. Dei 27 partecipanti della versione CB-C, 16 hanno fornito valutazioni numeriche e 11 solo commenti aperti; per CB-SBS è stato escluso un record di test, portando il numeratore a 6. La tabella seguente confronta le medie delle due versioni.</w:t>
@@ -2216,7 +2344,7 @@
           <w:p>
             <w:pPr>
               <w:pStyle w:val="Compact"/>
-              <w:jc w:val="left"/>
+              <w:jc w:val="both"/>
             </w:pPr>
             <w:r>
               <w:t xml:space="preserve">Dimensione</w:t>
@@ -2228,7 +2356,7 @@
           <w:p>
             <w:pPr>
               <w:pStyle w:val="Compact"/>
-              <w:jc w:val="left"/>
+              <w:jc w:val="both"/>
             </w:pPr>
             <w:r>
               <w:t xml:space="preserve">CB-SBS (n=6)</w:t>
@@ -2240,7 +2368,7 @@
           <w:p>
             <w:pPr>
               <w:pStyle w:val="Compact"/>
-              <w:jc w:val="left"/>
+              <w:jc w:val="both"/>
             </w:pPr>
             <w:r>
               <w:t xml:space="preserve">CB-C (n=16)</w:t>
@@ -2252,7 +2380,7 @@
           <w:p>
             <w:pPr>
               <w:pStyle w:val="Compact"/>
-              <w:jc w:val="left"/>
+              <w:jc w:val="both"/>
             </w:pPr>
             <w:r>
               <w:t xml:space="preserve">Δ</w:t>
@@ -2266,7 +2394,7 @@
           <w:p>
             <w:pPr>
               <w:pStyle w:val="Compact"/>
-              <w:jc w:val="left"/>
+              <w:jc w:val="both"/>
             </w:pPr>
             <w:r>
               <w:t xml:space="preserve">Facilità d’uso</w:t>
@@ -2278,7 +2406,7 @@
           <w:p>
             <w:pPr>
               <w:pStyle w:val="Compact"/>
-              <w:jc w:val="left"/>
+              <w:jc w:val="both"/>
             </w:pPr>
             <w:r>
               <w:t xml:space="preserve">4,17</w:t>
@@ -2290,7 +2418,7 @@
           <w:p>
             <w:pPr>
               <w:pStyle w:val="Compact"/>
-              <w:jc w:val="left"/>
+              <w:jc w:val="both"/>
             </w:pPr>
             <w:r>
               <w:t xml:space="preserve">3,38</w:t>
@@ -2302,7 +2430,7 @@
           <w:p>
             <w:pPr>
               <w:pStyle w:val="Compact"/>
-              <w:jc w:val="left"/>
+              <w:jc w:val="both"/>
             </w:pPr>
             <w:r>
               <w:t xml:space="preserve">+0,79</w:t>
@@ -2316,7 +2444,7 @@
           <w:p>
             <w:pPr>
               <w:pStyle w:val="Compact"/>
-              <w:jc w:val="left"/>
+              <w:jc w:val="both"/>
             </w:pPr>
             <w:r>
               <w:t xml:space="preserve">Pertinenza delle risposte</w:t>
@@ -2328,7 +2456,7 @@
           <w:p>
             <w:pPr>
               <w:pStyle w:val="Compact"/>
-              <w:jc w:val="left"/>
+              <w:jc w:val="both"/>
             </w:pPr>
             <w:r>
               <w:t xml:space="preserve">4,17</w:t>
@@ -2340,7 +2468,7 @@
           <w:p>
             <w:pPr>
               <w:pStyle w:val="Compact"/>
-              <w:jc w:val="left"/>
+              <w:jc w:val="both"/>
             </w:pPr>
             <w:r>
               <w:t xml:space="preserve">3,56</w:t>
@@ -2352,7 +2480,7 @@
           <w:p>
             <w:pPr>
               <w:pStyle w:val="Compact"/>
-              <w:jc w:val="left"/>
+              <w:jc w:val="both"/>
             </w:pPr>
             <w:r>
               <w:t xml:space="preserve">+0,60</w:t>
@@ -2366,7 +2494,7 @@
           <w:p>
             <w:pPr>
               <w:pStyle w:val="Compact"/>
-              <w:jc w:val="left"/>
+              <w:jc w:val="both"/>
             </w:pPr>
             <w:r>
               <w:t xml:space="preserve">Fiducia nelle informazioni</w:t>
@@ -2378,7 +2506,7 @@
           <w:p>
             <w:pPr>
               <w:pStyle w:val="Compact"/>
-              <w:jc w:val="left"/>
+              <w:jc w:val="both"/>
             </w:pPr>
             <w:r>
               <w:t xml:space="preserve">3,83</w:t>
@@ -2390,7 +2518,7 @@
           <w:p>
             <w:pPr>
               <w:pStyle w:val="Compact"/>
-              <w:jc w:val="left"/>
+              <w:jc w:val="both"/>
             </w:pPr>
             <w:r>
               <w:t xml:space="preserve">3,19</w:t>
@@ -2402,7 +2530,7 @@
           <w:p>
             <w:pPr>
               <w:pStyle w:val="Compact"/>
-              <w:jc w:val="left"/>
+              <w:jc w:val="both"/>
             </w:pPr>
             <w:r>
               <w:t xml:space="preserve">+0,65</w:t>
@@ -2416,7 +2544,7 @@
           <w:p>
             <w:pPr>
               <w:pStyle w:val="Compact"/>
-              <w:jc w:val="left"/>
+              <w:jc w:val="both"/>
             </w:pPr>
             <w:r>
               <w:t xml:space="preserve">Coinvolgimento</w:t>
@@ -2428,7 +2556,7 @@
           <w:p>
             <w:pPr>
               <w:pStyle w:val="Compact"/>
-              <w:jc w:val="left"/>
+              <w:jc w:val="both"/>
             </w:pPr>
             <w:r>
               <w:t xml:space="preserve">3,67</w:t>
@@ -2440,7 +2568,7 @@
           <w:p>
             <w:pPr>
               <w:pStyle w:val="Compact"/>
-              <w:jc w:val="left"/>
+              <w:jc w:val="both"/>
             </w:pPr>
             <w:r>
               <w:t xml:space="preserve">3,06</w:t>
@@ -2452,7 +2580,7 @@
           <w:p>
             <w:pPr>
               <w:pStyle w:val="Compact"/>
-              <w:jc w:val="left"/>
+              <w:jc w:val="both"/>
             </w:pPr>
             <w:r>
               <w:t xml:space="preserve">+0,60</w:t>
@@ -2466,7 +2594,7 @@
           <w:p>
             <w:pPr>
               <w:pStyle w:val="Compact"/>
-              <w:jc w:val="left"/>
+              <w:jc w:val="both"/>
             </w:pPr>
             <w:r>
               <w:t xml:space="preserve">Capacità di stimolare la riflessione</w:t>
@@ -2478,7 +2606,7 @@
           <w:p>
             <w:pPr>
               <w:pStyle w:val="Compact"/>
-              <w:jc w:val="left"/>
+              <w:jc w:val="both"/>
             </w:pPr>
             <w:r>
               <w:t xml:space="preserve">3,83</w:t>
@@ -2490,7 +2618,7 @@
           <w:p>
             <w:pPr>
               <w:pStyle w:val="Compact"/>
-              <w:jc w:val="left"/>
+              <w:jc w:val="both"/>
             </w:pPr>
             <w:r>
               <w:t xml:space="preserve">3,25</w:t>
@@ -2502,7 +2630,7 @@
           <w:p>
             <w:pPr>
               <w:pStyle w:val="Compact"/>
-              <w:jc w:val="left"/>
+              <w:jc w:val="both"/>
             </w:pPr>
             <w:r>
               <w:t xml:space="preserve">+0,58</w:t>
@@ -2516,7 +2644,7 @@
           <w:p>
             <w:pPr>
               <w:pStyle w:val="Compact"/>
-              <w:jc w:val="left"/>
+              <w:jc w:val="both"/>
             </w:pPr>
             <w:r>
               <w:t xml:space="preserve">Chiarezza</w:t>
@@ -2528,7 +2656,7 @@
           <w:p>
             <w:pPr>
               <w:pStyle w:val="Compact"/>
-              <w:jc w:val="left"/>
+              <w:jc w:val="both"/>
             </w:pPr>
             <w:r>
               <w:t xml:space="preserve">4,00</w:t>
@@ -2540,7 +2668,7 @@
           <w:p>
             <w:pPr>
               <w:pStyle w:val="Compact"/>
-              <w:jc w:val="left"/>
+              <w:jc w:val="both"/>
             </w:pPr>
             <w:r>
               <w:t xml:space="preserve">3,69</w:t>
@@ -2552,7 +2680,7 @@
           <w:p>
             <w:pPr>
               <w:pStyle w:val="Compact"/>
-              <w:jc w:val="left"/>
+              <w:jc w:val="both"/>
             </w:pPr>
             <w:r>
               <w:t xml:space="preserve">+0,31</w:t>
@@ -2566,7 +2694,7 @@
           <w:p>
             <w:pPr>
               <w:pStyle w:val="Compact"/>
-              <w:jc w:val="left"/>
+              <w:jc w:val="both"/>
             </w:pPr>
             <w:r>
               <w:t xml:space="preserve">Velocità di risposta</w:t>
@@ -2578,7 +2706,7 @@
           <w:p>
             <w:pPr>
               <w:pStyle w:val="Compact"/>
-              <w:jc w:val="left"/>
+              <w:jc w:val="both"/>
             </w:pPr>
             <w:r>
               <w:t xml:space="preserve">3,83</w:t>
@@ -2590,7 +2718,7 @@
           <w:p>
             <w:pPr>
               <w:pStyle w:val="Compact"/>
-              <w:jc w:val="left"/>
+              <w:jc w:val="both"/>
             </w:pPr>
             <w:r>
               <w:t xml:space="preserve">3,44</w:t>
@@ -2602,7 +2730,7 @@
           <w:p>
             <w:pPr>
               <w:pStyle w:val="Compact"/>
-              <w:jc w:val="left"/>
+              <w:jc w:val="both"/>
             </w:pPr>
             <w:r>
               <w:t xml:space="preserve">+0,40</w:t>
@@ -2616,7 +2744,7 @@
           <w:p>
             <w:pPr>
               <w:pStyle w:val="Compact"/>
-              <w:jc w:val="left"/>
+              <w:jc w:val="both"/>
             </w:pPr>
             <w:r>
               <w:t xml:space="preserve">Dettaglio delle risposte</w:t>
@@ -2628,7 +2756,7 @@
           <w:p>
             <w:pPr>
               <w:pStyle w:val="Compact"/>
-              <w:jc w:val="left"/>
+              <w:jc w:val="both"/>
             </w:pPr>
             <w:r>
               <w:t xml:space="preserve">3,67</w:t>
@@ -2640,7 +2768,7 @@
           <w:p>
             <w:pPr>
               <w:pStyle w:val="Compact"/>
-              <w:jc w:val="left"/>
+              <w:jc w:val="both"/>
             </w:pPr>
             <w:r>
               <w:t xml:space="preserve">3,56</w:t>
@@ -2652,7 +2780,7 @@
           <w:p>
             <w:pPr>
               <w:pStyle w:val="Compact"/>
-              <w:jc w:val="left"/>
+              <w:jc w:val="both"/>
             </w:pPr>
             <w:r>
               <w:t xml:space="preserve">+0,10</w:t>
@@ -2666,7 +2794,7 @@
           <w:p>
             <w:pPr>
               <w:pStyle w:val="Compact"/>
-              <w:jc w:val="left"/>
+              <w:jc w:val="both"/>
             </w:pPr>
             <w:r>
               <w:t xml:space="preserve">Utilità percepita</w:t>
@@ -2678,7 +2806,7 @@
           <w:p>
             <w:pPr>
               <w:pStyle w:val="Compact"/>
-              <w:jc w:val="left"/>
+              <w:jc w:val="both"/>
             </w:pPr>
             <w:r>
               <w:t xml:space="preserve">3,17</w:t>
@@ -2690,7 +2818,7 @@
           <w:p>
             <w:pPr>
               <w:pStyle w:val="Compact"/>
-              <w:jc w:val="left"/>
+              <w:jc w:val="both"/>
             </w:pPr>
             <w:r>
               <w:t xml:space="preserve">3,31</w:t>
@@ -2702,7 +2830,7 @@
           <w:p>
             <w:pPr>
               <w:pStyle w:val="Compact"/>
-              <w:jc w:val="left"/>
+              <w:jc w:val="both"/>
             </w:pPr>
             <w:r>
               <w:t xml:space="preserve">−0,15</w:t>
@@ -2716,7 +2844,7 @@
           <w:p>
             <w:pPr>
               <w:pStyle w:val="Compact"/>
-              <w:jc w:val="left"/>
+              <w:jc w:val="both"/>
             </w:pPr>
             <w:r>
               <w:t xml:space="preserve">Intenzione di riutilizzo</w:t>
@@ -2728,7 +2856,7 @@
           <w:p>
             <w:pPr>
               <w:pStyle w:val="Compact"/>
-              <w:jc w:val="left"/>
+              <w:jc w:val="both"/>
             </w:pPr>
             <w:r>
               <w:t xml:space="preserve">3,83</w:t>
@@ -2740,7 +2868,7 @@
           <w:p>
             <w:pPr>
               <w:pStyle w:val="Compact"/>
-              <w:jc w:val="left"/>
+              <w:jc w:val="both"/>
             </w:pPr>
             <w:r>
               <w:t xml:space="preserve">3,12</w:t>
@@ -2752,7 +2880,7 @@
           <w:p>
             <w:pPr>
               <w:pStyle w:val="Compact"/>
-              <w:jc w:val="left"/>
+              <w:jc w:val="both"/>
             </w:pPr>
             <w:r>
               <w:t xml:space="preserve">+0,71</w:t>
@@ -2764,6 +2892,7 @@
     <w:p>
       <w:pPr>
         <w:pStyle w:val="BodyText"/>
+        <w:jc w:val="both"/>
       </w:pPr>
       <w:r>
         <w:t xml:space="preserve">I miglioramenti più marcati riguardano facilità d’uso (Δ = +0,79), intenzione di riutilizzo (Δ = +0,71) e fiducia (Δ = +0,65); l’unica dimensione sostanzialmente invariata è l’utilità percepita (Δ = −0,15, entro il range di variabilità atteso per campioni ridotti).</w:t>
@@ -2776,12 +2905,16 @@
         <w:pStyle w:val="Heading3"/>
       </w:pPr>
       <w:r>
+        <w:rPr>
+          <w:color w:val="000000"/>
+        </w:rPr>
         <w:t xml:space="preserve">4.3 Risposte aperte</w:t>
       </w:r>
     </w:p>
     <w:p>
       <w:pPr>
         <w:pStyle w:val="FirstParagraph"/>
+        <w:jc w:val="both"/>
       </w:pPr>
       <w:r>
         <w:t xml:space="preserve">Undici partecipanti hanno fornito risposte alle domande aperte (tutti della versione CB-C). Dall’analisi tematica emergono quattro aree di criticità.</w:t>
@@ -2790,6 +2923,7 @@
     <w:p>
       <w:pPr>
         <w:pStyle w:val="BodyText"/>
+        <w:jc w:val="both"/>
       </w:pPr>
       <w:r>
         <w:t xml:space="preserve">Inserimento dati. (i) Tre partecipanti segnalano difficoltà nel caricamento dei punteggi: «mi ha chiesto di fare una cosa che avevo appena fatto», «inserirli 1 per 1 in chat è stato scomodo», con la richiesta esplicita di poter caricare un PDF per evitare errori di digitazione.</w:t>
@@ -2798,6 +2932,7 @@
     <w:p>
       <w:pPr>
         <w:pStyle w:val="BodyText"/>
+        <w:jc w:val="both"/>
       </w:pPr>
       <w:r>
         <w:t xml:space="preserve">Coerenza della memoria di sessione. (ii) Un partecipante riporta «incongruenze molto grandi tra i dati forniti e i riassunti finali» nella prima analisi, pur riconoscendo che una seconda analisi era più coerente.</w:t>
@@ -2806,6 +2941,7 @@
     <w:p>
       <w:pPr>
         <w:pStyle w:val="BodyText"/>
+        <w:jc w:val="both"/>
       </w:pPr>
       <w:r>
         <w:t xml:space="preserve">Completezza del contesto. (iii) Un partecipante osserva che il</w:t>
@@ -2830,6 +2966,7 @@
     <w:p>
       <w:pPr>
         <w:pStyle w:val="BodyText"/>
+        <w:jc w:val="both"/>
       </w:pPr>
       <w:r>
         <w:t xml:space="preserve">Lunghezza delle risposte. (iv) Un partecipante suggerisce di «sintetizzare le risposte».</w:t>
@@ -2838,6 +2975,7 @@
     <w:p>
       <w:pPr>
         <w:pStyle w:val="BodyText"/>
+        <w:jc w:val="both"/>
       </w:pPr>
       <w:r>
         <w:t xml:space="preserve">Sei partecipanti hanno espresso valutazioni positive sulla chiarezza, la pertinenza e l’utilità del sistema, descrivendo l’esperienza come «positiva», «interessante» e «il</w:t>
@@ -2867,12 +3005,16 @@
         <w:pStyle w:val="Heading2"/>
       </w:pPr>
       <w:r>
+        <w:rPr>
+          <w:color w:val="000000"/>
+        </w:rPr>
         <w:t xml:space="preserve">5. Discussione</w:t>
       </w:r>
     </w:p>
     <w:p>
       <w:pPr>
         <w:pStyle w:val="FirstParagraph"/>
+        <w:jc w:val="both"/>
       </w:pPr>
       <w:r>
         <w:t xml:space="preserve">I risultati presentati in §4 indicano una tendenza favorevole alla versione CB-SBS rispetto alla CB-C. Le criticità emerse dalle risposte aperte della versione CB-C — inserimento manuale dei dati e coerenza delle analisi — trovano riscontro nei punteggi più alti registrati da CB-SBS in facilità d’uso e fiducia; la loro risoluzione conferma che le scelte progettuali hanno prodotto un effetto positivo sull’esperienza utente. Rimane da verificare, su un campione più ampio, se anche le altre dimensioni — in particolare l’utilità percepita, sostanzialmente invariata — possano beneficiare delle stesse modifiche.</w:t>
@@ -2881,6 +3023,7 @@
     <w:p>
       <w:pPr>
         <w:pStyle w:val="BodyText"/>
+        <w:jc w:val="both"/>
       </w:pPr>
       <w:r>
         <w:t xml:space="preserve">Sul piano più generale, l’architettura ibrida di Counselorbot — che combina passi guidati deterministici con la flessibilità di un LLM — si dimostra praticabile per la riflessione assistita delle competenze strategiche. La possibilità di istruire il modello con direttive specifiche e di richiamare conoscenze contestuali apre la strada a forme di accompagnamento scalabili che la letteratura indica come ancora poco coperte (Wollny et al., 2021; Liu et al., 2025). Quanto alla sostenibilità economica, l’impiego di modelli aperti di dimensioni contenute, eseguibili anche su infrastrutture locali — come Gemma 4 4B, selezionato tramite benchmark sistematico per l’istanza CB-SBS — indica una via percorribile per contenere i costi di esercizio.</w:t>
@@ -2893,12 +3036,16 @@
         <w:pStyle w:val="Heading2"/>
       </w:pPr>
       <w:r>
+        <w:rPr>
+          <w:color w:val="000000"/>
+        </w:rPr>
         <w:t xml:space="preserve">6. Conclusioni</w:t>
       </w:r>
     </w:p>
     <w:p>
       <w:pPr>
         <w:pStyle w:val="FirstParagraph"/>
+        <w:jc w:val="both"/>
       </w:pPr>
       <w:r>
         <w:t xml:space="preserve">Rispondendo alla prima domanda di ricerca (D1), i risultati indicano che è possibile realizzare un</w:t>
@@ -2923,6 +3070,7 @@
     <w:p>
       <w:pPr>
         <w:pStyle w:val="BodyText"/>
+        <w:jc w:val="both"/>
       </w:pPr>
       <w:r>
         <w:t xml:space="preserve">I risultati vanno tuttavia interpretati alla luce dei limiti dello studio. Il presente lavoro si colloca nella fase di test del modello ADDIE (Branch, 2009): i dati raccolti informano il ciclo iterativo di sviluppo più che costituire una validazione conclusiva. Il campione è ridotto (n=6 per CB-SBS, n=16 per CB-C con dati numerici) e non probabilistico; la differenza tra le due versioni potrebbe risentire di fattori confondenti, quali la diversa composizione demografica o la maturità del percorso di sviluppo. Il dato disponibile è inoltre esclusivamente basato sulle valutazione degli studenti, che potrebbe risentire di effetti di desiderabilità sociale; restano da acquisire metriche oggettive — quali tempi di risposta e tassi di completamento — per una valutazione più completa. Per queste ragioni, i risultati vanno letti come indicatori di tendenza, non come evidenza definitiva.</w:t>
@@ -2931,6 +3079,7 @@
     <w:p>
       <w:pPr>
         <w:pStyle w:val="BodyText"/>
+        <w:jc w:val="both"/>
       </w:pPr>
       <w:r>
         <w:t xml:space="preserve">Per quanto riguarda lo sviluppo futuro, le direzioni di lavoro possono essere articolate su tre orizzonti temporali. A breve termine, l’obiettivo è consolidare l’affidabilità del percorso guidato sul QSA ed estendere la sperimentazione agli altri strumenti del sistema — QSAr, ZTPI, intervista di Savickas, QPCS, QPCC e QAP — per verificarne l’efficacia su un ventaglio più ampio di costrutti e utenti. Parallelamente, i dati raccolti durante le interazioni, opportunamente anonimizzati, potranno essere impiegati per un affinamento (</w:t>
@@ -2949,6 +3098,7 @@
     <w:p>
       <w:pPr>
         <w:pStyle w:val="BodyText"/>
+        <w:jc w:val="both"/>
       </w:pPr>
       <w:r>
         <w:t xml:space="preserve">A medio termine, lo sviluppo riguarda la possibilità di rendere Counselorbot multilingue, così da ampliarne l’accessibilità in contesti educativi internazionali. Tale evoluzione richiede non solo la traduzione dell’interfaccia e delle istruzioni del sistema, ma anche la disponibilità di versioni validate degli strumenti del portale</w:t>
@@ -2973,6 +3123,7 @@
     <w:p>
       <w:pPr>
         <w:pStyle w:val="BodyText"/>
+        <w:jc w:val="both"/>
       </w:pPr>
       <w:r>
         <w:t xml:space="preserve">A lungo termine, si prospettano studi longitudinali per valutare l’impatto del sistema sulle strategie di apprendimento, sui processi di riflessione assistita e sulle capacità di orientamento degli studenti. Sarà inoltre necessario proseguire la valutazione con gruppi di utenti più ampi e differenziati, analizzando le modalità con cui studenti, tutor e orientatori possono integrare lo strumento nelle rispettive pratiche. Infine, bisognerà tenere sempre sotto osservazione l’evoluzione dei modelli con meno di 15 miliardi di parametri — soglia che ha orientato la selezione per l’infrastruttura locale. Tale evoluzione amplia continuamente lo spazio delle opzioni disponibili. A titolo esemplificativo, Gemma 4 12B (Gemma Team, 2025) non era ancora disponibile al momento della valutazione e, una volta testato, potrebbe rivelarsi un candidato interessante per le future iterazioni del sistema.</w:t>
@@ -2985,12 +3136,16 @@
         <w:pStyle w:val="Heading2"/>
       </w:pPr>
       <w:r>
+        <w:rPr>
+          <w:color w:val="000000"/>
+        </w:rPr>
         <w:t xml:space="preserve">Bibliografia</w:t>
       </w:r>
     </w:p>
     <w:p>
       <w:pPr>
         <w:pStyle w:val="FirstParagraph"/>
+        <w:jc w:val="both"/>
       </w:pPr>
       <w:r>
         <w:t xml:space="preserve">Gemma Team, Google DeepMind. (2025). Gemma 4: Advancing open language models. https://ai.google.dev/gemma</w:t>
@@ -2999,6 +3154,7 @@
     <w:p>
       <w:pPr>
         <w:pStyle w:val="BodyText"/>
+        <w:jc w:val="both"/>
       </w:pPr>
       <w:r>
         <w:t xml:space="preserve">Pellerey, M., Epifani, F., Grządziel, D., Margottini, M., &amp; Ottone, E. (2013).</w:t>
@@ -3020,6 +3176,7 @@
     <w:p>
       <w:pPr>
         <w:pStyle w:val="BodyText"/>
+        <w:jc w:val="both"/>
       </w:pPr>
       <w:r>
         <w:t xml:space="preserve">Puech, R., Mačina, J., Chatain, J., Sachan, M., &amp; Kapur, M. (2025). Towards the pedagogical steering of large language models for tutoring: A case study with modeling productive failure. In</w:t>
@@ -3041,6 +3198,7 @@
     <w:p>
       <w:pPr>
         <w:pStyle w:val="BodyText"/>
+        <w:jc w:val="both"/>
       </w:pPr>
       <w:r>
         <w:t xml:space="preserve">Antunes, L. G., Passarelli, B., &amp; Claro, S. V. (2025). Large language models as Socratic mentors: Transforming educational approaches for epistemic development.</w:t>
@@ -3062,6 +3220,7 @@
     <w:p>
       <w:pPr>
         <w:pStyle w:val="BodyText"/>
+        <w:jc w:val="both"/>
       </w:pPr>
       <w:r>
         <w:t xml:space="preserve">Bender, E. M., Gebru, T., McMillan-Major, A., &amp; Shmitchell, S. (2021). On the dangers of stochastic parrots: Can language models be too big? In</w:t>
@@ -3086,6 +3245,7 @@
     <w:p>
       <w:pPr>
         <w:pStyle w:val="BodyText"/>
+        <w:jc w:val="both"/>
       </w:pPr>
       <w:r>
         <w:t xml:space="preserve">Branch, R. M. (2009).</w:t>
@@ -3107,6 +3267,7 @@
     <w:p>
       <w:pPr>
         <w:pStyle w:val="BodyText"/>
+        <w:jc w:val="both"/>
       </w:pPr>
       <w:r>
         <w:t xml:space="preserve">Brown, T. B., Mann, B., Ryder, N., et al. (2020). Language models are few-shot learners.</w:t>
@@ -3128,6 +3289,7 @@
     <w:p>
       <w:pPr>
         <w:pStyle w:val="BodyText"/>
+        <w:jc w:val="both"/>
       </w:pPr>
       <w:r>
         <w:t xml:space="preserve">Chang, D. H., Lin, M. P.-C., Hajian, S., &amp; Wang, Q. Q. (2023). Educational design principles of using AI</w:t>
@@ -3165,6 +3327,7 @@
     <w:p>
       <w:pPr>
         <w:pStyle w:val="BodyText"/>
+        <w:jc w:val="both"/>
       </w:pPr>
       <w:r>
         <w:t xml:space="preserve">Cukurova, M., Luckin, R., &amp; Kent, C. (2020). Impact of an artificial intelligence research frame on the perceived credibility of educational research evidence.</w:t>
@@ -3186,6 +3349,7 @@
     <w:p>
       <w:pPr>
         <w:pStyle w:val="BodyText"/>
+        <w:jc w:val="both"/>
       </w:pPr>
       <w:r>
         <w:t xml:space="preserve">D’Silva, G. M., Jani, M., Jadhav, V., Bhoir, A., &amp; Amin, P. N. (2020). Career counselling</w:t>
@@ -3226,6 +3390,7 @@
     <w:p>
       <w:pPr>
         <w:pStyle w:val="BodyText"/>
+        <w:jc w:val="both"/>
       </w:pPr>
       <w:r>
         <w:t xml:space="preserve">Jemstedt, A., Bälter, O., Gavel, A., Glassey, R., &amp; Bosk, D. (2024). Less to produce and less to consume: The advantage of pure question-based learning.</w:t>
@@ -3247,6 +3412,7 @@
     <w:p>
       <w:pPr>
         <w:pStyle w:val="BodyText"/>
+        <w:jc w:val="both"/>
       </w:pPr>
       <w:r>
         <w:t xml:space="preserve">Kasneci, E., Seßler, K., Küchemann, S., et al. (2023). ChatGPT for good? On opportunities and challenges of large language models for education.</w:t>
@@ -3268,6 +3434,7 @@
     <w:p>
       <w:pPr>
         <w:pStyle w:val="BodyText"/>
+        <w:jc w:val="both"/>
       </w:pPr>
       <w:r>
         <w:t xml:space="preserve">Kuhail, M. A., Alturki, N., Alramlawi, S., &amp; Alhejori, K. (2022). Interacting with educational</w:t>
@@ -3302,6 +3469,7 @@
     <w:p>
       <w:pPr>
         <w:pStyle w:val="BodyText"/>
+        <w:jc w:val="both"/>
       </w:pPr>
       <w:r>
         <w:t xml:space="preserve">Lewis, P., Perez, E., Piktus, A., et al. (2020). Retrieval-Augmented Generation for knowledge-intensive NLP tasks.</w:t>
@@ -3323,6 +3491,7 @@
     <w:p>
       <w:pPr>
         <w:pStyle w:val="BodyText"/>
+        <w:jc w:val="both"/>
       </w:pPr>
       <w:r>
         <w:t xml:space="preserve">Liu, X., Xiao, Y., &amp; Li, D. (2025). Assessing strategic use of artificial intelligence in self-regulated learning: Instrument development and evidence from Chinese university students.</w:t>
@@ -3344,6 +3513,7 @@
     <w:p>
       <w:pPr>
         <w:pStyle w:val="BodyText"/>
+        <w:jc w:val="both"/>
       </w:pPr>
       <w:r>
         <w:t xml:space="preserve">Mendez, S., Johanson, K., Conley, V. M., et al. (2020).</w:t>
@@ -3378,6 +3548,7 @@
     <w:p>
       <w:pPr>
         <w:pStyle w:val="BodyText"/>
+        <w:jc w:val="both"/>
       </w:pPr>
       <w:r>
         <w:t xml:space="preserve">Neumann, A. T., Arndt, T., Köbis, L., et al. (2021).</w:t>
@@ -3412,6 +3583,7 @@
     <w:p>
       <w:pPr>
         <w:pStyle w:val="BodyText"/>
+        <w:jc w:val="both"/>
       </w:pPr>
       <w:r>
         <w:t xml:space="preserve">Savickas, M. L. (2018). The career construction interview. In</w:t>
@@ -3436,6 +3608,7 @@
     <w:p>
       <w:pPr>
         <w:pStyle w:val="BodyText"/>
+        <w:jc w:val="both"/>
       </w:pPr>
       <w:r>
         <w:t xml:space="preserve">Self, J. A. (1974). Student models in computer-aided instruction.</w:t>
@@ -3457,6 +3630,7 @@
     <w:p>
       <w:pPr>
         <w:pStyle w:val="BodyText"/>
+        <w:jc w:val="both"/>
       </w:pPr>
       <w:r>
         <w:t xml:space="preserve">Su, L. H., Truong, D.-H., Tran, T.-Y.-L., et al. (2020). Development of an AI</w:t>
@@ -3494,6 +3668,7 @@
     <w:p>
       <w:pPr>
         <w:pStyle w:val="BodyText"/>
+        <w:jc w:val="both"/>
       </w:pPr>
       <w:r>
         <w:t xml:space="preserve">Susnjak, T. (2023). Beyond predictive learning analytics modelling and onto explainable artificial intelligence with prescriptive analytics and ChatGPT.</w:t>
@@ -3515,6 +3690,7 @@
     <w:p>
       <w:pPr>
         <w:pStyle w:val="BodyText"/>
+        <w:jc w:val="both"/>
       </w:pPr>
       <w:r>
         <w:t xml:space="preserve">Tankelevitch, L., Kewenig, V., Simkute, A., et al. (2024). The metacognitive demands and opportunities of generative AI. In</w:t>
@@ -3539,6 +3715,7 @@
     <w:p>
       <w:pPr>
         <w:pStyle w:val="BodyText"/>
+        <w:jc w:val="both"/>
       </w:pPr>
       <w:r>
         <w:t xml:space="preserve">Weizenbaum, J. (1966). ELIZA—A computer program for the study of natural language communication between man and machine.</w:t>
@@ -3560,6 +3737,7 @@
     <w:p>
       <w:pPr>
         <w:pStyle w:val="BodyText"/>
+        <w:jc w:val="both"/>
       </w:pPr>
       <w:r>
         <w:t xml:space="preserve">Wollny, S., Schneider, J., Di Mitri, D., et al. (2021). Are we there yet? A systematic literature review on</w:t>
@@ -3594,6 +3772,7 @@
     <w:p>
       <w:pPr>
         <w:pStyle w:val="BodyText"/>
+        <w:jc w:val="both"/>
       </w:pPr>
       <w:r>
         <w:t xml:space="preserve">Zawacki-Richter, O., Marín, V. I., Bond, M., &amp; Gouverneur, F. (2019). Systematic review of research on artificial intelligence applications in higher education: Where are the educators?</w:t>
@@ -4091,6 +4270,7 @@
     <w:rsid w:val="00FC693F"/>
     <w:pPr>
       <w:spacing w:after="120" w:line="360" w:lineRule="auto"/>
+      <w:jc w:val="both"/>
     </w:pPr>
     <w:rPr>
       <w:rFonts w:ascii="Times New Roman" w:hAnsi="Times New Roman"/>
@@ -4110,6 +4290,7 @@
         <w:tab w:pos="9360" w:val="right"/>
       </w:tabs>
       <w:spacing w:after="0" w:line="240" w:lineRule="auto"/>
+      <w:jc w:val="both"/>
     </w:pPr>
     <w:rPr>
       <w:rFonts w:ascii="Times New Roman" w:hAnsi="Times New Roman"/>
@@ -4138,6 +4319,7 @@
         <w:tab w:pos="9360" w:val="right"/>
       </w:tabs>
       <w:spacing w:after="0" w:line="240" w:lineRule="auto"/>
+      <w:jc w:val="both"/>
     </w:pPr>
     <w:rPr>
       <w:rFonts w:ascii="Times New Roman" w:hAnsi="Times New Roman"/>
@@ -4173,6 +4355,7 @@
       <w:bCs/>
       <w:sz w:val="28"/>
       <w:szCs w:val="28"/>
+      <w:color w:val="000000"/>
     </w:rPr>
   </w:style>
   <w:style w:styleId="Heading2" w:type="paragraph">
@@ -4196,6 +4379,7 @@
       <w:bCs/>
       <w:sz w:val="26"/>
       <w:szCs w:val="26"/>
+      <w:color w:val="000000"/>
     </w:rPr>
   </w:style>
   <w:style w:styleId="Heading3" w:type="paragraph">
@@ -4218,6 +4402,7 @@
       <w:b/>
       <w:bCs/>
       <w:sz w:val="24"/>
+      <w:color w:val="000000"/>
     </w:rPr>
   </w:style>
   <w:style w:styleId="Heading4" w:type="paragraph">
@@ -4242,6 +4427,7 @@
       <w:bCs/>
       <w:i/>
       <w:iCs/>
+      <w:color w:val="000000"/>
     </w:rPr>
   </w:style>
   <w:style w:styleId="Heading5" w:type="paragraph">
@@ -4262,6 +4448,7 @@
     </w:pPr>
     <w:rPr>
       <w:rFonts w:ascii="Times New Roman" w:asciiTheme="majorHAnsi" w:cstheme="majorBidi" w:eastAsiaTheme="majorEastAsia" w:hAnsi="Times New Roman" w:hAnsiTheme="majorHAnsi"/>
+      <w:color w:val="000000"/>
     </w:rPr>
   </w:style>
   <w:style w:styleId="Heading6" w:type="paragraph">
@@ -4284,6 +4471,7 @@
       <w:rFonts w:ascii="Times New Roman" w:asciiTheme="majorHAnsi" w:cstheme="majorBidi" w:eastAsiaTheme="majorEastAsia" w:hAnsi="Times New Roman" w:hAnsiTheme="majorHAnsi"/>
       <w:i/>
       <w:iCs/>
+      <w:color w:val="000000"/>
     </w:rPr>
   </w:style>
   <w:style w:styleId="Heading7" w:type="paragraph">
@@ -4306,6 +4494,7 @@
       <w:rFonts w:ascii="Times New Roman" w:asciiTheme="majorHAnsi" w:cstheme="majorBidi" w:eastAsiaTheme="majorEastAsia" w:hAnsi="Times New Roman" w:hAnsiTheme="majorHAnsi"/>
       <w:i/>
       <w:iCs/>
+      <w:color w:val="000000"/>
     </w:rPr>
   </w:style>
   <w:style w:styleId="Heading8" w:type="paragraph">
@@ -4328,6 +4517,7 @@
       <w:rFonts w:ascii="Times New Roman" w:asciiTheme="majorHAnsi" w:cstheme="majorBidi" w:eastAsiaTheme="majorEastAsia" w:hAnsi="Times New Roman" w:hAnsiTheme="majorHAnsi"/>
       <w:sz w:val="20"/>
       <w:szCs w:val="20"/>
+      <w:color w:val="000000"/>
     </w:rPr>
   </w:style>
   <w:style w:styleId="Heading9" w:type="paragraph">
@@ -4352,6 +4542,7 @@
       <w:iCs/>
       <w:sz w:val="20"/>
       <w:szCs w:val="20"/>
+      <w:color w:val="000000"/>
     </w:rPr>
   </w:style>
   <w:style w:default="1" w:styleId="DefaultParagraphFont" w:type="character">
@@ -4397,6 +4588,7 @@
     <w:rsid w:val="00FC693F"/>
     <w:pPr>
       <w:spacing w:after="0" w:line="240" w:lineRule="auto"/>
+      <w:jc w:val="both"/>
     </w:pPr>
     <w:rPr>
       <w:rFonts w:ascii="Times New Roman" w:hAnsi="Times New Roman"/>
@@ -4463,6 +4655,7 @@
       <w:kern w:val="28"/>
       <w:sz w:val="52"/>
       <w:szCs w:val="52"/>
+      <w:color w:val="000000"/>
     </w:rPr>
   </w:style>
   <w:style w:customStyle="1" w:styleId="TitleChar" w:type="character">
@@ -4499,6 +4692,7 @@
       <w:spacing w:val="15"/>
       <w:sz w:val="24"/>
       <w:szCs w:val="24"/>
+      <w:color w:val="000000"/>
     </w:rPr>
   </w:style>
   <w:style w:customStyle="1" w:styleId="SubtitleChar" w:type="character">
@@ -4525,6 +4719,7 @@
     <w:pPr>
       <w:ind w:left="720"/>
       <w:contextualSpacing/>
+      <w:jc w:val="both"/>
     </w:pPr>
     <w:rPr>
       <w:rFonts w:ascii="Times New Roman" w:hAnsi="Times New Roman"/>
@@ -4539,6 +4734,7 @@
     <w:rsid w:val="00AA1D8D"/>
     <w:pPr>
       <w:spacing w:after="120"/>
+      <w:jc w:val="both"/>
     </w:pPr>
     <w:rPr>
       <w:rFonts w:ascii="Times New Roman" w:hAnsi="Times New Roman"/>
@@ -4563,6 +4759,7 @@
     <w:rsid w:val="00AA1D8D"/>
     <w:pPr>
       <w:spacing w:after="120" w:line="480" w:lineRule="auto"/>
+      <w:jc w:val="both"/>
     </w:pPr>
     <w:rPr>
       <w:rFonts w:ascii="Times New Roman" w:hAnsi="Times New Roman"/>
@@ -4587,6 +4784,7 @@
     <w:rsid w:val="00AA1D8D"/>
     <w:pPr>
       <w:spacing w:after="120"/>
+      <w:jc w:val="both"/>
     </w:pPr>
     <w:rPr>
       <w:rFonts w:ascii="Times New Roman" w:hAnsi="Times New Roman"/>
@@ -4615,6 +4813,7 @@
     <w:pPr>
       <w:ind w:hanging="360" w:left="360"/>
       <w:contextualSpacing/>
+      <w:jc w:val="both"/>
     </w:pPr>
     <w:rPr>
       <w:rFonts w:ascii="Times New Roman" w:hAnsi="Times New Roman"/>
@@ -4629,6 +4828,7 @@
     <w:pPr>
       <w:ind w:hanging="360" w:left="720"/>
       <w:contextualSpacing/>
+      <w:jc w:val="both"/>
     </w:pPr>
     <w:rPr>
       <w:rFonts w:ascii="Times New Roman" w:hAnsi="Times New Roman"/>
@@ -4643,6 +4843,7 @@
     <w:pPr>
       <w:ind w:hanging="360" w:left="1080"/>
       <w:contextualSpacing/>
+      <w:jc w:val="both"/>
     </w:pPr>
     <w:rPr>
       <w:rFonts w:ascii="Times New Roman" w:hAnsi="Times New Roman"/>
@@ -4659,6 +4860,7 @@
         <w:numId w:val="1"/>
       </w:numPr>
       <w:contextualSpacing/>
+      <w:jc w:val="both"/>
     </w:pPr>
     <w:rPr>
       <w:rFonts w:ascii="Times New Roman" w:hAnsi="Times New Roman"/>
@@ -4675,6 +4877,7 @@
         <w:numId w:val="2"/>
       </w:numPr>
       <w:contextualSpacing/>
+      <w:jc w:val="both"/>
     </w:pPr>
     <w:rPr>
       <w:rFonts w:ascii="Times New Roman" w:hAnsi="Times New Roman"/>
@@ -4691,6 +4894,7 @@
         <w:numId w:val="3"/>
       </w:numPr>
       <w:contextualSpacing/>
+      <w:jc w:val="both"/>
     </w:pPr>
     <w:rPr>
       <w:rFonts w:ascii="Times New Roman" w:hAnsi="Times New Roman"/>
@@ -4707,6 +4911,7 @@
         <w:numId w:val="5"/>
       </w:numPr>
       <w:contextualSpacing/>
+      <w:jc w:val="both"/>
     </w:pPr>
     <w:rPr>
       <w:rFonts w:ascii="Times New Roman" w:hAnsi="Times New Roman"/>
@@ -4723,6 +4928,7 @@
         <w:numId w:val="6"/>
       </w:numPr>
       <w:contextualSpacing/>
+      <w:jc w:val="both"/>
     </w:pPr>
     <w:rPr>
       <w:rFonts w:ascii="Times New Roman" w:hAnsi="Times New Roman"/>
@@ -4739,6 +4945,7 @@
         <w:numId w:val="7"/>
       </w:numPr>
       <w:contextualSpacing/>
+      <w:jc w:val="both"/>
     </w:pPr>
     <w:rPr>
       <w:rFonts w:ascii="Times New Roman" w:hAnsi="Times New Roman"/>
@@ -4754,6 +4961,7 @@
       <w:spacing w:after="120"/>
       <w:ind w:left="360"/>
       <w:contextualSpacing/>
+      <w:jc w:val="both"/>
     </w:pPr>
     <w:rPr>
       <w:rFonts w:ascii="Times New Roman" w:hAnsi="Times New Roman"/>
@@ -4769,6 +4977,7 @@
       <w:spacing w:after="120"/>
       <w:ind w:left="720"/>
       <w:contextualSpacing/>
+      <w:jc w:val="both"/>
     </w:pPr>
     <w:rPr>
       <w:rFonts w:ascii="Times New Roman" w:hAnsi="Times New Roman"/>
@@ -4784,6 +4993,7 @@
       <w:spacing w:after="120"/>
       <w:ind w:left="1080"/>
       <w:contextualSpacing/>
+      <w:jc w:val="both"/>
     </w:pPr>
     <w:rPr>
       <w:rFonts w:ascii="Times New Roman" w:hAnsi="Times New Roman"/>
@@ -4805,6 +5015,7 @@
         <w:tab w:pos="3456" w:val="left"/>
         <w:tab w:pos="4032" w:val="left"/>
       </w:tabs>
+      <w:jc w:val="both"/>
     </w:pPr>
     <w:rPr>
       <w:rFonts w:ascii="Times New Roman" w:hAnsi="Times New Roman"/>
@@ -4825,6 +5036,9 @@
     </w:rPr>
   </w:style>
   <w:style w:styleId="Quote" w:type="paragraph">
+    <w:pPr>
+      <w:jc w:val="both"/>
+    </w:pPr>
     <w:name w:val="Quote"/>
     <w:basedOn w:val="Normal"/>
     <w:next w:val="Normal"/>
@@ -4941,6 +5155,7 @@
     <w:rsid w:val="00FC693F"/>
     <w:pPr>
       <w:spacing w:line="240" w:lineRule="auto"/>
+      <w:jc w:val="both"/>
     </w:pPr>
     <w:rPr>
       <w:rFonts w:ascii="Times New Roman" w:hAnsi="Times New Roman"/>
@@ -4988,6 +5203,7 @@
       </w:pBdr>
       <w:spacing w:after="280" w:before="200"/>
       <w:ind w:left="936" w:right="936"/>
+      <w:jc w:val="both"/>
     </w:pPr>
     <w:rPr>
       <w:rFonts w:ascii="Times New Roman" w:hAnsi="Times New Roman"/>
@@ -5092,6 +5308,7 @@
     </w:pPr>
     <w:rPr>
       <w:rFonts w:ascii="Times New Roman" w:hAnsi="Times New Roman"/>
+      <w:color w:val="000000"/>
     </w:rPr>
   </w:style>
   <w:style w:styleId="TableGrid" w:type="table">
@@ -15962,6 +16179,7 @@
     <w:link w:val="VerbatimChar"/>
     <w:pPr>
       <w:wordWrap w:val="off"/>
+      <w:jc w:val="both"/>
     </w:pPr>
   </w:style>
   <w:style w:type="character" w:customStyle="1" w:styleId="KeywordTok">

</xml_diff>

<commit_message>
update: revise article version to v40 and update reference document
</commit_message>
<xml_diff>
--- a/articles/current.docx
+++ b/articles/current.docx
@@ -71,7 +71,7 @@
         <w:t xml:space="preserve"> </w:t>
       </w:r>
       <w:r>
-        <w:t xml:space="preserve">basato su LLM a supporto della riflessione assistita sui risultati dell’autovalutazione delle competenze strategiche degli studenti. Il lavoro descrive l’architettura ibrida del sistema — che combina passi guidati deterministici con la flessibilità di un LLM — e il framework delle competenze strategiche su cui si basa. La valutazione, condotta su 34 partecipanti confrontando due versioni (CB-SBS e CB-C), suggerisce tendenze positive in 9 dimensioni su 10, con incrementi in facilità d’uso (Δ = +0,79) e fiducia (Δ = +0,65). Il lavoro si colloca nella fase di test del modello ADDIE e discute limiti e direzioni di sviluppo.</w:t>
+        <w:t xml:space="preserve">basato su LLM a supporto della riflessione assistita sui risultati dell’autovalutazione delle competenze strategiche degli studenti. Il lavoro descrive l’architettura ibrida del sistema — che combina passi guidati deterministici con la flessibilità di un LLM — e il framework delle competenze strategiche su cui si basa. La valutazione, condotta su 34 partecipanti confrontando due versioni (CB-SBS e CB-C), suggerisce tendenze positive in 9 dimensioni su 10, con incrementi in facilità d’uso (Δ = +0,79) e fiducia (Δ = +0,65). Il lavoro si colloca nella fase di test del approccio ADDIE e discute limiti e direzioni di sviluppo.</w:t>
       </w:r>
     </w:p>
     <w:p>
@@ -89,7 +89,7 @@
         <w:jc w:val="both"/>
       </w:pPr>
       <w:r>
-        <w:t xml:space="preserve">This paper presents Counselorbot, an LLM-based conversational assistant supporting students’ assisted reflection on their strategic-competences self-assessment. The paper describes the hybrid architecture — combining deterministic guided steps with LLM flexibility — and the strategic competences framework it builds on. The evaluation, carried out on 34 participants comparing two versions (CB-SBS and CB-C), suggests positive trends in 9 out of 10 dimensions, with increases in ease of use (Δ = +0.79) and trust (Δ = +0.65). The study is positioned within the test phase of the ADDIE model and discusses limitations and future directions.</w:t>
+        <w:t xml:space="preserve">This paper presents Counselorbot, an LLM-based conversational assistant supporting students’ assisted reflection on their strategic-competences self-assessment. The paper describes the hybrid architecture — combining deterministic guided steps with LLM flexibility — and the strategic competences framework it builds on. The evaluation, carried out on 34 participants comparing two versions (CB-SBS and CB-C), suggests positive trends in 9 out of 10 dimensions, with increases in ease of use (Δ = +0.79) and trust (Δ = +0.65). The study is positioned within the test phase of the ADDIE approach and discusses limitations and future directions.</w:t>
       </w:r>
     </w:p>
     <w:p>
@@ -486,7 +486,7 @@
         <w:t xml:space="preserve"> </w:t>
       </w:r>
       <w:r>
-        <w:t xml:space="preserve">formativo (Kuhail et al., 2022; Wollny et al., 2021; Zawacki-Richter et al., 2019). Gli LLM, in particolare, possono essere condizionati nell’interazione tramite vincoli di alto livello noti come</w:t>
+        <w:t xml:space="preserve">formativo (Kuhail et al., 2022; Wollny et al., 2021; Zawacki-Richter et al., 2019; D’Silva et al., 2020; Mendez et al., 2020; Su et al., 2020). Gli LLM, in particolare, possono essere condizionati nell’interazione tramite vincoli di alto livello noti come</w:t>
       </w:r>
       <w:r>
         <w:t xml:space="preserve"> </w:t>
@@ -553,7 +553,7 @@
         <w:jc w:val="both"/>
       </w:pPr>
       <w:r>
-        <w:t xml:space="preserve">Tuttavia, è necessario che gli studenti sviluppino un senso critico verso l’AI che permetta loro di valutarne l’attendibilità e la pertinenza, al fine di integrare in modo proficuo questa interazione nel proprio percorso di apprendimento (Tankelevitch et al., 2024). Tale competenza assume particolare rilevanza, poiché le strategie di autovalutazione supportate dall’AI risultano ancora tra quelle meno conosciute dagli studenti (Liu et al., 2025).</w:t>
+        <w:t xml:space="preserve">Tuttavia, è necessario che gli studenti sviluppino un senso critico verso l’AI che permetta loro di valutarne l’attendibilità e la pertinenza, al fine di integrare in modo proficuo questa interazione nel proprio percorso di apprendimento (Tankelevitch et al., 2024; Susnjak, 2023). Tale competenza assume particolare rilevanza, poiché le strategie di autovalutazione supportate dall’AI risultano ancora tra quelle meno conosciute dagli studenti (Liu et al., 2025).</w:t>
       </w:r>
     </w:p>
     <w:bookmarkEnd w:id="22"/>
@@ -919,7 +919,7 @@
         <w:t xml:space="preserve"> </w:t>
       </w:r>
       <w:r>
-        <w:t xml:space="preserve">(PQBL; Jemstedt et al., 2024). L’interfaccia richiede il caricamento di un documento didattico in formato PDF. Il sistema trasforma il contenuto in un percorso interattivo fondato su domande e feedback, trasformando il testo da materiale di lettura passiva a base per un’attività nella quale l’utente recupera, rielabora e applica le informazioni.</w:t>
+        <w:t xml:space="preserve">(PQBL; Jemstedt et al., 2024; Puech et al., 2025). L’interfaccia richiede il caricamento di un documento didattico in formato PDF. Il sistema trasforma il contenuto in un percorso interattivo fondato su domande e feedback, trasformando il testo da materiale di lettura passiva a base per un’attività nella quale l’utente recupera, rielabora e applica le informazioni.</w:t>
       </w:r>
     </w:p>
     <w:p>
@@ -950,7 +950,7 @@
         <w:jc w:val="both"/>
       </w:pPr>
       <w:r>
-        <w:t xml:space="preserve">Il principio organizzativo centrale di Counselorbot è rappresentato dai passi guidati (</w:t>
+        <w:t xml:space="preserve">Il principio organizzativo centrale di Counselorbot è costituito dai passi guidati (</w:t>
       </w:r>
       <w:r>
         <w:rPr>
@@ -960,7 +960,7 @@
         <w:t xml:space="preserve">guided steps</w:t>
       </w:r>
       <w:r>
-        <w:t xml:space="preserve">), ossia sequenze predefinite che determinano l’ordine delle diverse fasi del dialogo. A ciascun passo è associato uno specifico meta-prompt, nel quale vengono definiti l’obiettivo della fase, le informazioni da prendere in considerazione e il tipo di risposta che il modello linguistico deve produrre. Questa struttura permette di affrontare sistematicamente tutti gli ambiti previsti dallo strumento selezionato, riducendo il rischio che alcune dimensioni vengano trascurate.</w:t>
+        <w:t xml:space="preserve">): sequenze predefinite che regolano l’ordine delle diverse fasi del dialogo. A ciascun passo è associato un meta-prompt, nel quale sono specificati l’obiettivo della fase, le informazioni da considerare e il tipo di risposta attesa dal modello linguistico. L’organizzazione per passi consente di coprire in modo sistematico gli ambiti previsti dallo strumento selezionato e riduce il rischio che alcune dimensioni restino escluse dall’interazione.</w:t>
       </w:r>
     </w:p>
     <w:p>
@@ -969,7 +969,7 @@
         <w:jc w:val="both"/>
       </w:pPr>
       <w:r>
-        <w:t xml:space="preserve">All’interno di ciascun passo, tuttavia, il modello linguistico mantiene la flessibilità necessaria per adattare il linguaggio, gli esempi, le domande e il livello di approfondimento alle risposte dell’utente. Counselorbot realizza così una modalità di interazione ibrida, nella quale il controllo deterministico del percorso si combina con l’adattività conversazionale dell’LLM. L’interfaccia conversazionale presenta progressivamente le domande, le interpretazioni e le strategie associate a ciascun passo. L’utente può chiedere chiarimenti, richiedere esempi o soffermarsi su uno specifico argomento prima di proseguire.</w:t>
+        <w:t xml:space="preserve">All’interno di ciascun passo, tuttavia, il modello linguistico conserva la flessibilità necessaria per adattare linguaggio, esempi, domande e livello di approfondimento alle risposte dell’utente. Counselorbot realizza così un’interazione ibrida, nella quale il controllo deterministico del percorso si combina con l’adattività conversazionale dell’LLM. L’interfaccia presenta progressivamente domande, interpretazioni e strategie associate alla fase corrente; l’utente può chiedere chiarimenti, richiedere esempi o soffermarsi su un argomento prima di proseguire.</w:t>
       </w:r>
     </w:p>
     <w:p>
@@ -978,7 +978,7 @@
         <w:jc w:val="both"/>
       </w:pPr>
       <w:r>
-        <w:t xml:space="preserve">Poiché gli strumenti integrati presentano caratteristiche differenti, il sistema non applica un unico flusso indistinto, ma adotta percorsi specifici per i questionari, per la</w:t>
+        <w:t xml:space="preserve">Poiché gli strumenti integrati presentano caratteristiche differenti, Counselorbot non applica un flusso unico, ma adotta percorsi specifici per i questionari, per la</w:t>
       </w:r>
       <w:r>
         <w:t xml:space="preserve"> </w:t>
@@ -994,20 +994,16 @@
         <w:t xml:space="preserve"> </w:t>
       </w:r>
       <w:r>
-        <w:t xml:space="preserve">e per il</w:t>
-      </w:r>
-      <w:r>
-        <w:t xml:space="preserve"> </w:t>
-      </w:r>
-      <w:r>
-        <w:rPr>
-          <w:iCs/>
-          <w:i/>
-        </w:rPr>
-        <w:t xml:space="preserve">Question-Based Learning</w:t>
-      </w:r>
-      <w:r>
-        <w:t xml:space="preserve">. Nel caso dei questionari QSA, QSAr e ZTPI, il percorso ha inizio con l’inserimento dei punteggi. Il sistema elabora quindi il profilo e ne presenta una prima visualizzazione grafica. Successivamente prende avvio l’analisi guidata dei risultati, durante la quale l’utente può approfondire liberamente ciascun fattore prima di passare al successivo. L’interpretazione dei questionari si sviluppa secondo due modalità complementari. La prima è analitica ed è dedicata all’esame progressivo dei singoli fattori. Per ciascuna dimensione, Counselorbot presenta il risultato, ne chiarisce il significato, formula eventuali domande di approfondimento e propone strategie personalizzate. La seconda modalità è sintetica e mette in relazione le diverse componenti del profilo, facendo emergere le connessioni tra aspetti cognitivi, metacognitivi, affettivi, motivazionali e volitivi. In questo modo, il sistema non si limita a restituire una serie di punteggi isolati, ma favorisce la costruzione di una rappresentazione unitaria del funzionamento dello studente. Al termine dell’analisi, Counselorbot propone una sintesi complessiva dei principali punti di forza, delle aree suscettibili di sviluppo e delle strategie emerse durante il dialogo. L’utente può quindi selezionare e salvare le indicazioni considerate maggiormente significative.</w:t>
+        <w:t xml:space="preserve">e per il PQBL. Nel caso di QSA, QSAr e ZTPI, il percorso inizia con l’inserimento dei punteggi: il sistema elabora il profilo, ne presenta una prima visualizzazione grafica e avvia l’analisi guidata dei risultati, durante la quale l’utente può approfondire ciascun fattore prima di passare al successivo.</w:t>
+      </w:r>
+    </w:p>
+    <w:p>
+      <w:pPr>
+        <w:pStyle w:val="BodyText"/>
+        <w:jc w:val="both"/>
+      </w:pPr>
+      <w:r>
+        <w:t xml:space="preserve">L’interpretazione dei questionari si sviluppa secondo due modalità complementari. La prima, analitica, esamina progressivamente i singoli fattori: per ciascuna dimensione, Counselorbot presenta il risultato, ne chiarisce il significato, formula eventuali domande di approfondimento e propone strategie personalizzate. La seconda, sintetica, mette in relazione le diverse componenti del profilo e fa emergere connessioni tra aspetti cognitivi, metacognitivi, affettivi, motivazionali e volitivi. In questo modo, il sistema non restituisce una serie di punteggi isolati, ma favorisce una rappresentazione unitaria del funzionamento dello studente. Al termine dell’analisi, Counselorbot propone una sintesi dei principali punti di forza, delle aree suscettibili di sviluppo e delle strategie emerse durante il dialogo, che l’utente può selezionare e salvare, contribuendo a costruire un modello aggiornabile del proprio percorso (Self, 1974).</w:t>
       </w:r>
     </w:p>
     <w:p>
@@ -1032,7 +1028,7 @@
         <w:t xml:space="preserve"> </w:t>
       </w:r>
       <w:r>
-        <w:t xml:space="preserve">segue invece un percorso qualitativo e narrativo. In questo modulo non vengono inseriti punteggi e non viene elaborato un profilo psicometrico. Il sistema presenta progressivamente le cinque domande previste dal protocollo, analizza le risposte dell’utente e può formulare ulteriori domande per approfondire gli elementi più significativi. Pur mantenendo la sequenza generale stabilita, il modello linguistico adatta il dialogo ai contenuti emersi. Al termine dell’intervista, Counselorbot individua i temi ricorrenti e li integra in una sintesi narrativa relativa agli interessi, ai modelli di riferimento, alle aspirazioni e alla costruzione dell’identità professionale.</w:t>
+        <w:t xml:space="preserve">segue invece un percorso qualitativo e narrativo. Il modulo non richiede l’inserimento di punteggi né produce un profilo psicometrico. Counselorbot presenta progressivamente le cinque domande previste dal protocollo, analizza le risposte dell’utente e può formulare domande di approfondimento sugli elementi più significativi. Pur mantenendo la sequenza generale dell’intervista, il modello linguistico adatta il dialogo ai contenuti emersi. Al termine, Counselorbot individua i temi ricorrenti e li integra in una sintesi narrativa degli interessi, dei modelli di riferimento, delle aspirazioni e della costruzione dell’identità professionale.</w:t>
       </w:r>
     </w:p>
     <w:p>
@@ -1041,45 +1037,48 @@
         <w:jc w:val="both"/>
       </w:pPr>
       <w:r>
-        <w:t xml:space="preserve">Il modulo di</w:t>
-      </w:r>
-      <w:r>
-        <w:t xml:space="preserve"> </w:t>
+        <w:t xml:space="preserve">Il modulo PQBL segue un terzo flusso, orientato all’apprendimento attivo. Dopo il caricamento di un PDF, il sistema analizza e segmenta il contenuto, genera una sequenza di domande e le presenta progressivamente all’utente. Dopo ciascuna risposta, Counselorbot restituisce un feedback, propone chiarimenti e può adattare la difficoltà o il livello di approfondimento delle domande successive. Il percorso rimane ancorato al documento e si conclude con una sintesi dell’attività svolta e dei principali aspetti affrontati.</w:t>
+      </w:r>
+    </w:p>
+    <w:bookmarkEnd w:id="26"/>
+    <w:bookmarkStart w:id="27" w:name="infrastruttura-hardware"/>
+    <w:p>
+      <w:pPr>
+        <w:pStyle w:val="Heading3"/>
+      </w:pPr>
+      <w:r>
+        <w:rPr>
+          <w:color w:val="000000"/>
+        </w:rPr>
+        <w:t xml:space="preserve">2.3 Infrastruttura hardware</w:t>
+      </w:r>
+    </w:p>
+    <w:p>
+      <w:pPr>
+        <w:pStyle w:val="FirstParagraph"/>
+        <w:jc w:val="both"/>
+      </w:pPr>
+      <w:r>
+        <w:t xml:space="preserve">Counselorbot è eseguito su una workstation configurata per gestire localmente modelli linguistici e carichi computazionali intensivi. La macchina è dotata di processore AMD Ryzen Threadripper 7980X (64 core, 128 thread), 256 GB di RAM e GPU NVIDIA RTX 5090. La realizzazione dell’infrastruttura ha richiesto un investimento iniziale di circa 13.000 euro.</w:t>
+      </w:r>
+    </w:p>
+    <w:p>
+      <w:pPr>
+        <w:pStyle w:val="BodyText"/>
+        <w:jc w:val="both"/>
+      </w:pPr>
+      <w:r>
+        <w:t xml:space="preserve">La scelta dell’esecuzione locale risponde a tre esigenze. La prima riguarda la riservatezza dei dati, poiché riduce il trasferimento di conversazioni e informazioni degli utenti verso servizi esterni. La seconda riguarda l’indipendenza dai provider commerciali di intelligenza artificiale: il funzionamento del sistema non dipende esclusivamente dalla disponibilità, dai costi o dalle modifiche delle API (</w:t>
       </w:r>
       <w:r>
         <w:rPr>
           <w:iCs/>
           <w:i/>
         </w:rPr>
-        <w:t xml:space="preserve">Question-Based Learning</w:t>
-      </w:r>
-      <w:r>
-        <w:t xml:space="preserve"> </w:t>
-      </w:r>
-      <w:r>
-        <w:t xml:space="preserve">segue un terzo flusso, specificamente orientato all’apprendimento attivo. Dopo il caricamento del documento in formato PDF, il sistema ne analizza e segmenta il contenuto, genera una sequenza di domande e le presenta progressivamente all’utente. Dopo ciascuna risposta, Counselorbot restituisce un feedback, propone eventuali chiarimenti e può adattare la difficoltà o il livello di approfondimento delle domande successive. Il percorso rimane ancorato ai contenuti del documento e si conclude con una sintesi dell’attività svolta e degli aspetti principali affrontati.</w:t>
-      </w:r>
-    </w:p>
-    <w:bookmarkEnd w:id="26"/>
-    <w:bookmarkStart w:id="27" w:name="infrastruttura-hardware"/>
-    <w:p>
-      <w:pPr>
-        <w:pStyle w:val="Heading3"/>
-      </w:pPr>
-      <w:r>
-        <w:rPr>
-          <w:color w:val="000000"/>
-        </w:rPr>
-        <w:t xml:space="preserve">2.3 Infrastruttura hardware</w:t>
-      </w:r>
-    </w:p>
-    <w:p>
-      <w:pPr>
-        <w:pStyle w:val="FirstParagraph"/>
-        <w:jc w:val="both"/>
-      </w:pPr>
-      <w:r>
-        <w:t xml:space="preserve">Counselorbot è eseguito su una workstation ad alte prestazioni, configurata per gestire localmente modelli linguistici e carichi computazionali intensivi. La macchina è dotata di un processore AMD Ryzen Threadripper 7980X con 64 core e 128 thread, di 256 GB di memoria RAM e di una GPU NVIDIA RTX 5090. La realizzazione dell’infrastruttura ha richiesto un investimento iniziale di circa 13.000 euro. La scelta di un’infrastruttura locale risponde innanzitutto all’esigenza di tutelare la riservatezza dei dati, poiché consente di ridurre il trasferimento delle conversazioni e delle informazioni degli utenti verso servizi esterni. Inoltre, permette di mantenere una maggiore indipendenza dai provider commerciali di intelligenza artificiale, evitando che il funzionamento del sistema dipenda esclusivamente dalla disponibilità, dai costi o dalle modifiche delle API esterne. Infine, l’investimento iniziale può contribuire alla sostenibilità economica nel medio e lungo periodo, soprattutto in presenza di un numero elevato di interazioni.</w:t>
+        <w:t xml:space="preserve">application programming interface</w:t>
+      </w:r>
+      <w:r>
+        <w:t xml:space="preserve">), cioè le interfacce tecniche attraverso cui il sistema dialoga con servizi esterni. La terza riguarda la sostenibilità economica nel medio e lungo periodo, soprattutto in presenza di un numero elevato di interazioni.</w:t>
       </w:r>
     </w:p>
     <w:bookmarkEnd w:id="27"/>
@@ -1101,7 +1100,7 @@
         <w:jc w:val="both"/>
       </w:pPr>
       <w:r>
-        <w:t xml:space="preserve">Il software di Counselorbot comprende il sistema di gestione dei modelli linguistici, i meccanismi di recupero delle conoscenze e della memoria e le funzioni di registrazione e analisi delle interazioni.</w:t>
+        <w:t xml:space="preserve">Il software di Counselorbot comprende il sistema di gestione dei modelli linguistici, i meccanismi di recupero delle conoscenze e di gestione della memoria e le funzioni di registrazione e analisi delle interazioni. La distribuzione tramite container Docker rende replicabile l’ambiente software, includendo dipendenze, servizi e configurazioni, su macchine diverse dotate dei requisiti hardware necessari.</w:t>
       </w:r>
     </w:p>
     <w:bookmarkStart w:id="28" w:name="modelli-linguistici"/>
@@ -1122,7 +1121,7 @@
         <w:jc w:val="both"/>
       </w:pPr>
       <w:r>
-        <w:t xml:space="preserve">Per la gestione dei modelli linguistici, Counselorbot utilizza Ollama, uno strumento che consente l’esecuzione locale ed efficiente di modelli open-source. Durante la fase di sviluppo, la scelta si è orientata verso modelli con un numero di parametri inferiore a 15 miliardi, per garantire un equilibrio ottimale tra prestazioni e sostenibilità dell’infrastruttura locale. Sono stati testati modelli appartenenti a diverse famiglie, tra cui Gemma (nelle varianti da 2B, 4B e 12B parametri), DeepSeek-R1-Distill 8B e Qwen 3.5 9B.</w:t>
+        <w:t xml:space="preserve">Per la gestione dei modelli linguistici, Counselorbot utilizza Ollama, uno strumento che consente l’esecuzione locale ed efficiente di modelli open source. Durante la fase di sviluppo, la scelta si è orientata verso modelli con un numero di parametri inferiore a 15 miliardi, per garantire un equilibrio tra prestazioni e sostenibilità dell’infrastruttura locale. Sono stati testati modelli appartenenti a diverse famiglie: Gemma (nelle varianti 2B, 4B e 12B), DeepSeek-R1-Distill 8B e Qwen 3.5 9B.</w:t>
       </w:r>
     </w:p>
     <w:bookmarkEnd w:id="28"/>
@@ -1144,7 +1143,43 @@
         <w:jc w:val="both"/>
       </w:pPr>
       <w:r>
-        <w:t xml:space="preserve">Counselorbot utilizza diversi meccanismi per recuperare le informazioni rilevanti e mantenere la continuità delle interazioni. Tali meccanismi comprendono la memoria di sessione, la base di conoscenza, il grafo della conoscenza e una memoria condivisa delle risposte. La memoria di sessione conserva le informazioni emerse nel corso della singola conversazione. In questo modo, il sistema può ricordare i risultati, le risposte dell’utente e le strategie già discusse, evitando ripetizioni e garantendo coerenza tra le diverse fasi del percorso. La base di conoscenza contiene strategie educative e contenuti teorici precedentemente selezionati e approvati. Le strategie sono associate ai fattori dei questionari e indicizzate attraverso parole chiave e rappresentazioni semantiche. Quando viene analizzata una determinata dimensione, il sistema recupera automaticamente i contenuti maggiormente pertinenti rispetto al fattore, al punteggio e alle informazioni fornite dallo studente. Le informazioni recuperate vengono inserite nel contesto del modello linguistico e impiegate per generare la risposta. Questa soluzione consente agli amministratori di ampliare o aggiornare la base di conoscenza senza dover intervenire manualmente sui prompt. Il grafo della conoscenza collega tra loro gli strumenti, i fattori, le strategie e i riferimenti teorici. Tale struttura permette di estendere la ricerca documentale anche ai concetti semanticamente vicini, superando una corrispondenza esclusivamente letterale tra i termini utilizzati dall’utente e quelli presenti nei contenuti indicizzati. A questi meccanismi si aggiunge una memoria condivisa delle risposte. Quando un utente valuta positivamente una risposta dell’assistente, questa può essere conservata e utilizzata come riferimento per domande analoghe formulate in sessioni successive. Le risposte precedenti non vengono necessariamente riproposte in forma identica, ma possono essere recuperate come esempi utili alla produzione di nuove risposte. Si introduce così un meccanismo di apprendimento collettivo, nel quale le interazioni considerate efficaci contribuiscono progressivamente al miglioramento del sistema. La memoria condivisa rimane tuttavia distinta dalla base di conoscenza validata: quest’ultima contiene materiali selezionati dagli amministratori, mentre la memoria condivisa deriva dalla valutazione delle risposte generate durante l’utilizzo.</w:t>
+        <w:t xml:space="preserve">Counselorbot utilizza diversi meccanismi per recuperare le informazioni rilevanti e mantenere la continuità delle interazioni: la memoria di sessione, la base di conoscenza, il grafo della conoscenza e una memoria condivisa delle risposte.</w:t>
+      </w:r>
+    </w:p>
+    <w:p>
+      <w:pPr>
+        <w:pStyle w:val="BodyText"/>
+        <w:jc w:val="both"/>
+      </w:pPr>
+      <w:r>
+        <w:t xml:space="preserve">La memoria di sessione conserva le informazioni emerse nel corso della singola conversazione, consentendo al sistema di ricordare i risultati, le risposte dell’utente e le strategie già discusse, ed evitando così ripetizioni tra le diverse fasi del percorso.</w:t>
+      </w:r>
+    </w:p>
+    <w:p>
+      <w:pPr>
+        <w:pStyle w:val="BodyText"/>
+        <w:jc w:val="both"/>
+      </w:pPr>
+      <w:r>
+        <w:t xml:space="preserve">La base di conoscenza contiene strategie educative e contenuti teorici precedentemente selezionati e approvati. Le strategie sono associate ai fattori dei questionari e indicizzate attraverso parole chiave e rappresentazioni semantiche. Quando viene analizzata una determinata dimensione, il sistema recupera automaticamente i contenuti più pertinenti rispetto al fattore, al punteggio e alle informazioni fornite dallo studente, e li inserisce nel contesto del modello per generare la risposta. Questa soluzione consente agli amministratori di ampliare o aggiornare la base di conoscenza senza dover intervenire manualmente sui prompt.</w:t>
+      </w:r>
+    </w:p>
+    <w:p>
+      <w:pPr>
+        <w:pStyle w:val="BodyText"/>
+        <w:jc w:val="both"/>
+      </w:pPr>
+      <w:r>
+        <w:t xml:space="preserve">Il grafo della conoscenza collega tra loro gli strumenti, i fattori, le strategie e i riferimenti teorici, permettendo di estendere la ricerca anche ai concetti semanticamente vicini e di superare una corrispondenza esclusivamente letterale tra i termini dell’utente e quelli presenti nei contenuti indicizzati.</w:t>
+      </w:r>
+    </w:p>
+    <w:p>
+      <w:pPr>
+        <w:pStyle w:val="BodyText"/>
+        <w:jc w:val="both"/>
+      </w:pPr>
+      <w:r>
+        <w:t xml:space="preserve">A questi meccanismi si aggiunge una memoria condivisa delle risposte. Quando un utente valuta positivamente una risposta dell’assistente, questa può essere conservata e utilizzata come riferimento per domande analoghe in sessioni successive. Le risposte precedenti non vengono riproposte in forma identica, ma possono essere recuperate come esempi per la produzione di nuove risposte, introducendo così un meccanismo di apprendimento collettivo nel quale le interazioni efficaci contribuiscono progressivamente al miglioramento del sistema. La memoria condivisa rimane tuttavia distinta dalla base di conoscenza validata: quest’ultima contiene materiali selezionati dagli amministratori, mentre la memoria condivisa deriva dalla valutazione delle risposte generate durante l’utilizzo.</w:t>
       </w:r>
     </w:p>
     <w:bookmarkEnd w:id="29"/>
@@ -1166,7 +1201,7 @@
         <w:jc w:val="both"/>
       </w:pPr>
       <w:r>
-        <w:t xml:space="preserve">Le interazioni vengono registrate in un archivio consultabile dagli amministratori. Tale archivio permette di monitorare l’utilizzo del sistema, individuare domande ricorrenti, identificare eventuali difficoltà nei percorsi guidati e rilevare le aree nelle quali le risposte richiedono ulteriori miglioramenti. È inoltre in fase di progettazione un sistema di anonimizzazione che consenta di analizzare i contenuti delle conversazioni senza esporre i dati personali degli studenti. L’obiettivo è rendere possibile lo studio aggregato delle strategie maggiormente discusse, dei fattori percepiti come critici e dell’efficacia attribuita dagli utenti alle risposte del sistema. Questi dati potranno essere utilizzati per valutare l’impatto di Counselorbot, perfezionare i protocolli di interazione e studiare l’impiego del sistema su scala più ampia.</w:t>
+        <w:t xml:space="preserve">Le interazioni vengono registrate in un archivio consultabile dagli amministratori, che permette di monitorare l’utilizzo del sistema, individuare domande ricorrenti, identificare eventuali difficoltà nei percorsi guidati e rilevare le aree nelle quali le risposte richiedono ulteriori miglioramenti. È inoltre in fase di progettazione un sistema di anonimizzazione che consenta di analizzare i contenuti delle conversazioni senza esporre i dati personali degli studenti. L’obiettivo è consentire lo studio aggregato delle strategie più discusse, dei fattori percepiti come critici e dell’efficacia attribuita dagli utenti alle risposte del sistema. Questi dati potranno essere utilizzati per valutare l’impatto di Counselorbot, perfezionare i protocolli di interazione e studiare l’impiego del sistema su scala più ampia.</w:t>
       </w:r>
     </w:p>
     <w:bookmarkEnd w:id="30"/>
@@ -1189,7 +1224,43 @@
         <w:jc w:val="both"/>
       </w:pPr>
       <w:r>
-        <w:t xml:space="preserve">L’architettura applicativa di Counselorbot si articola in quattro componenti principali: frontend, backend, database e livello di astrazione dei modelli linguistici. Il frontend costituisce il livello con cui l’utente interagisce direttamente. Comprende il selettore degli strumenti, i moduli per l’inserimento dei risultati, il caricamento dei documenti, la visualizzazione grafica del profilo, l’interfaccia conversazionale, la navigazione tra i passi guidati e le funzioni di salvataggio delle strategie. La sua organizzazione modulare permette di associare a ciascuno strumento una specifica interfaccia, mantenendo al tempo stesso un’esperienza d’uso coerente all’interno della piattaforma. Il backend gestisce la logica applicativa e coordina le differenti componenti del sistema. Esso espone i servizi relativi alla chat, ai questionari, ai passi guidati, alla memoria, alla base di conoscenza e alle funzioni amministrative. Durante l’interazione, il backend individua il passo corrente, seleziona il meta-prompt corrispondente, recupera le informazioni pertinenti e costruisce il contesto da inviare al modello linguistico. Successivamente riceve la risposta generata, la restituisce all’interfaccia e aggiorna la memoria della sessione. Il database relazionale conserva le configurazioni necessarie al funzionamento della piattaforma. Al suo interno sono registrati gli strumenti disponibili, la struttura dei questionari, i fattori, gli item, le scale, le stanine, i prompt, i meta-prompt, i passi guidati, le strategie, le configurazioni dei modelli, la memoria delle sessioni e le interazioni archiviate. Counselorbot non si limita quindi a ricevere punteggi esterni, ma dispone di una rappresentazione strutturata dei questionari e può interpretarli in relazione alle loro caratteristiche. Il livello di astrazione dei modelli linguistici mette infine in comunicazione il backend con i diversi provider di intelligenza artificiale. Attraverso un’interfaccia comune, esso gestisce l’invio dei prompt, la ricezione delle risposte e i parametri di generazione. Questa componente rende Counselorbot indipendente dal singolo modello e consente di utilizzare sia modelli eseguiti localmente mediante Ollama sia eventuali servizi remoti. L’organizzazione complessiva separa dunque i contenuti educativi, la logica dei percorsi, l’interfaccia utente e il modello linguistico. Tale separazione permette di aggiornare ed estendere Counselorbot intervenendo sulle singole componenti, senza dover riprogettare l’intero sistema.</w:t>
+        <w:t xml:space="preserve">L’architettura applicativa di Counselorbot si articola in quattro componenti principali: frontend, backend, database e livello di astrazione dei modelli linguistici.</w:t>
+      </w:r>
+    </w:p>
+    <w:p>
+      <w:pPr>
+        <w:pStyle w:val="BodyText"/>
+        <w:jc w:val="both"/>
+      </w:pPr>
+      <w:r>
+        <w:t xml:space="preserve">Il frontend costituisce il livello con cui l’utente interagisce direttamente: comprende il selettore degli strumenti, i moduli per l’inserimento dei risultati, il caricamento dei documenti, la visualizzazione grafica del profilo, l’interfaccia conversazionale, la navigazione tra i passi guidati e le funzioni di salvataggio delle strategie. La sua organizzazione modulare permette di associare a ciascuno strumento una specifica interfaccia, mantenendo al tempo stesso un’esperienza d’uso coerente all’interno della piattaforma.</w:t>
+      </w:r>
+    </w:p>
+    <w:p>
+      <w:pPr>
+        <w:pStyle w:val="BodyText"/>
+        <w:jc w:val="both"/>
+      </w:pPr>
+      <w:r>
+        <w:t xml:space="preserve">Il backend gestisce la logica applicativa e coordina le diverse componenti del sistema. Espone i servizi relativi alla chat, ai questionari, ai passi guidati, alla memoria, alla base di conoscenza e alle funzioni amministrative. Durante l’interazione, individua il passo corrente, seleziona il meta-prompt corrispondente, recupera le informazioni pertinenti e costruisce il contesto da inviare al modello linguistico; riceve quindi la risposta generata, la restituisce all’interfaccia e aggiorna la memoria della sessione.</w:t>
+      </w:r>
+    </w:p>
+    <w:p>
+      <w:pPr>
+        <w:pStyle w:val="BodyText"/>
+        <w:jc w:val="both"/>
+      </w:pPr>
+      <w:r>
+        <w:t xml:space="preserve">Il database relazionale conserva le configurazioni necessarie al funzionamento della piattaforma: gli strumenti disponibili, la struttura dei questionari, i fattori, gli item, le scale, le stanine, i prompt, i meta-prompt, i passi guidati, le strategie, le configurazioni dei modelli, la memoria delle sessioni e le interazioni archiviate. Counselorbot non si limita pertanto a ricevere punteggi esterni, ma dispone di una rappresentazione strutturata dei questionari e può interpretarli in relazione alle loro caratteristiche.</w:t>
+      </w:r>
+    </w:p>
+    <w:p>
+      <w:pPr>
+        <w:pStyle w:val="BodyText"/>
+        <w:jc w:val="both"/>
+      </w:pPr>
+      <w:r>
+        <w:t xml:space="preserve">Il livello di astrazione dei modelli linguistici mette infine in comunicazione il backend con i diversi provider di intelligenza artificiale: attraverso un’interfaccia comune gestisce l’invio dei prompt, la ricezione delle risposte e i parametri di generazione, rendendo Counselorbot indipendente dal singolo modello e consentendo di utilizzare sia modelli eseguiti localmente mediante Ollama sia eventuali servizi remoti. L’organizzazione complessiva separa dunque i contenuti educativi, la logica dei percorsi, l’interfaccia utente e il modello linguistico, permettendo di aggiornare ed estendere Counselorbot intervenendo sulle singole componenti senza riprogettare l’intero sistema.</w:t>
       </w:r>
     </w:p>
     <w:bookmarkEnd w:id="32"/>
@@ -1224,7 +1295,7 @@
         <w:jc w:val="both"/>
       </w:pPr>
       <w:r>
-        <w:t xml:space="preserve">Per valutare il sistema descritto nel § 2 è stato adottato un disegno di ricerca articolato secondo il modello ADDIE (Branch, 2009). L’acronimo identifica cinque fasi iterative:</w:t>
+        <w:t xml:space="preserve">Per valutare il sistema descritto nel §2 è stato adottato un disegno di ricerca articolato secondo il approccio ADDIE (Branch, 2009), che identifica cinque fasi iterative:</w:t>
       </w:r>
       <w:r>
         <w:t xml:space="preserve"> </w:t>
@@ -1276,7 +1347,7 @@
         <w:t xml:space="preserve">Implementation</w:t>
       </w:r>
       <w:r>
-        <w:t xml:space="preserve">, riferita al rilascio e all’utilizzo del sistema; ed</w:t>
+        <w:t xml:space="preserve">, riferita al rilascio e all’utilizzo; ed</w:t>
       </w:r>
       <w:r>
         <w:t xml:space="preserve"> </w:t>
@@ -1289,7 +1360,7 @@
         <w:t xml:space="preserve">Evaluation</w:t>
       </w:r>
       <w:r>
-        <w:t xml:space="preserve">, finalizzata alla valutazione del suo funzionamento e dei risultati ottenuti. Il lavoro presentato in questo articolo si colloca nella fase di</w:t>
+        <w:t xml:space="preserve">, finalizzata alla valutazione del funzionamento e dei risultati. Il lavoro si colloca nella fase di</w:t>
       </w:r>
       <w:r>
         <w:t xml:space="preserve"> </w:t>
@@ -1305,7 +1376,16 @@
         <w:t xml:space="preserve"> </w:t>
       </w:r>
       <w:r>
-        <w:t xml:space="preserve">del secondo ciclo di sviluppo. Il primo ciclo ha portato alla realizzazione di CB-C, una versione basata su un’architettura RAG (</w:t>
+        <w:t xml:space="preserve">del secondo ciclo di sviluppo.</w:t>
+      </w:r>
+    </w:p>
+    <w:p>
+      <w:pPr>
+        <w:pStyle w:val="BodyText"/>
+        <w:jc w:val="both"/>
+      </w:pPr>
+      <w:r>
+        <w:t xml:space="preserve">Il primo ciclo ha portato alla realizzazione di CB-C, una versione basata su un’architettura RAG (</w:t>
       </w:r>
       <w:r>
         <w:rPr>
@@ -1315,7 +1395,7 @@
         <w:t xml:space="preserve">Retrieval-Augmented Generation</w:t>
       </w:r>
       <w:r>
-        <w:t xml:space="preserve">) e su un</w:t>
+        <w:t xml:space="preserve">; Lewis et al., 2020) e su un</w:t>
       </w:r>
       <w:r>
         <w:t xml:space="preserve"> </w:t>
@@ -1328,7 +1408,38 @@
         <w:t xml:space="preserve">system prompt</w:t>
       </w:r>
       <w:r>
-        <w:t xml:space="preserve">. In tale configurazione, il modello linguistico rispondeva alle domande dello studente recuperando le informazioni pertinenti da documenti indicizzati in una memoria vettoriale, senza seguire una sequenza di interazione prestabilita. I risultati del primo ciclo, discussi nel § 4, hanno evidenziato alcune criticità, in particolare nella coerenza delle analisi prodotte e nelle modalità di inserimento manuale dei dati. Tali risultati hanno orientato un successivo processo di ottimizzazione e la progettazione di una nuova versione del sistema. Il secondo ciclo ha quindi condotto allo sviluppo di CB-SBS, che introduce una procedura guidata per passi, un grafo della conoscenza, l’indicizzazione semantica delle strategie e un’interfaccia ottimizzata per l’inserimento e la visualizzazione dei profili. In particolare, l’inserimento manuale dei punteggi — segnalato come critico nella prima fase — è stato sostituito da un form iniziale e dal caricamento diretto dei PDF degli esiti; la memoria di sessione è stata rivista tramite sintesi dinamica del dialogo e iniezione costante dei punteggi a ogni turno; ed è stato introdotto un limite di token per contenere l’estensione degli interventi del LLM. La valutazione presentata in questo studio adotta un disegno comparativo</w:t>
+        <w:t xml:space="preserve">, in cui il modello linguistico rispondeva alle domande dello studente recuperando informazioni pertinenti da documenti indicizzati in una memoria vettoriale, senza sequenza di interazione prestabilita. I risultati, discussi nel §4, hanno evidenziato alcune criticità — in particolare nella coerenza delle analisi e nell’inserimento manuale dei dati — orientando la progettazione di una nuova versione del sistema.</w:t>
+      </w:r>
+    </w:p>
+    <w:p>
+      <w:pPr>
+        <w:pStyle w:val="BodyText"/>
+        <w:jc w:val="both"/>
+      </w:pPr>
+      <w:r>
+        <w:t xml:space="preserve">Il secondo ciclo ha condotto allo sviluppo di CB-SBS, che introduce una procedura guidata per passi, un grafo della conoscenza, l’indicizzazione semantica delle strategie e un’interfaccia ottimizzata per l’inserimento e la visualizzazione dei profili. In particolare, l’inserimento manuale dei punteggi è stato sostituito da un form iniziale e dal caricamento diretto dei PDF degli esiti; la memoria di sessione è stata rivista tramite sintesi dinamica del dialogo e iniezione costante dei punteggi a ogni turno; ed è stato introdotto un limite di token per contenere l’estensione degli interventi del LLM.</w:t>
+      </w:r>
+    </w:p>
+    <w:bookmarkEnd w:id="34"/>
+    <w:bookmarkStart w:id="35" w:name="partecipanti-e-procedura"/>
+    <w:p>
+      <w:pPr>
+        <w:pStyle w:val="Heading3"/>
+      </w:pPr>
+      <w:r>
+        <w:rPr>
+          <w:color w:val="000000"/>
+        </w:rPr>
+        <w:t xml:space="preserve">3.2 Partecipanti e procedura</w:t>
+      </w:r>
+    </w:p>
+    <w:p>
+      <w:pPr>
+        <w:pStyle w:val="FirstParagraph"/>
+        <w:jc w:val="both"/>
+      </w:pPr>
+      <w:r>
+        <w:t xml:space="preserve">La valutazione adotta un disegno comparativo</w:t>
       </w:r>
       <w:r>
         <w:t xml:space="preserve"> </w:t>
@@ -1344,29 +1455,16 @@
         <w:t xml:space="preserve"> </w:t>
       </w:r>
       <w:r>
-        <w:t xml:space="preserve">tra le due versioni, CB-C e CB-SBS. Ciascun partecipante ha utilizzato una sola versione di Counselorbot e, al termine dell’interazione, ha compilato il questionario di gradimento descritto nel § 3.3.</w:t>
-      </w:r>
-    </w:p>
-    <w:bookmarkEnd w:id="34"/>
-    <w:bookmarkStart w:id="35" w:name="partecipanti-e-procedura"/>
-    <w:p>
-      <w:pPr>
-        <w:pStyle w:val="Heading3"/>
-      </w:pPr>
-      <w:r>
-        <w:rPr>
-          <w:color w:val="000000"/>
-        </w:rPr>
-        <w:t xml:space="preserve">3.2 Partecipanti e procedura</w:t>
+        <w:t xml:space="preserve">tra le due versioni: ciascun partecipante ha utilizzato una sola versione e, al termine dell’interazione, ha compilato il questionario di gradimento descritto nel §3.3. Al momento della stesura, la raccolta dei dati è ancora in corso: hanno completato la procedura 34 partecipanti, di cui 7 nella versione CB-SBS e 27 nella versione CB-C. Il campione è eterogeneo per età (18–53 anni) e per livello di istruzione, dalla scuola secondaria di primo grado alla laurea magistrale.</w:t>
       </w:r>
     </w:p>
     <w:p>
       <w:pPr>
-        <w:pStyle w:val="FirstParagraph"/>
+        <w:pStyle w:val="BodyText"/>
         <w:jc w:val="both"/>
       </w:pPr>
       <w:r>
-        <w:t xml:space="preserve">Al momento della stesura dell’articolo, la raccolta dei dati è ancora in corso. Hanno completato la procedura 34 partecipanti: 7 hanno utilizzato la versione CB-SBS, mentre 27 hanno interagito con la versione precedente, CB-C. Il campione presenta una composizione eterogenea sia per età, compresa tra 14 e 53 anni, sia per livello di istruzione, che varia dalla scuola secondaria di primo grado alla laurea magistrale. La procedura prevedeva inizialmente la compilazione del Questionario sulle Strategie di Apprendimento (QSA). Successivamente, i partecipanti visualizzavano il proprio profilo e avviavano un’interazione con il chatbot articolata nell’analisi dei singoli fattori del questionario. Al termine del percorso veniva somministrato il questionario di gradimento.</w:t>
+        <w:t xml:space="preserve">La procedura prevedeva la compilazione del Questionario sulle Strategie di Apprendimento (QSA), seguita dalla visualizzazione del profilo e da un’interazione con il chatbot articolata nell’analisi dei singoli fattori del questionario. Al termine, i partecipanti compilavano il questionario di gradimento.</w:t>
       </w:r>
     </w:p>
     <w:bookmarkEnd w:id="35"/>
@@ -1388,7 +1486,7 @@
         <w:jc w:val="both"/>
       </w:pPr>
       <w:r>
-        <w:t xml:space="preserve">Il questionario di gradimento è composto da dieci item relativi ad altrettanti aspetti dell’esperienza di utilizzo: utilità percepita, pertinenza delle risposte, chiarezza delle spiegazioni, adeguatezza del livello di dettaglio, facilità d’uso dell’interfaccia, velocità di risposta, fiducia nelle informazioni ricevute, capacità del sistema di stimolare la riflessione su di sé, coinvolgimento complessivo e intenzione di riutilizzare il chatbot o di raccomandarlo ad altri. Per ciascun item viene calcolata la media aritmetica, separatamente per le due versioni del sistema. Gli item vengono analizzati singolarmente e non sono aggregati in sottoscale. Il questionario raccoglie inoltre informazioni sociodemografiche relative a età, sesso, titolo di studio, tipo di istituto frequentato e provenienza geografica. Nella versione estesa sono presenti anche due domande aperte, finalizzate a raccogliere osservazioni sull’esperienza e suggerimenti per il miglioramento del sistema. Le risposte vengono analizzate qualitativamente mediante una categorizzazione tematica.</w:t>
+        <w:t xml:space="preserve">Il questionario di gradimento comprende dieci item sull’esperienza di utilizzo: utilità percepita, pertinenza delle risposte, chiarezza delle spiegazioni, adeguatezza del livello di dettaglio, facilità d’uso dell’interfaccia, velocità di risposta, fiducia nelle informazioni ricevute, capacità del sistema di stimolare la riflessione su di sé, coinvolgimento complessivo e intenzione di riutilizzo o di raccomandazione ad altri. Per ciascun item è calcolata la media aritmetica separatamente nelle due versioni; gli item sono analizzati individualmente, senza aggregazione in sottoscale. Il questionario raccoglie inoltre informazioni sociodemografiche relative a età, sesso, titolo di studio, tipo di istituto frequentato e provenienza geografica. Sono presenti anche due domande aperte, finalizzate a raccogliere osservazioni sull’esperienza e suggerimenti per il miglioramento del sistema; le risposte sono analizzate mediante categorizzazione tematica.</w:t>
       </w:r>
     </w:p>
     <w:bookmarkEnd w:id="36"/>
@@ -1410,7 +1508,7 @@
         <w:jc w:val="both"/>
       </w:pPr>
       <w:r>
-        <w:t xml:space="preserve">La selezione del modello linguistico locale è stata articolata in due fasi. In una prima fase sono stati esaminati i risultati pubblicamente disponibili di alcuni benchmark utilizzati per confrontare le prestazioni dei modelli linguistici in compiti di conoscenza generale, ragionamento avanzato e generazione di codice. In particolare, sono stati considerati i risultati ottenuti in MMLU-Pro, GPQA Diamond e LiveCodeBench. L’analisi di tali benchmark ha permesso di individuare i modelli con le prestazioni complessivamente più elevate tra quelli compatibili con i requisiti dell’infrastruttura locale.</w:t>
+        <w:t xml:space="preserve">La selezione del modello linguistico locale è stata articolata in due fasi: nella prima sono stati esaminati i risultati pubblicamente disponibili di alcuni benchmark (prove standardizzate di valutazione comparativa) utilizzati per confrontare le prestazioni dei modelli in compiti di conoscenza generale, ragionamento avanzato e generazione di codice. In particolare, sono stati considerati i punteggi ottenuti in MMLU-Pro, GPQA Diamond e LiveCodeBench. Tale analisi ha permesso di individuare i modelli con le prestazioni complessivamente più elevate tra quelli compatibili con i requisiti hardware descritti nel §2.3.</w:t>
       </w:r>
     </w:p>
     <w:tbl>
@@ -1829,7 +1927,7 @@
         <w:jc w:val="both"/>
       </w:pPr>
       <w:r>
-        <w:t xml:space="preserve">La scelta dei modelli candidati non è stata tuttavia determinata esclusivamente dai punteggi ottenuti nei benchmark. Sono stati considerati anche il numero di parametri e la compatibilità con l’hardware disponibile, privilegiando modelli con meno di 15 miliardi di parametri, in grado di garantire un equilibrio tra prestazioni, velocità di esecuzione e sostenibilità computazionale.</w:t>
+        <w:t xml:space="preserve">Accanto ai punteggi di benchmark, sono stati considerati il numero di parametri e la compatibilità con l’hardware disponibile, privilegiando modelli con meno di 15 miliardi di parametri, in grado di garantire un equilibrio tra prestazioni, velocità di esecuzione e sostenibilità computazionale.</w:t>
       </w:r>
     </w:p>
     <w:p>
@@ -1838,7 +1936,7 @@
         <w:jc w:val="both"/>
       </w:pPr>
       <w:r>
-        <w:t xml:space="preserve">Nella seconda fase, i modelli selezionati sulla base dei benchmark sono stati installati e testati direttamente sulla macchina locale descritta nel § 2.3. La valutazione è stata condotta sull’intero flusso degli undici passi previsti per l’analisi del QSA.</w:t>
+        <w:t xml:space="preserve">Nella seconda fase, i modelli selezionati sulla base dei benchmark sono stati installati e testati direttamente sulla macchina locale descritta nel §2.3. La valutazione è stata condotta sull’intero flusso degli undici passi previsti per l’analisi del QSA.</w:t>
       </w:r>
     </w:p>
     <w:p>
@@ -1847,7 +1945,7 @@
         <w:jc w:val="both"/>
       </w:pPr>
       <w:r>
-        <w:t xml:space="preserve">Per ciascun modello sono state esaminate la capacità di rispettare la sequenza prestabilita, la copertura di tutti i fattori del questionario, la coerenza delle interpretazioni formulate e la pertinenza pedagogica delle strategie proposte. Tali criteri sono stati aggregati in un punteggio complessivo di qualità (da 0 a 1) che sintetizza copertura dei fattori, correttezza interpretativa rispetto ai punteggi, pertinenza pedagogica dei consigli e aderenza al formato richiesto. Sono stati inoltre rilevati due indicatori tecnici: la velocità media di generazione, espressa in token al secondo, e il Time to First Token (TTFT), corrispondente al tempo intercorrente tra l’invio della richiesta e la produzione del primo token della risposta. La valutazione dei criteri qualitativi e l’attribuzione del punteggio di qualità sono state eseguite in modalità automatica tramite Opus 4.8.</w:t>
+        <w:t xml:space="preserve">Per ciascun modello sono state esaminate la capacità di rispettare la sequenza prestabilita, la copertura dei fattori del questionario, la coerenza delle interpretazioni e la pertinenza pedagogica delle strategie proposte. Tali aspetti sono stati sintetizzati in un punteggio complessivo di qualità (da 0 a 1), calcolato su quattro componenti: copertura dei fattori, correttezza interpretativa rispetto ai punteggi, pertinenza pedagogica dei consigli e aderenza al formato richiesto. Sono stati inoltre rilevati due indicatori tecnici: la velocità media di generazione, espressa in token (unità minime di testo elaborate dal modello) al secondo, e il Time to First Token (TTFT), cioè il tempo tra l’invio della richiesta e il primo token della risposta. La valutazione dei criteri qualitativi e l’attribuzione del punteggio di qualità sono state eseguite in modalità automatica tramite Opus 4.8.</w:t>
       </w:r>
     </w:p>
     <w:bookmarkEnd w:id="37"/>
@@ -2297,7 +2395,7 @@
         <w:jc w:val="both"/>
       </w:pPr>
       <w:r>
-        <w:t xml:space="preserve">Tutti i modelli hanno mantenuto piena affidabilità di connessione lungo l’intero flusso. Gemma 4 4B ha ottenuto la qualità più alta (0,83), rispettando la sequenza prestabilita e fornendo interpretazioni coerenti con i punteggi in nove degli undici passi, a fronte di una velocità di generazione (472 token/s) e di un TTFT (4,5 s) adeguati all’uso interattivo. Gemma 4 12B, pur completo nella profondità d’analisi, ha registrato un TTFT sensibilmente superiore (12,3 s); DeepSeek-R1-Distill 8B ha alternato risposte eccellenti e scadenti a seconda del passo, mentre Qwen 3.5 9B ha riportato la qualità più bassa (0,45) nonostante il maggior numero di parametri. Sulla base di questo equilibrio tra qualità, velocità e sostenibilità computazionale, Gemma 4 4B è stato selezionato per l’istanza CB-SBS.</w:t>
+        <w:t xml:space="preserve">Tutti i modelli hanno completato l’intero flusso senza interruzioni. Gemma 4 4B ha ottenuto la qualità più alta (0,83), rispettando la sequenza prestabilita e fornendo interpretazioni coerenti con i punteggi in nove degli undici passi, con una velocità di generazione (472 token/s) e un TTFT (4,5 s) adeguati all’uso interattivo. Gemma 4 12B, pur più approfondito nell’analisi, ha registrato un TTFT sensibilmente superiore (12,3 s); DeepSeek-R1-Distill 8B ha alternato risposte eccellenti e scadenti a seconda del passo, mentre Qwen 3.5 9B ha riportato la qualità più bassa (0,45) nonostante il maggior numero di parametri. Sulla base di questo equilibrio tra qualità, velocità e sostenibilità computazionale, Gemma 4 4B è stato selezionato per l’istanza CB-SBS.</w:t>
       </w:r>
     </w:p>
     <w:bookmarkEnd w:id="39"/>
@@ -2319,7 +2417,7 @@
         <w:jc w:val="both"/>
       </w:pPr>
       <w:r>
-        <w:t xml:space="preserve">La versione CB-SBS presenta valutazioni tendenzialmente superiori alla precedente in 9 dimensioni su 10. Dei 27 partecipanti della versione CB-C, 16 hanno fornito valutazioni numeriche e 11 solo commenti aperti; per CB-SBS è stato escluso un record di test, portando il numeratore a 6. La tabella seguente confronta le medie delle due versioni.</w:t>
+        <w:t xml:space="preserve">La versione CB-SBS presenta valutazioni tendenzialmente superiori alla precedente in 9 dimensioni su 10. Dei 27 partecipanti della versione CB-C, 16 hanno fornito valutazioni numeriche e 11 solo commenti aperti; per CB-SBS le valutazioni numeriche sono state fornite da 6 partecipanti. La tabella seguente confronta le medie delle due versioni.</w:t>
       </w:r>
     </w:p>
     <w:tbl>
@@ -2895,7 +2993,7 @@
         <w:jc w:val="both"/>
       </w:pPr>
       <w:r>
-        <w:t xml:space="preserve">I miglioramenti più marcati riguardano facilità d’uso (Δ = +0,79), intenzione di riutilizzo (Δ = +0,71) e fiducia (Δ = +0,65); l’unica dimensione sostanzialmente invariata è l’utilità percepita (Δ = −0,15, entro il range di variabilità atteso per campioni ridotti).</w:t>
+        <w:t xml:space="preserve">I miglioramenti più marcati riguardano facilità d’uso (Δ = +0,79), intenzione di riutilizzo (Δ = +0,71) e fiducia (Δ = +0,65); l’unica dimensione sostanzialmente invariata è l’utilità percepita (Δ = −0,15, entro la variabilità attesa per campioni ridotti).</w:t>
       </w:r>
     </w:p>
     <w:bookmarkEnd w:id="40"/>
@@ -2926,7 +3024,7 @@
         <w:jc w:val="both"/>
       </w:pPr>
       <w:r>
-        <w:t xml:space="preserve">Inserimento dati. (i) Tre partecipanti segnalano difficoltà nel caricamento dei punteggi: «mi ha chiesto di fare una cosa che avevo appena fatto», «inserirli 1 per 1 in chat è stato scomodo», con la richiesta esplicita di poter caricare un PDF per evitare errori di digitazione.</w:t>
+        <w:t xml:space="preserve">Inserimento dati. (i) Tre partecipanti segnalano difficoltà nell’inserimento manuale dei punteggi: «mi ha chiesto di fare una cosa che avevo appena fatto», «inserirli 1 per 1 in chat è stato scomodo», con la richiesta esplicita di poter caricare un PDF per evitare errori di digitazione.</w:t>
       </w:r>
     </w:p>
     <w:p>
@@ -2935,7 +3033,7 @@
         <w:jc w:val="both"/>
       </w:pPr>
       <w:r>
-        <w:t xml:space="preserve">Coerenza della memoria di sessione. (ii) Un partecipante riporta «incongruenze molto grandi tra i dati forniti e i riassunti finali» nella prima analisi, pur riconoscendo che una seconda analisi era più coerente.</w:t>
+        <w:t xml:space="preserve">Coerenza della memoria di sessione. (ii) Un partecipante riporta «incongruenze molto grandi tra i dati forniti e i riassunti finali» al primo utilizzo, pur riconoscendo che una seconda analisi era più coerente.</w:t>
       </w:r>
     </w:p>
     <w:p>
@@ -2978,7 +3076,7 @@
         <w:jc w:val="both"/>
       </w:pPr>
       <w:r>
-        <w:t xml:space="preserve">Sei partecipanti hanno espresso valutazioni positive sulla chiarezza, la pertinenza e l’utilità del sistema, descrivendo l’esperienza come «positiva», «interessante» e «il</w:t>
+        <w:t xml:space="preserve">Sei partecipanti hanno espresso valutazioni positive sulla chiarezza, la pertinenza e l’utilità del sistema, descrivendo l’esperienza come «positiva» e «interessante»; un partecipante ha precisato che «il</w:t>
       </w:r>
       <w:r>
         <w:t xml:space="preserve"> </w:t>
@@ -3017,7 +3115,20 @@
         <w:jc w:val="both"/>
       </w:pPr>
       <w:r>
-        <w:t xml:space="preserve">I risultati presentati in §4 indicano una tendenza favorevole alla versione CB-SBS rispetto alla CB-C. Le criticità emerse dalle risposte aperte della versione CB-C — inserimento manuale dei dati e coerenza delle analisi — trovano riscontro nei punteggi più alti registrati da CB-SBS in facilità d’uso e fiducia; la loro risoluzione conferma che le scelte progettuali hanno prodotto un effetto positivo sull’esperienza utente. Rimane da verificare, su un campione più ampio, se anche le altre dimensioni — in particolare l’utilità percepita, sostanzialmente invariata — possano beneficiare delle stesse modifiche.</w:t>
+        <w:t xml:space="preserve">I risultati presentati in §4 indicano una tendenza favorevole alla versione CB-SBS rispetto alla CB-C. Le criticità emerse dalle risposte aperte della versione CB-C — inserimento manuale dei dati e coerenza delle analisi — trovano riscontro nei punteggi più alti registrati da CB-SBS in facilità d’uso e fiducia; la loro risoluzione conferma che le scelte progettuali hanno prodotto un effetto positivo sull’esperienza utente. Rimane da verificare, su un campione più ampio, se anche le altre dimensioni — in particolare l’utilità percepita, sostanzialmente invariata — possano beneficiare degli stessi interventi progettuali. Le aree (iii) e (iv) emerse dalle risposte aperte — completezza del contesto e lunghezza delle risposte — riflettono invece limitazioni strutturali legate alla gestione della finestra di contesto e alla calibrazione dei</w:t>
+      </w:r>
+      <w:r>
+        <w:t xml:space="preserve"> </w:t>
+      </w:r>
+      <w:r>
+        <w:rPr>
+          <w:iCs/>
+          <w:i/>
+        </w:rPr>
+        <w:t xml:space="preserve">prompt</w:t>
+      </w:r>
+      <w:r>
+        <w:t xml:space="preserve">; la loro risoluzione è prevista nelle direzioni di sviluppo a breve termine (cfr. §6).</w:t>
       </w:r>
     </w:p>
     <w:p>
@@ -3026,7 +3137,7 @@
         <w:jc w:val="both"/>
       </w:pPr>
       <w:r>
-        <w:t xml:space="preserve">Sul piano più generale, l’architettura ibrida di Counselorbot — che combina passi guidati deterministici con la flessibilità di un LLM — si dimostra praticabile per la riflessione assistita delle competenze strategiche. La possibilità di istruire il modello con direttive specifiche e di richiamare conoscenze contestuali apre la strada a forme di accompagnamento scalabili che la letteratura indica come ancora poco coperte (Wollny et al., 2021; Liu et al., 2025). Quanto alla sostenibilità economica, l’impiego di modelli aperti di dimensioni contenute, eseguibili anche su infrastrutture locali — come Gemma 4 4B, selezionato tramite benchmark sistematico per l’istanza CB-SBS — indica una via percorribile per contenere i costi di esercizio.</w:t>
+        <w:t xml:space="preserve">Sul piano più generale, l’architettura ibrida di Counselorbot — che combina passi guidati deterministici con la flessibilità di un LLM — si dimostra praticabile per la riflessione assistita delle competenze strategiche. La possibilità di istruire il modello con direttive specifiche e di richiamare conoscenze contestuali apre la strada a forme di accompagnamento scalabili ancora poco esplorate dalla letteratura (Wollny et al., 2021; Liu et al., 2025). Quanto alla sostenibilità economica, l’impiego di modelli aperti di dimensioni contenute, eseguibili anche su infrastrutture locali — come Gemma 4 4B, selezionato tramite benchmark sistematico per l’istanza CB-SBS — indica una via percorribile per contenere i costi di esercizio. Il punteggio di qualità ottenuto (0,83 su quattro componenti valutate lungo undici passi) segnala una copertura soddisfacente per un contesto di orientamento esplorativo, pur con margini di miglioramento nei passi a maggiore carico interpretativo. La preferenza per Gemma 4 4B rispetto a Gemma 4 12B — quest’ultimo più approfondito nell’analisi ma con una latenza quasi tripla (12,3 s vs 4,5 s) — evidenzia come la latenza percepita costituisca un criterio rilevante quanto la qualità del contenuto in contesti di interazione sincrona.</w:t>
       </w:r>
     </w:p>
     <w:bookmarkEnd w:id="43"/>
@@ -3064,7 +3175,7 @@
         <w:t xml:space="preserve"> </w:t>
       </w:r>
       <w:r>
-        <w:t xml:space="preserve">efficace con un investimento infrastrutturale rapportato ai costi ricorrenti delle API commerciali, a condizione di disporre di hardware adeguato (cfr. §2.3). Quanto alla seconda (D2), i dati comparativi suggeriscono che l’architettura step-by-step (CB-SBS) sia più efficace di quella puramente conversazionale (CB-C) per la riflessione assistita (cfr. Liu et al., 2025; Wollny et al., 2021). La qualità di uno strumento di questo tipo non dipende tuttavia da un singolo elemento, ma dalla configurazione complessiva di diversi fattori: la scelta del modello linguistico, la progettazione dell’esperienza d’uso, la gestione della memoria, la formulazione delle istruzioni e i tempi della loro somministrazione, le conoscenze integrate nel sistema, le modalità di recupero delle informazioni e un processo di miglioramento continuo. Le prestazioni possono variare sensibilmente in funzione del design adottato: il passaggio da un’architettura conversazionale a una struttura step-by-step, così come l’impiego di modelli differenti, incide non solo sulla coerenza e la completezza delle risposte, ma anche sulla percezione complessiva dell’esperienza d’uso (Kasneci et al., 2023; Antunes et al., 2025).</w:t>
+        <w:t xml:space="preserve">efficace con un investimento infrastrutturale paragonabile ai costi ricorrenti delle API commerciali, a condizione di disporre di hardware adeguato (cfr. §2.3). Quanto alla seconda (D2), i dati comparativi suggeriscono che l’architettura step-by-step (CB-SBS) sia più efficace di quella puramente conversazionale (CB-C) per la riflessione assistita (cfr. Liu et al., 2025; Wollny et al., 2021). La qualità di uno strumento di questo tipo non dipende tuttavia da un singolo elemento, ma dalla configurazione complessiva di fattori che riguardano il modello linguistico, la progettazione dell’esperienza d’uso e la gestione della memoria, la formulazione e la sequenza delle istruzioni, le conoscenze contestuali integrate e le modalità del loro recupero, e un processo di miglioramento continuo. Le prestazioni possono variare sensibilmente in funzione del design adottato: il passaggio da un’architettura conversazionale a una struttura step-by-step, così come l’impiego di modelli differenti, incide non solo sulla coerenza e la completezza delle risposte, ma anche sulla percezione complessiva dell’esperienza d’uso (Kasneci et al., 2023; Antunes et al., 2025). La molteplicità di questi fattori pone tuttavia una sfida interpretativa: isolare il contributo specifico di ciascuna componente e determinare quale di esse incida in misura prevalente sui risultati rimane un problema metodologico aperto.</w:t>
       </w:r>
     </w:p>
     <w:p>
@@ -3073,7 +3184,7 @@
         <w:jc w:val="both"/>
       </w:pPr>
       <w:r>
-        <w:t xml:space="preserve">I risultati vanno tuttavia interpretati alla luce dei limiti dello studio. Il presente lavoro si colloca nella fase di test del modello ADDIE (Branch, 2009): i dati raccolti informano il ciclo iterativo di sviluppo più che costituire una validazione conclusiva. Il campione è ridotto (n=6 per CB-SBS, n=16 per CB-C con dati numerici) e non probabilistico; la differenza tra le due versioni potrebbe risentire di fattori confondenti, quali la diversa composizione demografica o la maturità del percorso di sviluppo. Il dato disponibile è inoltre esclusivamente basato sulle valutazione degli studenti, che potrebbe risentire di effetti di desiderabilità sociale; restano da acquisire metriche oggettive — quali tempi di risposta e tassi di completamento — per una valutazione più completa. Per queste ragioni, i risultati vanno letti come indicatori di tendenza, non come evidenza definitiva.</w:t>
+        <w:t xml:space="preserve">I risultati vanno tuttavia interpretati alla luce dei limiti dello studio. Il presente lavoro si colloca nella fase di test del approccio ADDIE (Branch, 2009): i dati raccolti informano il ciclo iterativo di sviluppo più che costituire una validazione conclusiva. Il campione è ridotto (n=6 per CB-SBS, n=16 per CB-C con dati numerici) e non probabilistico; la differenza tra le due versioni potrebbe risentire di fattori confondenti, quali la diversa composizione demografica o la maturità del percorso di sviluppo. I dati disponibili sono inoltre esclusivamente basati sulle valutazioni degli studenti, che potrebbero risentire di effetti di desiderabilità sociale; restano da acquisire metriche oggettive — quali tempi di risposta e tassi di completamento — per una valutazione più completa. Va infine osservato che le risposte aperte provengono esclusivamente dalla versione CB-C: l’assenza di feedback qualitativo su CB-SBS limita la possibilità di interpretare le dimensioni in cui il miglioramento è più contenuto. Per queste ragioni, i risultati vanno letti come indicatori di tendenza, non come evidenza definitiva.</w:t>
       </w:r>
     </w:p>
     <w:p>
@@ -3082,7 +3193,7 @@
         <w:jc w:val="both"/>
       </w:pPr>
       <w:r>
-        <w:t xml:space="preserve">Per quanto riguarda lo sviluppo futuro, le direzioni di lavoro possono essere articolate su tre orizzonti temporali. A breve termine, l’obiettivo è consolidare l’affidabilità del percorso guidato sul QSA ed estendere la sperimentazione agli altri strumenti del sistema — QSAr, ZTPI, intervista di Savickas, QPCS, QPCC e QAP — per verificarne l’efficacia su un ventaglio più ampio di costrutti e utenti. Parallelamente, i dati raccolti durante le interazioni, opportunamente anonimizzati, potranno essere impiegati per un affinamento (</w:t>
+        <w:t xml:space="preserve">Le direzioni di sviluppo futuro si articolano su tre orizzonti temporali. A breve termine, l’obiettivo è consolidare l’affidabilità del percorso guidato sul QSA ed estendere la sperimentazione agli altri strumenti del sistema — QSAr, ZTPI, intervista di Savickas, QPCS, QPCC e QAP — per verificarne l’efficacia su un ventaglio più ampio di costrutti e utenti. Parallelamente, i dati raccolti durante le interazioni, opportunamente anonimizzati, potranno essere impiegati per un affinamento (</w:t>
       </w:r>
       <w:r>
         <w:rPr>
@@ -3126,7 +3237,7 @@
         <w:jc w:val="both"/>
       </w:pPr>
       <w:r>
-        <w:t xml:space="preserve">A lungo termine, si prospettano studi longitudinali per valutare l’impatto del sistema sulle strategie di apprendimento, sui processi di riflessione assistita e sulle capacità di orientamento degli studenti. Sarà inoltre necessario proseguire la valutazione con gruppi di utenti più ampi e differenziati, analizzando le modalità con cui studenti, tutor e orientatori possono integrare lo strumento nelle rispettive pratiche. Infine, bisognerà tenere sempre sotto osservazione l’evoluzione dei modelli con meno di 15 miliardi di parametri — soglia che ha orientato la selezione per l’infrastruttura locale. Tale evoluzione amplia continuamente lo spazio delle opzioni disponibili. A titolo esemplificativo, Gemma 4 12B (Gemma Team, 2025) non era ancora disponibile al momento della valutazione e, una volta testato, potrebbe rivelarsi un candidato interessante per le future iterazioni del sistema.</w:t>
+        <w:t xml:space="preserve">A lungo termine, si prospettano studi longitudinali per valutare l’impatto del sistema sulle strategie di apprendimento, sui processi di riflessione assistita e sulle capacità di orientamento degli studenti. Sarà inoltre necessario proseguire la valutazione con gruppi di utenti più ampi e differenziati, analizzando le modalità con cui studenti, tutor e orientatori possono integrare lo strumento nelle rispettive pratiche. Infine, sarà necessario monitorare l’evoluzione dei modelli con meno di 15 miliardi di parametri — soglia che ha orientato la selezione per l’infrastruttura locale. A titolo esemplificativo, Gemma 4 12B (Gemma Team, 2025) non era ancora disponibile al momento della valutazione e, una volta testato, potrebbe rivelarsi un candidato interessante per le future iterazioni del sistema.</w:t>
       </w:r>
     </w:p>
     <w:bookmarkEnd w:id="44"/>
@@ -3789,6 +3900,28 @@
       </w:r>
       <w:r>
         <w:t xml:space="preserve">(1), 39. https://doi.org/10.1186/s41239-019-0171-0</w:t>
+      </w:r>
+    </w:p>
+    <w:p>
+      <w:pPr>
+        <w:pStyle w:val="BodyText"/>
+        <w:jc w:val="both"/>
+      </w:pPr>
+      <w:r>
+        <w:t xml:space="preserve">Zimbardo, P. G., &amp; Boyd, J. N. (1999). Putting time in perspective: A valid, reliable individual-differences metric.</w:t>
+      </w:r>
+      <w:r>
+        <w:t xml:space="preserve"> </w:t>
+      </w:r>
+      <w:r>
+        <w:rPr>
+          <w:iCs/>
+          <w:i/>
+        </w:rPr>
+        <w:t xml:space="preserve">Journal of Personality and Social Psychology, 77</w:t>
+      </w:r>
+      <w:r>
+        <w:t xml:space="preserve">(6), 1271–1288. https://doi.org/10.1037/0022-3514.77.6.1271</w:t>
       </w:r>
     </w:p>
     <w:bookmarkEnd w:id="45"/>

</xml_diff>